<commit_message>
Doc: reflect atmospheric-floor evaporator pressure + add simAtmPress
Update the Plant Model pressure section to describe the non-condensable
air + vent behaviour (flat at atmospheric through warm-up, lifts at Tsat)
and add simAtmPress to the simulator-parameter reference.

Co-Authored-By: Claude Opus 4.8 <noreply@anthropic.com>
</commit_message>
<xml_diff>
--- a/MVR_Model_Reference.docx
+++ b/MVR_Model_Reference.docx
@@ -955,6 +955,42 @@
       </w:pPr>
       <w:r>
         <w:t xml:space="preserve">3.2  Pressures, deltaT (Antoine)</w:t>
+      </w:r>
+    </w:p>
+    <w:p>
+      <w:pPr>
+        <w:spacing w:after="120"/>
+      </w:pPr>
+      <w:r>
+        <w:t xml:space="preserve">The vessel holds non-condensable air and is vented at startup, so the absolute pressure sits at atmospheric and only lifts off as the water's vapor pressure reaches it near boiling -- NOT during warm-up. The pure-vapor Psat is therefore floored at simAtmPress; the steam side inherits the flat-then-rise through PR.</w:t>
+      </w:r>
+    </w:p>
+    <w:p>
+      <w:pPr>
+        <w:spacing w:after="60"/>
+        <w:ind w:left="360"/>
+      </w:pPr>
+      <w:r>
+        <w:rPr>
+          <w:rFonts w:ascii="Consolas" w:cs="Consolas" w:eastAsia="Consolas" w:hAnsi="Consolas"/>
+          <w:sz w:val="19"/>
+          <w:szCs w:val="19"/>
+        </w:rPr>
+        <w:t xml:space="preserve">PsatEvap = Antoine(eT)   (water saturation pressure, psia)</w:t>
+      </w:r>
+    </w:p>
+    <w:p>
+      <w:pPr>
+        <w:spacing w:after="60"/>
+        <w:ind w:left="360"/>
+      </w:pPr>
+      <w:r>
+        <w:rPr>
+          <w:rFonts w:ascii="Consolas" w:cs="Consolas" w:eastAsia="Consolas" w:hAnsi="Consolas"/>
+          <w:sz w:val="19"/>
+          <w:szCs w:val="19"/>
+        </w:rPr>
+        <w:t xml:space="preserve">simEvapPress -&gt; max( PsatEvap , simAtmPress )    (flat ~atm below ~100C, lifts at Tsat)</w:t>
       </w:r>
     </w:p>
     <w:p>
@@ -7884,6 +7920,95 @@
                 <w:szCs w:val="20"/>
               </w:rPr>
               <w:t xml:space="preserve">Blower pressure ratio / compression superheat (C per PR-1).</w:t>
+            </w:r>
+          </w:p>
+        </w:tc>
+      </w:tr>
+      <w:tr>
+        <w:tc>
+          <w:tcPr>
+            <w:tcW w:type="dxa" w:w="2600"/>
+            <w:tcBorders>
+              <w:top w:val="single" w:color="BBBBBB" w:sz="1"/>
+              <w:left w:val="single" w:color="BBBBBB" w:sz="1"/>
+              <w:bottom w:val="single" w:color="BBBBBB" w:sz="1"/>
+              <w:right w:val="single" w:color="BBBBBB" w:sz="1"/>
+            </w:tcBorders>
+            <w:tcMar>
+              <w:top w:type="dxa" w:w="50"/>
+              <w:left w:type="dxa" w:w="110"/>
+              <w:bottom w:type="dxa" w:w="50"/>
+              <w:right w:type="dxa" w:w="110"/>
+            </w:tcMar>
+          </w:tcPr>
+          <w:p>
+            <w:r>
+              <w:rPr>
+                <w:rFonts w:ascii="Consolas" w:cs="Consolas" w:eastAsia="Consolas" w:hAnsi="Consolas"/>
+                <w:b w:val="false"/>
+                <w:bCs w:val="false"/>
+                <w:sz w:val="18"/>
+                <w:szCs w:val="18"/>
+              </w:rPr>
+              <w:t xml:space="preserve">simAtmPress</w:t>
+            </w:r>
+          </w:p>
+        </w:tc>
+        <w:tc>
+          <w:tcPr>
+            <w:tcW w:type="dxa" w:w="1500"/>
+            <w:tcBorders>
+              <w:top w:val="single" w:color="BBBBBB" w:sz="1"/>
+              <w:left w:val="single" w:color="BBBBBB" w:sz="1"/>
+              <w:bottom w:val="single" w:color="BBBBBB" w:sz="1"/>
+              <w:right w:val="single" w:color="BBBBBB" w:sz="1"/>
+            </w:tcBorders>
+            <w:tcMar>
+              <w:top w:type="dxa" w:w="50"/>
+              <w:left w:type="dxa" w:w="110"/>
+              <w:bottom w:type="dxa" w:w="50"/>
+              <w:right w:type="dxa" w:w="110"/>
+            </w:tcMar>
+          </w:tcPr>
+          <w:p>
+            <w:r>
+              <w:rPr>
+                <w:rFonts w:ascii="Arial" w:cs="Arial" w:eastAsia="Arial" w:hAnsi="Arial"/>
+                <w:b w:val="false"/>
+                <w:bCs w:val="false"/>
+                <w:sz w:val="20"/>
+                <w:szCs w:val="20"/>
+              </w:rPr>
+              <w:t xml:space="preserve">14.7</w:t>
+            </w:r>
+          </w:p>
+        </w:tc>
+        <w:tc>
+          <w:tcPr>
+            <w:tcW w:type="dxa" w:w="5260"/>
+            <w:tcBorders>
+              <w:top w:val="single" w:color="BBBBBB" w:sz="1"/>
+              <w:left w:val="single" w:color="BBBBBB" w:sz="1"/>
+              <w:bottom w:val="single" w:color="BBBBBB" w:sz="1"/>
+              <w:right w:val="single" w:color="BBBBBB" w:sz="1"/>
+            </w:tcBorders>
+            <w:tcMar>
+              <w:top w:type="dxa" w:w="50"/>
+              <w:left w:type="dxa" w:w="110"/>
+              <w:bottom w:type="dxa" w:w="50"/>
+              <w:right w:type="dxa" w:w="110"/>
+            </w:tcMar>
+          </w:tcPr>
+          <w:p>
+            <w:r>
+              <w:rPr>
+                <w:rFonts w:ascii="Arial" w:cs="Arial" w:eastAsia="Arial" w:hAnsi="Arial"/>
+                <w:b w:val="false"/>
+                <w:bCs w:val="false"/>
+                <w:sz w:val="20"/>
+                <w:szCs w:val="20"/>
+              </w:rPr>
+              <w:t xml:space="preserve">Atmospheric / vent reference (psia). Evaporator pressure is floored here (non-condensable air + vent) until Psat(eT) exceeds it at boiling, so it stays flat through warm-up then lifts at Tsat. Set to local barometric.</w:t>
             </w:r>
           </w:p>
         </w:tc>

</xml_diff>

<commit_message>
Doc: pressure section now describes compressor suction/discharge
Evaporator is the suction (low) side -- never positive, pulled below
atmospheric when the blower spins up; steam/discharge side anchored at
the condensing pressure (>= atmospheric).

Co-Authored-By: Claude Opus 4.8 <noreply@anthropic.com>
</commit_message>
<xml_diff>
--- a/MVR_Model_Reference.docx
+++ b/MVR_Model_Reference.docx
@@ -954,7 +954,7 @@
         <w:pStyle w:val="Heading2"/>
       </w:pPr>
       <w:r>
-        <w:t xml:space="preserve">3.2  Pressures, deltaT (Antoine)</w:t>
+        <w:t xml:space="preserve">3.2  Pressures -- compressor suction / discharge (Antoine)</w:t>
       </w:r>
     </w:p>
     <w:p>
@@ -962,7 +962,7 @@
         <w:spacing w:after="120"/>
       </w:pPr>
       <w:r>
-        <w:t xml:space="preserve">The vessel holds non-condensable air and is vented at startup, so the absolute pressure sits at atmospheric and only lifts off as the water's vapor pressure reaches it near boiling -- NOT during warm-up. The pure-vapor Psat is therefore floored at simAtmPress; the steam side inherits the flat-then-rise through PR.</w:t>
+        <w:t xml:space="preserve">The blower is the COMPRESSOR: it draws vapor OFF the evaporator (suction, low side) and discharges into the steam chest (high side). The condensate / discharge side is vented (catch-tank vent), so it rests near atmospheric and rises with the condensing temperature. The EVAPORATOR is the suction side -- it never goes positive, and the instant the blower spins up it is pulled BELOW atmospheric (deepest while boil-off still lags blower throughput), recovering toward atmospheric as the chest warms. Blower off (warm-up): PR=1, both sides rest at atmospheric (air + vent).</w:t>
       </w:r>
     </w:p>
     <w:p>
@@ -976,7 +976,7 @@
           <w:sz w:val="19"/>
           <w:szCs w:val="19"/>
         </w:rPr>
-        <w:t xml:space="preserve">PsatEvap = Antoine(eT)   (water saturation pressure, psia)</w:t>
+        <w:t xml:space="preserve">PR        = 1 + (simPRmax-1)*compEff</w:t>
       </w:r>
     </w:p>
     <w:p>
@@ -990,7 +990,7 @@
           <w:sz w:val="19"/>
           <w:szCs w:val="19"/>
         </w:rPr>
-        <w:t xml:space="preserve">simEvapPress -&gt; max( PsatEvap , simAtmPress )    (flat ~atm below ~100C, lifts at Tsat)</w:t>
+        <w:t xml:space="preserve">discharge = max( Psat(simSteamChest) , simAtmPress )    // steam / condensing side</w:t>
       </w:r>
     </w:p>
     <w:p>
@@ -1004,7 +1004,7 @@
           <w:sz w:val="19"/>
           <w:szCs w:val="19"/>
         </w:rPr>
-        <w:t xml:space="preserve">PR = 1 + (simPRmax-1)*compEff ;  simSteamPress = simEvapPress * PR</w:t>
+        <w:t xml:space="preserve">simSteamPress -&gt; discharge        (lifts above atmospheric as the chest heats)</w:t>
       </w:r>
     </w:p>
     <w:p>
@@ -1018,7 +1018,21 @@
           <w:sz w:val="19"/>
           <w:szCs w:val="19"/>
         </w:rPr>
-        <w:t xml:space="preserve">Tsat(P)  via Antoine ;  deltaT = steamTsat - evapTsat</w:t>
+        <w:t xml:space="preserve">simEvapPress  -&gt; min( discharge / PR , simAtmPress )    // suction: NEVER positive</w:t>
+      </w:r>
+    </w:p>
+    <w:p>
+      <w:pPr>
+        <w:spacing w:after="60"/>
+        <w:ind w:left="360"/>
+      </w:pPr>
+      <w:r>
+        <w:rPr>
+          <w:rFonts w:ascii="Consolas" w:cs="Consolas" w:eastAsia="Consolas" w:hAnsi="Consolas"/>
+          <w:sz w:val="19"/>
+          <w:szCs w:val="19"/>
+        </w:rPr>
+        <w:t xml:space="preserve">Tsat(P) via Antoine ;  deltaT = Tsat(steam) - Tsat(evap)   (evap Tsat drops under vacuum)</w:t>
       </w:r>
     </w:p>
     <w:p>

</xml_diff>

<commit_message>
Doc: condensate section reworked for single-sensor pump-to-dry scheme
Updated 2.6/2.9 control laws, the condensate variable tables, sim state
and params, and calibration test 4.7 to the new design (HX bottom tube
+ one point sensor + meter on the pump outlet, batch-based production).

Co-Authored-By: Claude Opus 4.8 <noreply@anthropic.com>
</commit_message>
<xml_diff>
--- a/MVR_Model_Reference.docx
+++ b/MVR_Model_Reference.docx
@@ -632,7 +632,7 @@
         <w:spacing w:after="120"/>
       </w:pPr>
       <w:r>
-        <w:t xml:space="preserve">Trims the blower (the compressor / vapor pump) to hold the target distillate rate. Measured production = the calibrated condensate flow meter; while venting (meter ~0) it uses a blower-throughput estimate. cdt accelerates the integral in sim so it converges at the same wall-clock feel.</w:t>
+        <w:t xml:space="preserve">Trims the blower (the compressor / vapor pump) to hold the target distillate rate. Measured production now comes from the condensate BATCHES (see 2.9): each pump-to-dry cycle meters a known distillate volume, and volume / fill-time is the average production rate -- the only rate a single point-level sensor can give. Updated once per empty cycle (condRateLpm) and held between; before the first batch the blower holds nominal rpm. cdt accelerates the integral in sim so it converges at the same wall-clock feel.</w:t>
       </w:r>
     </w:p>
     <w:p>
@@ -646,7 +646,7 @@
           <w:sz w:val="19"/>
           <w:szCs w:val="19"/>
         </w:rPr>
-        <w:t xml:space="preserve">measProd = yCondFlow * condCalFactor          (when condLiquid; else blowerProdEst)</w:t>
+        <w:t xml:space="preserve">measProd = condRateLpm                         (batch volume / fill time)</w:t>
       </w:r>
     </w:p>
     <w:p>
@@ -794,7 +794,7 @@
         <w:pStyle w:val="Heading2"/>
       </w:pPr>
       <w:r>
-        <w:t xml:space="preserve">2.9  Condensate pump + flow-meter self-cal (CondensatePump)</w:t>
+        <w:t xml:space="preserve">2.9  Condensate -- single point sensor, pump-to-dry (CondensatePump)</w:t>
       </w:r>
     </w:p>
     <w:p>
@@ -802,7 +802,7 @@
         <w:spacing w:after="120"/>
       </w:pPr>
       <w:r>
-        <w:t xml:space="preserve">2-level pump (on at HIGH, off at LOW). The flow meter is integrated only while the condensate is LIQUID, and re-calibrated each fill against the known 120 ml (condHighML - condLowML).</w:t>
+        <w:t xml:space="preserve">No separate catch tank: condensate collects in the bottom TUBE of the HX. One point-level sensor ~3/4 up the tube (AI:CondLevel &gt; condLevelThresh -&gt; yCondHigh) starts the pump. The flow meter sits on the PUMP OUTLET, so it directly meters distillate leaving. The pump runs until the tube is DRY: when it sucks air the metered flow drops to the incoming trickle (below condEmptyFlow) -- that sustained drop, debounced, is the empty signal. Pumped volume per cycle is the distillate batch; batch / fill-time is the production rate.</w:t>
       </w:r>
     </w:p>
     <w:p>
@@ -816,7 +816,7 @@
           <w:sz w:val="19"/>
           <w:szCs w:val="19"/>
         </w:rPr>
-        <w:t xml:space="preserve">condLiquid = yCondTemp &lt; condLiquidTemp          (hysteresis)</w:t>
+        <w:t xml:space="preserve">start pump when  AI:CondLevel &gt; condLevelThresh   (tube ~3/4 full)</w:t>
       </w:r>
     </w:p>
     <w:p>
@@ -830,7 +830,7 @@
           <w:sz w:val="19"/>
           <w:szCs w:val="19"/>
         </w:rPr>
-        <w:t xml:space="preserve">ventOpen   = NOT condLiquid                      -&gt;  DO:VentValve</w:t>
+        <w:t xml:space="preserve">stop  when  yCondFlow &lt; condEmptyFlow for condEmptyDebounce   (tube dry)  [or condPumpMaxRun]</w:t>
       </w:r>
     </w:p>
     <w:p>
@@ -844,7 +844,40 @@
           <w:sz w:val="19"/>
           <w:szCs w:val="19"/>
         </w:rPr>
-        <w:t xml:space="preserve">on each LOW-&gt;HIGH fill:  condCalFactor &lt;- fit so the integrated raw = 120 ml</w:t>
+        <w:t xml:space="preserve">condBatchMl = integral(yCondFlow) * condCalFactor    ;  condProduct += condBatchMl</w:t>
+      </w:r>
+    </w:p>
+    <w:p>
+      <w:pPr>
+        <w:spacing w:after="60"/>
+        <w:ind w:left="360"/>
+      </w:pPr>
+      <w:r>
+        <w:rPr>
+          <w:rFonts w:ascii="Consolas" w:cs="Consolas" w:eastAsia="Consolas" w:hAnsi="Consolas"/>
+          <w:sz w:val="19"/>
+          <w:szCs w:val="19"/>
+        </w:rPr>
+        <w:t xml:space="preserve">condRateLpm = condBatchMl / fill-cycle-time     -&gt;  ProductionControl (2.6)</w:t>
+      </w:r>
+    </w:p>
+    <w:p>
+      <w:pPr>
+        <w:spacing w:after="120"/>
+      </w:pPr>
+      <w:r>
+        <w:t xml:space="preserve">The steam vent (DO:VentValve, </w:t>
+      </w:r>
+      <w:r>
+        <w:rPr>
+          <w:rFonts w:ascii="Consolas" w:cs="Consolas" w:eastAsia="Consolas" w:hAnsi="Consolas"/>
+          <w:sz w:val="19"/>
+          <w:szCs w:val="19"/>
+        </w:rPr>
+        <w:t xml:space="preserve">ventOpen = yCondTemp &gt; condLiquidTemp</w:t>
+      </w:r>
+      <w:r>
+        <w:t xml:space="preserve">) still purges steam/air at startup, but the flow meter no longer depends on it -- the level sensor + pump gate the metering.</w:t>
       </w:r>
     </w:p>
     <w:p>
@@ -2029,7 +2062,7 @@
         <w:pStyle w:val="Heading3"/>
       </w:pPr>
       <w:r>
-        <w:t xml:space="preserve">4.7  Catch-tank levels  -&gt;  condHighML, condLowML</w:t>
+        <w:t xml:space="preserve">4.7  Condensate flow meter + tube  -&gt;  condCalFactor, condEmptyFlow, condTubeTripML</w:t>
       </w:r>
     </w:p>
     <w:p>
@@ -2044,7 +2077,7 @@
         <w:t xml:space="preserve">Determines: </w:t>
       </w:r>
       <w:r>
-        <w:t xml:space="preserve">The two level-switch volumes (and the 120 ml cal reference).</w:t>
+        <w:t xml:space="preserve">Pump-outlet flow-meter calibration, the dry threshold, and the tube/sensor volume.</w:t>
       </w:r>
     </w:p>
     <w:p>
@@ -2069,7 +2102,33 @@
         <w:spacing w:after="40"/>
       </w:pPr>
       <w:r>
-        <w:t xml:space="preserve">Fill the catch tank slowly; record the volume (graduated / scale) at which the LOW switch and then the HIGH switch trip.</w:t>
+        <w:t xml:space="preserve">Bench: pump a known liquid volume through the meter; record pulses (or the app's integrated raw) to get pulses/L -&gt; condCalFactor.</w:t>
+      </w:r>
+    </w:p>
+    <w:p>
+      <w:pPr>
+        <w:pStyle w:val="ListParagraph"/>
+        <w:numPr>
+          <w:ilvl w:val="0"/>
+          <w:numId w:val="2"/>
+        </w:numPr>
+        <w:spacing w:after="40"/>
+      </w:pPr>
+      <w:r>
+        <w:t xml:space="preserve">Run the condensate pump empty (dry) and note its steady flow reading, then pumping liquid and note that reading -- the dry threshold sits between them.</w:t>
+      </w:r>
+    </w:p>
+    <w:p>
+      <w:pPr>
+        <w:pStyle w:val="ListParagraph"/>
+        <w:numPr>
+          <w:ilvl w:val="0"/>
+          <w:numId w:val="2"/>
+        </w:numPr>
+        <w:spacing w:after="40"/>
+      </w:pPr>
+      <w:r>
+        <w:t xml:space="preserve">Fill the HX bottom tube to the sensor trip and measure the volume pumped out (the app shows condBatchMl).</w:t>
       </w:r>
     </w:p>
     <w:p>
@@ -2095,7 +2154,7 @@
           <w:sz w:val="19"/>
           <w:szCs w:val="19"/>
         </w:rPr>
-        <w:t xml:space="preserve">condLowML  = volume at the LOW switch</w:t>
+        <w:t xml:space="preserve">condCalFactor = known_volume / metered_raw     (bench, fixed)</w:t>
       </w:r>
     </w:p>
     <w:p>
@@ -2109,7 +2168,21 @@
           <w:sz w:val="19"/>
           <w:szCs w:val="19"/>
         </w:rPr>
-        <w:t xml:space="preserve">condHighML = volume at the HIGH switch     (HIGH - LOW = the self-cal reference)</w:t>
+        <w:t xml:space="preserve">condEmptyFlow ~ halfway between the dry trickle (~production) and the full pump rate</w:t>
+      </w:r>
+    </w:p>
+    <w:p>
+      <w:pPr>
+        <w:spacing w:after="60"/>
+        <w:ind w:left="360"/>
+      </w:pPr>
+      <w:r>
+        <w:rPr>
+          <w:rFonts w:ascii="Consolas" w:cs="Consolas" w:eastAsia="Consolas" w:hAnsi="Consolas"/>
+          <w:sz w:val="19"/>
+          <w:szCs w:val="19"/>
+        </w:rPr>
+        <w:t xml:space="preserve">condTubeTripML = measured batch per cycle (geometric ~130 ml at 3/4 of the 1.16in x 10in tube)</w:t>
       </w:r>
     </w:p>
     <w:p>
@@ -5739,6 +5812,478 @@
                 <w:sz w:val="18"/>
                 <w:szCs w:val="18"/>
               </w:rPr>
+              <w:t xml:space="preserve">condLevelThresh</w:t>
+            </w:r>
+          </w:p>
+        </w:tc>
+        <w:tc>
+          <w:tcPr>
+            <w:tcW w:type="dxa" w:w="1300"/>
+            <w:tcBorders>
+              <w:top w:val="single" w:color="BBBBBB" w:sz="1"/>
+              <w:left w:val="single" w:color="BBBBBB" w:sz="1"/>
+              <w:bottom w:val="single" w:color="BBBBBB" w:sz="1"/>
+              <w:right w:val="single" w:color="BBBBBB" w:sz="1"/>
+            </w:tcBorders>
+            <w:tcMar>
+              <w:top w:type="dxa" w:w="50"/>
+              <w:left w:type="dxa" w:w="110"/>
+              <w:bottom w:type="dxa" w:w="50"/>
+              <w:right w:type="dxa" w:w="110"/>
+            </w:tcMar>
+          </w:tcPr>
+          <w:p>
+            <w:r>
+              <w:rPr>
+                <w:rFonts w:ascii="Arial" w:cs="Arial" w:eastAsia="Arial" w:hAnsi="Arial"/>
+                <w:b w:val="false"/>
+                <w:bCs w:val="false"/>
+                <w:sz w:val="20"/>
+                <w:szCs w:val="20"/>
+              </w:rPr>
+              <w:t xml:space="preserve">2.5</w:t>
+            </w:r>
+          </w:p>
+        </w:tc>
+        <w:tc>
+          <w:tcPr>
+            <w:tcW w:type="dxa" w:w="1500"/>
+            <w:tcBorders>
+              <w:top w:val="single" w:color="BBBBBB" w:sz="1"/>
+              <w:left w:val="single" w:color="BBBBBB" w:sz="1"/>
+              <w:bottom w:val="single" w:color="BBBBBB" w:sz="1"/>
+              <w:right w:val="single" w:color="BBBBBB" w:sz="1"/>
+            </w:tcBorders>
+            <w:tcMar>
+              <w:top w:type="dxa" w:w="50"/>
+              <w:left w:type="dxa" w:w="110"/>
+              <w:bottom w:type="dxa" w:w="50"/>
+              <w:right w:type="dxa" w:w="110"/>
+            </w:tcMar>
+          </w:tcPr>
+          <w:p>
+            <w:r>
+              <w:rPr>
+                <w:rFonts w:ascii="Arial" w:cs="Arial" w:eastAsia="Arial" w:hAnsi="Arial"/>
+                <w:b w:val="false"/>
+                <w:bCs w:val="false"/>
+                <w:sz w:val="20"/>
+                <w:szCs w:val="20"/>
+              </w:rPr>
+              <w:t xml:space="preserve">V/units</w:t>
+            </w:r>
+          </w:p>
+        </w:tc>
+        <w:tc>
+          <w:tcPr>
+            <w:tcW w:type="dxa" w:w="4360"/>
+            <w:tcBorders>
+              <w:top w:val="single" w:color="BBBBBB" w:sz="1"/>
+              <w:left w:val="single" w:color="BBBBBB" w:sz="1"/>
+              <w:bottom w:val="single" w:color="BBBBBB" w:sz="1"/>
+              <w:right w:val="single" w:color="BBBBBB" w:sz="1"/>
+            </w:tcBorders>
+            <w:tcMar>
+              <w:top w:type="dxa" w:w="50"/>
+              <w:left w:type="dxa" w:w="110"/>
+              <w:bottom w:type="dxa" w:w="50"/>
+              <w:right w:type="dxa" w:w="110"/>
+            </w:tcMar>
+          </w:tcPr>
+          <w:p>
+            <w:r>
+              <w:rPr>
+                <w:rFonts w:ascii="Arial" w:cs="Arial" w:eastAsia="Arial" w:hAnsi="Arial"/>
+                <w:b w:val="false"/>
+                <w:bCs w:val="false"/>
+                <w:sz w:val="20"/>
+                <w:szCs w:val="20"/>
+              </w:rPr>
+              <w:t xml:space="preserve">AI:CondLevel above this = tube ~3/4 full -&gt; start the condensate pump (the point sensor trip).</w:t>
+            </w:r>
+          </w:p>
+        </w:tc>
+      </w:tr>
+      <w:tr>
+        <w:tc>
+          <w:tcPr>
+            <w:tcW w:type="dxa" w:w="2200"/>
+            <w:tcBorders>
+              <w:top w:val="single" w:color="BBBBBB" w:sz="1"/>
+              <w:left w:val="single" w:color="BBBBBB" w:sz="1"/>
+              <w:bottom w:val="single" w:color="BBBBBB" w:sz="1"/>
+              <w:right w:val="single" w:color="BBBBBB" w:sz="1"/>
+            </w:tcBorders>
+            <w:tcMar>
+              <w:top w:type="dxa" w:w="50"/>
+              <w:left w:type="dxa" w:w="110"/>
+              <w:bottom w:type="dxa" w:w="50"/>
+              <w:right w:type="dxa" w:w="110"/>
+            </w:tcMar>
+          </w:tcPr>
+          <w:p>
+            <w:r>
+              <w:rPr>
+                <w:rFonts w:ascii="Consolas" w:cs="Consolas" w:eastAsia="Consolas" w:hAnsi="Consolas"/>
+                <w:b w:val="false"/>
+                <w:bCs w:val="false"/>
+                <w:sz w:val="18"/>
+                <w:szCs w:val="18"/>
+              </w:rPr>
+              <w:t xml:space="preserve">condEmptyFlow</w:t>
+            </w:r>
+          </w:p>
+        </w:tc>
+        <w:tc>
+          <w:tcPr>
+            <w:tcW w:type="dxa" w:w="1300"/>
+            <w:tcBorders>
+              <w:top w:val="single" w:color="BBBBBB" w:sz="1"/>
+              <w:left w:val="single" w:color="BBBBBB" w:sz="1"/>
+              <w:bottom w:val="single" w:color="BBBBBB" w:sz="1"/>
+              <w:right w:val="single" w:color="BBBBBB" w:sz="1"/>
+            </w:tcBorders>
+            <w:tcMar>
+              <w:top w:type="dxa" w:w="50"/>
+              <w:left w:type="dxa" w:w="110"/>
+              <w:bottom w:type="dxa" w:w="50"/>
+              <w:right w:type="dxa" w:w="110"/>
+            </w:tcMar>
+          </w:tcPr>
+          <w:p>
+            <w:r>
+              <w:rPr>
+                <w:rFonts w:ascii="Arial" w:cs="Arial" w:eastAsia="Arial" w:hAnsi="Arial"/>
+                <w:b w:val="false"/>
+                <w:bCs w:val="false"/>
+                <w:sz w:val="20"/>
+                <w:szCs w:val="20"/>
+              </w:rPr>
+              <w:t xml:space="preserve">0.5</w:t>
+            </w:r>
+          </w:p>
+        </w:tc>
+        <w:tc>
+          <w:tcPr>
+            <w:tcW w:type="dxa" w:w="1500"/>
+            <w:tcBorders>
+              <w:top w:val="single" w:color="BBBBBB" w:sz="1"/>
+              <w:left w:val="single" w:color="BBBBBB" w:sz="1"/>
+              <w:bottom w:val="single" w:color="BBBBBB" w:sz="1"/>
+              <w:right w:val="single" w:color="BBBBBB" w:sz="1"/>
+            </w:tcBorders>
+            <w:tcMar>
+              <w:top w:type="dxa" w:w="50"/>
+              <w:left w:type="dxa" w:w="110"/>
+              <w:bottom w:type="dxa" w:w="50"/>
+              <w:right w:type="dxa" w:w="110"/>
+            </w:tcMar>
+          </w:tcPr>
+          <w:p>
+            <w:r>
+              <w:rPr>
+                <w:rFonts w:ascii="Arial" w:cs="Arial" w:eastAsia="Arial" w:hAnsi="Arial"/>
+                <w:b w:val="false"/>
+                <w:bCs w:val="false"/>
+                <w:sz w:val="20"/>
+                <w:szCs w:val="20"/>
+              </w:rPr>
+              <w:t xml:space="preserve">L/min</w:t>
+            </w:r>
+          </w:p>
+        </w:tc>
+        <w:tc>
+          <w:tcPr>
+            <w:tcW w:type="dxa" w:w="4360"/>
+            <w:tcBorders>
+              <w:top w:val="single" w:color="BBBBBB" w:sz="1"/>
+              <w:left w:val="single" w:color="BBBBBB" w:sz="1"/>
+              <w:bottom w:val="single" w:color="BBBBBB" w:sz="1"/>
+              <w:right w:val="single" w:color="BBBBBB" w:sz="1"/>
+            </w:tcBorders>
+            <w:tcMar>
+              <w:top w:type="dxa" w:w="50"/>
+              <w:left w:type="dxa" w:w="110"/>
+              <w:bottom w:type="dxa" w:w="50"/>
+              <w:right w:type="dxa" w:w="110"/>
+            </w:tcMar>
+          </w:tcPr>
+          <w:p>
+            <w:r>
+              <w:rPr>
+                <w:rFonts w:ascii="Arial" w:cs="Arial" w:eastAsia="Arial" w:hAnsi="Arial"/>
+                <w:b w:val="false"/>
+                <w:bCs w:val="false"/>
+                <w:sz w:val="20"/>
+                <w:szCs w:val="20"/>
+              </w:rPr>
+              <w:t xml:space="preserve">Pump-outlet flow below this = tube DRY. Set between the max production trickle and the condensate-pump rate.</w:t>
+            </w:r>
+          </w:p>
+        </w:tc>
+      </w:tr>
+      <w:tr>
+        <w:tc>
+          <w:tcPr>
+            <w:tcW w:type="dxa" w:w="2200"/>
+            <w:tcBorders>
+              <w:top w:val="single" w:color="BBBBBB" w:sz="1"/>
+              <w:left w:val="single" w:color="BBBBBB" w:sz="1"/>
+              <w:bottom w:val="single" w:color="BBBBBB" w:sz="1"/>
+              <w:right w:val="single" w:color="BBBBBB" w:sz="1"/>
+            </w:tcBorders>
+            <w:tcMar>
+              <w:top w:type="dxa" w:w="50"/>
+              <w:left w:type="dxa" w:w="110"/>
+              <w:bottom w:type="dxa" w:w="50"/>
+              <w:right w:type="dxa" w:w="110"/>
+            </w:tcMar>
+          </w:tcPr>
+          <w:p>
+            <w:r>
+              <w:rPr>
+                <w:rFonts w:ascii="Consolas" w:cs="Consolas" w:eastAsia="Consolas" w:hAnsi="Consolas"/>
+                <w:b w:val="false"/>
+                <w:bCs w:val="false"/>
+                <w:sz w:val="18"/>
+                <w:szCs w:val="18"/>
+              </w:rPr>
+              <w:t xml:space="preserve">condEmptyDebounce</w:t>
+            </w:r>
+          </w:p>
+        </w:tc>
+        <w:tc>
+          <w:tcPr>
+            <w:tcW w:type="dxa" w:w="1300"/>
+            <w:tcBorders>
+              <w:top w:val="single" w:color="BBBBBB" w:sz="1"/>
+              <w:left w:val="single" w:color="BBBBBB" w:sz="1"/>
+              <w:bottom w:val="single" w:color="BBBBBB" w:sz="1"/>
+              <w:right w:val="single" w:color="BBBBBB" w:sz="1"/>
+            </w:tcBorders>
+            <w:tcMar>
+              <w:top w:type="dxa" w:w="50"/>
+              <w:left w:type="dxa" w:w="110"/>
+              <w:bottom w:type="dxa" w:w="50"/>
+              <w:right w:type="dxa" w:w="110"/>
+            </w:tcMar>
+          </w:tcPr>
+          <w:p>
+            <w:r>
+              <w:rPr>
+                <w:rFonts w:ascii="Arial" w:cs="Arial" w:eastAsia="Arial" w:hAnsi="Arial"/>
+                <w:b w:val="false"/>
+                <w:bCs w:val="false"/>
+                <w:sz w:val="20"/>
+                <w:szCs w:val="20"/>
+              </w:rPr>
+              <w:t xml:space="preserve">2.0</w:t>
+            </w:r>
+          </w:p>
+        </w:tc>
+        <w:tc>
+          <w:tcPr>
+            <w:tcW w:type="dxa" w:w="1500"/>
+            <w:tcBorders>
+              <w:top w:val="single" w:color="BBBBBB" w:sz="1"/>
+              <w:left w:val="single" w:color="BBBBBB" w:sz="1"/>
+              <w:bottom w:val="single" w:color="BBBBBB" w:sz="1"/>
+              <w:right w:val="single" w:color="BBBBBB" w:sz="1"/>
+            </w:tcBorders>
+            <w:tcMar>
+              <w:top w:type="dxa" w:w="50"/>
+              <w:left w:type="dxa" w:w="110"/>
+              <w:bottom w:type="dxa" w:w="50"/>
+              <w:right w:type="dxa" w:w="110"/>
+            </w:tcMar>
+          </w:tcPr>
+          <w:p>
+            <w:r>
+              <w:rPr>
+                <w:rFonts w:ascii="Arial" w:cs="Arial" w:eastAsia="Arial" w:hAnsi="Arial"/>
+                <w:b w:val="false"/>
+                <w:bCs w:val="false"/>
+                <w:sz w:val="20"/>
+                <w:szCs w:val="20"/>
+              </w:rPr>
+              <w:t xml:space="preserve">s</w:t>
+            </w:r>
+          </w:p>
+        </w:tc>
+        <w:tc>
+          <w:tcPr>
+            <w:tcW w:type="dxa" w:w="4360"/>
+            <w:tcBorders>
+              <w:top w:val="single" w:color="BBBBBB" w:sz="1"/>
+              <w:left w:val="single" w:color="BBBBBB" w:sz="1"/>
+              <w:bottom w:val="single" w:color="BBBBBB" w:sz="1"/>
+              <w:right w:val="single" w:color="BBBBBB" w:sz="1"/>
+            </w:tcBorders>
+            <w:tcMar>
+              <w:top w:type="dxa" w:w="50"/>
+              <w:left w:type="dxa" w:w="110"/>
+              <w:bottom w:type="dxa" w:w="50"/>
+              <w:right w:type="dxa" w:w="110"/>
+            </w:tcMar>
+          </w:tcPr>
+          <w:p>
+            <w:r>
+              <w:rPr>
+                <w:rFonts w:ascii="Arial" w:cs="Arial" w:eastAsia="Arial" w:hAnsi="Arial"/>
+                <w:b w:val="false"/>
+                <w:bCs w:val="false"/>
+                <w:sz w:val="20"/>
+                <w:szCs w:val="20"/>
+              </w:rPr>
+              <w:t xml:space="preserve">Dry must persist this long before the pump stops (debounce).</w:t>
+            </w:r>
+          </w:p>
+        </w:tc>
+      </w:tr>
+      <w:tr>
+        <w:tc>
+          <w:tcPr>
+            <w:tcW w:type="dxa" w:w="2200"/>
+            <w:tcBorders>
+              <w:top w:val="single" w:color="BBBBBB" w:sz="1"/>
+              <w:left w:val="single" w:color="BBBBBB" w:sz="1"/>
+              <w:bottom w:val="single" w:color="BBBBBB" w:sz="1"/>
+              <w:right w:val="single" w:color="BBBBBB" w:sz="1"/>
+            </w:tcBorders>
+            <w:tcMar>
+              <w:top w:type="dxa" w:w="50"/>
+              <w:left w:type="dxa" w:w="110"/>
+              <w:bottom w:type="dxa" w:w="50"/>
+              <w:right w:type="dxa" w:w="110"/>
+            </w:tcMar>
+          </w:tcPr>
+          <w:p>
+            <w:r>
+              <w:rPr>
+                <w:rFonts w:ascii="Consolas" w:cs="Consolas" w:eastAsia="Consolas" w:hAnsi="Consolas"/>
+                <w:b w:val="false"/>
+                <w:bCs w:val="false"/>
+                <w:sz w:val="18"/>
+                <w:szCs w:val="18"/>
+              </w:rPr>
+              <w:t xml:space="preserve">condPumpMinRun / condPumpMaxRun</w:t>
+            </w:r>
+          </w:p>
+        </w:tc>
+        <w:tc>
+          <w:tcPr>
+            <w:tcW w:type="dxa" w:w="1300"/>
+            <w:tcBorders>
+              <w:top w:val="single" w:color="BBBBBB" w:sz="1"/>
+              <w:left w:val="single" w:color="BBBBBB" w:sz="1"/>
+              <w:bottom w:val="single" w:color="BBBBBB" w:sz="1"/>
+              <w:right w:val="single" w:color="BBBBBB" w:sz="1"/>
+            </w:tcBorders>
+            <w:tcMar>
+              <w:top w:type="dxa" w:w="50"/>
+              <w:left w:type="dxa" w:w="110"/>
+              <w:bottom w:type="dxa" w:w="50"/>
+              <w:right w:type="dxa" w:w="110"/>
+            </w:tcMar>
+          </w:tcPr>
+          <w:p>
+            <w:r>
+              <w:rPr>
+                <w:rFonts w:ascii="Arial" w:cs="Arial" w:eastAsia="Arial" w:hAnsi="Arial"/>
+                <w:b w:val="false"/>
+                <w:bCs w:val="false"/>
+                <w:sz w:val="20"/>
+                <w:szCs w:val="20"/>
+              </w:rPr>
+              <w:t xml:space="preserve">1 / 90</w:t>
+            </w:r>
+          </w:p>
+        </w:tc>
+        <w:tc>
+          <w:tcPr>
+            <w:tcW w:type="dxa" w:w="1500"/>
+            <w:tcBorders>
+              <w:top w:val="single" w:color="BBBBBB" w:sz="1"/>
+              <w:left w:val="single" w:color="BBBBBB" w:sz="1"/>
+              <w:bottom w:val="single" w:color="BBBBBB" w:sz="1"/>
+              <w:right w:val="single" w:color="BBBBBB" w:sz="1"/>
+            </w:tcBorders>
+            <w:tcMar>
+              <w:top w:type="dxa" w:w="50"/>
+              <w:left w:type="dxa" w:w="110"/>
+              <w:bottom w:type="dxa" w:w="50"/>
+              <w:right w:type="dxa" w:w="110"/>
+            </w:tcMar>
+          </w:tcPr>
+          <w:p>
+            <w:r>
+              <w:rPr>
+                <w:rFonts w:ascii="Arial" w:cs="Arial" w:eastAsia="Arial" w:hAnsi="Arial"/>
+                <w:b w:val="false"/>
+                <w:bCs w:val="false"/>
+                <w:sz w:val="20"/>
+                <w:szCs w:val="20"/>
+              </w:rPr>
+              <w:t xml:space="preserve">s</w:t>
+            </w:r>
+          </w:p>
+        </w:tc>
+        <w:tc>
+          <w:tcPr>
+            <w:tcW w:type="dxa" w:w="4360"/>
+            <w:tcBorders>
+              <w:top w:val="single" w:color="BBBBBB" w:sz="1"/>
+              <w:left w:val="single" w:color="BBBBBB" w:sz="1"/>
+              <w:bottom w:val="single" w:color="BBBBBB" w:sz="1"/>
+              <w:right w:val="single" w:color="BBBBBB" w:sz="1"/>
+            </w:tcBorders>
+            <w:tcMar>
+              <w:top w:type="dxa" w:w="50"/>
+              <w:left w:type="dxa" w:w="110"/>
+              <w:bottom w:type="dxa" w:w="50"/>
+              <w:right w:type="dxa" w:w="110"/>
+            </w:tcMar>
+          </w:tcPr>
+          <w:p>
+            <w:r>
+              <w:rPr>
+                <w:rFonts w:ascii="Arial" w:cs="Arial" w:eastAsia="Arial" w:hAnsi="Arial"/>
+                <w:b w:val="false"/>
+                <w:bCs w:val="false"/>
+                <w:sz w:val="20"/>
+                <w:szCs w:val="20"/>
+              </w:rPr>
+              <w:t xml:space="preserve">Min run before dry-detect is armed / safety timeout if it never goes dry (sets condPumpFault).</w:t>
+            </w:r>
+          </w:p>
+        </w:tc>
+      </w:tr>
+      <w:tr>
+        <w:tc>
+          <w:tcPr>
+            <w:tcW w:type="dxa" w:w="2200"/>
+            <w:tcBorders>
+              <w:top w:val="single" w:color="BBBBBB" w:sz="1"/>
+              <w:left w:val="single" w:color="BBBBBB" w:sz="1"/>
+              <w:bottom w:val="single" w:color="BBBBBB" w:sz="1"/>
+              <w:right w:val="single" w:color="BBBBBB" w:sz="1"/>
+            </w:tcBorders>
+            <w:tcMar>
+              <w:top w:type="dxa" w:w="50"/>
+              <w:left w:type="dxa" w:w="110"/>
+              <w:bottom w:type="dxa" w:w="50"/>
+              <w:right w:type="dxa" w:w="110"/>
+            </w:tcMar>
+          </w:tcPr>
+          <w:p>
+            <w:r>
+              <w:rPr>
+                <w:rFonts w:ascii="Consolas" w:cs="Consolas" w:eastAsia="Consolas" w:hAnsi="Consolas"/>
+                <w:b w:val="false"/>
+                <w:bCs w:val="false"/>
+                <w:sz w:val="18"/>
+                <w:szCs w:val="18"/>
+              </w:rPr>
               <w:t xml:space="preserve">condLiquidTemp</w:t>
             </w:r>
           </w:p>
@@ -5826,7 +6371,7 @@
                 <w:sz w:val="20"/>
                 <w:szCs w:val="20"/>
               </w:rPr>
-              <w:t xml:space="preserve">Condensate OUTLET temp below this = liquid -&gt; count meter + close vent.</w:t>
+              <w:t xml:space="preserve">Vent only now: condensate outlet below this = liquid -&gt; close the steam vent (DO:VentValve).</w:t>
             </w:r>
           </w:p>
         </w:tc>
@@ -6835,7 +7380,7 @@
                 <w:sz w:val="18"/>
                 <w:szCs w:val="18"/>
               </w:rPr>
-              <w:t xml:space="preserve">condHighML / condLowML</w:t>
+              <w:t xml:space="preserve">condTubeTripML</w:t>
             </w:r>
           </w:p>
         </w:tc>
@@ -6864,7 +7409,7 @@
                 <w:sz w:val="20"/>
                 <w:szCs w:val="20"/>
               </w:rPr>
-              <w:t xml:space="preserve">170 / 50</w:t>
+              <w:t xml:space="preserve">130</w:t>
             </w:r>
           </w:p>
         </w:tc>
@@ -6922,7 +7467,125 @@
                 <w:sz w:val="20"/>
                 <w:szCs w:val="20"/>
               </w:rPr>
-              <w:t xml:space="preserve">Catch-tank HIGH / LOW switch volumes (120ml between = cal reference).</w:t>
+              <w:t xml:space="preserve">Volume in the HX bottom tube at the ~3/4 sensor (1.16in ID x 7.5in). The nominal distillate batch.</w:t>
+            </w:r>
+          </w:p>
+        </w:tc>
+      </w:tr>
+      <w:tr>
+        <w:tc>
+          <w:tcPr>
+            <w:tcW w:type="dxa" w:w="2000"/>
+            <w:tcBorders>
+              <w:top w:val="single" w:color="BBBBBB" w:sz="1"/>
+              <w:left w:val="single" w:color="BBBBBB" w:sz="1"/>
+              <w:bottom w:val="single" w:color="BBBBBB" w:sz="1"/>
+              <w:right w:val="single" w:color="BBBBBB" w:sz="1"/>
+            </w:tcBorders>
+            <w:tcMar>
+              <w:top w:type="dxa" w:w="50"/>
+              <w:left w:type="dxa" w:w="110"/>
+              <w:bottom w:type="dxa" w:w="50"/>
+              <w:right w:type="dxa" w:w="110"/>
+            </w:tcMar>
+          </w:tcPr>
+          <w:p>
+            <w:r>
+              <w:rPr>
+                <w:rFonts w:ascii="Consolas" w:cs="Consolas" w:eastAsia="Consolas" w:hAnsi="Consolas"/>
+                <w:b w:val="false"/>
+                <w:bCs w:val="false"/>
+                <w:sz w:val="18"/>
+                <w:szCs w:val="18"/>
+              </w:rPr>
+              <w:t xml:space="preserve">condTubeFullML</w:t>
+            </w:r>
+          </w:p>
+        </w:tc>
+        <w:tc>
+          <w:tcPr>
+            <w:tcW w:type="dxa" w:w="1400"/>
+            <w:tcBorders>
+              <w:top w:val="single" w:color="BBBBBB" w:sz="1"/>
+              <w:left w:val="single" w:color="BBBBBB" w:sz="1"/>
+              <w:bottom w:val="single" w:color="BBBBBB" w:sz="1"/>
+              <w:right w:val="single" w:color="BBBBBB" w:sz="1"/>
+            </w:tcBorders>
+            <w:tcMar>
+              <w:top w:type="dxa" w:w="50"/>
+              <w:left w:type="dxa" w:w="110"/>
+              <w:bottom w:type="dxa" w:w="50"/>
+              <w:right w:type="dxa" w:w="110"/>
+            </w:tcMar>
+          </w:tcPr>
+          <w:p>
+            <w:r>
+              <w:rPr>
+                <w:rFonts w:ascii="Arial" w:cs="Arial" w:eastAsia="Arial" w:hAnsi="Arial"/>
+                <w:b w:val="false"/>
+                <w:bCs w:val="false"/>
+                <w:sz w:val="20"/>
+                <w:szCs w:val="20"/>
+              </w:rPr>
+              <w:t xml:space="preserve">173</w:t>
+            </w:r>
+          </w:p>
+        </w:tc>
+        <w:tc>
+          <w:tcPr>
+            <w:tcW w:type="dxa" w:w="2000"/>
+            <w:tcBorders>
+              <w:top w:val="single" w:color="BBBBBB" w:sz="1"/>
+              <w:left w:val="single" w:color="BBBBBB" w:sz="1"/>
+              <w:bottom w:val="single" w:color="BBBBBB" w:sz="1"/>
+              <w:right w:val="single" w:color="BBBBBB" w:sz="1"/>
+            </w:tcBorders>
+            <w:tcMar>
+              <w:top w:type="dxa" w:w="50"/>
+              <w:left w:type="dxa" w:w="110"/>
+              <w:bottom w:type="dxa" w:w="50"/>
+              <w:right w:type="dxa" w:w="110"/>
+            </w:tcMar>
+          </w:tcPr>
+          <w:p>
+            <w:r>
+              <w:rPr>
+                <w:rFonts w:ascii="Arial" w:cs="Arial" w:eastAsia="Arial" w:hAnsi="Arial"/>
+                <w:b w:val="false"/>
+                <w:bCs w:val="false"/>
+                <w:sz w:val="20"/>
+                <w:szCs w:val="20"/>
+              </w:rPr>
+              <w:t xml:space="preserve">ml</w:t>
+            </w:r>
+          </w:p>
+        </w:tc>
+        <w:tc>
+          <w:tcPr>
+            <w:tcW w:type="dxa" w:w="3960"/>
+            <w:tcBorders>
+              <w:top w:val="single" w:color="BBBBBB" w:sz="1"/>
+              <w:left w:val="single" w:color="BBBBBB" w:sz="1"/>
+              <w:bottom w:val="single" w:color="BBBBBB" w:sz="1"/>
+              <w:right w:val="single" w:color="BBBBBB" w:sz="1"/>
+            </w:tcBorders>
+            <w:tcMar>
+              <w:top w:type="dxa" w:w="50"/>
+              <w:left w:type="dxa" w:w="110"/>
+              <w:bottom w:type="dxa" w:w="50"/>
+              <w:right w:type="dxa" w:w="110"/>
+            </w:tcMar>
+          </w:tcPr>
+          <w:p>
+            <w:r>
+              <w:rPr>
+                <w:rFonts w:ascii="Arial" w:cs="Arial" w:eastAsia="Arial" w:hAnsi="Arial"/>
+                <w:b w:val="false"/>
+                <w:bCs w:val="false"/>
+                <w:sz w:val="20"/>
+                <w:szCs w:val="20"/>
+              </w:rPr>
+              <w:t xml:space="preserve">Full HX bottom tube volume (1.16in ID x 10in deep).</w:t>
             </w:r>
           </w:p>
         </w:tc>
@@ -8943,6 +9606,95 @@
                 <w:sz w:val="18"/>
                 <w:szCs w:val="18"/>
               </w:rPr>
+              <w:t xml:space="preserve">simPumpMlMin</w:t>
+            </w:r>
+          </w:p>
+        </w:tc>
+        <w:tc>
+          <w:tcPr>
+            <w:tcW w:type="dxa" w:w="1500"/>
+            <w:tcBorders>
+              <w:top w:val="single" w:color="BBBBBB" w:sz="1"/>
+              <w:left w:val="single" w:color="BBBBBB" w:sz="1"/>
+              <w:bottom w:val="single" w:color="BBBBBB" w:sz="1"/>
+              <w:right w:val="single" w:color="BBBBBB" w:sz="1"/>
+            </w:tcBorders>
+            <w:tcMar>
+              <w:top w:type="dxa" w:w="50"/>
+              <w:left w:type="dxa" w:w="110"/>
+              <w:bottom w:type="dxa" w:w="50"/>
+              <w:right w:type="dxa" w:w="110"/>
+            </w:tcMar>
+          </w:tcPr>
+          <w:p>
+            <w:r>
+              <w:rPr>
+                <w:rFonts w:ascii="Arial" w:cs="Arial" w:eastAsia="Arial" w:hAnsi="Arial"/>
+                <w:b w:val="false"/>
+                <w:bCs w:val="false"/>
+                <w:sz w:val="20"/>
+                <w:szCs w:val="20"/>
+              </w:rPr>
+              <w:t xml:space="preserve">1100</w:t>
+            </w:r>
+          </w:p>
+        </w:tc>
+        <w:tc>
+          <w:tcPr>
+            <w:tcW w:type="dxa" w:w="5260"/>
+            <w:tcBorders>
+              <w:top w:val="single" w:color="BBBBBB" w:sz="1"/>
+              <w:left w:val="single" w:color="BBBBBB" w:sz="1"/>
+              <w:bottom w:val="single" w:color="BBBBBB" w:sz="1"/>
+              <w:right w:val="single" w:color="BBBBBB" w:sz="1"/>
+            </w:tcBorders>
+            <w:tcMar>
+              <w:top w:type="dxa" w:w="50"/>
+              <w:left w:type="dxa" w:w="110"/>
+              <w:bottom w:type="dxa" w:w="50"/>
+              <w:right w:type="dxa" w:w="110"/>
+            </w:tcMar>
+          </w:tcPr>
+          <w:p>
+            <w:r>
+              <w:rPr>
+                <w:rFonts w:ascii="Arial" w:cs="Arial" w:eastAsia="Arial" w:hAnsi="Arial"/>
+                <w:b w:val="false"/>
+                <w:bCs w:val="false"/>
+                <w:sz w:val="20"/>
+                <w:szCs w:val="20"/>
+              </w:rPr>
+              <w:t xml:space="preserve">Condensate-pump flow rate (ml/min) -- must exceed production so the pump empties the tube; also the sim meter reading while pumping liquid.</w:t>
+            </w:r>
+          </w:p>
+        </w:tc>
+      </w:tr>
+      <w:tr>
+        <w:tc>
+          <w:tcPr>
+            <w:tcW w:type="dxa" w:w="2600"/>
+            <w:tcBorders>
+              <w:top w:val="single" w:color="BBBBBB" w:sz="1"/>
+              <w:left w:val="single" w:color="BBBBBB" w:sz="1"/>
+              <w:bottom w:val="single" w:color="BBBBBB" w:sz="1"/>
+              <w:right w:val="single" w:color="BBBBBB" w:sz="1"/>
+            </w:tcBorders>
+            <w:tcMar>
+              <w:top w:type="dxa" w:w="50"/>
+              <w:left w:type="dxa" w:w="110"/>
+              <w:bottom w:type="dxa" w:w="50"/>
+              <w:right w:type="dxa" w:w="110"/>
+            </w:tcMar>
+          </w:tcPr>
+          <w:p>
+            <w:r>
+              <w:rPr>
+                <w:rFonts w:ascii="Consolas" w:cs="Consolas" w:eastAsia="Consolas" w:hAnsi="Consolas"/>
+                <w:b w:val="false"/>
+                <w:bCs w:val="false"/>
+                <w:sz w:val="18"/>
+                <w:szCs w:val="18"/>
+              </w:rPr>
               <w:t xml:space="preserve">simFlowCalErr / simFlowNoise</w:t>
             </w:r>
           </w:p>
@@ -9720,7 +10472,7 @@
                 <w:sz w:val="20"/>
                 <w:szCs w:val="20"/>
               </w:rPr>
-              <w:t xml:space="preserve">Condensate-tank volume (ml).</w:t>
+              <w:t xml:space="preserve">Condensate volume in the HX bottom tube (ml) -- sim state.</w:t>
             </w:r>
           </w:p>
         </w:tc>
@@ -9780,7 +10532,7 @@
                 <w:sz w:val="20"/>
                 <w:szCs w:val="20"/>
               </w:rPr>
-              <w:t xml:space="preserve">Sim flow-meter reading (steam while venting, liquid once collecting).</w:t>
+              <w:t xml:space="preserve">Sim pump-outlet flow meter (L/min): pump rate while liquid, drops to the trickle when dry.</w:t>
             </w:r>
           </w:p>
         </w:tc>
@@ -9900,7 +10652,7 @@
                 <w:sz w:val="20"/>
                 <w:szCs w:val="20"/>
               </w:rPr>
-              <w:t xml:space="preserve">Liquid-vs-steam gate / steam vent (DO:VentValve = NOT condLiquid).</w:t>
+              <w:t xml:space="preserve">Liquid-vs-steam gate (vent only) / steam vent (DO:VentValve).</w:t>
             </w:r>
           </w:p>
         </w:tc>
@@ -9991,7 +10743,7 @@
                 <w:sz w:val="18"/>
                 <w:szCs w:val="18"/>
               </w:rPr>
-              <w:t xml:space="preserve">condCalFactor / condProduct</w:t>
+              <w:t xml:space="preserve">condPumpOn / condProduct</w:t>
             </w:r>
           </w:p>
         </w:tc>
@@ -10020,7 +10772,127 @@
                 <w:sz w:val="20"/>
                 <w:szCs w:val="20"/>
               </w:rPr>
-              <w:t xml:space="preserve">Running flow-meter cal / lifetime calibrated distillate (ml).</w:t>
+              <w:t xml:space="preserve">Condensate pump command / lifetime calibrated distillate total (ml).</w:t>
+            </w:r>
+          </w:p>
+        </w:tc>
+      </w:tr>
+      <w:tr>
+        <w:tc>
+          <w:tcPr>
+            <w:tcW w:type="dxa" w:w="2700"/>
+            <w:tcBorders>
+              <w:top w:val="single" w:color="BBBBBB" w:sz="1"/>
+              <w:left w:val="single" w:color="BBBBBB" w:sz="1"/>
+              <w:bottom w:val="single" w:color="BBBBBB" w:sz="1"/>
+              <w:right w:val="single" w:color="BBBBBB" w:sz="1"/>
+            </w:tcBorders>
+            <w:tcMar>
+              <w:top w:type="dxa" w:w="50"/>
+              <w:left w:type="dxa" w:w="110"/>
+              <w:bottom w:type="dxa" w:w="50"/>
+              <w:right w:type="dxa" w:w="110"/>
+            </w:tcMar>
+          </w:tcPr>
+          <w:p>
+            <w:r>
+              <w:rPr>
+                <w:rFonts w:ascii="Consolas" w:cs="Consolas" w:eastAsia="Consolas" w:hAnsi="Consolas"/>
+                <w:b w:val="false"/>
+                <w:bCs w:val="false"/>
+                <w:sz w:val="18"/>
+                <w:szCs w:val="18"/>
+              </w:rPr>
+              <w:t xml:space="preserve">condBatchMl / condRateLpm</w:t>
+            </w:r>
+          </w:p>
+        </w:tc>
+        <w:tc>
+          <w:tcPr>
+            <w:tcW w:type="dxa" w:w="6660"/>
+            <w:tcBorders>
+              <w:top w:val="single" w:color="BBBBBB" w:sz="1"/>
+              <w:left w:val="single" w:color="BBBBBB" w:sz="1"/>
+              <w:bottom w:val="single" w:color="BBBBBB" w:sz="1"/>
+              <w:right w:val="single" w:color="BBBBBB" w:sz="1"/>
+            </w:tcBorders>
+            <w:tcMar>
+              <w:top w:type="dxa" w:w="50"/>
+              <w:left w:type="dxa" w:w="110"/>
+              <w:bottom w:type="dxa" w:w="50"/>
+              <w:right w:type="dxa" w:w="110"/>
+            </w:tcMar>
+          </w:tcPr>
+          <w:p>
+            <w:r>
+              <w:rPr>
+                <w:rFonts w:ascii="Arial" w:cs="Arial" w:eastAsia="Arial" w:hAnsi="Arial"/>
+                <w:b w:val="false"/>
+                <w:bCs w:val="false"/>
+                <w:sz w:val="20"/>
+                <w:szCs w:val="20"/>
+              </w:rPr>
+              <w:t xml:space="preserve">Last pumped batch (ml) / measured production rate = batch / fill time (L/min).</w:t>
+            </w:r>
+          </w:p>
+        </w:tc>
+      </w:tr>
+      <w:tr>
+        <w:tc>
+          <w:tcPr>
+            <w:tcW w:type="dxa" w:w="2700"/>
+            <w:tcBorders>
+              <w:top w:val="single" w:color="BBBBBB" w:sz="1"/>
+              <w:left w:val="single" w:color="BBBBBB" w:sz="1"/>
+              <w:bottom w:val="single" w:color="BBBBBB" w:sz="1"/>
+              <w:right w:val="single" w:color="BBBBBB" w:sz="1"/>
+            </w:tcBorders>
+            <w:tcMar>
+              <w:top w:type="dxa" w:w="50"/>
+              <w:left w:type="dxa" w:w="110"/>
+              <w:bottom w:type="dxa" w:w="50"/>
+              <w:right w:type="dxa" w:w="110"/>
+            </w:tcMar>
+          </w:tcPr>
+          <w:p>
+            <w:r>
+              <w:rPr>
+                <w:rFonts w:ascii="Consolas" w:cs="Consolas" w:eastAsia="Consolas" w:hAnsi="Consolas"/>
+                <w:b w:val="false"/>
+                <w:bCs w:val="false"/>
+                <w:sz w:val="18"/>
+                <w:szCs w:val="18"/>
+              </w:rPr>
+              <w:t xml:space="preserve">condCalFactor / condPumpFault</w:t>
+            </w:r>
+          </w:p>
+        </w:tc>
+        <w:tc>
+          <w:tcPr>
+            <w:tcW w:type="dxa" w:w="6660"/>
+            <w:tcBorders>
+              <w:top w:val="single" w:color="BBBBBB" w:sz="1"/>
+              <w:left w:val="single" w:color="BBBBBB" w:sz="1"/>
+              <w:bottom w:val="single" w:color="BBBBBB" w:sz="1"/>
+              <w:right w:val="single" w:color="BBBBBB" w:sz="1"/>
+            </w:tcBorders>
+            <w:tcMar>
+              <w:top w:type="dxa" w:w="50"/>
+              <w:left w:type="dxa" w:w="110"/>
+              <w:bottom w:type="dxa" w:w="50"/>
+              <w:right w:type="dxa" w:w="110"/>
+            </w:tcMar>
+          </w:tcPr>
+          <w:p>
+            <w:r>
+              <w:rPr>
+                <w:rFonts w:ascii="Arial" w:cs="Arial" w:eastAsia="Arial" w:hAnsi="Arial"/>
+                <w:b w:val="false"/>
+                <w:bCs w:val="false"/>
+                <w:sz w:val="20"/>
+                <w:szCs w:val="20"/>
+              </w:rPr>
+              <w:t xml:space="preserve">Flow-meter calibration (bench, x raw) / 1 = pump hit timeout without going dry.</w:t>
             </w:r>
           </w:p>
         </w:tc>

</xml_diff>

<commit_message>
Doc: condensate stop = whichever-first, 0.5 L/min thresholds, meter pacing
Document the three stop criteria, the retuned thresholds for the real
0.5 L/min pump, and how the pulse rate is windowed (counter_window_s).

Co-Authored-By: Claude Opus 4.8 <noreply@anthropic.com>
</commit_message>
<xml_diff>
--- a/MVR_Model_Reference.docx
+++ b/MVR_Model_Reference.docx
@@ -821,6 +821,14 @@
     </w:p>
     <w:p>
       <w:pPr>
+        <w:spacing w:after="120"/>
+      </w:pPr>
+      <w:r>
+        <w:t xml:space="preserve">Stop on WHICHEVER fires first (the pump is positive-displacement, so the empty point is bracketed three ways):</w:t>
+      </w:r>
+    </w:p>
+    <w:p>
+      <w:pPr>
         <w:spacing w:after="60"/>
         <w:ind w:left="360"/>
       </w:pPr>
@@ -830,7 +838,7 @@
           <w:sz w:val="19"/>
           <w:szCs w:val="19"/>
         </w:rPr>
-        <w:t xml:space="preserve">stop  when  yCondFlow &lt; condEmptyFlow for condEmptyDebounce   (tube dry)  [or condPumpMaxRun]</w:t>
+        <w:t xml:space="preserve">(1) yCondFlow &lt; condEmptyFlow for condEmptyDebounce   (meter drops to ~0 on air -&gt; dry; primary)</w:t>
       </w:r>
     </w:p>
     <w:p>
@@ -844,7 +852,54 @@
           <w:sz w:val="19"/>
           <w:szCs w:val="19"/>
         </w:rPr>
+        <w:t xml:space="preserve">(2) metered batch &gt; condBatchMaxML                    (guards a meter that keeps counting on air)</w:t>
+      </w:r>
+    </w:p>
+    <w:p>
+      <w:pPr>
+        <w:spacing w:after="60"/>
+        <w:ind w:left="360"/>
+      </w:pPr>
+      <w:r>
+        <w:rPr>
+          <w:rFonts w:ascii="Consolas" w:cs="Consolas" w:eastAsia="Consolas" w:hAnsi="Consolas"/>
+          <w:sz w:val="19"/>
+          <w:szCs w:val="19"/>
+        </w:rPr>
+        <w:t xml:space="preserve">(3) pump run &gt; condPumpMaxRun                         (hard time cap -&gt; sets condPumpFault)</w:t>
+      </w:r>
+    </w:p>
+    <w:p>
+      <w:pPr>
+        <w:spacing w:after="60"/>
+        <w:ind w:left="360"/>
+      </w:pPr>
+      <w:r>
+        <w:rPr>
+          <w:rFonts w:ascii="Consolas" w:cs="Consolas" w:eastAsia="Consolas" w:hAnsi="Consolas"/>
+          <w:sz w:val="19"/>
+          <w:szCs w:val="19"/>
+        </w:rPr>
         <w:t xml:space="preserve">condBatchMl = integral(yCondFlow) * condCalFactor    ;  condProduct += condBatchMl</w:t>
+      </w:r>
+    </w:p>
+    <w:p>
+      <w:pPr>
+        <w:spacing w:after="120"/>
+      </w:pPr>
+      <w:r>
+        <w:t xml:space="preserve">yCondFlow is a </w:t>
+      </w:r>
+      <w:r>
+        <w:rPr>
+          <w:rFonts w:ascii="Consolas" w:cs="Consolas" w:eastAsia="Consolas" w:hAnsi="Consolas"/>
+          <w:sz w:val="19"/>
+          <w:szCs w:val="19"/>
+        </w:rPr>
+        <w:t xml:space="preserve">counter_window_s</w:t>
+      </w:r>
+      <w:r>
+        <w:t xml:space="preserve">-windowed rate (CTR0 pulses, K=22000/L), refreshed ~once/sec and held between -- so condEmptyDebounce must be &gt;= ~2x that window. For an exact lifetime total, read the cumulative pulse count directly (meter on the pump outlet + stops on air =&gt; count/K = distillate).</w:t>
       </w:r>
     </w:p>
     <w:p>
@@ -5959,7 +6014,7 @@
                 <w:sz w:val="20"/>
                 <w:szCs w:val="20"/>
               </w:rPr>
-              <w:t xml:space="preserve">0.5</w:t>
+              <w:t xml:space="preserve">0.25</w:t>
             </w:r>
           </w:p>
         </w:tc>
@@ -6017,7 +6072,7 @@
                 <w:sz w:val="20"/>
                 <w:szCs w:val="20"/>
               </w:rPr>
-              <w:t xml:space="preserve">Pump-outlet flow below this = tube DRY. Set between the max production trickle and the condensate-pump rate.</w:t>
+              <w:t xml:space="preserve">Pump-outlet flow below this = tube DRY. Set between the ~0 dry reading and the condensate-pump rate (0.5).</w:t>
             </w:r>
           </w:p>
         </w:tc>
@@ -6077,7 +6132,7 @@
                 <w:sz w:val="20"/>
                 <w:szCs w:val="20"/>
               </w:rPr>
-              <w:t xml:space="preserve">2.0</w:t>
+              <w:t xml:space="preserve">2.5</w:t>
             </w:r>
           </w:p>
         </w:tc>
@@ -6135,7 +6190,7 @@
                 <w:sz w:val="20"/>
                 <w:szCs w:val="20"/>
               </w:rPr>
-              <w:t xml:space="preserve">Dry must persist this long before the pump stops (debounce).</w:t>
+              <w:t xml:space="preserve">Dry must persist this long before the pump stops. Keep &gt;= 2x counter_window_s (the meter's rate window).</w:t>
             </w:r>
           </w:p>
         </w:tc>
@@ -6166,6 +6221,124 @@
                 <w:sz w:val="18"/>
                 <w:szCs w:val="18"/>
               </w:rPr>
+              <w:t xml:space="preserve">condBatchMaxML</w:t>
+            </w:r>
+          </w:p>
+        </w:tc>
+        <w:tc>
+          <w:tcPr>
+            <w:tcW w:type="dxa" w:w="1300"/>
+            <w:tcBorders>
+              <w:top w:val="single" w:color="BBBBBB" w:sz="1"/>
+              <w:left w:val="single" w:color="BBBBBB" w:sz="1"/>
+              <w:bottom w:val="single" w:color="BBBBBB" w:sz="1"/>
+              <w:right w:val="single" w:color="BBBBBB" w:sz="1"/>
+            </w:tcBorders>
+            <w:tcMar>
+              <w:top w:type="dxa" w:w="50"/>
+              <w:left w:type="dxa" w:w="110"/>
+              <w:bottom w:type="dxa" w:w="50"/>
+              <w:right w:type="dxa" w:w="110"/>
+            </w:tcMar>
+          </w:tcPr>
+          <w:p>
+            <w:r>
+              <w:rPr>
+                <w:rFonts w:ascii="Arial" w:cs="Arial" w:eastAsia="Arial" w:hAnsi="Arial"/>
+                <w:b w:val="false"/>
+                <w:bCs w:val="false"/>
+                <w:sz w:val="20"/>
+                <w:szCs w:val="20"/>
+              </w:rPr>
+              <w:t xml:space="preserve">450</w:t>
+            </w:r>
+          </w:p>
+        </w:tc>
+        <w:tc>
+          <w:tcPr>
+            <w:tcW w:type="dxa" w:w="1500"/>
+            <w:tcBorders>
+              <w:top w:val="single" w:color="BBBBBB" w:sz="1"/>
+              <w:left w:val="single" w:color="BBBBBB" w:sz="1"/>
+              <w:bottom w:val="single" w:color="BBBBBB" w:sz="1"/>
+              <w:right w:val="single" w:color="BBBBBB" w:sz="1"/>
+            </w:tcBorders>
+            <w:tcMar>
+              <w:top w:type="dxa" w:w="50"/>
+              <w:left w:type="dxa" w:w="110"/>
+              <w:bottom w:type="dxa" w:w="50"/>
+              <w:right w:type="dxa" w:w="110"/>
+            </w:tcMar>
+          </w:tcPr>
+          <w:p>
+            <w:r>
+              <w:rPr>
+                <w:rFonts w:ascii="Arial" w:cs="Arial" w:eastAsia="Arial" w:hAnsi="Arial"/>
+                <w:b w:val="false"/>
+                <w:bCs w:val="false"/>
+                <w:sz w:val="20"/>
+                <w:szCs w:val="20"/>
+              </w:rPr>
+              <w:t xml:space="preserve">ml</w:t>
+            </w:r>
+          </w:p>
+        </w:tc>
+        <w:tc>
+          <w:tcPr>
+            <w:tcW w:type="dxa" w:w="4360"/>
+            <w:tcBorders>
+              <w:top w:val="single" w:color="BBBBBB" w:sz="1"/>
+              <w:left w:val="single" w:color="BBBBBB" w:sz="1"/>
+              <w:bottom w:val="single" w:color="BBBBBB" w:sz="1"/>
+              <w:right w:val="single" w:color="BBBBBB" w:sz="1"/>
+            </w:tcBorders>
+            <w:tcMar>
+              <w:top w:type="dxa" w:w="50"/>
+              <w:left w:type="dxa" w:w="110"/>
+              <w:bottom w:type="dxa" w:w="50"/>
+              <w:right w:type="dxa" w:w="110"/>
+            </w:tcMar>
+          </w:tcPr>
+          <w:p>
+            <w:r>
+              <w:rPr>
+                <w:rFonts w:ascii="Arial" w:cs="Arial" w:eastAsia="Arial" w:hAnsi="Arial"/>
+                <w:b w:val="false"/>
+                <w:bCs w:val="false"/>
+                <w:sz w:val="20"/>
+                <w:szCs w:val="20"/>
+              </w:rPr>
+              <w:t xml:space="preserve">Stop the pump if a single metered batch exceeds this (backstop for a meter that keeps counting on air).</w:t>
+            </w:r>
+          </w:p>
+        </w:tc>
+      </w:tr>
+      <w:tr>
+        <w:tc>
+          <w:tcPr>
+            <w:tcW w:type="dxa" w:w="2200"/>
+            <w:tcBorders>
+              <w:top w:val="single" w:color="BBBBBB" w:sz="1"/>
+              <w:left w:val="single" w:color="BBBBBB" w:sz="1"/>
+              <w:bottom w:val="single" w:color="BBBBBB" w:sz="1"/>
+              <w:right w:val="single" w:color="BBBBBB" w:sz="1"/>
+            </w:tcBorders>
+            <w:tcMar>
+              <w:top w:type="dxa" w:w="50"/>
+              <w:left w:type="dxa" w:w="110"/>
+              <w:bottom w:type="dxa" w:w="50"/>
+              <w:right w:type="dxa" w:w="110"/>
+            </w:tcMar>
+          </w:tcPr>
+          <w:p>
+            <w:r>
+              <w:rPr>
+                <w:rFonts w:ascii="Consolas" w:cs="Consolas" w:eastAsia="Consolas" w:hAnsi="Consolas"/>
+                <w:b w:val="false"/>
+                <w:bCs w:val="false"/>
+                <w:sz w:val="18"/>
+                <w:szCs w:val="18"/>
+              </w:rPr>
               <w:t xml:space="preserve">condPumpMinRun / condPumpMaxRun</w:t>
             </w:r>
           </w:p>
@@ -6195,7 +6368,7 @@
                 <w:sz w:val="20"/>
                 <w:szCs w:val="20"/>
               </w:rPr>
-              <w:t xml:space="preserve">1 / 90</w:t>
+              <w:t xml:space="preserve">1 / 120</w:t>
             </w:r>
           </w:p>
         </w:tc>
@@ -6253,7 +6426,7 @@
                 <w:sz w:val="20"/>
                 <w:szCs w:val="20"/>
               </w:rPr>
-              <w:t xml:space="preserve">Min run before dry-detect is armed / safety timeout if it never goes dry (sets condPumpFault).</w:t>
+              <w:t xml:space="preserve">Min run before dry-detect is armed / hard time cap (sets condPumpFault) if it never goes dry.</w:t>
             </w:r>
           </w:p>
         </w:tc>
@@ -9635,7 +9808,7 @@
                 <w:sz w:val="20"/>
                 <w:szCs w:val="20"/>
               </w:rPr>
-              <w:t xml:space="preserve">1100</w:t>
+              <w:t xml:space="preserve">500</w:t>
             </w:r>
           </w:p>
         </w:tc>
@@ -9664,7 +9837,7 @@
                 <w:sz w:val="20"/>
                 <w:szCs w:val="20"/>
               </w:rPr>
-              <w:t xml:space="preserve">Condensate-pump flow rate (ml/min) -- must exceed production so the pump empties the tube; also the sim meter reading while pumping liquid.</w:t>
+              <w:t xml:space="preserve">Condensate-pump flow rate (ml/min, = real 0.5 L/min) -- must exceed production so the pump empties the tube; also the sim meter reading while pumping liquid.</w:t>
             </w:r>
           </w:p>
         </w:tc>

</xml_diff>

<commit_message>
Doc: add condensate totalizer method + condUseTotalizer switch
Document the two distillate-measurement methods (exact pulse totalizer
vs windowed-rate integration), AI:CondTotal / counter_mode, and the switch.

Co-Authored-By: Claude Opus 4.8 <noreply@anthropic.com>
</commit_message>
<xml_diff>
--- a/MVR_Model_Reference.docx
+++ b/MVR_Model_Reference.docx
@@ -880,7 +880,15 @@
           <w:sz w:val="19"/>
           <w:szCs w:val="19"/>
         </w:rPr>
-        <w:t xml:space="preserve">condBatchMl = integral(yCondFlow) * condCalFactor    ;  condProduct += condBatchMl</w:t>
+        <w:t xml:space="preserve">condRateLpm = condBatchMl / fill-cycle-time     -&gt;  ProductionControl (2.6)</w:t>
+      </w:r>
+    </w:p>
+    <w:p>
+      <w:pPr>
+        <w:pStyle w:val="Heading3"/>
+      </w:pPr>
+      <w:r>
+        <w:t xml:space="preserve">Distillate measurement -- two methods (condUseTotalizer)</w:t>
       </w:r>
     </w:p>
     <w:p>
@@ -899,7 +907,7 @@
         <w:t xml:space="preserve">counter_window_s</w:t>
       </w:r>
       <w:r>
-        <w:t xml:space="preserve">-windowed rate (CTR0 pulses, K=22000/L), refreshed ~once/sec and held between -- so condEmptyDebounce must be &gt;= ~2x that window. For an exact lifetime total, read the cumulative pulse count directly (meter on the pump outlet + stops on air =&gt; count/K = distillate).</w:t>
+        <w:t xml:space="preserve">-windowed RATE (CTR0 pulses, K=22000/L), recomputed ~once/sec and held between, sampled every tick -- so condEmptyDebounce must be &gt;= ~2x that window. Two ways to measure the distillate:</w:t>
       </w:r>
     </w:p>
     <w:p>
@@ -913,7 +921,43 @@
           <w:sz w:val="19"/>
           <w:szCs w:val="19"/>
         </w:rPr>
-        <w:t xml:space="preserve">condRateLpm = condBatchMl / fill-cycle-time     -&gt;  ProductionControl (2.6)</w:t>
+        <w:t xml:space="preserve">condUseTotalizer = 1  (default):  condProduct = AI:CondTotal * condCalFactor * 1000</w:t>
+      </w:r>
+    </w:p>
+    <w:p>
+      <w:pPr>
+        <w:spacing w:after="60"/>
+        <w:ind w:left="360"/>
+      </w:pPr>
+      <w:r>
+        <w:rPr>
+          <w:rFonts w:ascii="Consolas" w:cs="Consolas" w:eastAsia="Consolas" w:hAnsi="Consolas"/>
+          <w:sz w:val="19"/>
+          <w:szCs w:val="19"/>
+        </w:rPr>
+        <w:t xml:space="preserve">    AI:CondTotal = cumulative pulse count / K (rollover-safe 32-bit, big-int sum) -&gt; EXACT, no windowed-rate boundary error</w:t>
+      </w:r>
+    </w:p>
+    <w:p>
+      <w:pPr>
+        <w:spacing w:after="60"/>
+        <w:ind w:left="360"/>
+      </w:pPr>
+      <w:r>
+        <w:rPr>
+          <w:rFonts w:ascii="Consolas" w:cs="Consolas" w:eastAsia="Consolas" w:hAnsi="Consolas"/>
+          <w:sz w:val="19"/>
+          <w:szCs w:val="19"/>
+        </w:rPr>
+        <w:t xml:space="preserve">condUseTotalizer = 0:  condProduct += integral(yCondFlow) * condCalFactor   (windowed-rate integration, ~1 window error/batch)</w:t>
+      </w:r>
+    </w:p>
+    <w:p>
+      <w:pPr>
+        <w:spacing w:after="120"/>
+      </w:pPr>
+      <w:r>
+        <w:t xml:space="preserve">Both use the same CTR0 meter on the pump outlet; the totalizer is a second logical channel (counter_mode='total'). The pump batch cycle and the empty detection are identical either way -- the switch only changes the volume/rate source. condCalFactor (bench: known volume / metered pulses) corrects both.</w:t>
       </w:r>
     </w:p>
     <w:p>
@@ -5955,6 +5999,124 @@
                 <w:szCs w:val="20"/>
               </w:rPr>
               <w:t xml:space="preserve">AI:CondLevel above this = tube ~3/4 full -&gt; start the condensate pump (the point sensor trip).</w:t>
+            </w:r>
+          </w:p>
+        </w:tc>
+      </w:tr>
+      <w:tr>
+        <w:tc>
+          <w:tcPr>
+            <w:tcW w:type="dxa" w:w="2200"/>
+            <w:tcBorders>
+              <w:top w:val="single" w:color="BBBBBB" w:sz="1"/>
+              <w:left w:val="single" w:color="BBBBBB" w:sz="1"/>
+              <w:bottom w:val="single" w:color="BBBBBB" w:sz="1"/>
+              <w:right w:val="single" w:color="BBBBBB" w:sz="1"/>
+            </w:tcBorders>
+            <w:tcMar>
+              <w:top w:type="dxa" w:w="50"/>
+              <w:left w:type="dxa" w:w="110"/>
+              <w:bottom w:type="dxa" w:w="50"/>
+              <w:right w:type="dxa" w:w="110"/>
+            </w:tcMar>
+          </w:tcPr>
+          <w:p>
+            <w:r>
+              <w:rPr>
+                <w:rFonts w:ascii="Consolas" w:cs="Consolas" w:eastAsia="Consolas" w:hAnsi="Consolas"/>
+                <w:b w:val="false"/>
+                <w:bCs w:val="false"/>
+                <w:sz w:val="18"/>
+                <w:szCs w:val="18"/>
+              </w:rPr>
+              <w:t xml:space="preserve">condUseTotalizer</w:t>
+            </w:r>
+          </w:p>
+        </w:tc>
+        <w:tc>
+          <w:tcPr>
+            <w:tcW w:type="dxa" w:w="1300"/>
+            <w:tcBorders>
+              <w:top w:val="single" w:color="BBBBBB" w:sz="1"/>
+              <w:left w:val="single" w:color="BBBBBB" w:sz="1"/>
+              <w:bottom w:val="single" w:color="BBBBBB" w:sz="1"/>
+              <w:right w:val="single" w:color="BBBBBB" w:sz="1"/>
+            </w:tcBorders>
+            <w:tcMar>
+              <w:top w:type="dxa" w:w="50"/>
+              <w:left w:type="dxa" w:w="110"/>
+              <w:bottom w:type="dxa" w:w="50"/>
+              <w:right w:type="dxa" w:w="110"/>
+            </w:tcMar>
+          </w:tcPr>
+          <w:p>
+            <w:r>
+              <w:rPr>
+                <w:rFonts w:ascii="Arial" w:cs="Arial" w:eastAsia="Arial" w:hAnsi="Arial"/>
+                <w:b w:val="false"/>
+                <w:bCs w:val="false"/>
+                <w:sz w:val="20"/>
+                <w:szCs w:val="20"/>
+              </w:rPr>
+              <w:t xml:space="preserve">1</w:t>
+            </w:r>
+          </w:p>
+        </w:tc>
+        <w:tc>
+          <w:tcPr>
+            <w:tcW w:type="dxa" w:w="1500"/>
+            <w:tcBorders>
+              <w:top w:val="single" w:color="BBBBBB" w:sz="1"/>
+              <w:left w:val="single" w:color="BBBBBB" w:sz="1"/>
+              <w:bottom w:val="single" w:color="BBBBBB" w:sz="1"/>
+              <w:right w:val="single" w:color="BBBBBB" w:sz="1"/>
+            </w:tcBorders>
+            <w:tcMar>
+              <w:top w:type="dxa" w:w="50"/>
+              <w:left w:type="dxa" w:w="110"/>
+              <w:bottom w:type="dxa" w:w="50"/>
+              <w:right w:type="dxa" w:w="110"/>
+            </w:tcMar>
+          </w:tcPr>
+          <w:p>
+            <w:r>
+              <w:rPr>
+                <w:rFonts w:ascii="Arial" w:cs="Arial" w:eastAsia="Arial" w:hAnsi="Arial"/>
+                <w:b w:val="false"/>
+                <w:bCs w:val="false"/>
+                <w:sz w:val="20"/>
+                <w:szCs w:val="20"/>
+              </w:rPr>
+              <w:t xml:space="preserve">0/1</w:t>
+            </w:r>
+          </w:p>
+        </w:tc>
+        <w:tc>
+          <w:tcPr>
+            <w:tcW w:type="dxa" w:w="4360"/>
+            <w:tcBorders>
+              <w:top w:val="single" w:color="BBBBBB" w:sz="1"/>
+              <w:left w:val="single" w:color="BBBBBB" w:sz="1"/>
+              <w:bottom w:val="single" w:color="BBBBBB" w:sz="1"/>
+              <w:right w:val="single" w:color="BBBBBB" w:sz="1"/>
+            </w:tcBorders>
+            <w:tcMar>
+              <w:top w:type="dxa" w:w="50"/>
+              <w:left w:type="dxa" w:w="110"/>
+              <w:bottom w:type="dxa" w:w="50"/>
+              <w:right w:type="dxa" w:w="110"/>
+            </w:tcMar>
+          </w:tcPr>
+          <w:p>
+            <w:r>
+              <w:rPr>
+                <w:rFonts w:ascii="Arial" w:cs="Arial" w:eastAsia="Arial" w:hAnsi="Arial"/>
+                <w:b w:val="false"/>
+                <w:bCs w:val="false"/>
+                <w:sz w:val="20"/>
+                <w:szCs w:val="20"/>
+              </w:rPr>
+              <w:t xml:space="preserve">Distillate measurement: 1 = exact cumulative pulse totalizer (AI:CondTotal, count/K); 0 = integrate the windowed rate.</w:t>
             </w:r>
           </w:p>
         </w:tc>

</xml_diff>

<commit_message>
config + doc: single CTR0 channel (CondTotal); rate derived in-expression
ch6 -> CondTotal (counter_mode='total'); ch7 reverted to AI7. Doc updated to
describe the one-counter design and condRateWin-windowed rate derivation.

Co-Authored-By: Claude Opus 4.8 <noreply@anthropic.com>
</commit_message>
<xml_diff>
--- a/MVR_Model_Reference.docx
+++ b/MVR_Model_Reference.docx
@@ -888,7 +888,7 @@
         <w:pStyle w:val="Heading3"/>
       </w:pPr>
       <w:r>
-        <w:t xml:space="preserve">Distillate measurement -- two methods (condUseTotalizer)</w:t>
+        <w:t xml:space="preserve">One counter, measured in software (condUseTotalizer)</w:t>
       </w:r>
     </w:p>
     <w:p>
@@ -896,7 +896,7 @@
         <w:spacing w:after="120"/>
       </w:pPr>
       <w:r>
-        <w:t xml:space="preserve">yCondFlow is a </w:t>
+        <w:t xml:space="preserve">The CTR0 count is read once and exposed as the cumulative total: AI:CondTotal = count/K (rollover-safe 32-bit, summed into a big-int). There is NO second channel -- the flow RATE is derived from the total in the expression, windowed over </w:t>
       </w:r>
       <w:r>
         <w:rPr>
@@ -904,10 +904,10 @@
           <w:sz w:val="19"/>
           <w:szCs w:val="19"/>
         </w:rPr>
-        <w:t xml:space="preserve">counter_window_s</w:t>
-      </w:r>
-      <w:r>
-        <w:t xml:space="preserve">-windowed RATE (CTR0 pulses, K=22000/L), recomputed ~once/sec and held between, sampled every tick -- so condEmptyDebounce must be &gt;= ~2x that window. Two ways to measure the distillate:</w:t>
+        <w:t xml:space="preserve">condRateWin</w:t>
+      </w:r>
+      <w:r>
+        <w:t xml:space="preserve"> (so per-tick pulse coarseness averages out), held between updates:</w:t>
       </w:r>
     </w:p>
     <w:p>
@@ -921,7 +921,15 @@
           <w:sz w:val="19"/>
           <w:szCs w:val="19"/>
         </w:rPr>
-        <w:t xml:space="preserve">condUseTotalizer = 1  (default):  condProduct = AI:CondTotal * condCalFactor * 1000</w:t>
+        <w:t xml:space="preserve">yCondFlow = (yCondTotal - prevWindowTotal) / windowElapsed * 60     // L/min, every condRateWin</w:t>
+      </w:r>
+    </w:p>
+    <w:p>
+      <w:pPr>
+        <w:spacing w:after="120"/>
+      </w:pPr>
+      <w:r>
+        <w:t xml:space="preserve">Two ways to report the distillate, both off that one total:</w:t>
       </w:r>
     </w:p>
     <w:p>
@@ -935,7 +943,7 @@
           <w:sz w:val="19"/>
           <w:szCs w:val="19"/>
         </w:rPr>
-        <w:t xml:space="preserve">    AI:CondTotal = cumulative pulse count / K (rollover-safe 32-bit, big-int sum) -&gt; EXACT, no windowed-rate boundary error</w:t>
+        <w:t xml:space="preserve">condUseTotalizer = 1 (default):  condProduct = yCondTotal * condCalFactor * 1000   // EXACT, no integration error</w:t>
       </w:r>
     </w:p>
     <w:p>
@@ -949,7 +957,7 @@
           <w:sz w:val="19"/>
           <w:szCs w:val="19"/>
         </w:rPr>
-        <w:t xml:space="preserve">condUseTotalizer = 0:  condProduct += integral(yCondFlow) * condCalFactor   (windowed-rate integration, ~1 window error/batch)</w:t>
+        <w:t xml:space="preserve">condUseTotalizer = 0:  condProduct += integral(yCondFlow) * condCalFactor          // windowed-rate integration</w:t>
       </w:r>
     </w:p>
     <w:p>
@@ -957,7 +965,7 @@
         <w:spacing w:after="120"/>
       </w:pPr>
       <w:r>
-        <w:t xml:space="preserve">Both use the same CTR0 meter on the pump outlet; the totalizer is a second logical channel (counter_mode='total'). The pump batch cycle and the empty detection are identical either way -- the switch only changes the volume/rate source. condCalFactor (bench: known volume / metered pulses) corrects both.</w:t>
+        <w:t xml:space="preserve">The pump batch cycle and the empty detection (on yCondFlow) are identical either way; the switch only changes how condProduct is formed. condCalFactor (bench: known volume / metered pulses) corrects both. condEmptyDebounce should be &gt;= ~2x condRateWin.</w:t>
       </w:r>
     </w:p>
     <w:p>

</xml_diff>

<commit_message>
Doc: totalizer reads CTR:CondTotal (first-class counter input)
Co-Authored-By: Claude Opus 4.8 <noreply@anthropic.com>
</commit_message>
<xml_diff>
--- a/MVR_Model_Reference.docx
+++ b/MVR_Model_Reference.docx
@@ -896,7 +896,7 @@
         <w:spacing w:after="120"/>
       </w:pPr>
       <w:r>
-        <w:t xml:space="preserve">The CTR0 count is read once and exposed as the cumulative total: AI:CondTotal = count/K (rollover-safe 32-bit, summed into a big-int). There is NO second channel -- the flow RATE is derived from the total in the expression, windowed over </w:t>
+        <w:t xml:space="preserve">The CTR0 count is read once and exposed as a first-class CTR input -- the cumulative total: CTR:CondTotal = count/K (rollover-safe 32-bit, summed into a big-int). The flow RATE is derived from the total in the expression, windowed over </w:t>
       </w:r>
       <w:r>
         <w:rPr>
@@ -6124,7 +6124,7 @@
                 <w:sz w:val="20"/>
                 <w:szCs w:val="20"/>
               </w:rPr>
-              <w:t xml:space="preserve">Distillate measurement: 1 = exact cumulative pulse totalizer (AI:CondTotal, count/K); 0 = integrate the windowed rate.</w:t>
+              <w:t xml:space="preserve">Distillate measurement: 1 = exact cumulative pulse totalizer (CTR:CondTotal, count/K); 0 = integrate the windowed rate.</w:t>
             </w:r>
           </w:p>
         </w:tc>

</xml_diff>

<commit_message>
Doc: system-time (sysMs/dtReal) timing for expressions
Co-Authored-By: Claude Opus 4.8 <noreply@anthropic.com>
</commit_message>
<xml_diff>
--- a/MVR_Model_Reference.docx
+++ b/MVR_Model_Reference.docx
@@ -303,6 +303,47 @@
       </w:pPr>
       <w:r>
         <w:t xml:space="preserve">These run regardless of sim vs real. Heater outputs are PWM duty 0..1; temps degC; pressures psia.</w:t>
+      </w:r>
+    </w:p>
+    <w:p>
+      <w:pPr>
+        <w:spacing w:after="120"/>
+      </w:pPr>
+      <w:r>
+        <w:t xml:space="preserve">TIMING: the server stamps the system monotonic clock (ms) into </w:t>
+      </w:r>
+      <w:r>
+        <w:rPr>
+          <w:rFonts w:ascii="Consolas" w:cs="Consolas" w:eastAsia="Consolas" w:hAnsi="Consolas"/>
+          <w:sz w:val="19"/>
+          <w:szCs w:val="19"/>
+        </w:rPr>
+        <w:t xml:space="preserve">static.sysMs</w:t>
+      </w:r>
+      <w:r>
+        <w:t xml:space="preserve"> every tick before the expressions evaluate. Setpoints differences it into </w:t>
+      </w:r>
+      <w:r>
+        <w:rPr>
+          <w:rFonts w:ascii="Consolas" w:cs="Consolas" w:eastAsia="Consolas" w:hAnsi="Consolas"/>
+          <w:sz w:val="19"/>
+          <w:szCs w:val="19"/>
+        </w:rPr>
+        <w:t xml:space="preserve">static.dtReal</w:t>
+      </w:r>
+      <w:r>
+        <w:t xml:space="preserve"> = (sysMs - lastTickMs)/1000 -- the REAL elapsed time, which every timer/integral/window uses instead of the nominal tick period. In sim it is accelerated as </w:t>
+      </w:r>
+      <w:r>
+        <w:rPr>
+          <w:rFonts w:ascii="Consolas" w:cs="Consolas" w:eastAsia="Consolas" w:hAnsi="Consolas"/>
+          <w:sz w:val="19"/>
+          <w:szCs w:val="19"/>
+        </w:rPr>
+        <w:t xml:space="preserve">dtReal * simSpeed</w:t>
+      </w:r>
+      <w:r>
+        <w:t xml:space="preserve">; in measure mode it is the true elapsed seconds. timeIncSec is only the fallback (first ticks / hiccups).</w:t>
       </w:r>
     </w:p>
     <w:p>
@@ -6745,6 +6786,242 @@
                 <w:sz w:val="18"/>
                 <w:szCs w:val="18"/>
               </w:rPr>
+              <w:t xml:space="preserve">sysMs</w:t>
+            </w:r>
+          </w:p>
+        </w:tc>
+        <w:tc>
+          <w:tcPr>
+            <w:tcW w:type="dxa" w:w="1300"/>
+            <w:tcBorders>
+              <w:top w:val="single" w:color="BBBBBB" w:sz="1"/>
+              <w:left w:val="single" w:color="BBBBBB" w:sz="1"/>
+              <w:bottom w:val="single" w:color="BBBBBB" w:sz="1"/>
+              <w:right w:val="single" w:color="BBBBBB" w:sz="1"/>
+            </w:tcBorders>
+            <w:tcMar>
+              <w:top w:type="dxa" w:w="50"/>
+              <w:left w:type="dxa" w:w="110"/>
+              <w:bottom w:type="dxa" w:w="50"/>
+              <w:right w:type="dxa" w:w="110"/>
+            </w:tcMar>
+          </w:tcPr>
+          <w:p>
+            <w:r>
+              <w:rPr>
+                <w:rFonts w:ascii="Arial" w:cs="Arial" w:eastAsia="Arial" w:hAnsi="Arial"/>
+                <w:b w:val="false"/>
+                <w:bCs w:val="false"/>
+                <w:sz w:val="20"/>
+                <w:szCs w:val="20"/>
+              </w:rPr>
+              <w:t xml:space="preserve">(server)</w:t>
+            </w:r>
+          </w:p>
+        </w:tc>
+        <w:tc>
+          <w:tcPr>
+            <w:tcW w:type="dxa" w:w="1500"/>
+            <w:tcBorders>
+              <w:top w:val="single" w:color="BBBBBB" w:sz="1"/>
+              <w:left w:val="single" w:color="BBBBBB" w:sz="1"/>
+              <w:bottom w:val="single" w:color="BBBBBB" w:sz="1"/>
+              <w:right w:val="single" w:color="BBBBBB" w:sz="1"/>
+            </w:tcBorders>
+            <w:tcMar>
+              <w:top w:type="dxa" w:w="50"/>
+              <w:left w:type="dxa" w:w="110"/>
+              <w:bottom w:type="dxa" w:w="50"/>
+              <w:right w:type="dxa" w:w="110"/>
+            </w:tcMar>
+          </w:tcPr>
+          <w:p>
+            <w:r>
+              <w:rPr>
+                <w:rFonts w:ascii="Arial" w:cs="Arial" w:eastAsia="Arial" w:hAnsi="Arial"/>
+                <w:b w:val="false"/>
+                <w:bCs w:val="false"/>
+                <w:sz w:val="20"/>
+                <w:szCs w:val="20"/>
+              </w:rPr>
+              <w:t xml:space="preserve">ms</w:t>
+            </w:r>
+          </w:p>
+        </w:tc>
+        <w:tc>
+          <w:tcPr>
+            <w:tcW w:type="dxa" w:w="4360"/>
+            <w:tcBorders>
+              <w:top w:val="single" w:color="BBBBBB" w:sz="1"/>
+              <w:left w:val="single" w:color="BBBBBB" w:sz="1"/>
+              <w:bottom w:val="single" w:color="BBBBBB" w:sz="1"/>
+              <w:right w:val="single" w:color="BBBBBB" w:sz="1"/>
+            </w:tcBorders>
+            <w:tcMar>
+              <w:top w:type="dxa" w:w="50"/>
+              <w:left w:type="dxa" w:w="110"/>
+              <w:bottom w:type="dxa" w:w="50"/>
+              <w:right w:type="dxa" w:w="110"/>
+            </w:tcMar>
+          </w:tcPr>
+          <w:p>
+            <w:r>
+              <w:rPr>
+                <w:rFonts w:ascii="Arial" w:cs="Arial" w:eastAsia="Arial" w:hAnsi="Arial"/>
+                <w:b w:val="false"/>
+                <w:bCs w:val="false"/>
+                <w:sz w:val="20"/>
+                <w:szCs w:val="20"/>
+              </w:rPr>
+              <w:t xml:space="preserve">System monotonic clock, stamped by the server each tick BEFORE evaluate. Read it for any interval math (now - startMs).</w:t>
+            </w:r>
+          </w:p>
+        </w:tc>
+      </w:tr>
+      <w:tr>
+        <w:tc>
+          <w:tcPr>
+            <w:tcW w:type="dxa" w:w="2200"/>
+            <w:tcBorders>
+              <w:top w:val="single" w:color="BBBBBB" w:sz="1"/>
+              <w:left w:val="single" w:color="BBBBBB" w:sz="1"/>
+              <w:bottom w:val="single" w:color="BBBBBB" w:sz="1"/>
+              <w:right w:val="single" w:color="BBBBBB" w:sz="1"/>
+            </w:tcBorders>
+            <w:tcMar>
+              <w:top w:type="dxa" w:w="50"/>
+              <w:left w:type="dxa" w:w="110"/>
+              <w:bottom w:type="dxa" w:w="50"/>
+              <w:right w:type="dxa" w:w="110"/>
+            </w:tcMar>
+          </w:tcPr>
+          <w:p>
+            <w:r>
+              <w:rPr>
+                <w:rFonts w:ascii="Consolas" w:cs="Consolas" w:eastAsia="Consolas" w:hAnsi="Consolas"/>
+                <w:b w:val="false"/>
+                <w:bCs w:val="false"/>
+                <w:sz w:val="18"/>
+                <w:szCs w:val="18"/>
+              </w:rPr>
+              <w:t xml:space="preserve">dtReal</w:t>
+            </w:r>
+          </w:p>
+        </w:tc>
+        <w:tc>
+          <w:tcPr>
+            <w:tcW w:type="dxa" w:w="1300"/>
+            <w:tcBorders>
+              <w:top w:val="single" w:color="BBBBBB" w:sz="1"/>
+              <w:left w:val="single" w:color="BBBBBB" w:sz="1"/>
+              <w:bottom w:val="single" w:color="BBBBBB" w:sz="1"/>
+              <w:right w:val="single" w:color="BBBBBB" w:sz="1"/>
+            </w:tcBorders>
+            <w:tcMar>
+              <w:top w:type="dxa" w:w="50"/>
+              <w:left w:type="dxa" w:w="110"/>
+              <w:bottom w:type="dxa" w:w="50"/>
+              <w:right w:type="dxa" w:w="110"/>
+            </w:tcMar>
+          </w:tcPr>
+          <w:p>
+            <w:r>
+              <w:rPr>
+                <w:rFonts w:ascii="Arial" w:cs="Arial" w:eastAsia="Arial" w:hAnsi="Arial"/>
+                <w:b w:val="false"/>
+                <w:bCs w:val="false"/>
+                <w:sz w:val="20"/>
+                <w:szCs w:val="20"/>
+              </w:rPr>
+              <w:t xml:space="preserve">~timeIncSec</w:t>
+            </w:r>
+          </w:p>
+        </w:tc>
+        <w:tc>
+          <w:tcPr>
+            <w:tcW w:type="dxa" w:w="1500"/>
+            <w:tcBorders>
+              <w:top w:val="single" w:color="BBBBBB" w:sz="1"/>
+              <w:left w:val="single" w:color="BBBBBB" w:sz="1"/>
+              <w:bottom w:val="single" w:color="BBBBBB" w:sz="1"/>
+              <w:right w:val="single" w:color="BBBBBB" w:sz="1"/>
+            </w:tcBorders>
+            <w:tcMar>
+              <w:top w:type="dxa" w:w="50"/>
+              <w:left w:type="dxa" w:w="110"/>
+              <w:bottom w:type="dxa" w:w="50"/>
+              <w:right w:type="dxa" w:w="110"/>
+            </w:tcMar>
+          </w:tcPr>
+          <w:p>
+            <w:r>
+              <w:rPr>
+                <w:rFonts w:ascii="Arial" w:cs="Arial" w:eastAsia="Arial" w:hAnsi="Arial"/>
+                <w:b w:val="false"/>
+                <w:bCs w:val="false"/>
+                <w:sz w:val="20"/>
+                <w:szCs w:val="20"/>
+              </w:rPr>
+              <w:t xml:space="preserve">s</w:t>
+            </w:r>
+          </w:p>
+        </w:tc>
+        <w:tc>
+          <w:tcPr>
+            <w:tcW w:type="dxa" w:w="4360"/>
+            <w:tcBorders>
+              <w:top w:val="single" w:color="BBBBBB" w:sz="1"/>
+              <w:left w:val="single" w:color="BBBBBB" w:sz="1"/>
+              <w:bottom w:val="single" w:color="BBBBBB" w:sz="1"/>
+              <w:right w:val="single" w:color="BBBBBB" w:sz="1"/>
+            </w:tcBorders>
+            <w:tcMar>
+              <w:top w:type="dxa" w:w="50"/>
+              <w:left w:type="dxa" w:w="110"/>
+              <w:bottom w:type="dxa" w:w="50"/>
+              <w:right w:type="dxa" w:w="110"/>
+            </w:tcMar>
+          </w:tcPr>
+          <w:p>
+            <w:r>
+              <w:rPr>
+                <w:rFonts w:ascii="Arial" w:cs="Arial" w:eastAsia="Arial" w:hAnsi="Arial"/>
+                <w:b w:val="false"/>
+                <w:bCs w:val="false"/>
+                <w:sz w:val="20"/>
+                <w:szCs w:val="20"/>
+              </w:rPr>
+              <w:t xml:space="preserve">REAL elapsed time since the last tick = (sysMs - lastTickMs)/1000, guarded. ALL expression timing (PI integrals, condensate timers, sim dt) uses this, not timeIncSec.</w:t>
+            </w:r>
+          </w:p>
+        </w:tc>
+      </w:tr>
+      <w:tr>
+        <w:tc>
+          <w:tcPr>
+            <w:tcW w:type="dxa" w:w="2200"/>
+            <w:tcBorders>
+              <w:top w:val="single" w:color="BBBBBB" w:sz="1"/>
+              <w:left w:val="single" w:color="BBBBBB" w:sz="1"/>
+              <w:bottom w:val="single" w:color="BBBBBB" w:sz="1"/>
+              <w:right w:val="single" w:color="BBBBBB" w:sz="1"/>
+            </w:tcBorders>
+            <w:tcMar>
+              <w:top w:type="dxa" w:w="50"/>
+              <w:left w:type="dxa" w:w="110"/>
+              <w:bottom w:type="dxa" w:w="50"/>
+              <w:right w:type="dxa" w:w="110"/>
+            </w:tcMar>
+          </w:tcPr>
+          <w:p>
+            <w:r>
+              <w:rPr>
+                <w:rFonts w:ascii="Consolas" w:cs="Consolas" w:eastAsia="Consolas" w:hAnsi="Consolas"/>
+                <w:b w:val="false"/>
+                <w:bCs w:val="false"/>
+                <w:sz w:val="18"/>
+                <w:szCs w:val="18"/>
+              </w:rPr>
               <w:t xml:space="preserve">timeIncSec</w:t>
             </w:r>
           </w:p>
@@ -6832,7 +7109,7 @@
                 <w:sz w:val="20"/>
                 <w:szCs w:val="20"/>
               </w:rPr>
-              <w:t xml:space="preserve">Control tick period (set to the real loop rate).</w:t>
+              <w:t xml:space="preserve">Nominal tick period -- now only the FALLBACK for dtReal on the first ticks / a scheduling hiccup.</w:t>
             </w:r>
           </w:p>
         </w:tc>

</xml_diff>

<commit_message>
Doc: startup PURGE phase (reverse pump-out) + params
Co-Authored-By: Claude Opus 4.8 <noreply@anthropic.com>
</commit_message>
<xml_diff>
--- a/MVR_Model_Reference.docx
+++ b/MVR_Model_Reference.docx
@@ -359,7 +359,7 @@
         <w:spacing w:after="120"/>
       </w:pPr>
       <w:r>
-        <w:t xml:space="preserve">IDLE -&gt; PRIME -&gt; HEAT -&gt; RUN. heatOK and the blower are gated on phase&gt;=HEAT so the makeup element never dry-fires.</w:t>
+        <w:t xml:space="preserve">IDLE -&gt; PURGE -&gt; PRIME -&gt; HEAT -&gt; RUN. heatOK and the blower are gated on phase&gt;=HEAT so the makeup element never dry-fires.</w:t>
       </w:r>
     </w:p>
     <w:p>
@@ -376,7 +376,10 @@
           <w:b/>
           <w:bCs/>
         </w:rPr>
-        <w:t xml:space="preserve">PRIME: </w:t>
+        <w:t xml:space="preserve">PURGE: </w:t>
+      </w:r>
+      <w:r>
+        <w:t xml:space="preserve">ALWAYS first -- reverse the feed pump (</w:t>
       </w:r>
       <w:r>
         <w:rPr>
@@ -384,10 +387,10 @@
           <w:sz w:val="19"/>
           <w:szCs w:val="19"/>
         </w:rPr>
-        <w:t xml:space="preserve">feedCmd = feedPrimeRpm</w:t>
-      </w:r>
-      <w:r>
-        <w:t xml:space="preserve">; advance when </w:t>
+        <w:t xml:space="preserve">vel = -purgeRevRpm</w:t>
+      </w:r>
+      <w:r>
+        <w:t xml:space="preserve">) to empty the feed/evaporator side to a KNOWN baseline, so an interrupted run (stop / power loss) restarts from a known state instead of trusting leftover inventory. Advance when the input level detector reads empty (</w:t>
       </w:r>
       <w:r>
         <w:rPr>
@@ -395,10 +398,60 @@
           <w:sz w:val="19"/>
           <w:szCs w:val="19"/>
         </w:rPr>
+        <w:t xml:space="preserve">yFeedEmpty</w:t>
+      </w:r>
+      <w:r>
+        <w:t xml:space="preserve">) or the dead-reckon backstop </w:t>
+      </w:r>
+      <w:r>
+        <w:rPr>
+          <w:rFonts w:ascii="Consolas" w:cs="Consolas" w:eastAsia="Consolas" w:hAnsi="Consolas"/>
+          <w:sz w:val="19"/>
+          <w:szCs w:val="19"/>
+        </w:rPr>
+        <w:t xml:space="preserve">purgeOutML &gt;= purgeMaxML</w:t>
+      </w:r>
+      <w:r>
+        <w:t xml:space="preserve"> is reached; then feedInvEst is zeroed.</w:t>
+      </w:r>
+    </w:p>
+    <w:p>
+      <w:pPr>
+        <w:pStyle w:val="ListParagraph"/>
+        <w:numPr>
+          <w:ilvl w:val="0"/>
+          <w:numId w:val="2"/>
+        </w:numPr>
+        <w:spacing w:after="40"/>
+      </w:pPr>
+      <w:r>
+        <w:rPr>
+          <w:b/>
+          <w:bCs/>
+        </w:rPr>
+        <w:t xml:space="preserve">PRIME: </w:t>
+      </w:r>
+      <w:r>
+        <w:rPr>
+          <w:rFonts w:ascii="Consolas" w:cs="Consolas" w:eastAsia="Consolas" w:hAnsi="Consolas"/>
+          <w:sz w:val="19"/>
+          <w:szCs w:val="19"/>
+        </w:rPr>
+        <w:t xml:space="preserve">feedCmd = feedPrimeRpm</w:t>
+      </w:r>
+      <w:r>
+        <w:t xml:space="preserve">; advance when </w:t>
+      </w:r>
+      <w:r>
+        <w:rPr>
+          <w:rFonts w:ascii="Consolas" w:cs="Consolas" w:eastAsia="Consolas" w:hAnsi="Consolas"/>
+          <w:sz w:val="19"/>
+          <w:szCs w:val="19"/>
+        </w:rPr>
         <w:t xml:space="preserve">feedInvEst &gt;= feedPrimeML</w:t>
       </w:r>
       <w:r>
-        <w:t xml:space="preserve"> (dead-reckon fill; a restart with a charged HX skips it).</w:t>
+        <w:t xml:space="preserve"> (dead-reckon fill from the purged-empty baseline).</w:t>
       </w:r>
     </w:p>
     <w:p>
@@ -7852,6 +7905,360 @@
                 <w:szCs w:val="20"/>
               </w:rPr>
               <w:t xml:space="preserve">Feed rpm during the PRIME fill.</w:t>
+            </w:r>
+          </w:p>
+        </w:tc>
+      </w:tr>
+      <w:tr>
+        <w:tc>
+          <w:tcPr>
+            <w:tcW w:type="dxa" w:w="2000"/>
+            <w:tcBorders>
+              <w:top w:val="single" w:color="BBBBBB" w:sz="1"/>
+              <w:left w:val="single" w:color="BBBBBB" w:sz="1"/>
+              <w:bottom w:val="single" w:color="BBBBBB" w:sz="1"/>
+              <w:right w:val="single" w:color="BBBBBB" w:sz="1"/>
+            </w:tcBorders>
+            <w:tcMar>
+              <w:top w:type="dxa" w:w="50"/>
+              <w:left w:type="dxa" w:w="110"/>
+              <w:bottom w:type="dxa" w:w="50"/>
+              <w:right w:type="dxa" w:w="110"/>
+            </w:tcMar>
+          </w:tcPr>
+          <w:p>
+            <w:r>
+              <w:rPr>
+                <w:rFonts w:ascii="Consolas" w:cs="Consolas" w:eastAsia="Consolas" w:hAnsi="Consolas"/>
+                <w:b w:val="false"/>
+                <w:bCs w:val="false"/>
+                <w:sz w:val="18"/>
+                <w:szCs w:val="18"/>
+              </w:rPr>
+              <w:t xml:space="preserve">purgeRevRpm</w:t>
+            </w:r>
+          </w:p>
+        </w:tc>
+        <w:tc>
+          <w:tcPr>
+            <w:tcW w:type="dxa" w:w="1400"/>
+            <w:tcBorders>
+              <w:top w:val="single" w:color="BBBBBB" w:sz="1"/>
+              <w:left w:val="single" w:color="BBBBBB" w:sz="1"/>
+              <w:bottom w:val="single" w:color="BBBBBB" w:sz="1"/>
+              <w:right w:val="single" w:color="BBBBBB" w:sz="1"/>
+            </w:tcBorders>
+            <w:tcMar>
+              <w:top w:type="dxa" w:w="50"/>
+              <w:left w:type="dxa" w:w="110"/>
+              <w:bottom w:type="dxa" w:w="50"/>
+              <w:right w:type="dxa" w:w="110"/>
+            </w:tcMar>
+          </w:tcPr>
+          <w:p>
+            <w:r>
+              <w:rPr>
+                <w:rFonts w:ascii="Arial" w:cs="Arial" w:eastAsia="Arial" w:hAnsi="Arial"/>
+                <w:b w:val="false"/>
+                <w:bCs w:val="false"/>
+                <w:sz w:val="20"/>
+                <w:szCs w:val="20"/>
+              </w:rPr>
+              <w:t xml:space="preserve">120</w:t>
+            </w:r>
+          </w:p>
+        </w:tc>
+        <w:tc>
+          <w:tcPr>
+            <w:tcW w:type="dxa" w:w="2000"/>
+            <w:tcBorders>
+              <w:top w:val="single" w:color="BBBBBB" w:sz="1"/>
+              <w:left w:val="single" w:color="BBBBBB" w:sz="1"/>
+              <w:bottom w:val="single" w:color="BBBBBB" w:sz="1"/>
+              <w:right w:val="single" w:color="BBBBBB" w:sz="1"/>
+            </w:tcBorders>
+            <w:tcMar>
+              <w:top w:type="dxa" w:w="50"/>
+              <w:left w:type="dxa" w:w="110"/>
+              <w:bottom w:type="dxa" w:w="50"/>
+              <w:right w:type="dxa" w:w="110"/>
+            </w:tcMar>
+          </w:tcPr>
+          <w:p>
+            <w:r>
+              <w:rPr>
+                <w:rFonts w:ascii="Arial" w:cs="Arial" w:eastAsia="Arial" w:hAnsi="Arial"/>
+                <w:b w:val="false"/>
+                <w:bCs w:val="false"/>
+                <w:sz w:val="20"/>
+                <w:szCs w:val="20"/>
+              </w:rPr>
+              <w:t xml:space="preserve">rpm</w:t>
+            </w:r>
+          </w:p>
+        </w:tc>
+        <w:tc>
+          <w:tcPr>
+            <w:tcW w:type="dxa" w:w="3960"/>
+            <w:tcBorders>
+              <w:top w:val="single" w:color="BBBBBB" w:sz="1"/>
+              <w:left w:val="single" w:color="BBBBBB" w:sz="1"/>
+              <w:bottom w:val="single" w:color="BBBBBB" w:sz="1"/>
+              <w:right w:val="single" w:color="BBBBBB" w:sz="1"/>
+            </w:tcBorders>
+            <w:tcMar>
+              <w:top w:type="dxa" w:w="50"/>
+              <w:left w:type="dxa" w:w="110"/>
+              <w:bottom w:type="dxa" w:w="50"/>
+              <w:right w:type="dxa" w:w="110"/>
+            </w:tcMar>
+          </w:tcPr>
+          <w:p>
+            <w:r>
+              <w:rPr>
+                <w:rFonts w:ascii="Arial" w:cs="Arial" w:eastAsia="Arial" w:hAnsi="Arial"/>
+                <w:b w:val="false"/>
+                <w:bCs w:val="false"/>
+                <w:sz w:val="20"/>
+                <w:szCs w:val="20"/>
+              </w:rPr>
+              <w:t xml:space="preserve">STARTUP PURGE: feed-pump REVERSE rpm that empties the feed/evap side to a known baseline before priming.</w:t>
+            </w:r>
+          </w:p>
+        </w:tc>
+      </w:tr>
+      <w:tr>
+        <w:tc>
+          <w:tcPr>
+            <w:tcW w:type="dxa" w:w="2000"/>
+            <w:tcBorders>
+              <w:top w:val="single" w:color="BBBBBB" w:sz="1"/>
+              <w:left w:val="single" w:color="BBBBBB" w:sz="1"/>
+              <w:bottom w:val="single" w:color="BBBBBB" w:sz="1"/>
+              <w:right w:val="single" w:color="BBBBBB" w:sz="1"/>
+            </w:tcBorders>
+            <w:tcMar>
+              <w:top w:type="dxa" w:w="50"/>
+              <w:left w:type="dxa" w:w="110"/>
+              <w:bottom w:type="dxa" w:w="50"/>
+              <w:right w:type="dxa" w:w="110"/>
+            </w:tcMar>
+          </w:tcPr>
+          <w:p>
+            <w:r>
+              <w:rPr>
+                <w:rFonts w:ascii="Consolas" w:cs="Consolas" w:eastAsia="Consolas" w:hAnsi="Consolas"/>
+                <w:b w:val="false"/>
+                <w:bCs w:val="false"/>
+                <w:sz w:val="18"/>
+                <w:szCs w:val="18"/>
+              </w:rPr>
+              <w:t xml:space="preserve">purgeMaxML</w:t>
+            </w:r>
+          </w:p>
+        </w:tc>
+        <w:tc>
+          <w:tcPr>
+            <w:tcW w:type="dxa" w:w="1400"/>
+            <w:tcBorders>
+              <w:top w:val="single" w:color="BBBBBB" w:sz="1"/>
+              <w:left w:val="single" w:color="BBBBBB" w:sz="1"/>
+              <w:bottom w:val="single" w:color="BBBBBB" w:sz="1"/>
+              <w:right w:val="single" w:color="BBBBBB" w:sz="1"/>
+            </w:tcBorders>
+            <w:tcMar>
+              <w:top w:type="dxa" w:w="50"/>
+              <w:left w:type="dxa" w:w="110"/>
+              <w:bottom w:type="dxa" w:w="50"/>
+              <w:right w:type="dxa" w:w="110"/>
+            </w:tcMar>
+          </w:tcPr>
+          <w:p>
+            <w:r>
+              <w:rPr>
+                <w:rFonts w:ascii="Arial" w:cs="Arial" w:eastAsia="Arial" w:hAnsi="Arial"/>
+                <w:b w:val="false"/>
+                <w:bCs w:val="false"/>
+                <w:sz w:val="20"/>
+                <w:szCs w:val="20"/>
+              </w:rPr>
+              <w:t xml:space="preserve">2000</w:t>
+            </w:r>
+          </w:p>
+        </w:tc>
+        <w:tc>
+          <w:tcPr>
+            <w:tcW w:type="dxa" w:w="2000"/>
+            <w:tcBorders>
+              <w:top w:val="single" w:color="BBBBBB" w:sz="1"/>
+              <w:left w:val="single" w:color="BBBBBB" w:sz="1"/>
+              <w:bottom w:val="single" w:color="BBBBBB" w:sz="1"/>
+              <w:right w:val="single" w:color="BBBBBB" w:sz="1"/>
+            </w:tcBorders>
+            <w:tcMar>
+              <w:top w:type="dxa" w:w="50"/>
+              <w:left w:type="dxa" w:w="110"/>
+              <w:bottom w:type="dxa" w:w="50"/>
+              <w:right w:type="dxa" w:w="110"/>
+            </w:tcMar>
+          </w:tcPr>
+          <w:p>
+            <w:r>
+              <w:rPr>
+                <w:rFonts w:ascii="Arial" w:cs="Arial" w:eastAsia="Arial" w:hAnsi="Arial"/>
+                <w:b w:val="false"/>
+                <w:bCs w:val="false"/>
+                <w:sz w:val="20"/>
+                <w:szCs w:val="20"/>
+              </w:rPr>
+              <w:t xml:space="preserve">ml</w:t>
+            </w:r>
+          </w:p>
+        </w:tc>
+        <w:tc>
+          <w:tcPr>
+            <w:tcW w:type="dxa" w:w="3960"/>
+            <w:tcBorders>
+              <w:top w:val="single" w:color="BBBBBB" w:sz="1"/>
+              <w:left w:val="single" w:color="BBBBBB" w:sz="1"/>
+              <w:bottom w:val="single" w:color="BBBBBB" w:sz="1"/>
+              <w:right w:val="single" w:color="BBBBBB" w:sz="1"/>
+            </w:tcBorders>
+            <w:tcMar>
+              <w:top w:type="dxa" w:w="50"/>
+              <w:left w:type="dxa" w:w="110"/>
+              <w:bottom w:type="dxa" w:w="50"/>
+              <w:right w:type="dxa" w:w="110"/>
+            </w:tcMar>
+          </w:tcPr>
+          <w:p>
+            <w:r>
+              <w:rPr>
+                <w:rFonts w:ascii="Arial" w:cs="Arial" w:eastAsia="Arial" w:hAnsi="Arial"/>
+                <w:b w:val="false"/>
+                <w:bCs w:val="false"/>
+                <w:sz w:val="20"/>
+                <w:szCs w:val="20"/>
+              </w:rPr>
+              <w:t xml:space="preserve">PURGE dead-reckon backstop: reverse-pump up to this if the empty sensor (yFeedEmpty) never trips (~1.5L primed + margin).</w:t>
+            </w:r>
+          </w:p>
+        </w:tc>
+      </w:tr>
+      <w:tr>
+        <w:tc>
+          <w:tcPr>
+            <w:tcW w:type="dxa" w:w="2000"/>
+            <w:tcBorders>
+              <w:top w:val="single" w:color="BBBBBB" w:sz="1"/>
+              <w:left w:val="single" w:color="BBBBBB" w:sz="1"/>
+              <w:bottom w:val="single" w:color="BBBBBB" w:sz="1"/>
+              <w:right w:val="single" w:color="BBBBBB" w:sz="1"/>
+            </w:tcBorders>
+            <w:tcMar>
+              <w:top w:type="dxa" w:w="50"/>
+              <w:left w:type="dxa" w:w="110"/>
+              <w:bottom w:type="dxa" w:w="50"/>
+              <w:right w:type="dxa" w:w="110"/>
+            </w:tcMar>
+          </w:tcPr>
+          <w:p>
+            <w:r>
+              <w:rPr>
+                <w:rFonts w:ascii="Consolas" w:cs="Consolas" w:eastAsia="Consolas" w:hAnsi="Consolas"/>
+                <w:b w:val="false"/>
+                <w:bCs w:val="false"/>
+                <w:sz w:val="18"/>
+                <w:szCs w:val="18"/>
+              </w:rPr>
+              <w:t xml:space="preserve">yFeedEmpty / purgeEmptyML</w:t>
+            </w:r>
+          </w:p>
+        </w:tc>
+        <w:tc>
+          <w:tcPr>
+            <w:tcW w:type="dxa" w:w="1400"/>
+            <w:tcBorders>
+              <w:top w:val="single" w:color="BBBBBB" w:sz="1"/>
+              <w:left w:val="single" w:color="BBBBBB" w:sz="1"/>
+              <w:bottom w:val="single" w:color="BBBBBB" w:sz="1"/>
+              <w:right w:val="single" w:color="BBBBBB" w:sz="1"/>
+            </w:tcBorders>
+            <w:tcMar>
+              <w:top w:type="dxa" w:w="50"/>
+              <w:left w:type="dxa" w:w="110"/>
+              <w:bottom w:type="dxa" w:w="50"/>
+              <w:right w:type="dxa" w:w="110"/>
+            </w:tcMar>
+          </w:tcPr>
+          <w:p>
+            <w:r>
+              <w:rPr>
+                <w:rFonts w:ascii="Arial" w:cs="Arial" w:eastAsia="Arial" w:hAnsi="Arial"/>
+                <w:b w:val="false"/>
+                <w:bCs w:val="false"/>
+                <w:sz w:val="20"/>
+                <w:szCs w:val="20"/>
+              </w:rPr>
+              <w:t xml:space="preserve">sensor / 50</w:t>
+            </w:r>
+          </w:p>
+        </w:tc>
+        <w:tc>
+          <w:tcPr>
+            <w:tcW w:type="dxa" w:w="2000"/>
+            <w:tcBorders>
+              <w:top w:val="single" w:color="BBBBBB" w:sz="1"/>
+              <w:left w:val="single" w:color="BBBBBB" w:sz="1"/>
+              <w:bottom w:val="single" w:color="BBBBBB" w:sz="1"/>
+              <w:right w:val="single" w:color="BBBBBB" w:sz="1"/>
+            </w:tcBorders>
+            <w:tcMar>
+              <w:top w:type="dxa" w:w="50"/>
+              <w:left w:type="dxa" w:w="110"/>
+              <w:bottom w:type="dxa" w:w="50"/>
+              <w:right w:type="dxa" w:w="110"/>
+            </w:tcMar>
+          </w:tcPr>
+          <w:p>
+            <w:r>
+              <w:rPr>
+                <w:rFonts w:ascii="Arial" w:cs="Arial" w:eastAsia="Arial" w:hAnsi="Arial"/>
+                <w:b w:val="false"/>
+                <w:bCs w:val="false"/>
+                <w:sz w:val="20"/>
+                <w:szCs w:val="20"/>
+              </w:rPr>
+              <w:t xml:space="preserve">- / ml</w:t>
+            </w:r>
+          </w:p>
+        </w:tc>
+        <w:tc>
+          <w:tcPr>
+            <w:tcW w:type="dxa" w:w="3960"/>
+            <w:tcBorders>
+              <w:top w:val="single" w:color="BBBBBB" w:sz="1"/>
+              <w:left w:val="single" w:color="BBBBBB" w:sz="1"/>
+              <w:bottom w:val="single" w:color="BBBBBB" w:sz="1"/>
+              <w:right w:val="single" w:color="BBBBBB" w:sz="1"/>
+            </w:tcBorders>
+            <w:tcMar>
+              <w:top w:type="dxa" w:w="50"/>
+              <w:left w:type="dxa" w:w="110"/>
+              <w:bottom w:type="dxa" w:w="50"/>
+              <w:right w:type="dxa" w:w="110"/>
+            </w:tcMar>
+          </w:tcPr>
+          <w:p>
+            <w:r>
+              <w:rPr>
+                <w:rFonts w:ascii="Arial" w:cs="Arial" w:eastAsia="Arial" w:hAnsi="Arial"/>
+                <w:b w:val="false"/>
+                <w:bCs w:val="false"/>
+                <w:sz w:val="20"/>
+                <w:szCs w:val="20"/>
+              </w:rPr>
+              <w:t xml:space="preserve">Input level detector = empty (real sensor; sim: evaporator inventory below purgeEmptyML).</w:t>
             </w:r>
           </w:p>
         </w:tc>

</xml_diff>

<commit_message>
Doc: PURGE always pumps full dead-reckon; SH heater + wet-comp trip gated to RUN
Co-Authored-By: Claude Opus 4.8 <noreply@anthropic.com>
</commit_message>
<xml_diff>
--- a/MVR_Model_Reference.docx
+++ b/MVR_Model_Reference.docx
@@ -390,7 +390,7 @@
         <w:t xml:space="preserve">vel = -purgeRevRpm</w:t>
       </w:r>
       <w:r>
-        <w:t xml:space="preserve">) to empty the feed/evaporator side to a KNOWN baseline, so an interrupted run (stop / power loss) restarts from a known state instead of trusting leftover inventory. Advance when the input level detector reads empty (</w:t>
+        <w:t xml:space="preserve">) to empty the feed/evaporator side to a KNOWN baseline, so an interrupted run (stop / power loss) restarts from a known state instead of trusting leftover inventory. It ALWAYS pumps the full dead-reckon volume (</w:t>
       </w:r>
       <w:r>
         <w:rPr>
@@ -398,10 +398,10 @@
           <w:sz w:val="19"/>
           <w:szCs w:val="19"/>
         </w:rPr>
-        <w:t xml:space="preserve">yFeedEmpty</w:t>
-      </w:r>
-      <w:r>
-        <w:t xml:space="preserve">) or the dead-reckon backstop </w:t>
+        <w:t xml:space="preserve">purgeOutML &gt;= purgeMaxML</w:t>
+      </w:r>
+      <w:r>
+        <w:t xml:space="preserve">, ~2 L) to guarantee empty without trusting the sensor, AND requires the input level detector empty (</w:t>
       </w:r>
       <w:r>
         <w:rPr>
@@ -409,10 +409,10 @@
           <w:sz w:val="19"/>
           <w:szCs w:val="19"/>
         </w:rPr>
-        <w:t xml:space="preserve">purgeOutML &gt;= purgeMaxML</w:t>
-      </w:r>
-      <w:r>
-        <w:t xml:space="preserve"> is reached; then feedInvEst is zeroed.</w:t>
+        <w:t xml:space="preserve">yFeedEmpty</w:t>
+      </w:r>
+      <w:r>
+        <w:t xml:space="preserve">); a 2x hard cap stops a runaway if the sensor never trips. Then feedInvEst is zeroed.</w:t>
       </w:r>
     </w:p>
     <w:p>
@@ -682,7 +682,7 @@
         <w:spacing w:after="120"/>
       </w:pPr>
       <w:r>
-        <w:t xml:space="preserve">Holds vapor superheat. Gated by heatOK AND yEvapTemp &gt; evapTempSet-5 (so the cartridge never dry-fires with no steam flow).</w:t>
+        <w:t xml:space="preserve">Holds vapor superheat. Gated by heatOK AND phase &gt;= RUN -- superheat is only meaningful once vapor is actually flowing, so the cartridge never dry-fires during warm-up. Both heater PI integrators reset to 0 whenever their heater is off, so no stale windup carries across a stop. The wet-compression (low-superheat) trip likewise arms/fires only in RUN.</w:t>
       </w:r>
     </w:p>
     <w:p>

</xml_diff>

<commit_message>
Doc: demister drain hysteresis params
Co-Authored-By: Claude Opus 4.8 <noreply@anthropic.com>
</commit_message>
<xml_diff>
--- a/MVR_Model_Reference.docx
+++ b/MVR_Model_Reference.docx
@@ -6809,6 +6809,242 @@
                 <w:szCs w:val="20"/>
               </w:rPr>
               <w:t xml:space="preserve">Vent only now: condensate outlet below this = liquid -&gt; close the steam vent (DO:VentValve).</w:t>
+            </w:r>
+          </w:p>
+        </w:tc>
+      </w:tr>
+      <w:tr>
+        <w:tc>
+          <w:tcPr>
+            <w:tcW w:type="dxa" w:w="2200"/>
+            <w:tcBorders>
+              <w:top w:val="single" w:color="BBBBBB" w:sz="1"/>
+              <w:left w:val="single" w:color="BBBBBB" w:sz="1"/>
+              <w:bottom w:val="single" w:color="BBBBBB" w:sz="1"/>
+              <w:right w:val="single" w:color="BBBBBB" w:sz="1"/>
+            </w:tcBorders>
+            <w:tcMar>
+              <w:top w:type="dxa" w:w="50"/>
+              <w:left w:type="dxa" w:w="110"/>
+              <w:bottom w:type="dxa" w:w="50"/>
+              <w:right w:type="dxa" w:w="110"/>
+            </w:tcMar>
+          </w:tcPr>
+          <w:p>
+            <w:r>
+              <w:rPr>
+                <w:rFonts w:ascii="Consolas" w:cs="Consolas" w:eastAsia="Consolas" w:hAnsi="Consolas"/>
+                <w:b w:val="false"/>
+                <w:bCs w:val="false"/>
+                <w:sz w:val="18"/>
+                <w:szCs w:val="18"/>
+              </w:rPr>
+              <w:t xml:space="preserve">demisterTripML / demisterResetML</w:t>
+            </w:r>
+          </w:p>
+        </w:tc>
+        <w:tc>
+          <w:tcPr>
+            <w:tcW w:type="dxa" w:w="1300"/>
+            <w:tcBorders>
+              <w:top w:val="single" w:color="BBBBBB" w:sz="1"/>
+              <w:left w:val="single" w:color="BBBBBB" w:sz="1"/>
+              <w:bottom w:val="single" w:color="BBBBBB" w:sz="1"/>
+              <w:right w:val="single" w:color="BBBBBB" w:sz="1"/>
+            </w:tcBorders>
+            <w:tcMar>
+              <w:top w:type="dxa" w:w="50"/>
+              <w:left w:type="dxa" w:w="110"/>
+              <w:bottom w:type="dxa" w:w="50"/>
+              <w:right w:type="dxa" w:w="110"/>
+            </w:tcMar>
+          </w:tcPr>
+          <w:p>
+            <w:r>
+              <w:rPr>
+                <w:rFonts w:ascii="Arial" w:cs="Arial" w:eastAsia="Arial" w:hAnsi="Arial"/>
+                <w:b w:val="false"/>
+                <w:bCs w:val="false"/>
+                <w:sz w:val="20"/>
+                <w:szCs w:val="20"/>
+              </w:rPr>
+              <w:t xml:space="preserve">80 / 5</w:t>
+            </w:r>
+          </w:p>
+        </w:tc>
+        <w:tc>
+          <w:tcPr>
+            <w:tcW w:type="dxa" w:w="1500"/>
+            <w:tcBorders>
+              <w:top w:val="single" w:color="BBBBBB" w:sz="1"/>
+              <w:left w:val="single" w:color="BBBBBB" w:sz="1"/>
+              <w:bottom w:val="single" w:color="BBBBBB" w:sz="1"/>
+              <w:right w:val="single" w:color="BBBBBB" w:sz="1"/>
+            </w:tcBorders>
+            <w:tcMar>
+              <w:top w:type="dxa" w:w="50"/>
+              <w:left w:type="dxa" w:w="110"/>
+              <w:bottom w:type="dxa" w:w="50"/>
+              <w:right w:type="dxa" w:w="110"/>
+            </w:tcMar>
+          </w:tcPr>
+          <w:p>
+            <w:r>
+              <w:rPr>
+                <w:rFonts w:ascii="Arial" w:cs="Arial" w:eastAsia="Arial" w:hAnsi="Arial"/>
+                <w:b w:val="false"/>
+                <w:bCs w:val="false"/>
+                <w:sz w:val="20"/>
+                <w:szCs w:val="20"/>
+              </w:rPr>
+              <w:t xml:space="preserve">cc</w:t>
+            </w:r>
+          </w:p>
+        </w:tc>
+        <w:tc>
+          <w:tcPr>
+            <w:tcW w:type="dxa" w:w="4360"/>
+            <w:tcBorders>
+              <w:top w:val="single" w:color="BBBBBB" w:sz="1"/>
+              <w:left w:val="single" w:color="BBBBBB" w:sz="1"/>
+              <w:bottom w:val="single" w:color="BBBBBB" w:sz="1"/>
+              <w:right w:val="single" w:color="BBBBBB" w:sz="1"/>
+            </w:tcBorders>
+            <w:tcMar>
+              <w:top w:type="dxa" w:w="50"/>
+              <w:left w:type="dxa" w:w="110"/>
+              <w:bottom w:type="dxa" w:w="50"/>
+              <w:right w:type="dxa" w:w="110"/>
+            </w:tcMar>
+          </w:tcPr>
+          <w:p>
+            <w:r>
+              <w:rPr>
+                <w:rFonts w:ascii="Arial" w:cs="Arial" w:eastAsia="Arial" w:hAnsi="Arial"/>
+                <w:b w:val="false"/>
+                <w:bCs w:val="false"/>
+                <w:sz w:val="20"/>
+                <w:szCs w:val="20"/>
+              </w:rPr>
+              <w:t xml:space="preserve">Demister DRAIN peristaltic pump hysteresis: ON at the trip (measured ~80cc), OFF pumped down to reset. Prevents the old single-threshold ~10Hz chatter.</w:t>
+            </w:r>
+          </w:p>
+        </w:tc>
+      </w:tr>
+      <w:tr>
+        <w:tc>
+          <w:tcPr>
+            <w:tcW w:type="dxa" w:w="2200"/>
+            <w:tcBorders>
+              <w:top w:val="single" w:color="BBBBBB" w:sz="1"/>
+              <w:left w:val="single" w:color="BBBBBB" w:sz="1"/>
+              <w:bottom w:val="single" w:color="BBBBBB" w:sz="1"/>
+              <w:right w:val="single" w:color="BBBBBB" w:sz="1"/>
+            </w:tcBorders>
+            <w:tcMar>
+              <w:top w:type="dxa" w:w="50"/>
+              <w:left w:type="dxa" w:w="110"/>
+              <w:bottom w:type="dxa" w:w="50"/>
+              <w:right w:type="dxa" w:w="110"/>
+            </w:tcMar>
+          </w:tcPr>
+          <w:p>
+            <w:r>
+              <w:rPr>
+                <w:rFonts w:ascii="Consolas" w:cs="Consolas" w:eastAsia="Consolas" w:hAnsi="Consolas"/>
+                <w:b w:val="false"/>
+                <w:bCs w:val="false"/>
+                <w:sz w:val="18"/>
+                <w:szCs w:val="18"/>
+              </w:rPr>
+              <w:t xml:space="preserve">demisterPumpMlMin / demisterFloodML</w:t>
+            </w:r>
+          </w:p>
+        </w:tc>
+        <w:tc>
+          <w:tcPr>
+            <w:tcW w:type="dxa" w:w="1300"/>
+            <w:tcBorders>
+              <w:top w:val="single" w:color="BBBBBB" w:sz="1"/>
+              <w:left w:val="single" w:color="BBBBBB" w:sz="1"/>
+              <w:bottom w:val="single" w:color="BBBBBB" w:sz="1"/>
+              <w:right w:val="single" w:color="BBBBBB" w:sz="1"/>
+            </w:tcBorders>
+            <w:tcMar>
+              <w:top w:type="dxa" w:w="50"/>
+              <w:left w:type="dxa" w:w="110"/>
+              <w:bottom w:type="dxa" w:w="50"/>
+              <w:right w:type="dxa" w:w="110"/>
+            </w:tcMar>
+          </w:tcPr>
+          <w:p>
+            <w:r>
+              <w:rPr>
+                <w:rFonts w:ascii="Arial" w:cs="Arial" w:eastAsia="Arial" w:hAnsi="Arial"/>
+                <w:b w:val="false"/>
+                <w:bCs w:val="false"/>
+                <w:sz w:val="20"/>
+                <w:szCs w:val="20"/>
+              </w:rPr>
+              <w:t xml:space="preserve">500 / 150</w:t>
+            </w:r>
+          </w:p>
+        </w:tc>
+        <w:tc>
+          <w:tcPr>
+            <w:tcW w:type="dxa" w:w="1500"/>
+            <w:tcBorders>
+              <w:top w:val="single" w:color="BBBBBB" w:sz="1"/>
+              <w:left w:val="single" w:color="BBBBBB" w:sz="1"/>
+              <w:bottom w:val="single" w:color="BBBBBB" w:sz="1"/>
+              <w:right w:val="single" w:color="BBBBBB" w:sz="1"/>
+            </w:tcBorders>
+            <w:tcMar>
+              <w:top w:type="dxa" w:w="50"/>
+              <w:left w:type="dxa" w:w="110"/>
+              <w:bottom w:type="dxa" w:w="50"/>
+              <w:right w:type="dxa" w:w="110"/>
+            </w:tcMar>
+          </w:tcPr>
+          <w:p>
+            <w:r>
+              <w:rPr>
+                <w:rFonts w:ascii="Arial" w:cs="Arial" w:eastAsia="Arial" w:hAnsi="Arial"/>
+                <w:b w:val="false"/>
+                <w:bCs w:val="false"/>
+                <w:sz w:val="20"/>
+                <w:szCs w:val="20"/>
+              </w:rPr>
+              <w:t xml:space="preserve">ml/min / cc</w:t>
+            </w:r>
+          </w:p>
+        </w:tc>
+        <w:tc>
+          <w:tcPr>
+            <w:tcW w:type="dxa" w:w="4360"/>
+            <w:tcBorders>
+              <w:top w:val="single" w:color="BBBBBB" w:sz="1"/>
+              <w:left w:val="single" w:color="BBBBBB" w:sz="1"/>
+              <w:bottom w:val="single" w:color="BBBBBB" w:sz="1"/>
+              <w:right w:val="single" w:color="BBBBBB" w:sz="1"/>
+            </w:tcBorders>
+            <w:tcMar>
+              <w:top w:type="dxa" w:w="50"/>
+              <w:left w:type="dxa" w:w="110"/>
+              <w:bottom w:type="dxa" w:w="50"/>
+              <w:right w:type="dxa" w:w="110"/>
+            </w:tcMar>
+          </w:tcPr>
+          <w:p>
+            <w:r>
+              <w:rPr>
+                <w:rFonts w:ascii="Arial" w:cs="Arial" w:eastAsia="Arial" w:hAnsi="Arial"/>
+                <w:b w:val="false"/>
+                <w:bCs w:val="false"/>
+                <w:sz w:val="20"/>
+                <w:szCs w:val="20"/>
+              </w:rPr>
+              <w:t xml:space="preserve">Drain pump rate / flood-trip overflow level. Calibrate AI:DemisterWater to read cc.</w:t>
             </w:r>
           </w:p>
         </w:tc>

</xml_diff>

<commit_message>
Doc: vent valve is now a startup air purge on blower-out vapor temp
Co-Authored-By: Claude Opus 4.8 <noreply@anthropic.com>
</commit_message>
<xml_diff>
--- a/MVR_Model_Reference.docx
+++ b/MVR_Model_Reference.docx
@@ -1067,7 +1067,7 @@
         <w:spacing w:after="120"/>
       </w:pPr>
       <w:r>
-        <w:t xml:space="preserve">The steam vent (DO:VentValve, </w:t>
+        <w:t xml:space="preserve">The vent (DO:VentValve) is a startup NON-CONDENSABLE (air) purge: it holds OPEN while the system warms (blower on, phase &gt;= HEAT) so trapped air is pushed out, then CLOSES once the blower-out vapor (</w:t>
       </w:r>
       <w:r>
         <w:rPr>
@@ -1075,10 +1075,32 @@
           <w:sz w:val="19"/>
           <w:szCs w:val="19"/>
         </w:rPr>
-        <w:t xml:space="preserve">ventOpen = yCondTemp &gt; condLiquidTemp</w:t>
-      </w:r>
-      <w:r>
-        <w:t xml:space="preserve">) still purges steam/air at startup, but the flow meter no longer depends on it -- the level sensor + pump gate the metering.</w:t>
+        <w:t xml:space="preserve">yVaporOut</w:t>
+      </w:r>
+      <w:r>
+        <w:t xml:space="preserve">) reaches steam temperature -- hysteresis </w:t>
+      </w:r>
+      <w:r>
+        <w:rPr>
+          <w:rFonts w:ascii="Consolas" w:cs="Consolas" w:eastAsia="Consolas" w:hAnsi="Consolas"/>
+          <w:sz w:val="19"/>
+          <w:szCs w:val="19"/>
+        </w:rPr>
+        <w:t xml:space="preserve">ventOpenTemp</w:t>
+      </w:r>
+      <w:r>
+        <w:t xml:space="preserve"> (98C, open below) / </w:t>
+      </w:r>
+      <w:r>
+        <w:rPr>
+          <w:rFonts w:ascii="Consolas" w:cs="Consolas" w:eastAsia="Consolas" w:hAnsi="Consolas"/>
+          <w:sz w:val="19"/>
+          <w:szCs w:val="19"/>
+        </w:rPr>
+        <w:t xml:space="preserve">ventCloseTemp</w:t>
+      </w:r>
+      <w:r>
+        <w:t xml:space="preserve"> (101C, close above). It is independent of condLiquid (the condensate-outlet liquid gate the sim uses for metering); closed when idle.</w:t>
       </w:r>
     </w:p>
     <w:p>
@@ -6808,7 +6830,125 @@
                 <w:sz w:val="20"/>
                 <w:szCs w:val="20"/>
               </w:rPr>
-              <w:t xml:space="preserve">Vent only now: condensate outlet below this = liquid -&gt; close the steam vent (DO:VentValve).</w:t>
+              <w:t xml:space="preserve">Condensate outlet below this = LIQUID (count meter, sim collects condensate). Not the vent anymore.</w:t>
+            </w:r>
+          </w:p>
+        </w:tc>
+      </w:tr>
+      <w:tr>
+        <w:tc>
+          <w:tcPr>
+            <w:tcW w:type="dxa" w:w="2200"/>
+            <w:tcBorders>
+              <w:top w:val="single" w:color="BBBBBB" w:sz="1"/>
+              <w:left w:val="single" w:color="BBBBBB" w:sz="1"/>
+              <w:bottom w:val="single" w:color="BBBBBB" w:sz="1"/>
+              <w:right w:val="single" w:color="BBBBBB" w:sz="1"/>
+            </w:tcBorders>
+            <w:tcMar>
+              <w:top w:type="dxa" w:w="50"/>
+              <w:left w:type="dxa" w:w="110"/>
+              <w:bottom w:type="dxa" w:w="50"/>
+              <w:right w:type="dxa" w:w="110"/>
+            </w:tcMar>
+          </w:tcPr>
+          <w:p>
+            <w:r>
+              <w:rPr>
+                <w:rFonts w:ascii="Consolas" w:cs="Consolas" w:eastAsia="Consolas" w:hAnsi="Consolas"/>
+                <w:b w:val="false"/>
+                <w:bCs w:val="false"/>
+                <w:sz w:val="18"/>
+                <w:szCs w:val="18"/>
+              </w:rPr>
+              <w:t xml:space="preserve">ventOpenTemp / ventCloseTemp</w:t>
+            </w:r>
+          </w:p>
+        </w:tc>
+        <w:tc>
+          <w:tcPr>
+            <w:tcW w:type="dxa" w:w="1300"/>
+            <w:tcBorders>
+              <w:top w:val="single" w:color="BBBBBB" w:sz="1"/>
+              <w:left w:val="single" w:color="BBBBBB" w:sz="1"/>
+              <w:bottom w:val="single" w:color="BBBBBB" w:sz="1"/>
+              <w:right w:val="single" w:color="BBBBBB" w:sz="1"/>
+            </w:tcBorders>
+            <w:tcMar>
+              <w:top w:type="dxa" w:w="50"/>
+              <w:left w:type="dxa" w:w="110"/>
+              <w:bottom w:type="dxa" w:w="50"/>
+              <w:right w:type="dxa" w:w="110"/>
+            </w:tcMar>
+          </w:tcPr>
+          <w:p>
+            <w:r>
+              <w:rPr>
+                <w:rFonts w:ascii="Arial" w:cs="Arial" w:eastAsia="Arial" w:hAnsi="Arial"/>
+                <w:b w:val="false"/>
+                <w:bCs w:val="false"/>
+                <w:sz w:val="20"/>
+                <w:szCs w:val="20"/>
+              </w:rPr>
+              <w:t xml:space="preserve">98 / 101</w:t>
+            </w:r>
+          </w:p>
+        </w:tc>
+        <w:tc>
+          <w:tcPr>
+            <w:tcW w:type="dxa" w:w="1500"/>
+            <w:tcBorders>
+              <w:top w:val="single" w:color="BBBBBB" w:sz="1"/>
+              <w:left w:val="single" w:color="BBBBBB" w:sz="1"/>
+              <w:bottom w:val="single" w:color="BBBBBB" w:sz="1"/>
+              <w:right w:val="single" w:color="BBBBBB" w:sz="1"/>
+            </w:tcBorders>
+            <w:tcMar>
+              <w:top w:type="dxa" w:w="50"/>
+              <w:left w:type="dxa" w:w="110"/>
+              <w:bottom w:type="dxa" w:w="50"/>
+              <w:right w:type="dxa" w:w="110"/>
+            </w:tcMar>
+          </w:tcPr>
+          <w:p>
+            <w:r>
+              <w:rPr>
+                <w:rFonts w:ascii="Arial" w:cs="Arial" w:eastAsia="Arial" w:hAnsi="Arial"/>
+                <w:b w:val="false"/>
+                <w:bCs w:val="false"/>
+                <w:sz w:val="20"/>
+                <w:szCs w:val="20"/>
+              </w:rPr>
+              <w:t xml:space="preserve">C</w:t>
+            </w:r>
+          </w:p>
+        </w:tc>
+        <w:tc>
+          <w:tcPr>
+            <w:tcW w:type="dxa" w:w="4360"/>
+            <w:tcBorders>
+              <w:top w:val="single" w:color="BBBBBB" w:sz="1"/>
+              <w:left w:val="single" w:color="BBBBBB" w:sz="1"/>
+              <w:bottom w:val="single" w:color="BBBBBB" w:sz="1"/>
+              <w:right w:val="single" w:color="BBBBBB" w:sz="1"/>
+            </w:tcBorders>
+            <w:tcMar>
+              <w:top w:type="dxa" w:w="50"/>
+              <w:left w:type="dxa" w:w="110"/>
+              <w:bottom w:type="dxa" w:w="50"/>
+              <w:right w:type="dxa" w:w="110"/>
+            </w:tcMar>
+          </w:tcPr>
+          <w:p>
+            <w:r>
+              <w:rPr>
+                <w:rFonts w:ascii="Arial" w:cs="Arial" w:eastAsia="Arial" w:hAnsi="Arial"/>
+                <w:b w:val="false"/>
+                <w:bCs w:val="false"/>
+                <w:sz w:val="20"/>
+                <w:szCs w:val="20"/>
+              </w:rPr>
+              <w:t xml:space="preserve">Startup air-purge vent: OPEN below / CLOSE above this blower-out vapor temp (yVaporOut). Hysteresis.</w:t>
             </w:r>
           </w:p>
         </w:tc>
@@ -11915,7 +12055,7 @@
                 <w:sz w:val="20"/>
                 <w:szCs w:val="20"/>
               </w:rPr>
-              <w:t xml:space="preserve">Liquid-vs-steam gate (vent only) / steam vent (DO:VentValve).</w:t>
+              <w:t xml:space="preserve">Condensate-outlet liquid-vs-steam gate (sim metering) / startup air-purge vent state (DO:VentValve).</w:t>
             </w:r>
           </w:p>
         </w:tc>

</xml_diff>

<commit_message>
Doc: EvapLevel sensor + PRIME wet-confirm/evapLevelErr fault; fix stale phase numbering
Co-Authored-By: Claude Opus 4.8 <noreply@anthropic.com>
</commit_message>
<xml_diff>
--- a/MVR_Model_Reference.docx
+++ b/MVR_Model_Reference.docx
@@ -390,7 +390,7 @@
         <w:t xml:space="preserve">vel = -purgeRevRpm</w:t>
       </w:r>
       <w:r>
-        <w:t xml:space="preserve">) to empty the feed/evaporator side to a KNOWN baseline, so an interrupted run (stop / power loss) restarts from a known state instead of trusting leftover inventory. It ALWAYS pumps the full dead-reckon volume (</w:t>
+        <w:t xml:space="preserve">) to empty the feed/evaporator side to a KNOWN baseline, so an interrupted run (stop / power loss) restarts from a known state instead of trusting leftover inventory. It ALWAYS pumps the full dead-reckon volume </w:t>
       </w:r>
       <w:r>
         <w:rPr>
@@ -401,18 +401,7 @@
         <w:t xml:space="preserve">purgeOutML &gt;= purgeMaxML</w:t>
       </w:r>
       <w:r>
-        <w:t xml:space="preserve">, ~2 L) to guarantee empty without trusting the sensor, AND requires the input level detector empty (</w:t>
-      </w:r>
-      <w:r>
-        <w:rPr>
-          <w:rFonts w:ascii="Consolas" w:cs="Consolas" w:eastAsia="Consolas" w:hAnsi="Consolas"/>
-          <w:sz w:val="19"/>
-          <w:szCs w:val="19"/>
-        </w:rPr>
-        <w:t xml:space="preserve">yFeedEmpty</w:t>
-      </w:r>
-      <w:r>
-        <w:t xml:space="preserve">); a 2x hard cap stops a runaway if the sensor never trips. Then feedInvEst is zeroed.</w:t>
+        <w:t xml:space="preserve"> (~2 L), BLIND -- the evaporator contents are unknown at startup so no level reading is trusted here. Then feedInvEst is zeroed.</w:t>
       </w:r>
     </w:p>
     <w:p>
@@ -440,7 +429,7 @@
         <w:t xml:space="preserve">feedCmd = feedPrimeRpm</w:t>
       </w:r>
       <w:r>
-        <w:t xml:space="preserve">; advance when </w:t>
+        <w:t xml:space="preserve">; advance to HEAT when </w:t>
       </w:r>
       <w:r>
         <w:rPr>
@@ -448,10 +437,32 @@
           <w:sz w:val="19"/>
           <w:szCs w:val="19"/>
         </w:rPr>
-        <w:t xml:space="preserve">feedInvEst &gt;= feedPrimeML</w:t>
-      </w:r>
-      <w:r>
-        <w:t xml:space="preserve"> (dead-reckon fill from the purged-empty baseline).</w:t>
+        <w:t xml:space="preserve">feedInvEst &gt;= feedPrimeML AND yEvapLevel</w:t>
+      </w:r>
+      <w:r>
+        <w:t xml:space="preserve"> -- i.e. the dead-reckon fill is reached AND the EvapLevel sensor confirms the evaporator is actually WET, so the heater never fires dry. If primed but still dry by </w:t>
+      </w:r>
+      <w:r>
+        <w:rPr>
+          <w:rFonts w:ascii="Consolas" w:cs="Consolas" w:eastAsia="Consolas" w:hAnsi="Consolas"/>
+          <w:sz w:val="19"/>
+          <w:szCs w:val="19"/>
+        </w:rPr>
+        <w:t xml:space="preserve">evapLevelCheckML</w:t>
+      </w:r>
+      <w:r>
+        <w:t xml:space="preserve">, Interlocks latches </w:t>
+      </w:r>
+      <w:r>
+        <w:rPr>
+          <w:rFonts w:ascii="Consolas" w:cs="Consolas" w:eastAsia="Consolas" w:hAnsi="Consolas"/>
+          <w:sz w:val="19"/>
+          <w:szCs w:val="19"/>
+        </w:rPr>
+        <w:t xml:space="preserve">evapLevelErr</w:t>
+      </w:r>
+      <w:r>
+        <w:t xml:space="preserve"> (feed-pump or level-sensor failure) -&gt; trip + UI popup; clears on Stop.</w:t>
       </w:r>
     </w:p>
     <w:p>
@@ -566,7 +577,7 @@
         <w:spacing w:after="120"/>
       </w:pPr>
       <w:r>
-        <w:t xml:space="preserve">trip = any of: evap/steam over-pressure, vapor-out over-temp, demister flood, low-superheat (wet compression, latched-arm), makeup-cartridge over-temp, superheat-cartridge over-temp. The two cartridge trips and the wet-compression trip LATCH until runSystem is cycled.</w:t>
+        <w:t xml:space="preserve">trip = any of: evap/steam over-pressure, vapor-out over-temp, demister flood, low-superheat (wet compression, latched-arm), makeup-cartridge over-temp, superheat-cartridge over-temp, evaporator-level prime-verify (evapLevelErr). The cartridge trips, wet-compression, and evapLevelErr LATCH until runSystem is cycled. evapLevelErr also fires a UI popup.</w:t>
       </w:r>
     </w:p>
     <w:p>
@@ -7779,7 +7790,7 @@
                 <w:sz w:val="20"/>
                 <w:szCs w:val="20"/>
               </w:rPr>
-              <w:t xml:space="preserve">0=IDLE 1=PRIME 2=HEAT 3=RUN</w:t>
+              <w:t xml:space="preserve">0=IDLE 1=PURGE 2=PRIME 3=HEAT 4=RUN</w:t>
             </w:r>
           </w:p>
         </w:tc>
@@ -8516,7 +8527,7 @@
                 <w:sz w:val="20"/>
                 <w:szCs w:val="20"/>
               </w:rPr>
-              <w:t xml:space="preserve">PURGE dead-reckon backstop: reverse-pump up to this if the empty sensor (yFeedEmpty) never trips (~1.5L primed + margin).</w:t>
+              <w:t xml:space="preserve">PURGE: ALWAYS reverse-pump this full volume at startup, BLIND. Evaporator contents are unknown at startup -- never trust a level reading here.</w:t>
             </w:r>
           </w:p>
         </w:tc>
@@ -8634,7 +8645,243 @@
                 <w:sz w:val="20"/>
                 <w:szCs w:val="20"/>
               </w:rPr>
-              <w:t xml:space="preserve">Input level detector = empty (real sensor; sim: evaporator inventory below purgeEmptyML).</w:t>
+              <w:t xml:space="preserve">Input level detector = empty (real sensor; sim: evaporator inventory below purgeEmptyML). Monitoring only -- does NOT shorten the purge.</w:t>
+            </w:r>
+          </w:p>
+        </w:tc>
+      </w:tr>
+      <w:tr>
+        <w:tc>
+          <w:tcPr>
+            <w:tcW w:type="dxa" w:w="2000"/>
+            <w:tcBorders>
+              <w:top w:val="single" w:color="BBBBBB" w:sz="1"/>
+              <w:left w:val="single" w:color="BBBBBB" w:sz="1"/>
+              <w:bottom w:val="single" w:color="BBBBBB" w:sz="1"/>
+              <w:right w:val="single" w:color="BBBBBB" w:sz="1"/>
+            </w:tcBorders>
+            <w:tcMar>
+              <w:top w:type="dxa" w:w="50"/>
+              <w:left w:type="dxa" w:w="110"/>
+              <w:bottom w:type="dxa" w:w="50"/>
+              <w:right w:type="dxa" w:w="110"/>
+            </w:tcMar>
+          </w:tcPr>
+          <w:p>
+            <w:r>
+              <w:rPr>
+                <w:rFonts w:ascii="Consolas" w:cs="Consolas" w:eastAsia="Consolas" w:hAnsi="Consolas"/>
+                <w:b w:val="false"/>
+                <w:bCs w:val="false"/>
+                <w:sz w:val="18"/>
+                <w:szCs w:val="18"/>
+              </w:rPr>
+              <w:t xml:space="preserve">EvapLevel (AI6) / evapLevelTripML</w:t>
+            </w:r>
+          </w:p>
+        </w:tc>
+        <w:tc>
+          <w:tcPr>
+            <w:tcW w:type="dxa" w:w="1400"/>
+            <w:tcBorders>
+              <w:top w:val="single" w:color="BBBBBB" w:sz="1"/>
+              <w:left w:val="single" w:color="BBBBBB" w:sz="1"/>
+              <w:bottom w:val="single" w:color="BBBBBB" w:sz="1"/>
+              <w:right w:val="single" w:color="BBBBBB" w:sz="1"/>
+            </w:tcBorders>
+            <w:tcMar>
+              <w:top w:type="dxa" w:w="50"/>
+              <w:left w:type="dxa" w:w="110"/>
+              <w:bottom w:type="dxa" w:w="50"/>
+              <w:right w:type="dxa" w:w="110"/>
+            </w:tcMar>
+          </w:tcPr>
+          <w:p>
+            <w:r>
+              <w:rPr>
+                <w:rFonts w:ascii="Arial" w:cs="Arial" w:eastAsia="Arial" w:hAnsi="Arial"/>
+                <w:b w:val="false"/>
+                <w:bCs w:val="false"/>
+                <w:sz w:val="20"/>
+                <w:szCs w:val="20"/>
+              </w:rPr>
+              <w:t xml:space="preserve">wet-dry / 100</w:t>
+            </w:r>
+          </w:p>
+        </w:tc>
+        <w:tc>
+          <w:tcPr>
+            <w:tcW w:type="dxa" w:w="2000"/>
+            <w:tcBorders>
+              <w:top w:val="single" w:color="BBBBBB" w:sz="1"/>
+              <w:left w:val="single" w:color="BBBBBB" w:sz="1"/>
+              <w:bottom w:val="single" w:color="BBBBBB" w:sz="1"/>
+              <w:right w:val="single" w:color="BBBBBB" w:sz="1"/>
+            </w:tcBorders>
+            <w:tcMar>
+              <w:top w:type="dxa" w:w="50"/>
+              <w:left w:type="dxa" w:w="110"/>
+              <w:bottom w:type="dxa" w:w="50"/>
+              <w:right w:type="dxa" w:w="110"/>
+            </w:tcMar>
+          </w:tcPr>
+          <w:p>
+            <w:r>
+              <w:rPr>
+                <w:rFonts w:ascii="Arial" w:cs="Arial" w:eastAsia="Arial" w:hAnsi="Arial"/>
+                <w:b w:val="false"/>
+                <w:bCs w:val="false"/>
+                <w:sz w:val="20"/>
+                <w:szCs w:val="20"/>
+              </w:rPr>
+              <w:t xml:space="preserve">0-5V / ml</w:t>
+            </w:r>
+          </w:p>
+        </w:tc>
+        <w:tc>
+          <w:tcPr>
+            <w:tcW w:type="dxa" w:w="3960"/>
+            <w:tcBorders>
+              <w:top w:val="single" w:color="BBBBBB" w:sz="1"/>
+              <w:left w:val="single" w:color="BBBBBB" w:sz="1"/>
+              <w:bottom w:val="single" w:color="BBBBBB" w:sz="1"/>
+              <w:right w:val="single" w:color="BBBBBB" w:sz="1"/>
+            </w:tcBorders>
+            <w:tcMar>
+              <w:top w:type="dxa" w:w="50"/>
+              <w:left w:type="dxa" w:w="110"/>
+              <w:bottom w:type="dxa" w:w="50"/>
+              <w:right w:type="dxa" w:w="110"/>
+            </w:tcMar>
+          </w:tcPr>
+          <w:p>
+            <w:r>
+              <w:rPr>
+                <w:rFonts w:ascii="Arial" w:cs="Arial" w:eastAsia="Arial" w:hAnsi="Arial"/>
+                <w:b w:val="false"/>
+                <w:bCs w:val="false"/>
+                <w:sz w:val="20"/>
+                <w:szCs w:val="20"/>
+              </w:rPr>
+              <w:t xml:space="preserve">Evaporator level sensor (high=wet, like demister/flood). Sim reads wet above evapLevelTripML inventory; real: AI:EvapLevel &gt; 2.5V.</w:t>
+            </w:r>
+          </w:p>
+        </w:tc>
+      </w:tr>
+      <w:tr>
+        <w:tc>
+          <w:tcPr>
+            <w:tcW w:type="dxa" w:w="2000"/>
+            <w:tcBorders>
+              <w:top w:val="single" w:color="BBBBBB" w:sz="1"/>
+              <w:left w:val="single" w:color="BBBBBB" w:sz="1"/>
+              <w:bottom w:val="single" w:color="BBBBBB" w:sz="1"/>
+              <w:right w:val="single" w:color="BBBBBB" w:sz="1"/>
+            </w:tcBorders>
+            <w:tcMar>
+              <w:top w:type="dxa" w:w="50"/>
+              <w:left w:type="dxa" w:w="110"/>
+              <w:bottom w:type="dxa" w:w="50"/>
+              <w:right w:type="dxa" w:w="110"/>
+            </w:tcMar>
+          </w:tcPr>
+          <w:p>
+            <w:r>
+              <w:rPr>
+                <w:rFonts w:ascii="Consolas" w:cs="Consolas" w:eastAsia="Consolas" w:hAnsi="Consolas"/>
+                <w:b w:val="false"/>
+                <w:bCs w:val="false"/>
+                <w:sz w:val="18"/>
+                <w:szCs w:val="18"/>
+              </w:rPr>
+              <w:t xml:space="preserve">evapLevelCheckML</w:t>
+            </w:r>
+          </w:p>
+        </w:tc>
+        <w:tc>
+          <w:tcPr>
+            <w:tcW w:type="dxa" w:w="1400"/>
+            <w:tcBorders>
+              <w:top w:val="single" w:color="BBBBBB" w:sz="1"/>
+              <w:left w:val="single" w:color="BBBBBB" w:sz="1"/>
+              <w:bottom w:val="single" w:color="BBBBBB" w:sz="1"/>
+              <w:right w:val="single" w:color="BBBBBB" w:sz="1"/>
+            </w:tcBorders>
+            <w:tcMar>
+              <w:top w:type="dxa" w:w="50"/>
+              <w:left w:type="dxa" w:w="110"/>
+              <w:bottom w:type="dxa" w:w="50"/>
+              <w:right w:type="dxa" w:w="110"/>
+            </w:tcMar>
+          </w:tcPr>
+          <w:p>
+            <w:r>
+              <w:rPr>
+                <w:rFonts w:ascii="Arial" w:cs="Arial" w:eastAsia="Arial" w:hAnsi="Arial"/>
+                <w:b w:val="false"/>
+                <w:bCs w:val="false"/>
+                <w:sz w:val="20"/>
+                <w:szCs w:val="20"/>
+              </w:rPr>
+              <w:t xml:space="preserve">1500</w:t>
+            </w:r>
+          </w:p>
+        </w:tc>
+        <w:tc>
+          <w:tcPr>
+            <w:tcW w:type="dxa" w:w="2000"/>
+            <w:tcBorders>
+              <w:top w:val="single" w:color="BBBBBB" w:sz="1"/>
+              <w:left w:val="single" w:color="BBBBBB" w:sz="1"/>
+              <w:bottom w:val="single" w:color="BBBBBB" w:sz="1"/>
+              <w:right w:val="single" w:color="BBBBBB" w:sz="1"/>
+            </w:tcBorders>
+            <w:tcMar>
+              <w:top w:type="dxa" w:w="50"/>
+              <w:left w:type="dxa" w:w="110"/>
+              <w:bottom w:type="dxa" w:w="50"/>
+              <w:right w:type="dxa" w:w="110"/>
+            </w:tcMar>
+          </w:tcPr>
+          <w:p>
+            <w:r>
+              <w:rPr>
+                <w:rFonts w:ascii="Arial" w:cs="Arial" w:eastAsia="Arial" w:hAnsi="Arial"/>
+                <w:b w:val="false"/>
+                <w:bCs w:val="false"/>
+                <w:sz w:val="20"/>
+                <w:szCs w:val="20"/>
+              </w:rPr>
+              <w:t xml:space="preserve">ml</w:t>
+            </w:r>
+          </w:p>
+        </w:tc>
+        <w:tc>
+          <w:tcPr>
+            <w:tcW w:type="dxa" w:w="3960"/>
+            <w:tcBorders>
+              <w:top w:val="single" w:color="BBBBBB" w:sz="1"/>
+              <w:left w:val="single" w:color="BBBBBB" w:sz="1"/>
+              <w:bottom w:val="single" w:color="BBBBBB" w:sz="1"/>
+              <w:right w:val="single" w:color="BBBBBB" w:sz="1"/>
+            </w:tcBorders>
+            <w:tcMar>
+              <w:top w:type="dxa" w:w="50"/>
+              <w:left w:type="dxa" w:w="110"/>
+              <w:bottom w:type="dxa" w:w="50"/>
+              <w:right w:type="dxa" w:w="110"/>
+            </w:tcMar>
+          </w:tcPr>
+          <w:p>
+            <w:r>
+              <w:rPr>
+                <w:rFonts w:ascii="Arial" w:cs="Arial" w:eastAsia="Arial" w:hAnsi="Arial"/>
+                <w:b w:val="false"/>
+                <w:bCs w:val="false"/>
+                <w:sz w:val="20"/>
+                <w:szCs w:val="20"/>
+              </w:rPr>
+              <w:t xml:space="preserve">PRIME verify: by this dead-reckoned fill the EvapLevel sensor MUST read wet, else evapLevelErr fault (feed-pump or sensor failure). Certainly wet by 1.5L.</w:t>
             </w:r>
           </w:p>
         </w:tc>

</xml_diff>

<commit_message>
MVR level rework: config AI6/AI7 sensors, UI 2.1.68, reference doc
config.json: AI6 EvapLowLevel + AI7 EvapMidLevel (both included, wet/dry 0-5V).
app.js 2.1.68: two-sensor naming + reworded evapLevelErr popup.
Reference doc: level->volume map, two-sensor ladder, sensor-integral level
control (2.2a), prime-then-ramp, manual meter cal, makeup-heater fold-back.

Co-Authored-By: Claude Opus 4.8 <noreply@anthropic.com>
</commit_message>
<xml_diff>
--- a/MVR_Model_Reference.docx
+++ b/MVR_Model_Reference.docx
@@ -429,7 +429,7 @@
         <w:t xml:space="preserve">feedCmd = feedPrimeRpm</w:t>
       </w:r>
       <w:r>
-        <w:t xml:space="preserve">; advance to HEAT when </w:t>
+        <w:t xml:space="preserve">; fill to the EvapLow mark (~0.75 L, heater covered) and advance to HEAT when </w:t>
       </w:r>
       <w:r>
         <w:rPr>
@@ -437,10 +437,10 @@
           <w:sz w:val="19"/>
           <w:szCs w:val="19"/>
         </w:rPr>
-        <w:t xml:space="preserve">feedInvEst &gt;= feedPrimeML AND yEvapLevel</w:t>
-      </w:r>
-      <w:r>
-        <w:t xml:space="preserve"> -- i.e. the dead-reckon fill is reached AND the EvapLevel sensor confirms the evaporator is actually WET, so the heater never fires dry. If primed but still dry by </w:t>
+        <w:t xml:space="preserve">feedInvEst &gt;= feedPrimeML AND yEvapLow</w:t>
+      </w:r>
+      <w:r>
+        <w:t xml:space="preserve"> -- the low sight-glass sensor CONFIRMS wet, so the heater never fires dry. If primed but EvapLow stays dry by </w:t>
       </w:r>
       <w:r>
         <w:rPr>
@@ -462,7 +462,7 @@
         <w:t xml:space="preserve">evapLevelErr</w:t>
       </w:r>
       <w:r>
-        <w:t xml:space="preserve"> (feed-pump or level-sensor failure) -&gt; trip + UI popup; clears on Stop.</w:t>
+        <w:t xml:space="preserve"> (feed-pump or sensor failure) -&gt; trip + UI popup; clears on Stop.</w:t>
       </w:r>
     </w:p>
     <w:p>
@@ -482,7 +482,7 @@
         <w:t xml:space="preserve">HEAT: </w:t>
       </w:r>
       <w:r>
-        <w:t xml:space="preserve">makeup heater on; advance when </w:t>
+        <w:t xml:space="preserve">makeup heater on; the feed RAMPS the level from EvapLow up to the operating mark (EvapMid, ~2 L). Advance to RUN when </w:t>
       </w:r>
       <w:r>
         <w:rPr>
@@ -490,10 +490,10 @@
           <w:sz w:val="19"/>
           <w:szCs w:val="19"/>
         </w:rPr>
-        <w:t xml:space="preserve">yEvapTemp &gt; evapTempSet - 3</w:t>
-      </w:r>
-      <w:r>
-        <w:t xml:space="preserve"> (seed prodMeas = prodSetSafe so the blower doesn't spike).</w:t>
+        <w:t xml:space="preserve">yEvapTemp &gt; evapTempSet - 3 AND yEvapMid</w:t>
+      </w:r>
+      <w:r>
+        <w:t xml:space="preserve"> -- near boiling AND at the operating level (seed prodMeas = prodSetSafe so the blower doesn't spike).</w:t>
       </w:r>
     </w:p>
     <w:p>
@@ -513,7 +513,7 @@
         <w:t xml:space="preserve">RUN: </w:t>
       </w:r>
       <w:r>
-        <w:t xml:space="preserve">closed-loop production + feed.</w:t>
+        <w:t xml:space="preserve">closed-loop production; the feed HOLDS the level at EvapMid (see 2.2a).</w:t>
       </w:r>
     </w:p>
     <w:p>
@@ -521,7 +521,7 @@
         <w:pStyle w:val="Heading2"/>
       </w:pPr>
       <w:r>
-        <w:t xml:space="preserve">2.2  Setpoint safety bounds</w:t>
+        <w:t xml:space="preserve">2.2a  Evaporator level control (FeedFollow)</w:t>
       </w:r>
     </w:p>
     <w:p>
@@ -529,30 +529,90 @@
         <w:spacing w:after="120"/>
       </w:pPr>
       <w:r>
-        <w:t xml:space="preserve">Each live setpoint is range-checked every tick; an out-of-range value is </w:t>
-      </w:r>
-      <w:r>
-        <w:rPr>
-          <w:b/>
-          <w:bCs/>
-        </w:rPr>
-        <w:t xml:space="preserve">ignored</w:t>
-      </w:r>
-      <w:r>
-        <w:t xml:space="preserve"> and the last valid value is kept in a *Safe companion. The controllers read the *Safe value, never the raw input.</w:t>
-      </w:r>
-    </w:p>
-    <w:p>
-      <w:pPr>
-        <w:spacing w:after="60"/>
-        <w:ind w:left="360"/>
-      </w:pPr>
+        <w:t xml:space="preserve">No continuous evaporator level sensor fits the design, so level is held with TWO wet/dry sight-glass sensors and the precisely-calibrated positive-displacement feed pump. Feed = measured-production feed-forward </w:t>
+      </w:r>
       <w:r>
         <w:rPr>
           <w:rFonts w:ascii="Consolas" w:cs="Consolas" w:eastAsia="Consolas" w:hAnsi="Consolas"/>
           <w:sz w:val="19"/>
           <w:szCs w:val="19"/>
         </w:rPr>
+        <w:t xml:space="preserve">prodMeas x (1+blowdownFrac)</w:t>
+      </w:r>
+      <w:r>
+        <w:t xml:space="preserve"> plus a SLOW integral on the EvapMid wet/dry state: wet -&gt; trim the feed below boil-off (draw down), dry -&gt; above (fill up). The level rides the mark with a slow toggle (~tens of minutes), and because the integral -- not the dead-reckon -- closes the loop, a mis-calibrated flow meter can NEVER run the level away (wet always pulls feed down). Far below the mark the feed fills at </w:t>
+      </w:r>
+      <w:r>
+        <w:rPr>
+          <w:rFonts w:ascii="Consolas" w:cs="Consolas" w:eastAsia="Consolas" w:hAnsi="Consolas"/>
+          <w:sz w:val="19"/>
+          <w:szCs w:val="19"/>
+        </w:rPr>
+        <w:t xml:space="preserve">feedFillLpm</w:t>
+      </w:r>
+      <w:r>
+        <w:t xml:space="preserve">. The dead-reckon </w:t>
+      </w:r>
+      <w:r>
+        <w:rPr>
+          <w:rFonts w:ascii="Consolas" w:cs="Consolas" w:eastAsia="Consolas" w:hAnsi="Consolas"/>
+          <w:sz w:val="19"/>
+          <w:szCs w:val="19"/>
+        </w:rPr>
+        <w:t xml:space="preserve">feedInvEst</w:t>
+      </w:r>
+      <w:r>
+        <w:t xml:space="preserve"> is clamped consistent with the sensor states each tick (for prime-verify + display), not used to hold level. Calibrate </w:t>
+      </w:r>
+      <w:r>
+        <w:rPr>
+          <w:rFonts w:ascii="Consolas" w:cs="Consolas" w:eastAsia="Consolas" w:hAnsi="Consolas"/>
+          <w:sz w:val="19"/>
+          <w:szCs w:val="19"/>
+        </w:rPr>
+        <w:t xml:space="preserve">condCalFactor</w:t>
+      </w:r>
+      <w:r>
+        <w:t xml:space="preserve"> once against the feed pump so production reads true.</w:t>
+      </w:r>
+    </w:p>
+    <w:p>
+      <w:pPr>
+        <w:pStyle w:val="Heading2"/>
+      </w:pPr>
+      <w:r>
+        <w:t xml:space="preserve">2.2  Setpoint safety bounds</w:t>
+      </w:r>
+    </w:p>
+    <w:p>
+      <w:pPr>
+        <w:spacing w:after="120"/>
+      </w:pPr>
+      <w:r>
+        <w:t xml:space="preserve">Each live setpoint is range-checked every tick; an out-of-range value is </w:t>
+      </w:r>
+      <w:r>
+        <w:rPr>
+          <w:b/>
+          <w:bCs/>
+        </w:rPr>
+        <w:t xml:space="preserve">ignored</w:t>
+      </w:r>
+      <w:r>
+        <w:t xml:space="preserve"> and the last valid value is kept in a *Safe companion. The controllers read the *Safe value, never the raw input.</w:t>
+      </w:r>
+    </w:p>
+    <w:p>
+      <w:pPr>
+        <w:spacing w:after="60"/>
+        <w:ind w:left="360"/>
+      </w:pPr>
+      <w:r>
+        <w:rPr>
+          <w:rFonts w:ascii="Consolas" w:cs="Consolas" w:eastAsia="Consolas" w:hAnsi="Consolas"/>
+          <w:sz w:val="19"/>
+          <w:szCs w:val="19"/>
+        </w:rPr>
         <w:t xml:space="preserve">if (lo &lt;= setpoint &lt;= hi)  -&gt;  setpointSafe = setpoint   ; else keep last</w:t>
       </w:r>
     </w:p>
@@ -577,7 +637,48 @@
         <w:spacing w:after="120"/>
       </w:pPr>
       <w:r>
-        <w:t xml:space="preserve">trip = any of: evap/steam over-pressure, vapor-out over-temp, demister flood, low-superheat (wet compression, latched-arm), makeup-cartridge over-temp, superheat-cartridge over-temp, evaporator-level prime-verify (evapLevelErr). The cartridge trips, wet-compression, and evapLevelErr LATCH until runSystem is cycled. evapLevelErr also fires a UI popup.</w:t>
+        <w:t xml:space="preserve">trip = any of: evap/steam over-pressure, vapor-out over-temp, demister flood, low-superheat (wet compression, latched-arm), makeup-cartridge over-temp (HARD backstop makeupHtrMax=140C), superheat-cartridge over-temp, evaporator-level prime-verify (evapLevelErr). The cartridge trips, wet-compression, and evapLevelErr LATCH until runSystem is cycled. evapLevelErr also fires a UI popup.</w:t>
+      </w:r>
+    </w:p>
+    <w:p>
+      <w:pPr>
+        <w:spacing w:after="120"/>
+      </w:pPr>
+      <w:r>
+        <w:t xml:space="preserve">Makeup-heater element protection is SOFT first: in MakeupControl, above </w:t>
+      </w:r>
+      <w:r>
+        <w:rPr>
+          <w:rFonts w:ascii="Consolas" w:cs="Consolas" w:eastAsia="Consolas" w:hAnsi="Consolas"/>
+          <w:sz w:val="19"/>
+          <w:szCs w:val="19"/>
+        </w:rPr>
+        <w:t xml:space="preserve">makeupHtrSoft</w:t>
+      </w:r>
+      <w:r>
+        <w:t xml:space="preserve"> (115C) the PWM duty is folded back proportionally (violent boil / local dry-out -&gt; ease off so water re-wets the element), never below the keep-warm floor </w:t>
+      </w:r>
+      <w:r>
+        <w:rPr>
+          <w:rFonts w:ascii="Consolas" w:cs="Consolas" w:eastAsia="Consolas" w:hAnsi="Consolas"/>
+          <w:sz w:val="19"/>
+          <w:szCs w:val="19"/>
+        </w:rPr>
+        <w:t xml:space="preserve">makeupHtrMinDuty</w:t>
+      </w:r>
+      <w:r>
+        <w:t xml:space="preserve">. Only if the element keeps climbing to </w:t>
+      </w:r>
+      <w:r>
+        <w:rPr>
+          <w:rFonts w:ascii="Consolas" w:cs="Consolas" w:eastAsia="Consolas" w:hAnsi="Consolas"/>
+          <w:sz w:val="19"/>
+          <w:szCs w:val="19"/>
+        </w:rPr>
+        <w:t xml:space="preserve">makeupHtrMax</w:t>
+      </w:r>
+      <w:r>
+        <w:t xml:space="preserve"> (140C) despite fold-back does the hard trip fire. Tune makeupHtrMinDuty to the PWM that just holds the vapor at ~100C.</w:t>
       </w:r>
     </w:p>
     <w:p>
@@ -8115,7 +8216,7 @@
                 <w:sz w:val="20"/>
                 <w:szCs w:val="20"/>
               </w:rPr>
-              <w:t xml:space="preserve">1500</w:t>
+              <w:t xml:space="preserve">750</w:t>
             </w:r>
           </w:p>
         </w:tc>
@@ -8173,7 +8274,7 @@
                 <w:sz w:val="20"/>
                 <w:szCs w:val="20"/>
               </w:rPr>
-              <w:t xml:space="preserve">Volume PRIME dead-reckons before heat (~half a ~3L HX side).</w:t>
+              <w:t xml:space="preserve">PRIME fills to this (= EvapLow mark, heater covered) + confirms wet, THEN heats. Feed ramps to the operating level during warm-up.</w:t>
             </w:r>
           </w:p>
         </w:tc>
@@ -8676,7 +8777,7 @@
                 <w:sz w:val="18"/>
                 <w:szCs w:val="18"/>
               </w:rPr>
-              <w:t xml:space="preserve">EvapLevel (AI6) / evapLevelTripML</w:t>
+              <w:t xml:space="preserve">EvapLowLevel (AI6) / evapLowMark</w:t>
             </w:r>
           </w:p>
         </w:tc>
@@ -8705,7 +8806,7 @@
                 <w:sz w:val="20"/>
                 <w:szCs w:val="20"/>
               </w:rPr>
-              <w:t xml:space="preserve">wet-dry / 100</w:t>
+              <w:t xml:space="preserve">wet-dry / 750</w:t>
             </w:r>
           </w:p>
         </w:tc>
@@ -8763,7 +8864,7 @@
                 <w:sz w:val="20"/>
                 <w:szCs w:val="20"/>
               </w:rPr>
-              <w:t xml:space="preserve">Evaporator level sensor (high=wet, like demister/flood). Sim reads wet above evapLevelTripML inventory; real: AI:EvapLevel &gt; 2.5V.</w:t>
+              <w:t xml:space="preserve">LOW sight-glass sensor: heater-covered floor + wet-confirm to heat. WET above evapLowMark (sim); real: AI &gt; 2.5V. Heater covered ~550ml (simHtrCoverML).</w:t>
             </w:r>
           </w:p>
         </w:tc>
@@ -8794,6 +8895,360 @@
                 <w:sz w:val="18"/>
                 <w:szCs w:val="18"/>
               </w:rPr>
+              <w:t xml:space="preserve">EvapMidLevel (AI7) / evapMidMark</w:t>
+            </w:r>
+          </w:p>
+        </w:tc>
+        <w:tc>
+          <w:tcPr>
+            <w:tcW w:type="dxa" w:w="1400"/>
+            <w:tcBorders>
+              <w:top w:val="single" w:color="BBBBBB" w:sz="1"/>
+              <w:left w:val="single" w:color="BBBBBB" w:sz="1"/>
+              <w:bottom w:val="single" w:color="BBBBBB" w:sz="1"/>
+              <w:right w:val="single" w:color="BBBBBB" w:sz="1"/>
+            </w:tcBorders>
+            <w:tcMar>
+              <w:top w:type="dxa" w:w="50"/>
+              <w:left w:type="dxa" w:w="110"/>
+              <w:bottom w:type="dxa" w:w="50"/>
+              <w:right w:type="dxa" w:w="110"/>
+            </w:tcMar>
+          </w:tcPr>
+          <w:p>
+            <w:r>
+              <w:rPr>
+                <w:rFonts w:ascii="Arial" w:cs="Arial" w:eastAsia="Arial" w:hAnsi="Arial"/>
+                <w:b w:val="false"/>
+                <w:bCs w:val="false"/>
+                <w:sz w:val="20"/>
+                <w:szCs w:val="20"/>
+              </w:rPr>
+              <w:t xml:space="preserve">wet-dry / 2000</w:t>
+            </w:r>
+          </w:p>
+        </w:tc>
+        <w:tc>
+          <w:tcPr>
+            <w:tcW w:type="dxa" w:w="2000"/>
+            <w:tcBorders>
+              <w:top w:val="single" w:color="BBBBBB" w:sz="1"/>
+              <w:left w:val="single" w:color="BBBBBB" w:sz="1"/>
+              <w:bottom w:val="single" w:color="BBBBBB" w:sz="1"/>
+              <w:right w:val="single" w:color="BBBBBB" w:sz="1"/>
+            </w:tcBorders>
+            <w:tcMar>
+              <w:top w:type="dxa" w:w="50"/>
+              <w:left w:type="dxa" w:w="110"/>
+              <w:bottom w:type="dxa" w:w="50"/>
+              <w:right w:type="dxa" w:w="110"/>
+            </w:tcMar>
+          </w:tcPr>
+          <w:p>
+            <w:r>
+              <w:rPr>
+                <w:rFonts w:ascii="Arial" w:cs="Arial" w:eastAsia="Arial" w:hAnsi="Arial"/>
+                <w:b w:val="false"/>
+                <w:bCs w:val="false"/>
+                <w:sz w:val="20"/>
+                <w:szCs w:val="20"/>
+              </w:rPr>
+              <w:t xml:space="preserve">0-5V / ml</w:t>
+            </w:r>
+          </w:p>
+        </w:tc>
+        <w:tc>
+          <w:tcPr>
+            <w:tcW w:type="dxa" w:w="3960"/>
+            <w:tcBorders>
+              <w:top w:val="single" w:color="BBBBBB" w:sz="1"/>
+              <w:left w:val="single" w:color="BBBBBB" w:sz="1"/>
+              <w:bottom w:val="single" w:color="BBBBBB" w:sz="1"/>
+              <w:right w:val="single" w:color="BBBBBB" w:sz="1"/>
+            </w:tcBorders>
+            <w:tcMar>
+              <w:top w:type="dxa" w:w="50"/>
+              <w:left w:type="dxa" w:w="110"/>
+              <w:bottom w:type="dxa" w:w="50"/>
+              <w:right w:type="dxa" w:w="110"/>
+            </w:tcMar>
+          </w:tcPr>
+          <w:p>
+            <w:r>
+              <w:rPr>
+                <w:rFonts w:ascii="Arial" w:cs="Arial" w:eastAsia="Arial" w:hAnsi="Arial"/>
+                <w:b w:val="false"/>
+                <w:bCs w:val="false"/>
+                <w:sz w:val="20"/>
+                <w:szCs w:val="20"/>
+              </w:rPr>
+              <w:t xml:space="preserve">OPERATING-level sight-glass sensor (~3/4 up HX). The feed holds the level AT this mark via a slow wet/dry integral.</w:t>
+            </w:r>
+          </w:p>
+        </w:tc>
+      </w:tr>
+      <w:tr>
+        <w:tc>
+          <w:tcPr>
+            <w:tcW w:type="dxa" w:w="2000"/>
+            <w:tcBorders>
+              <w:top w:val="single" w:color="BBBBBB" w:sz="1"/>
+              <w:left w:val="single" w:color="BBBBBB" w:sz="1"/>
+              <w:bottom w:val="single" w:color="BBBBBB" w:sz="1"/>
+              <w:right w:val="single" w:color="BBBBBB" w:sz="1"/>
+            </w:tcBorders>
+            <w:tcMar>
+              <w:top w:type="dxa" w:w="50"/>
+              <w:left w:type="dxa" w:w="110"/>
+              <w:bottom w:type="dxa" w:w="50"/>
+              <w:right w:type="dxa" w:w="110"/>
+            </w:tcMar>
+          </w:tcPr>
+          <w:p>
+            <w:r>
+              <w:rPr>
+                <w:rFonts w:ascii="Consolas" w:cs="Consolas" w:eastAsia="Consolas" w:hAnsi="Consolas"/>
+                <w:b w:val="false"/>
+                <w:bCs w:val="false"/>
+                <w:sz w:val="18"/>
+                <w:szCs w:val="18"/>
+              </w:rPr>
+              <w:t xml:space="preserve">evapLevelSet / kFeedLevelI / feedFillLpm</w:t>
+            </w:r>
+          </w:p>
+        </w:tc>
+        <w:tc>
+          <w:tcPr>
+            <w:tcW w:type="dxa" w:w="1400"/>
+            <w:tcBorders>
+              <w:top w:val="single" w:color="BBBBBB" w:sz="1"/>
+              <w:left w:val="single" w:color="BBBBBB" w:sz="1"/>
+              <w:bottom w:val="single" w:color="BBBBBB" w:sz="1"/>
+              <w:right w:val="single" w:color="BBBBBB" w:sz="1"/>
+            </w:tcBorders>
+            <w:tcMar>
+              <w:top w:type="dxa" w:w="50"/>
+              <w:left w:type="dxa" w:w="110"/>
+              <w:bottom w:type="dxa" w:w="50"/>
+              <w:right w:type="dxa" w:w="110"/>
+            </w:tcMar>
+          </w:tcPr>
+          <w:p>
+            <w:r>
+              <w:rPr>
+                <w:rFonts w:ascii="Arial" w:cs="Arial" w:eastAsia="Arial" w:hAnsi="Arial"/>
+                <w:b w:val="false"/>
+                <w:bCs w:val="false"/>
+                <w:sz w:val="20"/>
+                <w:szCs w:val="20"/>
+              </w:rPr>
+              <w:t xml:space="preserve">2000 / 0.0015 / 0.25</w:t>
+            </w:r>
+          </w:p>
+        </w:tc>
+        <w:tc>
+          <w:tcPr>
+            <w:tcW w:type="dxa" w:w="2000"/>
+            <w:tcBorders>
+              <w:top w:val="single" w:color="BBBBBB" w:sz="1"/>
+              <w:left w:val="single" w:color="BBBBBB" w:sz="1"/>
+              <w:bottom w:val="single" w:color="BBBBBB" w:sz="1"/>
+              <w:right w:val="single" w:color="BBBBBB" w:sz="1"/>
+            </w:tcBorders>
+            <w:tcMar>
+              <w:top w:type="dxa" w:w="50"/>
+              <w:left w:type="dxa" w:w="110"/>
+              <w:bottom w:type="dxa" w:w="50"/>
+              <w:right w:type="dxa" w:w="110"/>
+            </w:tcMar>
+          </w:tcPr>
+          <w:p>
+            <w:r>
+              <w:rPr>
+                <w:rFonts w:ascii="Arial" w:cs="Arial" w:eastAsia="Arial" w:hAnsi="Arial"/>
+                <w:b w:val="false"/>
+                <w:bCs w:val="false"/>
+                <w:sz w:val="20"/>
+                <w:szCs w:val="20"/>
+              </w:rPr>
+              <w:t xml:space="preserve">ml / (L/min/s) / L/min</w:t>
+            </w:r>
+          </w:p>
+        </w:tc>
+        <w:tc>
+          <w:tcPr>
+            <w:tcW w:type="dxa" w:w="3960"/>
+            <w:tcBorders>
+              <w:top w:val="single" w:color="BBBBBB" w:sz="1"/>
+              <w:left w:val="single" w:color="BBBBBB" w:sz="1"/>
+              <w:bottom w:val="single" w:color="BBBBBB" w:sz="1"/>
+              <w:right w:val="single" w:color="BBBBBB" w:sz="1"/>
+            </w:tcBorders>
+            <w:tcMar>
+              <w:top w:type="dxa" w:w="50"/>
+              <w:left w:type="dxa" w:w="110"/>
+              <w:bottom w:type="dxa" w:w="50"/>
+              <w:right w:type="dxa" w:w="110"/>
+            </w:tcMar>
+          </w:tcPr>
+          <w:p>
+            <w:r>
+              <w:rPr>
+                <w:rFonts w:ascii="Arial" w:cs="Arial" w:eastAsia="Arial" w:hAnsi="Arial"/>
+                <w:b w:val="false"/>
+                <w:bCs w:val="false"/>
+                <w:sz w:val="20"/>
+                <w:szCs w:val="20"/>
+              </w:rPr>
+              <w:t xml:space="preserve">Operating level = EvapMid. Hold integral gain (toggle speed) / warm-up fill rate. Feed = production feed-forward + the level integral; meter bias can't run the level away (wet always draws feed below boil-off).</w:t>
+            </w:r>
+          </w:p>
+        </w:tc>
+      </w:tr>
+      <w:tr>
+        <w:tc>
+          <w:tcPr>
+            <w:tcW w:type="dxa" w:w="2000"/>
+            <w:tcBorders>
+              <w:top w:val="single" w:color="BBBBBB" w:sz="1"/>
+              <w:left w:val="single" w:color="BBBBBB" w:sz="1"/>
+              <w:bottom w:val="single" w:color="BBBBBB" w:sz="1"/>
+              <w:right w:val="single" w:color="BBBBBB" w:sz="1"/>
+            </w:tcBorders>
+            <w:tcMar>
+              <w:top w:type="dxa" w:w="50"/>
+              <w:left w:type="dxa" w:w="110"/>
+              <w:bottom w:type="dxa" w:w="50"/>
+              <w:right w:type="dxa" w:w="110"/>
+            </w:tcMar>
+          </w:tcPr>
+          <w:p>
+            <w:r>
+              <w:rPr>
+                <w:rFonts w:ascii="Consolas" w:cs="Consolas" w:eastAsia="Consolas" w:hAnsi="Consolas"/>
+                <w:b w:val="false"/>
+                <w:bCs w:val="false"/>
+                <w:sz w:val="18"/>
+                <w:szCs w:val="18"/>
+              </w:rPr>
+              <w:t xml:space="preserve">condCalFactor</w:t>
+            </w:r>
+          </w:p>
+        </w:tc>
+        <w:tc>
+          <w:tcPr>
+            <w:tcW w:type="dxa" w:w="1400"/>
+            <w:tcBorders>
+              <w:top w:val="single" w:color="BBBBBB" w:sz="1"/>
+              <w:left w:val="single" w:color="BBBBBB" w:sz="1"/>
+              <w:bottom w:val="single" w:color="BBBBBB" w:sz="1"/>
+              <w:right w:val="single" w:color="BBBBBB" w:sz="1"/>
+            </w:tcBorders>
+            <w:tcMar>
+              <w:top w:type="dxa" w:w="50"/>
+              <w:left w:type="dxa" w:w="110"/>
+              <w:bottom w:type="dxa" w:w="50"/>
+              <w:right w:type="dxa" w:w="110"/>
+            </w:tcMar>
+          </w:tcPr>
+          <w:p>
+            <w:r>
+              <w:rPr>
+                <w:rFonts w:ascii="Arial" w:cs="Arial" w:eastAsia="Arial" w:hAnsi="Arial"/>
+                <w:b w:val="false"/>
+                <w:bCs w:val="false"/>
+                <w:sz w:val="20"/>
+                <w:szCs w:val="20"/>
+              </w:rPr>
+              <w:t xml:space="preserve">1.0 (MANUAL)</w:t>
+            </w:r>
+          </w:p>
+        </w:tc>
+        <w:tc>
+          <w:tcPr>
+            <w:tcW w:type="dxa" w:w="2000"/>
+            <w:tcBorders>
+              <w:top w:val="single" w:color="BBBBBB" w:sz="1"/>
+              <w:left w:val="single" w:color="BBBBBB" w:sz="1"/>
+              <w:bottom w:val="single" w:color="BBBBBB" w:sz="1"/>
+              <w:right w:val="single" w:color="BBBBBB" w:sz="1"/>
+            </w:tcBorders>
+            <w:tcMar>
+              <w:top w:type="dxa" w:w="50"/>
+              <w:left w:type="dxa" w:w="110"/>
+              <w:bottom w:type="dxa" w:w="50"/>
+              <w:right w:type="dxa" w:w="110"/>
+            </w:tcMar>
+          </w:tcPr>
+          <w:p>
+            <w:r>
+              <w:rPr>
+                <w:rFonts w:ascii="Arial" w:cs="Arial" w:eastAsia="Arial" w:hAnsi="Arial"/>
+                <w:b w:val="false"/>
+                <w:bCs w:val="false"/>
+                <w:sz w:val="20"/>
+                <w:szCs w:val="20"/>
+              </w:rPr>
+              <w:t xml:space="preserve">x</w:t>
+            </w:r>
+          </w:p>
+        </w:tc>
+        <w:tc>
+          <w:tcPr>
+            <w:tcW w:type="dxa" w:w="3960"/>
+            <w:tcBorders>
+              <w:top w:val="single" w:color="BBBBBB" w:sz="1"/>
+              <w:left w:val="single" w:color="BBBBBB" w:sz="1"/>
+              <w:bottom w:val="single" w:color="BBBBBB" w:sz="1"/>
+              <w:right w:val="single" w:color="BBBBBB" w:sz="1"/>
+            </w:tcBorders>
+            <w:tcMar>
+              <w:top w:type="dxa" w:w="50"/>
+              <w:left w:type="dxa" w:w="110"/>
+              <w:bottom w:type="dxa" w:w="50"/>
+              <w:right w:type="dxa" w:w="110"/>
+            </w:tcMar>
+          </w:tcPr>
+          <w:p>
+            <w:r>
+              <w:rPr>
+                <w:rFonts w:ascii="Arial" w:cs="Arial" w:eastAsia="Arial" w:hAnsi="Arial"/>
+                <w:b w:val="false"/>
+                <w:bCs w:val="false"/>
+                <w:sz w:val="20"/>
+                <w:szCs w:val="20"/>
+              </w:rPr>
+              <w:t xml:space="preserve">Flow-meter cal -- set ONCE against the feed pump at steady level: distillate = feed/(1+blowdownFrac). Auto-cal removed (it looped through the blower production control).</w:t>
+            </w:r>
+          </w:p>
+        </w:tc>
+      </w:tr>
+      <w:tr>
+        <w:tc>
+          <w:tcPr>
+            <w:tcW w:type="dxa" w:w="2000"/>
+            <w:tcBorders>
+              <w:top w:val="single" w:color="BBBBBB" w:sz="1"/>
+              <w:left w:val="single" w:color="BBBBBB" w:sz="1"/>
+              <w:bottom w:val="single" w:color="BBBBBB" w:sz="1"/>
+              <w:right w:val="single" w:color="BBBBBB" w:sz="1"/>
+            </w:tcBorders>
+            <w:tcMar>
+              <w:top w:type="dxa" w:w="50"/>
+              <w:left w:type="dxa" w:w="110"/>
+              <w:bottom w:type="dxa" w:w="50"/>
+              <w:right w:type="dxa" w:w="110"/>
+            </w:tcMar>
+          </w:tcPr>
+          <w:p>
+            <w:r>
+              <w:rPr>
+                <w:rFonts w:ascii="Consolas" w:cs="Consolas" w:eastAsia="Consolas" w:hAnsi="Consolas"/>
+                <w:b w:val="false"/>
+                <w:bCs w:val="false"/>
+                <w:sz w:val="18"/>
+                <w:szCs w:val="18"/>
+              </w:rPr>
               <w:t xml:space="preserve">evapLevelCheckML</w:t>
             </w:r>
           </w:p>
@@ -8823,7 +9278,7 @@
                 <w:sz w:val="20"/>
                 <w:szCs w:val="20"/>
               </w:rPr>
-              <w:t xml:space="preserve">1500</w:t>
+              <w:t xml:space="preserve">1000</w:t>
             </w:r>
           </w:p>
         </w:tc>
@@ -8881,7 +9336,7 @@
                 <w:sz w:val="20"/>
                 <w:szCs w:val="20"/>
               </w:rPr>
-              <w:t xml:space="preserve">PRIME verify: by this dead-reckoned fill the EvapLevel sensor MUST read wet, else evapLevelErr fault (feed-pump or sensor failure). Certainly wet by 1.5L.</w:t>
+              <w:t xml:space="preserve">PRIME verify: if this much fill is dead-reckoned and EvapLow is still DRY -&gt; evapLevelErr fault + popup (feed-pump or sensor failure).</w:t>
             </w:r>
           </w:p>
         </w:tc>

</xml_diff>

<commit_message>
Doc: regenerate MVR_Model_Reference.docx (blowdown-disabled + sensor-integral level control)
Co-Authored-By: Claude Opus 4.8 <noreply@anthropic.com>
</commit_message>
<xml_diff>
--- a/MVR_Model_Reference.docx
+++ b/MVR_Model_Reference.docx
@@ -915,7 +915,7 @@
         <w:spacing w:after="120"/>
       </w:pPr>
       <w:r>
-        <w:t xml:space="preserve">Feed = evaporator LEVEL control (real MVR behaviour): hold evapLevelSet using the actual level, with a production feed-forward. Active in HEAT + RUN so feed replaces boil-off immediately.</w:t>
+        <w:t xml:space="preserve">Two wet/dry sight-glass sensors + the calibrated feed pump (see 2.2a). Far below the operating mark the feed FILLS; near it, a slow EvapMid wet/dry integral holds the level. blowdownFrac = 0 (no blowdown valve), so the feed-forward is just the production rate:</w:t>
       </w:r>
     </w:p>
     <w:p>
@@ -929,7 +929,7 @@
           <w:sz w:val="19"/>
           <w:szCs w:val="19"/>
         </w:rPr>
-        <w:t xml:space="preserve">feedLpm  = prodMeas*(1+blowdownFrac) + kFeedLevel*(evapLevelSet - yEvapLevel)</w:t>
+        <w:t xml:space="preserve">feedLpm  = prodMeas*(1+blowdownFrac) + feedLevelTrim   ; feedLevelTrim += kFeedLevelI * (EvapMid dry ? +1 : -1) * dt</w:t>
       </w:r>
     </w:p>
     <w:p>
@@ -951,18 +951,7 @@
         <w:spacing w:after="120"/>
       </w:pPr>
       <w:r>
-        <w:t xml:space="preserve">Velocity is driven as a LEVEL (0 = stop) so every run/stop transition re-triggers the stepper move. With no evaporator level sensor, swap </w:t>
-      </w:r>
-      <w:r>
-        <w:rPr>
-          <w:rFonts w:ascii="Consolas" w:cs="Consolas" w:eastAsia="Consolas" w:hAnsi="Consolas"/>
-          <w:sz w:val="19"/>
-          <w:szCs w:val="19"/>
-        </w:rPr>
-        <w:t xml:space="preserve">yEvapLevel -&gt; feedInvEst</w:t>
-      </w:r>
-      <w:r>
-        <w:t xml:space="preserve"> (the dead-reckon).</w:t>
+        <w:t xml:space="preserve">Velocity is driven as a LEVEL (0 = stop) so every run/stop transition re-triggers the stepper move. The level integral -- not the dead-reckon -- closes the loop, so a mis-calibrated flow meter can never run the level away ('wet' always pulls feed below boil-off).</w:t>
       </w:r>
     </w:p>
     <w:p>
@@ -5822,7 +5811,7 @@
                 <w:sz w:val="20"/>
                 <w:szCs w:val="20"/>
               </w:rPr>
-              <w:t xml:space="preserve">0.05</w:t>
+              <w:t xml:space="preserve">0 (disabled)</w:t>
             </w:r>
           </w:p>
         </w:tc>
@@ -5880,7 +5869,7 @@
                 <w:sz w:val="20"/>
                 <w:szCs w:val="20"/>
               </w:rPr>
-              <w:t xml:space="preserve">Feed excess over distillate (blowdown / concentrate purge).</w:t>
+              <w:t xml:space="preserve">Concentrate blowdown DISABLED -- no blowdown valve fitted, so feed exactly matches distillate. Dissolved solids concentrate over a run; drain/flush the evaporator periodically (manual blowdown). Set &gt;0 only with a real bleed/drain.</w:t>
             </w:r>
           </w:p>
         </w:tc>

</xml_diff>

<commit_message>
Doc: demister/condensate sensors are wet/dry (0/5V); drain min-run
Co-Authored-By: Claude Opus 4.8 <noreply@anthropic.com>
</commit_message>
<xml_diff>
--- a/MVR_Model_Reference.docx
+++ b/MVR_Model_Reference.docx
@@ -7080,7 +7080,7 @@
                 <w:sz w:val="18"/>
                 <w:szCs w:val="18"/>
               </w:rPr>
-              <w:t xml:space="preserve">demisterTripML / demisterResetML</w:t>
+              <w:t xml:space="preserve">DemisterWater / DemisterFlood / CondLevel</w:t>
             </w:r>
           </w:p>
         </w:tc>
@@ -7109,7 +7109,7 @@
                 <w:sz w:val="20"/>
                 <w:szCs w:val="20"/>
               </w:rPr>
-              <w:t xml:space="preserve">80 / 5</w:t>
+              <w:t xml:space="preserve">wet-dry</w:t>
             </w:r>
           </w:p>
         </w:tc>
@@ -7138,7 +7138,7 @@
                 <w:sz w:val="20"/>
                 <w:szCs w:val="20"/>
               </w:rPr>
-              <w:t xml:space="preserve">cc</w:t>
+              <w:t xml:space="preserve">0-5V</w:t>
             </w:r>
           </w:p>
         </w:tc>
@@ -7167,7 +7167,7 @@
                 <w:sz w:val="20"/>
                 <w:szCs w:val="20"/>
               </w:rPr>
-              <w:t xml:space="preserve">Demister DRAIN peristaltic pump hysteresis: ON at the trip (measured ~80cc), OFF pumped down to reset. Prevents the old single-threshold ~10Hz chatter.</w:t>
+              <w:t xml:space="preserve">ALL WET/DRY point sensors (0=dry, 5V=wet), like the Evap sensors. Muxed to 0/1 (real: AI &gt; 2.5V). Mist = water at the demister; Flood = overflow above it; CondLevel = condensate at the tube sensor (~3/4 up).</w:t>
             </w:r>
           </w:p>
         </w:tc>
@@ -7198,7 +7198,7 @@
                 <w:sz w:val="18"/>
                 <w:szCs w:val="18"/>
               </w:rPr>
-              <w:t xml:space="preserve">demisterPumpMlMin / demisterFloodML</w:t>
+              <w:t xml:space="preserve">demisterDrainRunS / demisterPumpMlMin</w:t>
             </w:r>
           </w:p>
         </w:tc>
@@ -7227,7 +7227,7 @@
                 <w:sz w:val="20"/>
                 <w:szCs w:val="20"/>
               </w:rPr>
-              <w:t xml:space="preserve">500 / 150</w:t>
+              <w:t xml:space="preserve">12 / 500</w:t>
             </w:r>
           </w:p>
         </w:tc>
@@ -7256,7 +7256,7 @@
                 <w:sz w:val="20"/>
                 <w:szCs w:val="20"/>
               </w:rPr>
-              <w:t xml:space="preserve">ml/min / cc</w:t>
+              <w:t xml:space="preserve">s / ml/min</w:t>
             </w:r>
           </w:p>
         </w:tc>
@@ -7285,7 +7285,7 @@
                 <w:sz w:val="20"/>
                 <w:szCs w:val="20"/>
               </w:rPr>
-              <w:t xml:space="preserve">Drain pump rate / flood-trip overflow level. Calibrate AI:DemisterWater to read cc.</w:t>
+              <w:t xml:space="preserve">Demister drain peristaltic pump: ON when DemisterWater wet, runs at least demisterDrainRunS to clear below the sensor (single wet/dry threshold + min-run = no chatter), then off when dry. (sim trip/flood levels demisterTripML 80 / demisterFloodML 150 cc set where the sim sensors go wet.)</w:t>
             </w:r>
           </w:p>
         </w:tc>

</xml_diff>

<commit_message>
MVR: operate at the measured 75%-full point (3025ml plateau edge)
The 2000ml setpoint was ~50% full per the cal notes (a relic of the old 3L model). The
75% target lands exactly on the 2900|3150 plateau edge (2.59V|2.79V; notes: 70%=2900,
80%=3150) -- a perfectly placed observable edge. evapMidMark/evapLevelSet 2000->3025;
evapHighMark 2450->3250 (trips on the 3.0V full plateau ~3325, feed pauses ~475ml before
the ~3.8L demister spill). Sim: holds 3019..3032 = 13mL band (tightest yet -- plateaus
are narrower up there), clean startup, no trips/warns.

Co-Authored-By: Claude Opus 4.8 <noreply@anthropic.com>
</commit_message>
<xml_diff>
--- a/MVR_Model_Reference.docx
+++ b/MVR_Model_Reference.docx
@@ -9031,7 +9031,7 @@
                 <w:sz w:val="20"/>
                 <w:szCs w:val="20"/>
               </w:rPr>
-              <w:t xml:space="preserve">2000 / 0.015 / 0.0015 / 100</w:t>
+              <w:t xml:space="preserve">3025 / 0.015 / 0.0015 / 100</w:t>
             </w:r>
           </w:p>
         </w:tc>
@@ -9089,7 +9089,7 @@
                 <w:sz w:val="20"/>
                 <w:szCs w:val="20"/>
               </w:rPr>
-              <w:t xml:space="preserve">Operating level = the measured 1900|2100 plateau edge. Mid-edge INTEGRAL rides the edge (integrates only inside the deadband); P outside recovers fill/upsets. Holds ~1950..1975 (band ~23mL) in sim; ~100mL with heavy float bob.</w:t>
+              <w:t xml:space="preserve">Operating level = the 2900|3150 plateau edge = the measured 75%-full point (cal notes: 70%=2900, 80%=3150). Mid-edge INTEGRAL rides the edge; P outside the deadband recovers fill/upsets. Holds ~3019..3032 (band ~13mL) in sim.</w:t>
             </w:r>
           </w:p>
         </w:tc>
@@ -9207,7 +9207,7 @@
                 <w:sz w:val="20"/>
                 <w:szCs w:val="20"/>
               </w:rPr>
-              <w:t xml:space="preserve">33-240ohm arm-float sender + 550ohm (4x2.2k parallel) pullup to REGULATED 12V. AI6 slope -1.0 / offset 3.68 (KEEP: the cal is in these scaled volts; dry=0V, full ~3.0V, uh-oh-full 3600ml). Level-vs-ohms is strongly NONLINEAR (arm swing + tank geometry), so the decode is the MEASURED 14-plateau table (MVR Level Cal.csv) mapping scaled V -&gt; plateau-center ml. Valid range -0.3..3.3V; outside (open wire = negative, short = 3.68) -&gt; all switches DRY, no heat. Level switches derive from the decoded plateau: low 750 (587|850 edge), mid 2000 (1900|2100 edge = operating), high 2450 (2350|2600 edge, under the demister). feedInvEst FUSED: dead-reckon + plateau-change midpoint snaps (teach the rate-bias) + span window (+/-senderSpanML 200, no teaching).</w:t>
+              <w:t xml:space="preserve">33-240ohm arm-float sender + 550ohm (4x2.2k parallel) pullup to REGULATED 12V. AI6 slope -1.0 / offset 3.68 (KEEP: the cal is in these scaled volts; dry=0V, full ~3.0V, uh-oh-full 3600ml). Level-vs-ohms is strongly NONLINEAR (arm swing + tank geometry), so the decode is the MEASURED 14-plateau table (MVR Level Cal.csv) mapping scaled V -&gt; plateau-center ml. Valid range -0.3..3.3V; outside (open wire = negative, short = 3.68) -&gt; all switches DRY, no heat. Level switches derive from the decoded plateau: low 750 (587|850 edge), mid 3025 (2900|3150 edge = the measured 75%-FULL point = operating), high 3250 (trips on the 3.0V full plateau ~3325; spill into the demister only past ~3.8L). feedInvEst FUSED: dead-reckon + plateau-change midpoint snaps (teach the rate-bias) + span window (+/-senderSpanML 200, no teaching).</w:t>
             </w:r>
           </w:p>
         </w:tc>

</xml_diff>

<commit_message>
Doc: reference brought current -- warm-start purge (pump to at/below the mark), shutdown/empty buttons, vent-fix level sensing, 2475/2750 marks, blower soft-start, flood AND-gate, sender/purge trips, prime 250 / purge 400
Co-Authored-By: Claude Opus 4.8 <noreply@anthropic.com>
</commit_message>
<xml_diff>
--- a/MVR_Model_Reference.docx
+++ b/MVR_Model_Reference.docx
@@ -60,7 +60,7 @@
           <w:sz w:val="18"/>
           <w:szCs w:val="18"/>
         </w:rPr>
-        <w:t xml:space="preserve">Generated from server/config/expressions.json</w:t>
+        <w:t xml:space="preserve">Generated from server/config/expressions_MVR.json</w:t>
       </w:r>
     </w:p>
     <w:p>
@@ -376,10 +376,10 @@
           <w:b/>
           <w:bCs/>
         </w:rPr>
-        <w:t xml:space="preserve">PURGE: </w:t>
-      </w:r>
-      <w:r>
-        <w:t xml:space="preserve">ALWAYS first -- reverse the feed pump (</w:t>
+        <w:t xml:space="preserve">PURGE (full / dry start): </w:t>
+      </w:r>
+      <w:r>
+        <w:t xml:space="preserve">reverse the feed pump (</w:t>
       </w:r>
       <w:r>
         <w:rPr>
@@ -390,7 +390,7 @@
         <w:t xml:space="preserve">vel = -purgeRevRpm</w:t>
       </w:r>
       <w:r>
-        <w:t xml:space="preserve">) to empty the feed/evaporator side to a KNOWN baseline, so an interrupted run (stop / power loss) restarts from a known state instead of trusting leftover inventory. It ALWAYS pumps the full dead-reckon volume </w:t>
+        <w:t xml:space="preserve">, 400 rpm) until the CALIBRATED sender reads BOTTOM (plateau 0), then keep pumping </w:t>
       </w:r>
       <w:r>
         <w:rPr>
@@ -398,10 +398,43 @@
           <w:sz w:val="19"/>
           <w:szCs w:val="19"/>
         </w:rPr>
-        <w:t xml:space="preserve">purgeOutML &gt;= purgeMaxML</w:t>
-      </w:r>
-      <w:r>
-        <w:t xml:space="preserve"> (~2 L), BLIND -- the evaporator contents are unknown at startup so no level reading is trusted here. Then feedInvEst is zeroed.</w:t>
+        <w:t xml:space="preserve">purgeExtraML</w:t>
+      </w:r>
+      <w:r>
+        <w:t xml:space="preserve"> (200 ml) more -- water below the float pickup is still in there. If the sender is faulted, fall back to the blind </w:t>
+      </w:r>
+      <w:r>
+        <w:rPr>
+          <w:rFonts w:ascii="Consolas" w:cs="Consolas" w:eastAsia="Consolas" w:hAnsi="Consolas"/>
+          <w:sz w:val="19"/>
+          <w:szCs w:val="19"/>
+        </w:rPr>
+        <w:t xml:space="preserve">purgeMaxML</w:t>
+      </w:r>
+      <w:r>
+        <w:t xml:space="preserve"> dead-reckon cap. A WATCHDOG (</w:t>
+      </w:r>
+      <w:r>
+        <w:rPr>
+          <w:rFonts w:ascii="Consolas" w:cs="Consolas" w:eastAsia="Consolas" w:hAnsi="Consolas"/>
+          <w:sz w:val="19"/>
+          <w:szCs w:val="19"/>
+        </w:rPr>
+        <w:t xml:space="preserve">purgeStallS</w:t>
+      </w:r>
+      <w:r>
+        <w:t xml:space="preserve">) trips </w:t>
+      </w:r>
+      <w:r>
+        <w:rPr>
+          <w:rFonts w:ascii="Consolas" w:cs="Consolas" w:eastAsia="Consolas" w:hAnsi="Consolas"/>
+          <w:sz w:val="19"/>
+          <w:szCs w:val="19"/>
+        </w:rPr>
+        <w:t xml:space="preserve">purgeErr</w:t>
+      </w:r>
+      <w:r>
+        <w:t xml:space="preserve"> if the level stops dropping (pump/direction fault); it disarms once bottom is reached (the overrun is legitimately flat).</w:t>
       </w:r>
     </w:p>
     <w:p>
@@ -418,7 +451,10 @@
           <w:b/>
           <w:bCs/>
         </w:rPr>
-        <w:t xml:space="preserve">PRIME: </w:t>
+        <w:t xml:space="preserve">PURGE (WARM START, purgeWarmEn=1): </w:t>
+      </w:r>
+      <w:r>
+        <w:t xml:space="preserve">if the sender already shows water at Run, do NOT purge to dry: pump down until the level has dropped at least ONE plateau AND reads at/below the operating mark. Every plateau-drop crossing snaps </w:t>
       </w:r>
       <w:r>
         <w:rPr>
@@ -426,43 +462,10 @@
           <w:sz w:val="19"/>
           <w:szCs w:val="19"/>
         </w:rPr>
-        <w:t xml:space="preserve">feedCmd = feedPrimeRpm</w:t>
-      </w:r>
-      <w:r>
-        <w:t xml:space="preserve">; fill to the EvapLow mark (~0.75 L, heater covered) and advance to HEAT when </w:t>
-      </w:r>
-      <w:r>
-        <w:rPr>
-          <w:rFonts w:ascii="Consolas" w:cs="Consolas" w:eastAsia="Consolas" w:hAnsi="Consolas"/>
-          <w:sz w:val="19"/>
-          <w:szCs w:val="19"/>
-        </w:rPr>
-        <w:t xml:space="preserve">feedInvEst &gt;= feedPrimeML AND yEvapLow</w:t>
-      </w:r>
-      <w:r>
-        <w:t xml:space="preserve"> -- the low sight-glass sensor CONFIRMS wet, so the heater never fires dry. If primed but EvapLow stays dry by </w:t>
-      </w:r>
-      <w:r>
-        <w:rPr>
-          <w:rFonts w:ascii="Consolas" w:cs="Consolas" w:eastAsia="Consolas" w:hAnsi="Consolas"/>
-          <w:sz w:val="19"/>
-          <w:szCs w:val="19"/>
-        </w:rPr>
-        <w:t xml:space="preserve">evapLevelCheckML</w:t>
-      </w:r>
-      <w:r>
-        <w:t xml:space="preserve">, Interlocks latches </w:t>
-      </w:r>
-      <w:r>
-        <w:rPr>
-          <w:rFonts w:ascii="Consolas" w:cs="Consolas" w:eastAsia="Consolas" w:hAnsi="Consolas"/>
-          <w:sz w:val="19"/>
-          <w:szCs w:val="19"/>
-        </w:rPr>
-        <w:t xml:space="preserve">evapLevelErr</w:t>
-      </w:r>
-      <w:r>
-        <w:t xml:space="preserve"> (feed-pump or sensor failure) -&gt; trip + UI popup; clears on Stop.</w:t>
+        <w:t xml:space="preserve">feedInvEst</w:t>
+      </w:r>
+      <w:r>
+        <w:t xml:space="preserve"> to the edge midpoint (the fusion), so startup continues from a CALIBRATED level -- a restart from an overfull shutdown pumps down to the mark, and coming from above the LAST crossing is the 2600|2350 edge = exactly the 2475 operating level. Minutes instead of a full drain + refill.</w:t>
       </w:r>
     </w:p>
     <w:p>
@@ -479,10 +482,7 @@
           <w:b/>
           <w:bCs/>
         </w:rPr>
-        <w:t xml:space="preserve">HEAT: </w:t>
-      </w:r>
-      <w:r>
-        <w:t xml:space="preserve">makeup heater on; the feed RAMPS the level from EvapLow up to the operating mark (EvapMid, ~2 L). Advance to RUN when </w:t>
+        <w:t xml:space="preserve">PRIME: </w:t>
       </w:r>
       <w:r>
         <w:rPr>
@@ -490,10 +490,43 @@
           <w:sz w:val="19"/>
           <w:szCs w:val="19"/>
         </w:rPr>
-        <w:t xml:space="preserve">yEvapTemp &gt; evapTempSet - 3 AND yEvapMid</w:t>
-      </w:r>
-      <w:r>
-        <w:t xml:space="preserve"> -- near boiling AND at the operating level (seed prodMeas = prodSetSafe so the blower doesn't spike).</w:t>
+        <w:t xml:space="preserve">feedCmd = feedPrimeRpm</w:t>
+      </w:r>
+      <w:r>
+        <w:t xml:space="preserve"> (250 rpm); fill to the EvapLow mark (~0.75 L, heater covered) and advance to HEAT when </w:t>
+      </w:r>
+      <w:r>
+        <w:rPr>
+          <w:rFonts w:ascii="Consolas" w:cs="Consolas" w:eastAsia="Consolas" w:hAnsi="Consolas"/>
+          <w:sz w:val="19"/>
+          <w:szCs w:val="19"/>
+        </w:rPr>
+        <w:t xml:space="preserve">feedInvEst &gt;= feedPrimeML AND yEvapLow</w:t>
+      </w:r>
+      <w:r>
+        <w:t xml:space="preserve"> -- the low switch CONFIRMS wet, so the heater never fires dry. A warm start that lands above the low mark falls straight through. If primed but EvapLow stays dry by </w:t>
+      </w:r>
+      <w:r>
+        <w:rPr>
+          <w:rFonts w:ascii="Consolas" w:cs="Consolas" w:eastAsia="Consolas" w:hAnsi="Consolas"/>
+          <w:sz w:val="19"/>
+          <w:szCs w:val="19"/>
+        </w:rPr>
+        <w:t xml:space="preserve">evapLevelCheckML</w:t>
+      </w:r>
+      <w:r>
+        <w:t xml:space="preserve">, Interlocks latches </w:t>
+      </w:r>
+      <w:r>
+        <w:rPr>
+          <w:rFonts w:ascii="Consolas" w:cs="Consolas" w:eastAsia="Consolas" w:hAnsi="Consolas"/>
+          <w:sz w:val="19"/>
+          <w:szCs w:val="19"/>
+        </w:rPr>
+        <w:t xml:space="preserve">evapLevelErr</w:t>
+      </w:r>
+      <w:r>
+        <w:t xml:space="preserve"> (feed-pump or sensor failure) -&gt; trip + UI popup; clears on Stop.</w:t>
       </w:r>
     </w:p>
     <w:p>
@@ -510,26 +543,10 @@
           <w:b/>
           <w:bCs/>
         </w:rPr>
-        <w:t xml:space="preserve">RUN: </w:t>
-      </w:r>
-      <w:r>
-        <w:t xml:space="preserve">closed-loop production; the feed HOLDS the level at EvapMid (see 2.2a).</w:t>
-      </w:r>
-    </w:p>
-    <w:p>
-      <w:pPr>
-        <w:pStyle w:val="Heading2"/>
-      </w:pPr>
-      <w:r>
-        <w:t xml:space="preserve">2.2a  Evaporator level control (FeedFollow)</w:t>
-      </w:r>
-    </w:p>
-    <w:p>
-      <w:pPr>
-        <w:spacing w:after="120"/>
-      </w:pPr>
-      <w:r>
-        <w:t xml:space="preserve">No continuous evaporator level sensor fits the design, so level is held with TWO wet/dry sight-glass sensors and the precisely-calibrated positive-displacement feed pump. Feed = measured-production feed-forward </w:t>
+        <w:t xml:space="preserve">HEAT: </w:t>
+      </w:r>
+      <w:r>
+        <w:t xml:space="preserve">makeup heater on; the feed RAMPS the level up to the operating mark (2475). The blower stays OFF until </w:t>
       </w:r>
       <w:r>
         <w:rPr>
@@ -537,10 +554,10 @@
           <w:sz w:val="19"/>
           <w:szCs w:val="19"/>
         </w:rPr>
-        <w:t xml:space="preserve">prodMeas x (1+blowdownFrac)</w:t>
-      </w:r>
-      <w:r>
-        <w:t xml:space="preserve"> plus a SLOW integral on the EvapMid wet/dry state: wet -&gt; trim the feed below boil-off (draw down), dry -&gt; above (fill up). The level rides the mark with a slow toggle (~tens of minutes), and because the integral -- not the dead-reckon -- closes the loop, a mis-calibrated flow meter can NEVER run the level away (wet always pulls feed down). Far below the mark the feed fills at </w:t>
+        <w:t xml:space="preserve">yEvapTemp &gt;= blowerStartTemp</w:t>
+      </w:r>
+      <w:r>
+        <w:t xml:space="preserve"> (90 C), then soft-starts (2.10). Advance to RUN when </w:t>
       </w:r>
       <w:r>
         <w:rPr>
@@ -548,10 +565,50 @@
           <w:sz w:val="19"/>
           <w:szCs w:val="19"/>
         </w:rPr>
-        <w:t xml:space="preserve">feedFillLpm</w:t>
-      </w:r>
-      <w:r>
-        <w:t xml:space="preserve">. The dead-reckon </w:t>
+        <w:t xml:space="preserve">yEvapTemp &gt; evapTempSet - 3 AND yEvapMid</w:t>
+      </w:r>
+      <w:r>
+        <w:t xml:space="preserve"> -- near boiling AND at the operating level (seed prodMeas = prodSetSafe so the blower doesn't spike).</w:t>
+      </w:r>
+    </w:p>
+    <w:p>
+      <w:pPr>
+        <w:pStyle w:val="ListParagraph"/>
+        <w:numPr>
+          <w:ilvl w:val="0"/>
+          <w:numId w:val="2"/>
+        </w:numPr>
+        <w:spacing w:after="40"/>
+      </w:pPr>
+      <w:r>
+        <w:rPr>
+          <w:b/>
+          <w:bCs/>
+        </w:rPr>
+        <w:t xml:space="preserve">RUN: </w:t>
+      </w:r>
+      <w:r>
+        <w:t xml:space="preserve">closed-loop production; the feed HOLDS the level at the 2475 edge (see 2.2a).</w:t>
+      </w:r>
+    </w:p>
+    <w:p>
+      <w:pPr>
+        <w:pStyle w:val="ListParagraph"/>
+        <w:numPr>
+          <w:ilvl w:val="0"/>
+          <w:numId w:val="2"/>
+        </w:numPr>
+        <w:spacing w:after="40"/>
+      </w:pPr>
+      <w:r>
+        <w:rPr>
+          <w:b/>
+          <w:bCs/>
+        </w:rPr>
+        <w:t xml:space="preserve">EMPTY / SHUTDOWN (buttons, Run OFF): </w:t>
+      </w:r>
+      <w:r>
+        <w:t xml:space="preserve">Button widgets in Variable mode named </w:t>
       </w:r>
       <w:r>
         <w:rPr>
@@ -559,10 +616,10 @@
           <w:sz w:val="19"/>
           <w:szCs w:val="19"/>
         </w:rPr>
-        <w:t xml:space="preserve">feedInvEst</w:t>
-      </w:r>
-      <w:r>
-        <w:t xml:space="preserve"> is clamped consistent with the sensor states each tick (for prime-verify + display), not used to hold level. Calibrate </w:t>
+        <w:t xml:space="preserve">emptySystem</w:t>
+      </w:r>
+      <w:r>
+        <w:t xml:space="preserve"> or </w:t>
       </w:r>
       <w:r>
         <w:rPr>
@@ -570,50 +627,29 @@
           <w:sz w:val="19"/>
           <w:szCs w:val="19"/>
         </w:rPr>
-        <w:t xml:space="preserve">condCalFactor</w:t>
-      </w:r>
-      <w:r>
-        <w:t xml:space="preserve"> once against the feed pump so production reads true.</w:t>
-      </w:r>
-    </w:p>
-    <w:p>
-      <w:pPr>
-        <w:pStyle w:val="Heading2"/>
-      </w:pPr>
-      <w:r>
-        <w:t xml:space="preserve">2.2  Setpoint safety bounds</w:t>
-      </w:r>
-    </w:p>
-    <w:p>
-      <w:pPr>
-        <w:spacing w:after="120"/>
-      </w:pPr>
-      <w:r>
-        <w:t xml:space="preserve">Each live setpoint is range-checked every tick; an out-of-range value is </w:t>
-      </w:r>
-      <w:r>
-        <w:rPr>
-          <w:b/>
-          <w:bCs/>
-        </w:rPr>
-        <w:t xml:space="preserve">ignored</w:t>
-      </w:r>
-      <w:r>
-        <w:t xml:space="preserve"> and the last valid value is kept in a *Safe companion. The controllers read the *Safe value, never the raw input.</w:t>
-      </w:r>
-    </w:p>
-    <w:p>
-      <w:pPr>
-        <w:spacing w:after="60"/>
-        <w:ind w:left="360"/>
-      </w:pPr>
+        <w:t xml:space="preserve">shutdown</w:t>
+      </w:r>
+      <w:r>
+        <w:t xml:space="preserve"> reverse-pump the system dry without a run: sender bottom + purgeExtraML, </w:t>
+      </w:r>
       <w:r>
         <w:rPr>
           <w:rFonts w:ascii="Consolas" w:cs="Consolas" w:eastAsia="Consolas" w:hAnsi="Consolas"/>
           <w:sz w:val="19"/>
           <w:szCs w:val="19"/>
         </w:rPr>
-        <w:t xml:space="preserve">if (lo &lt;= setpoint &lt;= hi)  -&gt;  setpointSafe = setpoint   ; else keep last</w:t>
+        <w:t xml:space="preserve">emptyMaxML</w:t>
+      </w:r>
+      <w:r>
+        <w:t xml:space="preserve"> (4000) backstop. With Run off the heaters are already forced off (heatOK=0 -&gt; HeaterEnable + both PWMs = 0) and the blower is disabled, so shutdown = verified-heaters-off + pump-out. Ignored while running; toggle off to re-arm; hitting Run aborts it.</w:t>
+      </w:r>
+    </w:p>
+    <w:p>
+      <w:pPr>
+        <w:pStyle w:val="Heading2"/>
+      </w:pPr>
+      <w:r>
+        <w:t xml:space="preserve">2.2a  Evaporator level control (FeedFollow + the sender fusion)</w:t>
       </w:r>
     </w:p>
     <w:p>
@@ -621,31 +657,7 @@
         <w:spacing w:after="120"/>
       </w:pPr>
       <w:r>
-        <w:t xml:space="preserve">Guarded: productionSet [0,prodSetMax], superheatSet [0,superheatSetMax], evapTempSet [min,max], blowerRpmSet [0,blowerMaxRpm], feedRpmSet [0,feedRpmMax].</w:t>
-      </w:r>
-    </w:p>
-    <w:p>
-      <w:pPr>
-        <w:pStyle w:val="Heading2"/>
-      </w:pPr>
-      <w:r>
-        <w:t xml:space="preserve">2.3  Interlocks &amp; trips (Interlocks)</w:t>
-      </w:r>
-    </w:p>
-    <w:p>
-      <w:pPr>
-        <w:spacing w:after="120"/>
-      </w:pPr>
-      <w:r>
-        <w:t xml:space="preserve">trip = any of: evap/steam over-pressure, vapor-out over-temp, demister flood, low-superheat (wet compression, latched-arm), makeup-cartridge over-temp (HARD backstop makeupHtrMax=140C), superheat-cartridge over-temp, evaporator-level prime-verify (evapLevelErr). The cartridge trips, wet-compression, and evapLevelErr LATCH until runSystem is cycled. evapLevelErr also fires a UI popup.</w:t>
-      </w:r>
-    </w:p>
-    <w:p>
-      <w:pPr>
-        <w:spacing w:after="120"/>
-      </w:pPr>
-      <w:r>
-        <w:t xml:space="preserve">Makeup-heater element protection is SOFT first: in MakeupControl, above </w:t>
+        <w:t xml:space="preserve">The tank-gauge sender IS the level sensing -- a 14-step STAIRCASE (plateau centers from the measured cal table), so the raw reading cannot resolve the level within a plateau (~200-350 ml wide). The control fuses it with the calibrated positive-displacement feed pump: </w:t>
       </w:r>
       <w:r>
         <w:rPr>
@@ -653,10 +665,10 @@
           <w:sz w:val="19"/>
           <w:szCs w:val="19"/>
         </w:rPr>
-        <w:t xml:space="preserve">makeupHtrSoft</w:t>
-      </w:r>
-      <w:r>
-        <w:t xml:space="preserve"> (115C) the PWM duty is folded back proportionally (violent boil / local dry-out -&gt; ease off so water re-wets the element), never below the keep-warm floor </w:t>
+        <w:t xml:space="preserve">feedInvEst</w:t>
+      </w:r>
+      <w:r>
+        <w:t xml:space="preserve"> dead-reckons feed-in minus vapor-out between plateaus; every plateau CHANGE is a known physical edge crossing that SNAPS the estimate to the old/new plateau midpoint (and teaches a slow rate-bias </w:t>
       </w:r>
       <w:r>
         <w:rPr>
@@ -664,10 +676,10 @@
           <w:sz w:val="19"/>
           <w:szCs w:val="19"/>
         </w:rPr>
-        <w:t xml:space="preserve">makeupHtrMinDuty</w:t>
-      </w:r>
-      <w:r>
-        <w:t xml:space="preserve">. Only if the element keeps climbing to </w:t>
+        <w:t xml:space="preserve">levelBiasLpm</w:t>
+      </w:r>
+      <w:r>
+        <w:t xml:space="preserve">, clamp +/-0.05 L/min); between crossings the estimate is clamped inside plateau-center +/- </w:t>
       </w:r>
       <w:r>
         <w:rPr>
@@ -675,82 +687,88 @@
           <w:sz w:val="19"/>
           <w:szCs w:val="19"/>
         </w:rPr>
-        <w:t xml:space="preserve">makeupHtrMax</w:t>
-      </w:r>
-      <w:r>
-        <w:t xml:space="preserve"> (140C) despite fold-back does the hard trip fire. Tune makeupHtrMinDuty to the PWM that just holds the vapor at ~100C.</w:t>
-      </w:r>
-    </w:p>
-    <w:p>
-      <w:pPr>
-        <w:spacing w:after="60"/>
-        <w:ind w:left="360"/>
-      </w:pPr>
+        <w:t xml:space="preserve">senderSpanML</w:t>
+      </w:r>
+      <w:r>
+        <w:t xml:space="preserve"> (no teaching -- centers are only approximate).</w:t>
+      </w:r>
+    </w:p>
+    <w:p>
+      <w:pPr>
+        <w:spacing w:after="120"/>
+      </w:pPr>
+      <w:r>
+        <w:t xml:space="preserve">Feed = measured-production feed-forward </w:t>
+      </w:r>
       <w:r>
         <w:rPr>
           <w:rFonts w:ascii="Consolas" w:cs="Consolas" w:eastAsia="Consolas" w:hAnsi="Consolas"/>
           <w:sz w:val="19"/>
           <w:szCs w:val="19"/>
         </w:rPr>
-        <w:t xml:space="preserve">heatOK = runSystem AND (trip == 0) AND (mvrPhase &gt;= HEAT)</w:t>
-      </w:r>
-    </w:p>
-    <w:p>
-      <w:pPr>
-        <w:spacing w:after="60"/>
-        <w:ind w:left="360"/>
-      </w:pPr>
+        <w:t xml:space="preserve">prodMeas x (1+blowdownFrac)</w:t>
+      </w:r>
+      <w:r>
+        <w:t xml:space="preserve"> + P on the fused estimate OUTSIDE a +/-</w:t>
+      </w:r>
       <w:r>
         <w:rPr>
           <w:rFonts w:ascii="Consolas" w:cs="Consolas" w:eastAsia="Consolas" w:hAnsi="Consolas"/>
           <w:sz w:val="19"/>
           <w:szCs w:val="19"/>
         </w:rPr>
-        <w:t xml:space="preserve">makeupHtrTrip latches if  yMakeupHtrTemp &gt; makeupHtrMax   (uncovered / feed overheat)</w:t>
-      </w:r>
-    </w:p>
-    <w:p>
-      <w:pPr>
-        <w:spacing w:after="60"/>
-        <w:ind w:left="360"/>
-      </w:pPr>
+        <w:t xml:space="preserve">levelDeadML</w:t>
+      </w:r>
+      <w:r>
+        <w:t xml:space="preserve"> deadband (fast fill / upset recovery) + a slow EvapMid-switch integral INSIDE the deadband (the tight hold: the 2475 edge is a perfect 1-bit sensor placed exactly at the setpoint). Integrating only where P is silent stops the two from fighting. A HEAT-phase guard keeps filling while the mid switch is dry regardless of the estimate, and </w:t>
+      </w:r>
       <w:r>
         <w:rPr>
           <w:rFonts w:ascii="Consolas" w:cs="Consolas" w:eastAsia="Consolas" w:hAnsi="Consolas"/>
           <w:sz w:val="19"/>
           <w:szCs w:val="19"/>
         </w:rPr>
-        <w:t xml:space="preserve">superHtrTrip  latches if  ySuperHtrTemp  &gt; superHtrMax</w:t>
-      </w:r>
-    </w:p>
-    <w:p>
-      <w:pPr>
-        <w:pStyle w:val="Heading2"/>
-      </w:pPr>
-      <w:r>
-        <w:t xml:space="preserve">2.4  Makeup heater PI (MakeupControl)</w:t>
-      </w:r>
-    </w:p>
-    <w:p>
-      <w:pPr>
-        <w:spacing w:after="120"/>
-      </w:pPr>
-      <w:r>
-        <w:t xml:space="preserve">Holds the evaporator at the boiling setpoint. Conditional anti-windup; gated by heatOK.</w:t>
-      </w:r>
-    </w:p>
-    <w:p>
-      <w:pPr>
-        <w:spacing w:after="60"/>
-        <w:ind w:left="360"/>
-      </w:pPr>
+        <w:t xml:space="preserve">yEvapHigh</w:t>
+      </w:r>
+      <w:r>
+        <w:t xml:space="preserve"> cuts the feed entirely. The marks sit ON plateau edges (750 / 2475 / 2750) so each switch flip is a real crossing. Calibrate </w:t>
+      </w:r>
       <w:r>
         <w:rPr>
           <w:rFonts w:ascii="Consolas" w:cs="Consolas" w:eastAsia="Consolas" w:hAnsi="Consolas"/>
           <w:sz w:val="19"/>
           <w:szCs w:val="19"/>
         </w:rPr>
-        <w:t xml:space="preserve">err  = evapTempSetSafe - yEvapTemp</w:t>
+        <w:t xml:space="preserve">condCalFactor</w:t>
+      </w:r>
+      <w:r>
+        <w:t xml:space="preserve"> once against the feed pump so production reads true.</w:t>
+      </w:r>
+    </w:p>
+    <w:p>
+      <w:pPr>
+        <w:pStyle w:val="Heading2"/>
+      </w:pPr>
+      <w:r>
+        <w:t xml:space="preserve">2.2  Setpoint safety bounds</w:t>
+      </w:r>
+    </w:p>
+    <w:p>
+      <w:pPr>
+        <w:spacing w:after="120"/>
+      </w:pPr>
+      <w:r>
+        <w:t xml:space="preserve">Each live setpoint is range-checked every tick; an out-of-range value is </w:t>
+      </w:r>
+      <w:r>
+        <w:rPr>
+          <w:b/>
+          <w:bCs/>
+        </w:rPr>
+        <w:t xml:space="preserve">ignored</w:t>
+      </w:r>
+      <w:r>
+        <w:t xml:space="preserve"> and the last valid value is kept in a *Safe companion. The controllers read the *Safe value, never the raw input.</w:t>
       </w:r>
     </w:p>
     <w:p>
@@ -764,81 +782,72 @@
           <w:sz w:val="19"/>
           <w:szCs w:val="19"/>
         </w:rPr>
-        <w:t xml:space="preserve">I    = clamp( I + kiMakeup * err * dt , 0 , 1 )</w:t>
-      </w:r>
-    </w:p>
-    <w:p>
-      <w:pPr>
-        <w:spacing w:after="60"/>
-        <w:ind w:left="360"/>
-      </w:pPr>
+        <w:t xml:space="preserve">if (lo &lt;= setpoint &lt;= hi)  -&gt;  setpointSafe = setpoint   ; else keep last</w:t>
+      </w:r>
+    </w:p>
+    <w:p>
+      <w:pPr>
+        <w:spacing w:after="120"/>
+      </w:pPr>
+      <w:r>
+        <w:t xml:space="preserve">Guarded: productionSet [0,prodSetMax], superheatSet [0,superheatSetMax], evapTempSet [min,max], blowerRpmSet [0,blowerMaxRpm], feedRpmSet [0,feedRpmMax].</w:t>
+      </w:r>
+    </w:p>
+    <w:p>
+      <w:pPr>
+        <w:pStyle w:val="Heading2"/>
+      </w:pPr>
+      <w:r>
+        <w:t xml:space="preserve">2.3  Interlocks &amp; trips (Interlocks)</w:t>
+      </w:r>
+    </w:p>
+    <w:p>
+      <w:pPr>
+        <w:spacing w:after="120"/>
+      </w:pPr>
+      <w:r>
+        <w:t xml:space="preserve">trip = any of: evap/steam over-pressure, vapor-out over-temp, demister flood (QUALIFIED: DemisterFlood AND DemisterWater both wet -- fog films the flood sensor alone), low-superheat (wet compression; arms only at target blower rpm), makeup-cartridge over-temp (HARD backstop makeupHtrMax=140C), superheat-cartridge over-temp, evaporator-level prime-verify (evapLevelErr), level-sender fault (senderErr: open/short mid-run, debounced), purge stall (purgeErr: watchdog). All the latched trips clear when runSystem cycles; evapLevelErr, senderErr, purgeErr, and the high-level warning also fire UI popups. The HIGH-LEVEL warning (evapHighWarn, 2750) is latched + feed-cut but NOT a trip, and does not latch during PURGE (an overfull warm start is legitimately high while draining).</w:t>
+      </w:r>
+    </w:p>
+    <w:p>
+      <w:pPr>
+        <w:spacing w:after="120"/>
+      </w:pPr>
+      <w:r>
+        <w:t xml:space="preserve">Makeup-heater element protection is SOFT first: in MakeupControl, above </w:t>
+      </w:r>
       <w:r>
         <w:rPr>
           <w:rFonts w:ascii="Consolas" w:cs="Consolas" w:eastAsia="Consolas" w:hAnsi="Consolas"/>
           <w:sz w:val="19"/>
           <w:szCs w:val="19"/>
         </w:rPr>
-        <w:t xml:space="preserve">duty = clamp( kpMakeup * err + I , 0 , 1 )      -&gt;  DO:MakeupHtr  (makeupDuty)</w:t>
-      </w:r>
-    </w:p>
-    <w:p>
-      <w:pPr>
-        <w:pStyle w:val="Heading2"/>
-      </w:pPr>
-      <w:r>
-        <w:t xml:space="preserve">2.5  Superheat heater PI (SuperheatControl)</w:t>
-      </w:r>
-    </w:p>
-    <w:p>
-      <w:pPr>
-        <w:spacing w:after="120"/>
-      </w:pPr>
-      <w:r>
-        <w:t xml:space="preserve">Holds vapor superheat. Gated by heatOK AND phase &gt;= RUN -- superheat is only meaningful once vapor is actually flowing, so the cartridge never dry-fires during warm-up. Both heater PI integrators reset to 0 whenever their heater is off, so no stale windup carries across a stop. The wet-compression (low-superheat) trip likewise arms/fires only in RUN.</w:t>
-      </w:r>
-    </w:p>
-    <w:p>
-      <w:pPr>
-        <w:spacing w:after="60"/>
-        <w:ind w:left="360"/>
-      </w:pPr>
+        <w:t xml:space="preserve">makeupHtrSoft</w:t>
+      </w:r>
+      <w:r>
+        <w:t xml:space="preserve"> (115C) the PWM duty is folded back proportionally (violent boil / local dry-out -&gt; ease off so water re-wets the element), never below the keep-warm floor </w:t>
+      </w:r>
       <w:r>
         <w:rPr>
           <w:rFonts w:ascii="Consolas" w:cs="Consolas" w:eastAsia="Consolas" w:hAnsi="Consolas"/>
           <w:sz w:val="19"/>
           <w:szCs w:val="19"/>
         </w:rPr>
-        <w:t xml:space="preserve">err  = superheatSetSafe - superheatIn</w:t>
-      </w:r>
-    </w:p>
-    <w:p>
-      <w:pPr>
-        <w:spacing w:after="60"/>
-        <w:ind w:left="360"/>
-      </w:pPr>
+        <w:t xml:space="preserve">makeupHtrMinDuty</w:t>
+      </w:r>
+      <w:r>
+        <w:t xml:space="preserve">. Only if the element keeps climbing to </w:t>
+      </w:r>
       <w:r>
         <w:rPr>
           <w:rFonts w:ascii="Consolas" w:cs="Consolas" w:eastAsia="Consolas" w:hAnsi="Consolas"/>
           <w:sz w:val="19"/>
           <w:szCs w:val="19"/>
         </w:rPr>
-        <w:t xml:space="preserve">duty = clamp( kpSuper * err + I , 0 , 1 )       -&gt;  DO:SuperHtr  (superDuty)</w:t>
-      </w:r>
-    </w:p>
-    <w:p>
-      <w:pPr>
-        <w:pStyle w:val="Heading2"/>
-      </w:pPr>
-      <w:r>
-        <w:t xml:space="preserve">2.6  Blower production control (ProductionControl)</w:t>
-      </w:r>
-    </w:p>
-    <w:p>
-      <w:pPr>
-        <w:spacing w:after="120"/>
-      </w:pPr>
-      <w:r>
-        <w:t xml:space="preserve">Trims the blower (the compressor / vapor pump) to hold the target distillate rate. Measured production now comes from the condensate BATCHES (see 2.9): each pump-to-dry cycle meters a known distillate volume, and volume / fill-time is the average production rate -- the only rate a single point-level sensor can give. Updated once per empty cycle (condRateLpm) and held between; before the first batch the blower holds nominal rpm. cdt accelerates the integral in sim so it converges at the same wall-clock feel.</w:t>
+        <w:t xml:space="preserve">makeupHtrMax</w:t>
+      </w:r>
+      <w:r>
+        <w:t xml:space="preserve"> (140C) despite fold-back does the hard trip fire. Tune makeupHtrMinDuty to the PWM that just holds the vapor at ~100C.</w:t>
       </w:r>
     </w:p>
     <w:p>
@@ -852,7 +861,7 @@
           <w:sz w:val="19"/>
           <w:szCs w:val="19"/>
         </w:rPr>
-        <w:t xml:space="preserve">measProd = condRateLpm                         (batch volume / fill time)</w:t>
+        <w:t xml:space="preserve">heatOK = runSystem AND (trip == 0) AND (mvrPhase &gt;= HEAT)</w:t>
       </w:r>
     </w:p>
     <w:p>
@@ -866,7 +875,7 @@
           <w:sz w:val="19"/>
           <w:szCs w:val="19"/>
         </w:rPr>
-        <w:t xml:space="preserve">prodMeas += (measProd - prodMeas) * smoothing</w:t>
+        <w:t xml:space="preserve">makeupHtrTrip latches if  yMakeupHtrTemp &gt; makeupHtrMax   (uncovered / feed overheat)</w:t>
       </w:r>
     </w:p>
     <w:p>
@@ -880,7 +889,15 @@
           <w:sz w:val="19"/>
           <w:szCs w:val="19"/>
         </w:rPr>
-        <w:t xml:space="preserve">blowerRpmSet = clamp( blowerRpmSet + kProd*(prodSetSafe - prodMeas)*cdt , min , max )</w:t>
+        <w:t xml:space="preserve">superHtrTrip  latches if  ySuperHtrTemp  &gt; superHtrMax</w:t>
+      </w:r>
+    </w:p>
+    <w:p>
+      <w:pPr>
+        <w:pStyle w:val="Heading2"/>
+      </w:pPr>
+      <w:r>
+        <w:t xml:space="preserve">2.4  Makeup heater PI (MakeupControl)</w:t>
       </w:r>
     </w:p>
     <w:p>
@@ -888,34 +905,21 @@
         <w:spacing w:after="120"/>
       </w:pPr>
       <w:r>
-        <w:t xml:space="preserve">Blower estimate (used while venting and for feedInvEst): </w:t>
-      </w:r>
+        <w:t xml:space="preserve">Holds the evaporator at the boiling setpoint. Conditional anti-windup; gated by heatOK.</w:t>
+      </w:r>
+    </w:p>
+    <w:p>
+      <w:pPr>
+        <w:spacing w:after="60"/>
+        <w:ind w:left="360"/>
+      </w:pPr>
       <w:r>
         <w:rPr>
           <w:rFonts w:ascii="Consolas" w:cs="Consolas" w:eastAsia="Consolas" w:hAnsi="Consolas"/>
           <w:sz w:val="19"/>
           <w:szCs w:val="19"/>
         </w:rPr>
-        <w:t xml:space="preserve">blowerProdEst = prodPerRpm * blowerRpmSafe * clamp((eT-95)/5,0,1)</w:t>
-      </w:r>
-      <w:r>
-        <w:t xml:space="preserve">.</w:t>
-      </w:r>
-    </w:p>
-    <w:p>
-      <w:pPr>
-        <w:pStyle w:val="Heading2"/>
-      </w:pPr>
-      <w:r>
-        <w:t xml:space="preserve">2.7  Feed level control (FeedFollow + FeedwaterControl)</w:t>
-      </w:r>
-    </w:p>
-    <w:p>
-      <w:pPr>
-        <w:spacing w:after="120"/>
-      </w:pPr>
-      <w:r>
-        <w:t xml:space="preserve">Two wet/dry sight-glass sensors + the calibrated feed pump (see 2.2a). Far below the operating mark the feed FILLS; near it, a slow EvapMid wet/dry integral holds the level. blowdownFrac = 0 (no blowdown valve), so the feed-forward is just the production rate:</w:t>
+        <w:t xml:space="preserve">err  = evapTempSetSafe - yEvapTemp</w:t>
       </w:r>
     </w:p>
     <w:p>
@@ -929,7 +933,7 @@
           <w:sz w:val="19"/>
           <w:szCs w:val="19"/>
         </w:rPr>
-        <w:t xml:space="preserve">feedLpm  = prodMeas*(1+blowdownFrac) + feedLevelTrim   ; feedLevelTrim += kFeedLevelI * (EvapMid dry ? +1 : -1) * dt</w:t>
+        <w:t xml:space="preserve">I    = clamp( I + kiMakeup * err * dt , 0 , 1 )</w:t>
       </w:r>
     </w:p>
     <w:p>
@@ -943,7 +947,15 @@
           <w:sz w:val="19"/>
           <w:szCs w:val="19"/>
         </w:rPr>
-        <w:t xml:space="preserve">feedRpmSet = clamp( feedLpm / (stepsPerRev*LPerStep) , 0 , feedRpmMax )   -&gt; STEP:Feed.VELOCITY</w:t>
+        <w:t xml:space="preserve">duty = clamp( kpMakeup * err + I , 0 , 1 )      -&gt;  DO:MakeupHtr  (makeupDuty)</w:t>
+      </w:r>
+    </w:p>
+    <w:p>
+      <w:pPr>
+        <w:pStyle w:val="Heading2"/>
+      </w:pPr>
+      <w:r>
+        <w:t xml:space="preserve">2.5  Superheat heater PI (SuperheatControl)</w:t>
       </w:r>
     </w:p>
     <w:p>
@@ -951,23 +963,7 @@
         <w:spacing w:after="120"/>
       </w:pPr>
       <w:r>
-        <w:t xml:space="preserve">Velocity is driven as a LEVEL (0 = stop) so every run/stop transition re-triggers the stepper move. The level integral -- not the dead-reckon -- closes the loop, so a mis-calibrated flow meter can never run the level away ('wet' always pulls feed below boil-off).</w:t>
-      </w:r>
-    </w:p>
-    <w:p>
-      <w:pPr>
-        <w:pStyle w:val="Heading2"/>
-      </w:pPr>
-      <w:r>
-        <w:t xml:space="preserve">2.8  Feed-side inventory dead-reckon (feedInvEst)</w:t>
-      </w:r>
-    </w:p>
-    <w:p>
-      <w:pPr>
-        <w:spacing w:after="120"/>
-      </w:pPr>
-      <w:r>
-        <w:t xml:space="preserve">Positive-displacement feed pumped IN minus calibrated distillate OUT -- a level estimate that needs no sensor. While venting (meter ~0) it subtracts the blower estimate instead, so it tracks through the steamy startup.</w:t>
+        <w:t xml:space="preserve">Holds vapor superheat. Gated by heatOK AND phase &gt;= RUN AND blowerCmdRpm &gt;= blowerMinRpm -- the cartridge only fires with REAL vapor flow past the copper mesh (during the soft-start ramp the flow is a trickle and it would dry-fire). Both heater PI integrators reset to 0 whenever their heater is off, so no stale windup carries across a stop. The wet-compression (low-superheat) trip likewise arms only once the blower has reached its target.</w:t>
       </w:r>
     </w:p>
     <w:p>
@@ -981,23 +977,7 @@
           <w:sz w:val="19"/>
           <w:szCs w:val="19"/>
         </w:rPr>
-        <w:t xml:space="preserve">feedInvEst += feedInMl - vaporOutMl     ; vaporOutMl = metered (liquid) | blower est (steam)</w:t>
-      </w:r>
-    </w:p>
-    <w:p>
-      <w:pPr>
-        <w:pStyle w:val="Heading2"/>
-      </w:pPr>
-      <w:r>
-        <w:t xml:space="preserve">2.9  Condensate -- single point sensor, pump-to-dry (CondensatePump)</w:t>
-      </w:r>
-    </w:p>
-    <w:p>
-      <w:pPr>
-        <w:spacing w:after="120"/>
-      </w:pPr>
-      <w:r>
-        <w:t xml:space="preserve">No separate catch tank: condensate collects in the bottom TUBE of the HX. One point-level sensor ~3/4 up the tube (AI:CondLevel &gt; condLevelThresh -&gt; yCondHigh) starts the pump. The flow meter sits on the PUMP OUTLET, so it directly meters distillate leaving. The pump runs until the tube is DRY: when it sucks air the metered flow drops to the incoming trickle (below condEmptyFlow) -- that sustained drop, debounced, is the empty signal. Pumped volume per cycle is the distillate batch; batch / fill-time is the production rate.</w:t>
+        <w:t xml:space="preserve">err  = superheatSetSafe - superheatIn</w:t>
       </w:r>
     </w:p>
     <w:p>
@@ -1011,7 +991,15 @@
           <w:sz w:val="19"/>
           <w:szCs w:val="19"/>
         </w:rPr>
-        <w:t xml:space="preserve">start pump when  AI:CondLevel &gt; condLevelThresh   (tube ~3/4 full)</w:t>
+        <w:t xml:space="preserve">duty = clamp( kpSuper * err + I , 0 , 1 )       -&gt;  DO:SuperHtr  (superDuty)</w:t>
+      </w:r>
+    </w:p>
+    <w:p>
+      <w:pPr>
+        <w:pStyle w:val="Heading2"/>
+      </w:pPr>
+      <w:r>
+        <w:t xml:space="preserve">2.6  Blower production control (ProductionControl)</w:t>
       </w:r>
     </w:p>
     <w:p>
@@ -1019,7 +1007,7 @@
         <w:spacing w:after="120"/>
       </w:pPr>
       <w:r>
-        <w:t xml:space="preserve">Stop on WHICHEVER fires first (the pump is positive-displacement, so the empty point is bracketed three ways):</w:t>
+        <w:t xml:space="preserve">Trims the blower (the compressor / vapor pump) to hold the target distillate rate. Measured production now comes from the condensate BATCHES (see 2.9): each pump-to-dry cycle meters a known distillate volume, and volume / fill-time is the average production rate -- the only rate a single point-level sensor can give. Updated once per empty cycle (condRateLpm) and held between; before the first batch the blower holds nominal rpm. cdt accelerates the integral in sim so it converges at the same wall-clock feel.</w:t>
       </w:r>
     </w:p>
     <w:p>
@@ -1033,7 +1021,7 @@
           <w:sz w:val="19"/>
           <w:szCs w:val="19"/>
         </w:rPr>
-        <w:t xml:space="preserve">(1) yCondFlow &lt; condEmptyFlow for condEmptyDebounce   (meter drops to ~0 on air -&gt; dry; primary)</w:t>
+        <w:t xml:space="preserve">measProd = condRateLpm                         (batch volume / fill time)</w:t>
       </w:r>
     </w:p>
     <w:p>
@@ -1047,7 +1035,7 @@
           <w:sz w:val="19"/>
           <w:szCs w:val="19"/>
         </w:rPr>
-        <w:t xml:space="preserve">(2) metered batch &gt; condBatchMaxML                    (guards a meter that keeps counting on air)</w:t>
+        <w:t xml:space="preserve">prodMeas += (measProd - prodMeas) * smoothing</w:t>
       </w:r>
     </w:p>
     <w:p>
@@ -1061,29 +1049,34 @@
           <w:sz w:val="19"/>
           <w:szCs w:val="19"/>
         </w:rPr>
-        <w:t xml:space="preserve">(3) pump run &gt; condPumpMaxRun                         (hard time cap -&gt; sets condPumpFault)</w:t>
-      </w:r>
-    </w:p>
-    <w:p>
-      <w:pPr>
-        <w:spacing w:after="60"/>
-        <w:ind w:left="360"/>
-      </w:pPr>
+        <w:t xml:space="preserve">blowerRpmSet = clamp( blowerRpmSet + kProd*(prodSetSafe - prodMeas)*cdt , min , max )</w:t>
+      </w:r>
+    </w:p>
+    <w:p>
+      <w:pPr>
+        <w:spacing w:after="120"/>
+      </w:pPr>
+      <w:r>
+        <w:t xml:space="preserve">Blower estimate (used while venting and for feedInvEst): </w:t>
+      </w:r>
       <w:r>
         <w:rPr>
           <w:rFonts w:ascii="Consolas" w:cs="Consolas" w:eastAsia="Consolas" w:hAnsi="Consolas"/>
           <w:sz w:val="19"/>
           <w:szCs w:val="19"/>
         </w:rPr>
-        <w:t xml:space="preserve">condRateLpm = condBatchMl / fill-cycle-time     -&gt;  ProductionControl (2.6)</w:t>
-      </w:r>
-    </w:p>
-    <w:p>
-      <w:pPr>
-        <w:pStyle w:val="Heading3"/>
-      </w:pPr>
-      <w:r>
-        <w:t xml:space="preserve">One counter, measured in software (condUseTotalizer)</w:t>
+        <w:t xml:space="preserve">blowerProdEst = prodPerRpm * blowerRpmSafe * clamp((eT-95)/5,0,1)</w:t>
+      </w:r>
+      <w:r>
+        <w:t xml:space="preserve">.</w:t>
+      </w:r>
+    </w:p>
+    <w:p>
+      <w:pPr>
+        <w:pStyle w:val="Heading2"/>
+      </w:pPr>
+      <w:r>
+        <w:t xml:space="preserve">2.7  Feed level control (FeedFollow + FeedwaterControl)</w:t>
       </w:r>
     </w:p>
     <w:p>
@@ -1091,18 +1084,21 @@
         <w:spacing w:after="120"/>
       </w:pPr>
       <w:r>
-        <w:t xml:space="preserve">The CTR0 count is read once and exposed as a first-class CTR input -- the cumulative total: CTR:CondTotal = count/K (rollover-safe 32-bit, summed into a big-int). The flow RATE is derived from the total in the expression, windowed over </w:t>
-      </w:r>
+        <w:t xml:space="preserve">The stepped tank-gauge sender fused with the calibrated feed pump (see 2.2a). Far below the operating mark P fills fast; inside the deadband the EvapMid edge integral holds the level. blowdownFrac = 0 (no blowdown valve), so the feed-forward is just the production rate:</w:t>
+      </w:r>
+    </w:p>
+    <w:p>
+      <w:pPr>
+        <w:spacing w:after="60"/>
+        <w:ind w:left="360"/>
+      </w:pPr>
       <w:r>
         <w:rPr>
           <w:rFonts w:ascii="Consolas" w:cs="Consolas" w:eastAsia="Consolas" w:hAnsi="Consolas"/>
           <w:sz w:val="19"/>
           <w:szCs w:val="19"/>
         </w:rPr>
-        <w:t xml:space="preserve">condRateWin</w:t>
-      </w:r>
-      <w:r>
-        <w:t xml:space="preserve"> (so per-tick pulse coarseness averages out), held between updates:</w:t>
+        <w:t xml:space="preserve">feedLpm = prodMeas*(1+blowdownFrac) + P(fused est, outside deadband) + feedLevelTrim</w:t>
       </w:r>
     </w:p>
     <w:p>
@@ -1116,15 +1112,7 @@
           <w:sz w:val="19"/>
           <w:szCs w:val="19"/>
         </w:rPr>
-        <w:t xml:space="preserve">yCondFlow = (yCondTotal - prevWindowTotal) / windowElapsed * 60     // L/min, every condRateWin</w:t>
-      </w:r>
-    </w:p>
-    <w:p>
-      <w:pPr>
-        <w:spacing w:after="120"/>
-      </w:pPr>
-      <w:r>
-        <w:t xml:space="preserve">Two ways to report the distillate, both off that one total:</w:t>
+        <w:t xml:space="preserve">feedLevelTrim += kFeedLevelI * (EvapMid dry ? +1 : -1) * dt      (INSIDE the deadband only)</w:t>
       </w:r>
     </w:p>
     <w:p>
@@ -1138,7 +1126,31 @@
           <w:sz w:val="19"/>
           <w:szCs w:val="19"/>
         </w:rPr>
-        <w:t xml:space="preserve">condUseTotalizer = 1 (default):  condProduct = yCondTotal * condCalFactor * 1000   // EXACT, no integration error</w:t>
+        <w:t xml:space="preserve">feedRpmSet = clamp( feedLpm / (stepsPerRev*LPerStep) , 0 , feedRpmMax )   -&gt; STEP:Feed.VELOCITY</w:t>
+      </w:r>
+    </w:p>
+    <w:p>
+      <w:pPr>
+        <w:spacing w:after="120"/>
+      </w:pPr>
+      <w:r>
+        <w:t xml:space="preserve">Velocity is driven as a LEVEL (0 = stop) so every run/stop transition re-triggers the stepper move. The edge integral -- not the dead-reckon -- closes the tight loop, so a mis-calibrated flow meter can never run the level away ('wet' always pulls feed below boil-off).</w:t>
+      </w:r>
+    </w:p>
+    <w:p>
+      <w:pPr>
+        <w:pStyle w:val="Heading2"/>
+      </w:pPr>
+      <w:r>
+        <w:t xml:space="preserve">2.8  Feed-side inventory dead-reckon (feedInvEst)</w:t>
+      </w:r>
+    </w:p>
+    <w:p>
+      <w:pPr>
+        <w:spacing w:after="120"/>
+      </w:pPr>
+      <w:r>
+        <w:t xml:space="preserve">Positive-displacement feed pumped IN minus calibrated distillate OUT -- a level estimate that needs no sensor. While venting (meter ~0) it subtracts the blower estimate instead, so it tracks through the steamy startup.</w:t>
       </w:r>
     </w:p>
     <w:p>
@@ -1152,7 +1164,15 @@
           <w:sz w:val="19"/>
           <w:szCs w:val="19"/>
         </w:rPr>
-        <w:t xml:space="preserve">condUseTotalizer = 0:  condProduct += integral(yCondFlow) * condCalFactor          // windowed-rate integration</w:t>
+        <w:t xml:space="preserve">feedInvEst += feedInMl - vaporOutMl     ; vaporOutMl = metered (liquid) | blower est (steam)</w:t>
+      </w:r>
+    </w:p>
+    <w:p>
+      <w:pPr>
+        <w:pStyle w:val="Heading2"/>
+      </w:pPr>
+      <w:r>
+        <w:t xml:space="preserve">2.9  Condensate -- single point sensor, pump-to-dry (CondensatePump)</w:t>
       </w:r>
     </w:p>
     <w:p>
@@ -1160,56 +1180,57 @@
         <w:spacing w:after="120"/>
       </w:pPr>
       <w:r>
-        <w:t xml:space="preserve">The pump batch cycle and the empty detection (on yCondFlow) are identical either way; the switch only changes how condProduct is formed. condCalFactor (bench: known volume / metered pulses) corrects both. condEmptyDebounce should be &gt;= ~2x condRateWin.</w:t>
-      </w:r>
-    </w:p>
-    <w:p>
-      <w:pPr>
-        <w:spacing w:after="120"/>
-      </w:pPr>
-      <w:r>
-        <w:t xml:space="preserve">The vent (DO:VentValve) is a startup NON-CONDENSABLE (air) purge: it holds OPEN while the system warms (blower on, phase &gt;= HEAT) so trapped air is pushed out, then CLOSES once the blower-out vapor (</w:t>
-      </w:r>
+        <w:t xml:space="preserve">No separate catch tank: condensate collects in the bottom TUBE of the HX. One point-level sensor ~3/4 up the tube (AI:CondLevel &gt; condLevelThresh -&gt; yCondHigh) starts the pump. The flow meter sits on the PUMP OUTLET, so it directly meters distillate leaving. The pump runs until the tube is DRY: when it sucks air the metered flow drops to the incoming trickle (below condEmptyFlow) -- that sustained drop, debounced, is the empty signal. Pumped volume per cycle is the distillate batch; batch / fill-time is the production rate.</w:t>
+      </w:r>
+    </w:p>
+    <w:p>
+      <w:pPr>
+        <w:spacing w:after="60"/>
+        <w:ind w:left="360"/>
+      </w:pPr>
       <w:r>
         <w:rPr>
           <w:rFonts w:ascii="Consolas" w:cs="Consolas" w:eastAsia="Consolas" w:hAnsi="Consolas"/>
           <w:sz w:val="19"/>
           <w:szCs w:val="19"/>
         </w:rPr>
-        <w:t xml:space="preserve">yVaporOut</w:t>
-      </w:r>
-      <w:r>
-        <w:t xml:space="preserve">) reaches steam temperature -- hysteresis </w:t>
-      </w:r>
+        <w:t xml:space="preserve">start pump when  AI:CondLevel &gt; condLevelThresh   (tube ~3/4 full)</w:t>
+      </w:r>
+    </w:p>
+    <w:p>
+      <w:pPr>
+        <w:spacing w:after="120"/>
+      </w:pPr>
+      <w:r>
+        <w:t xml:space="preserve">Stop on WHICHEVER fires first (the pump is positive-displacement, so the empty point is bracketed three ways):</w:t>
+      </w:r>
+    </w:p>
+    <w:p>
+      <w:pPr>
+        <w:spacing w:after="60"/>
+        <w:ind w:left="360"/>
+      </w:pPr>
       <w:r>
         <w:rPr>
           <w:rFonts w:ascii="Consolas" w:cs="Consolas" w:eastAsia="Consolas" w:hAnsi="Consolas"/>
           <w:sz w:val="19"/>
           <w:szCs w:val="19"/>
         </w:rPr>
-        <w:t xml:space="preserve">ventOpenTemp</w:t>
-      </w:r>
-      <w:r>
-        <w:t xml:space="preserve"> (98C, open below) / </w:t>
-      </w:r>
+        <w:t xml:space="preserve">(1) yCondFlow &lt; condEmptyFlow for condEmptyDebounce   (meter drops to ~0 on air -&gt; dry; primary)</w:t>
+      </w:r>
+    </w:p>
+    <w:p>
+      <w:pPr>
+        <w:spacing w:after="60"/>
+        <w:ind w:left="360"/>
+      </w:pPr>
       <w:r>
         <w:rPr>
           <w:rFonts w:ascii="Consolas" w:cs="Consolas" w:eastAsia="Consolas" w:hAnsi="Consolas"/>
           <w:sz w:val="19"/>
           <w:szCs w:val="19"/>
         </w:rPr>
-        <w:t xml:space="preserve">ventCloseTemp</w:t>
-      </w:r>
-      <w:r>
-        <w:t xml:space="preserve"> (101C, close above). It is independent of condLiquid (the condensate-outlet liquid gate the sim uses for metering); closed when idle.</w:t>
-      </w:r>
-    </w:p>
-    <w:p>
-      <w:pPr>
-        <w:pStyle w:val="Heading2"/>
-      </w:pPr>
-      <w:r>
-        <w:t xml:space="preserve">2.10  Anti-surge bypass (BlowerControl)</w:t>
+        <w:t xml:space="preserve">(2) metered batch &gt; condBatchMaxML                    (guards a meter that keeps counting on air)</w:t>
       </w:r>
     </w:p>
     <w:p>
@@ -1223,31 +1244,7 @@
           <w:sz w:val="19"/>
           <w:szCs w:val="19"/>
         </w:rPr>
-        <w:t xml:space="preserve">bypassV = clamp( (surgeThresh - deltaT) * surgeGain , 0 , 10 )   -&gt;  AO:BypassValve</w:t>
-      </w:r>
-    </w:p>
-    <w:p>
-      <w:pPr>
-        <w:pStyle w:val="Heading1"/>
-      </w:pPr>
-      <w:r>
-        <w:t xml:space="preserve">3.  Plant Model Equations (MVRSim)</w:t>
-      </w:r>
-    </w:p>
-    <w:p>
-      <w:pPr>
-        <w:spacing w:after="120"/>
-      </w:pPr>
-      <w:r>
-        <w:t xml:space="preserve">The lumped first-order simulator. Active only when simEnable=1. cp ~ 4186 J/kg.C; 1 L ~ 1 kg of water.</w:t>
-      </w:r>
-    </w:p>
-    <w:p>
-      <w:pPr>
-        <w:pStyle w:val="Heading2"/>
-      </w:pPr>
-      <w:r>
-        <w:t xml:space="preserve">3.1  Blower &amp; production</w:t>
+        <w:t xml:space="preserve">(3) pump run &gt; condPumpMaxRun                         (hard time cap -&gt; sets condPumpFault)</w:t>
       </w:r>
     </w:p>
     <w:p>
@@ -1261,21 +1258,34 @@
           <w:sz w:val="19"/>
           <w:szCs w:val="19"/>
         </w:rPr>
-        <w:t xml:space="preserve">simBlowerRpm += (cmd - simBlowerRpm) * dt/simTauBlower</w:t>
-      </w:r>
-    </w:p>
-    <w:p>
-      <w:pPr>
-        <w:spacing w:after="60"/>
-        <w:ind w:left="360"/>
-      </w:pPr>
+        <w:t xml:space="preserve">condRateLpm = condBatchMl / fill-cycle-time     -&gt;  ProductionControl (2.6)</w:t>
+      </w:r>
+    </w:p>
+    <w:p>
+      <w:pPr>
+        <w:pStyle w:val="Heading3"/>
+      </w:pPr>
+      <w:r>
+        <w:t xml:space="preserve">One counter, measured in software (condUseTotalizer)</w:t>
+      </w:r>
+    </w:p>
+    <w:p>
+      <w:pPr>
+        <w:spacing w:after="120"/>
+      </w:pPr>
+      <w:r>
+        <w:t xml:space="preserve">The CTR0 count is read once and exposed as a first-class CTR input -- the cumulative total: CTR:CondTotal = count/K (rollover-safe 32-bit, summed into a big-int). The flow RATE is derived from the total in the expression, windowed over </w:t>
+      </w:r>
       <w:r>
         <w:rPr>
           <w:rFonts w:ascii="Consolas" w:cs="Consolas" w:eastAsia="Consolas" w:hAnsi="Consolas"/>
           <w:sz w:val="19"/>
           <w:szCs w:val="19"/>
         </w:rPr>
-        <w:t xml:space="preserve">blowFrac = simBlowerRpm/simBlowerRated ;  compEff = blowFrac*(1-bypass)</w:t>
+        <w:t xml:space="preserve">condRateWin</w:t>
+      </w:r>
+      <w:r>
+        <w:t xml:space="preserve"> (so per-tick pulse coarseness averages out), held between updates:</w:t>
       </w:r>
     </w:p>
     <w:p>
@@ -1289,7 +1299,15 @@
           <w:sz w:val="19"/>
           <w:szCs w:val="19"/>
         </w:rPr>
-        <w:t xml:space="preserve">boilReady = clamp((eT-95)/5,0,1)</w:t>
+        <w:t xml:space="preserve">yCondFlow = (yCondTotal - prevWindowTotal) / windowElapsed * 60     // L/min, every condRateWin</w:t>
+      </w:r>
+    </w:p>
+    <w:p>
+      <w:pPr>
+        <w:spacing w:after="120"/>
+      </w:pPr>
+      <w:r>
+        <w:t xml:space="preserve">Two ways to report the distillate, both off that one total:</w:t>
       </w:r>
     </w:p>
     <w:p>
@@ -1303,6 +1321,251 @@
           <w:sz w:val="19"/>
           <w:szCs w:val="19"/>
         </w:rPr>
+        <w:t xml:space="preserve">condUseTotalizer = 1 (default):  condProduct = yCondTotal * condCalFactor * 1000   // EXACT, no integration error</w:t>
+      </w:r>
+    </w:p>
+    <w:p>
+      <w:pPr>
+        <w:spacing w:after="60"/>
+        <w:ind w:left="360"/>
+      </w:pPr>
+      <w:r>
+        <w:rPr>
+          <w:rFonts w:ascii="Consolas" w:cs="Consolas" w:eastAsia="Consolas" w:hAnsi="Consolas"/>
+          <w:sz w:val="19"/>
+          <w:szCs w:val="19"/>
+        </w:rPr>
+        <w:t xml:space="preserve">condUseTotalizer = 0:  condProduct += integral(yCondFlow) * condCalFactor          // windowed-rate integration</w:t>
+      </w:r>
+    </w:p>
+    <w:p>
+      <w:pPr>
+        <w:spacing w:after="120"/>
+      </w:pPr>
+      <w:r>
+        <w:t xml:space="preserve">The pump batch cycle and the empty detection (on yCondFlow) are identical either way; the switch only changes how condProduct is formed. condCalFactor (bench: known volume / metered pulses) corrects both. condEmptyDebounce should be &gt;= ~2x condRateWin.</w:t>
+      </w:r>
+    </w:p>
+    <w:p>
+      <w:pPr>
+        <w:spacing w:after="120"/>
+      </w:pPr>
+      <w:r>
+        <w:t xml:space="preserve">The vent (DO:VentValve) is a startup NON-CONDENSABLE (air) purge: it holds OPEN while the system warms (blower on, phase &gt;= HEAT) so trapped air is pushed out, then CLOSES once the blower-out vapor (</w:t>
+      </w:r>
+      <w:r>
+        <w:rPr>
+          <w:rFonts w:ascii="Consolas" w:cs="Consolas" w:eastAsia="Consolas" w:hAnsi="Consolas"/>
+          <w:sz w:val="19"/>
+          <w:szCs w:val="19"/>
+        </w:rPr>
+        <w:t xml:space="preserve">yVaporOut</w:t>
+      </w:r>
+      <w:r>
+        <w:t xml:space="preserve">) reaches steam temperature -- hysteresis </w:t>
+      </w:r>
+      <w:r>
+        <w:rPr>
+          <w:rFonts w:ascii="Consolas" w:cs="Consolas" w:eastAsia="Consolas" w:hAnsi="Consolas"/>
+          <w:sz w:val="19"/>
+          <w:szCs w:val="19"/>
+        </w:rPr>
+        <w:t xml:space="preserve">ventOpenTemp</w:t>
+      </w:r>
+      <w:r>
+        <w:t xml:space="preserve"> (98C, open below) / </w:t>
+      </w:r>
+      <w:r>
+        <w:rPr>
+          <w:rFonts w:ascii="Consolas" w:cs="Consolas" w:eastAsia="Consolas" w:hAnsi="Consolas"/>
+          <w:sz w:val="19"/>
+          <w:szCs w:val="19"/>
+        </w:rPr>
+        <w:t xml:space="preserve">ventCloseTemp</w:t>
+      </w:r>
+      <w:r>
+        <w:t xml:space="preserve"> (101C, close above). It is independent of condLiquid (the condensate-outlet liquid gate the sim uses for metering); closed when idle.</w:t>
+      </w:r>
+    </w:p>
+    <w:p>
+      <w:pPr>
+        <w:pStyle w:val="Heading2"/>
+      </w:pPr>
+      <w:r>
+        <w:t xml:space="preserve">2.10  Blower soft-start + anti-surge bypass (BlowerControl)</w:t>
+      </w:r>
+    </w:p>
+    <w:p>
+      <w:pPr>
+        <w:spacing w:after="120"/>
+      </w:pPr>
+      <w:r>
+        <w:t xml:space="preserve">The blower stays OFF below </w:t>
+      </w:r>
+      <w:r>
+        <w:rPr>
+          <w:rFonts w:ascii="Consolas" w:cs="Consolas" w:eastAsia="Consolas" w:hAnsi="Consolas"/>
+          <w:sz w:val="19"/>
+          <w:szCs w:val="19"/>
+        </w:rPr>
+        <w:t xml:space="preserve">blowerStartTemp</w:t>
+      </w:r>
+      <w:r>
+        <w:t xml:space="preserve"> (90 C): a cold evaporator has no vapor to pump -- the blower would only pull vacuum. Once the gate opens it starts at </w:t>
+      </w:r>
+      <w:r>
+        <w:rPr>
+          <w:rFonts w:ascii="Consolas" w:cs="Consolas" w:eastAsia="Consolas" w:hAnsi="Consolas"/>
+          <w:sz w:val="19"/>
+          <w:szCs w:val="19"/>
+        </w:rPr>
+        <w:t xml:space="preserve">blowerRampRpm0</w:t>
+      </w:r>
+      <w:r>
+        <w:t xml:space="preserve"> (200 rpm) and ramps at </w:t>
+      </w:r>
+      <w:r>
+        <w:rPr>
+          <w:rFonts w:ascii="Consolas" w:cs="Consolas" w:eastAsia="Consolas" w:hAnsi="Consolas"/>
+          <w:sz w:val="19"/>
+          <w:szCs w:val="19"/>
+        </w:rPr>
+        <w:t xml:space="preserve">blowerRampRpmS</w:t>
+      </w:r>
+      <w:r>
+        <w:t xml:space="preserve"> (10 rpm/s) to the target; </w:t>
+      </w:r>
+      <w:r>
+        <w:rPr>
+          <w:rFonts w:ascii="Consolas" w:cs="Consolas" w:eastAsia="Consolas" w:hAnsi="Consolas"/>
+          <w:sz w:val="19"/>
+          <w:szCs w:val="19"/>
+        </w:rPr>
+        <w:t xml:space="preserve">blowerCmdRpm</w:t>
+      </w:r>
+      <w:r>
+        <w:t xml:space="preserve"> (the rate-limited state) is the ONLY rpm sent to the VFD, and everything downstream (SH-heater gate, wet-comp arming, production anti-windup) keys off it. This replaced a suction-lie failure on the rig: a hard blower start pulled the level gauge down, the control over-filled chasing the false low reading, and the demister flooded. The HARDWARE fix -- venting the gauge to the evap vapor space (connected-vessel manometer) -- removed the need for pressure compensation entirely; the soft ramp is kept as good practice.</w:t>
+      </w:r>
+    </w:p>
+    <w:p>
+      <w:pPr>
+        <w:spacing w:after="60"/>
+        <w:ind w:left="360"/>
+      </w:pPr>
+      <w:r>
+        <w:rPr>
+          <w:rFonts w:ascii="Consolas" w:cs="Consolas" w:eastAsia="Consolas" w:hAnsi="Consolas"/>
+          <w:sz w:val="19"/>
+          <w:szCs w:val="19"/>
+        </w:rPr>
+        <w:t xml:space="preserve">run = runSystem AND !trip AND phase&gt;=HEAT AND yEvapTemp &gt;= blowerStartTemp</w:t>
+      </w:r>
+    </w:p>
+    <w:p>
+      <w:pPr>
+        <w:spacing w:after="60"/>
+        <w:ind w:left="360"/>
+      </w:pPr>
+      <w:r>
+        <w:rPr>
+          <w:rFonts w:ascii="Consolas" w:cs="Consolas" w:eastAsia="Consolas" w:hAnsi="Consolas"/>
+          <w:sz w:val="19"/>
+          <w:szCs w:val="19"/>
+        </w:rPr>
+        <w:t xml:space="preserve">cmd = min( max(cmd, blowerRampRpm0) + blowerRampRpmS*dt , blowerRpmSafe )   -&gt; VFD</w:t>
+      </w:r>
+    </w:p>
+    <w:p>
+      <w:pPr>
+        <w:spacing w:after="60"/>
+        <w:ind w:left="360"/>
+      </w:pPr>
+      <w:r>
+        <w:rPr>
+          <w:rFonts w:ascii="Consolas" w:cs="Consolas" w:eastAsia="Consolas" w:hAnsi="Consolas"/>
+          <w:sz w:val="19"/>
+          <w:szCs w:val="19"/>
+        </w:rPr>
+        <w:t xml:space="preserve">bypassV = clamp( (surgeThresh - deltaT) * surgeGain , 0 , 10 )   -&gt;  AO:BypassValve</w:t>
+      </w:r>
+    </w:p>
+    <w:p>
+      <w:pPr>
+        <w:pStyle w:val="Heading1"/>
+      </w:pPr>
+      <w:r>
+        <w:t xml:space="preserve">3.  Plant Model Equations (MVRSim)</w:t>
+      </w:r>
+    </w:p>
+    <w:p>
+      <w:pPr>
+        <w:spacing w:after="120"/>
+      </w:pPr>
+      <w:r>
+        <w:t xml:space="preserve">The lumped first-order simulator. Active only when simEnable=1. cp ~ 4186 J/kg.C; 1 L ~ 1 kg of water.</w:t>
+      </w:r>
+    </w:p>
+    <w:p>
+      <w:pPr>
+        <w:pStyle w:val="Heading2"/>
+      </w:pPr>
+      <w:r>
+        <w:t xml:space="preserve">3.1  Blower &amp; production</w:t>
+      </w:r>
+    </w:p>
+    <w:p>
+      <w:pPr>
+        <w:spacing w:after="60"/>
+        <w:ind w:left="360"/>
+      </w:pPr>
+      <w:r>
+        <w:rPr>
+          <w:rFonts w:ascii="Consolas" w:cs="Consolas" w:eastAsia="Consolas" w:hAnsi="Consolas"/>
+          <w:sz w:val="19"/>
+          <w:szCs w:val="19"/>
+        </w:rPr>
+        <w:t xml:space="preserve">simBlowerRpm += (cmd - simBlowerRpm) * dt/simTauBlower</w:t>
+      </w:r>
+    </w:p>
+    <w:p>
+      <w:pPr>
+        <w:spacing w:after="60"/>
+        <w:ind w:left="360"/>
+      </w:pPr>
+      <w:r>
+        <w:rPr>
+          <w:rFonts w:ascii="Consolas" w:cs="Consolas" w:eastAsia="Consolas" w:hAnsi="Consolas"/>
+          <w:sz w:val="19"/>
+          <w:szCs w:val="19"/>
+        </w:rPr>
+        <w:t xml:space="preserve">blowFrac = simBlowerRpm/simBlowerRated ;  compEff = blowFrac*(1-bypass)</w:t>
+      </w:r>
+    </w:p>
+    <w:p>
+      <w:pPr>
+        <w:spacing w:after="60"/>
+        <w:ind w:left="360"/>
+      </w:pPr>
+      <w:r>
+        <w:rPr>
+          <w:rFonts w:ascii="Consolas" w:cs="Consolas" w:eastAsia="Consolas" w:hAnsi="Consolas"/>
+          <w:sz w:val="19"/>
+          <w:szCs w:val="19"/>
+        </w:rPr>
+        <w:t xml:space="preserve">boilReady = clamp((eT-95)/5,0,1)</w:t>
+      </w:r>
+    </w:p>
+    <w:p>
+      <w:pPr>
+        <w:spacing w:after="60"/>
+        <w:ind w:left="360"/>
+      </w:pPr>
+      <w:r>
+        <w:rPr>
+          <w:rFonts w:ascii="Consolas" w:cs="Consolas" w:eastAsia="Consolas" w:hAnsi="Consolas"/>
+          <w:sz w:val="19"/>
+          <w:szCs w:val="19"/>
+        </w:rPr>
         <w:t xml:space="preserve">simProd  -&gt; compEff * simVaporMax * boilReady * surge      (L/min, blower-driven)</w:t>
       </w:r>
     </w:p>
@@ -1319,7 +1582,7 @@
         <w:spacing w:after="120"/>
       </w:pPr>
       <w:r>
-        <w:t xml:space="preserve">The blower is the COMPRESSOR: it draws vapor OFF the evaporator (suction, low side) and discharges into the steam chest (high side). The condensate / discharge side is vented (catch-tank vent), so it rests near atmospheric and rises with the condensing temperature. The EVAPORATOR is the suction side -- it never goes positive, and the instant the blower spins up it is pulled BELOW atmospheric (deepest while boil-off still lags blower throughput), recovering toward atmospheric as the chest warms. Blower off (warm-up): PR=1, both sides rest at atmospheric (air + vent).</w:t>
+        <w:t xml:space="preserve">The blower is the COMPRESSOR: it draws vapor OFF the evaporator (suction, low side) and discharges into the steam chest (high side). The condensate / discharge side is vented (catch-tank vent), so it rests near atmospheric and rises with the condensing temperature. The EVAPORATOR is the suction side -- it never goes positive, and the instant the blower spins up it is pulled BELOW atmospheric (deepest while boil-off still lags blower throughput), recovering toward atmospheric as the chest warms. Blower off (warm-up): PR=1, both sides rest at atmospheric (air + vent). NOTE: evaporator suction no longer disturbs the level reading -- the gauge vent line ties to the evap vapor space (connected-vessel manometer), so both legs see the same pressure and the sender reads true.</w:t>
       </w:r>
     </w:p>
     <w:p>
@@ -3619,7 +3882,7 @@
                 <w:sz w:val="20"/>
                 <w:szCs w:val="20"/>
               </w:rPr>
-              <w:t xml:space="preserve">1500</w:t>
+              <w:t xml:space="preserve">2475</w:t>
             </w:r>
           </w:p>
         </w:tc>
@@ -3648,7 +3911,7 @@
                 <w:sz w:val="20"/>
                 <w:szCs w:val="20"/>
               </w:rPr>
-              <w:t xml:space="preserve">500 - 4000 ml</w:t>
+              <w:t xml:space="preserve">500 - 3500 ml</w:t>
             </w:r>
           </w:p>
         </w:tc>
@@ -3677,7 +3940,7 @@
                 <w:sz w:val="20"/>
                 <w:szCs w:val="20"/>
               </w:rPr>
-              <w:t xml:space="preserve">Evaporator working-level target the feed holds.</w:t>
+              <w:t xml:space="preserve">Operating level the feed holds (= evapMidMark, the 2350|2600 plateau edge, ~2.5 L). Lowered from 3025: thermal expansion (~4% cold-&gt;boiling) + wobble took the 3/4 fill over the top on the rig.</w:t>
             </w:r>
           </w:p>
         </w:tc>
@@ -3796,6 +4059,124 @@
                 <w:szCs w:val="20"/>
               </w:rPr>
               <w:t xml:space="preserve">Enable the blower / feed closed loops.</w:t>
+            </w:r>
+          </w:p>
+        </w:tc>
+      </w:tr>
+      <w:tr>
+        <w:tc>
+          <w:tcPr>
+            <w:tcW w:type="dxa" w:w="1900"/>
+            <w:tcBorders>
+              <w:top w:val="single" w:color="BBBBBB" w:sz="1"/>
+              <w:left w:val="single" w:color="BBBBBB" w:sz="1"/>
+              <w:bottom w:val="single" w:color="BBBBBB" w:sz="1"/>
+              <w:right w:val="single" w:color="BBBBBB" w:sz="1"/>
+            </w:tcBorders>
+            <w:tcMar>
+              <w:top w:type="dxa" w:w="50"/>
+              <w:left w:type="dxa" w:w="110"/>
+              <w:bottom w:type="dxa" w:w="50"/>
+              <w:right w:type="dxa" w:w="110"/>
+            </w:tcMar>
+          </w:tcPr>
+          <w:p>
+            <w:r>
+              <w:rPr>
+                <w:rFonts w:ascii="Consolas" w:cs="Consolas" w:eastAsia="Consolas" w:hAnsi="Consolas"/>
+                <w:b w:val="false"/>
+                <w:bCs w:val="false"/>
+                <w:sz w:val="18"/>
+                <w:szCs w:val="18"/>
+              </w:rPr>
+              <w:t xml:space="preserve">emptySystem / shutdown</w:t>
+            </w:r>
+          </w:p>
+        </w:tc>
+        <w:tc>
+          <w:tcPr>
+            <w:tcW w:type="dxa" w:w="1100"/>
+            <w:tcBorders>
+              <w:top w:val="single" w:color="BBBBBB" w:sz="1"/>
+              <w:left w:val="single" w:color="BBBBBB" w:sz="1"/>
+              <w:bottom w:val="single" w:color="BBBBBB" w:sz="1"/>
+              <w:right w:val="single" w:color="BBBBBB" w:sz="1"/>
+            </w:tcBorders>
+            <w:tcMar>
+              <w:top w:type="dxa" w:w="50"/>
+              <w:left w:type="dxa" w:w="110"/>
+              <w:bottom w:type="dxa" w:w="50"/>
+              <w:right w:type="dxa" w:w="110"/>
+            </w:tcMar>
+          </w:tcPr>
+          <w:p>
+            <w:r>
+              <w:rPr>
+                <w:rFonts w:ascii="Arial" w:cs="Arial" w:eastAsia="Arial" w:hAnsi="Arial"/>
+                <w:b w:val="false"/>
+                <w:bCs w:val="false"/>
+                <w:sz w:val="20"/>
+                <w:szCs w:val="20"/>
+              </w:rPr>
+              <w:t xml:space="preserve">buttons</w:t>
+            </w:r>
+          </w:p>
+        </w:tc>
+        <w:tc>
+          <w:tcPr>
+            <w:tcW w:type="dxa" w:w="2300"/>
+            <w:tcBorders>
+              <w:top w:val="single" w:color="BBBBBB" w:sz="1"/>
+              <w:left w:val="single" w:color="BBBBBB" w:sz="1"/>
+              <w:bottom w:val="single" w:color="BBBBBB" w:sz="1"/>
+              <w:right w:val="single" w:color="BBBBBB" w:sz="1"/>
+            </w:tcBorders>
+            <w:tcMar>
+              <w:top w:type="dxa" w:w="50"/>
+              <w:left w:type="dxa" w:w="110"/>
+              <w:bottom w:type="dxa" w:w="50"/>
+              <w:right w:type="dxa" w:w="110"/>
+            </w:tcMar>
+          </w:tcPr>
+          <w:p>
+            <w:r>
+              <w:rPr>
+                <w:rFonts w:ascii="Arial" w:cs="Arial" w:eastAsia="Arial" w:hAnsi="Arial"/>
+                <w:b w:val="false"/>
+                <w:bCs w:val="false"/>
+                <w:sz w:val="20"/>
+                <w:szCs w:val="20"/>
+              </w:rPr>
+              <w:t xml:space="preserve">0 / 1</w:t>
+            </w:r>
+          </w:p>
+        </w:tc>
+        <w:tc>
+          <w:tcPr>
+            <w:tcW w:type="dxa" w:w="4060"/>
+            <w:tcBorders>
+              <w:top w:val="single" w:color="BBBBBB" w:sz="1"/>
+              <w:left w:val="single" w:color="BBBBBB" w:sz="1"/>
+              <w:bottom w:val="single" w:color="BBBBBB" w:sz="1"/>
+              <w:right w:val="single" w:color="BBBBBB" w:sz="1"/>
+            </w:tcBorders>
+            <w:tcMar>
+              <w:top w:type="dxa" w:w="50"/>
+              <w:left w:type="dxa" w:w="110"/>
+              <w:bottom w:type="dxa" w:w="50"/>
+              <w:right w:type="dxa" w:w="110"/>
+            </w:tcMar>
+          </w:tcPr>
+          <w:p>
+            <w:r>
+              <w:rPr>
+                <w:rFonts w:ascii="Arial" w:cs="Arial" w:eastAsia="Arial" w:hAnsi="Arial"/>
+                <w:b w:val="false"/>
+                <w:bCs w:val="false"/>
+                <w:sz w:val="20"/>
+                <w:szCs w:val="20"/>
+              </w:rPr>
+              <w:t xml:space="preserve">Button widgets (Variable mode): reverse-pump the system dry WITHOUT a run -- to sender bottom + purgeExtraML (emptyMaxML backstop). Heaters are already forced off with Run off, so shutdown = verified-heaters-off + pump-out. IGNORED while running (turn Run off first); toggle off to re-arm.</w:t>
             </w:r>
           </w:p>
         </w:tc>
@@ -4597,7 +4978,7 @@
                 <w:sz w:val="20"/>
                 <w:szCs w:val="20"/>
               </w:rPr>
-              <w:t xml:space="preserve">110</w:t>
+              <w:t xml:space="preserve">140</w:t>
             </w:r>
           </w:p>
         </w:tc>
@@ -4655,7 +5036,7 @@
                 <w:sz w:val="20"/>
                 <w:szCs w:val="20"/>
               </w:rPr>
-              <w:t xml:space="preserve">Makeup-cartridge TC over-temp TRIP (uncovered / feed overheat). Latched.</w:t>
+              <w:t xml:space="preserve">Makeup-cartridge TC over-temp HARD trip (backstop). SOFT fold-back first: above makeupHtrSoft (115) the duty scales down over makeupHtrFoldBand (15), never below makeupHtrMinDuty (0.12). Latched.</w:t>
             </w:r>
           </w:p>
         </w:tc>
@@ -5127,7 +5508,479 @@
                 <w:sz w:val="20"/>
                 <w:szCs w:val="20"/>
               </w:rPr>
-              <w:t xml:space="preserve">Wet-compression (low-superheat) trip, latched-arm.</w:t>
+              <w:t xml:space="preserve">Wet-compression (low-superheat) trip; arms only once the blower has REACHED its target rpm (soft-start ramp legitimately collapses superheat). Latched-arm.</w:t>
+            </w:r>
+          </w:p>
+        </w:tc>
+      </w:tr>
+      <w:tr>
+        <w:tc>
+          <w:tcPr>
+            <w:tcW w:type="dxa" w:w="2400"/>
+            <w:tcBorders>
+              <w:top w:val="single" w:color="BBBBBB" w:sz="1"/>
+              <w:left w:val="single" w:color="BBBBBB" w:sz="1"/>
+              <w:bottom w:val="single" w:color="BBBBBB" w:sz="1"/>
+              <w:right w:val="single" w:color="BBBBBB" w:sz="1"/>
+            </w:tcBorders>
+            <w:tcMar>
+              <w:top w:type="dxa" w:w="50"/>
+              <w:left w:type="dxa" w:w="110"/>
+              <w:bottom w:type="dxa" w:w="50"/>
+              <w:right w:type="dxa" w:w="110"/>
+            </w:tcMar>
+          </w:tcPr>
+          <w:p>
+            <w:r>
+              <w:rPr>
+                <w:rFonts w:ascii="Consolas" w:cs="Consolas" w:eastAsia="Consolas" w:hAnsi="Consolas"/>
+                <w:b w:val="false"/>
+                <w:bCs w:val="false"/>
+                <w:sz w:val="18"/>
+                <w:szCs w:val="18"/>
+              </w:rPr>
+              <w:t xml:space="preserve">evapHighMark</w:t>
+            </w:r>
+          </w:p>
+        </w:tc>
+        <w:tc>
+          <w:tcPr>
+            <w:tcW w:type="dxa" w:w="1100"/>
+            <w:tcBorders>
+              <w:top w:val="single" w:color="BBBBBB" w:sz="1"/>
+              <w:left w:val="single" w:color="BBBBBB" w:sz="1"/>
+              <w:bottom w:val="single" w:color="BBBBBB" w:sz="1"/>
+              <w:right w:val="single" w:color="BBBBBB" w:sz="1"/>
+            </w:tcBorders>
+            <w:tcMar>
+              <w:top w:type="dxa" w:w="50"/>
+              <w:left w:type="dxa" w:w="110"/>
+              <w:bottom w:type="dxa" w:w="50"/>
+              <w:right w:type="dxa" w:w="110"/>
+            </w:tcMar>
+          </w:tcPr>
+          <w:p>
+            <w:r>
+              <w:rPr>
+                <w:rFonts w:ascii="Arial" w:cs="Arial" w:eastAsia="Arial" w:hAnsi="Arial"/>
+                <w:b w:val="false"/>
+                <w:bCs w:val="false"/>
+                <w:sz w:val="20"/>
+                <w:szCs w:val="20"/>
+              </w:rPr>
+              <w:t xml:space="preserve">2750</w:t>
+            </w:r>
+          </w:p>
+        </w:tc>
+        <w:tc>
+          <w:tcPr>
+            <w:tcW w:type="dxa" w:w="800"/>
+            <w:tcBorders>
+              <w:top w:val="single" w:color="BBBBBB" w:sz="1"/>
+              <w:left w:val="single" w:color="BBBBBB" w:sz="1"/>
+              <w:bottom w:val="single" w:color="BBBBBB" w:sz="1"/>
+              <w:right w:val="single" w:color="BBBBBB" w:sz="1"/>
+            </w:tcBorders>
+            <w:tcMar>
+              <w:top w:type="dxa" w:w="50"/>
+              <w:left w:type="dxa" w:w="110"/>
+              <w:bottom w:type="dxa" w:w="50"/>
+              <w:right w:type="dxa" w:w="110"/>
+            </w:tcMar>
+          </w:tcPr>
+          <w:p>
+            <w:r>
+              <w:rPr>
+                <w:rFonts w:ascii="Arial" w:cs="Arial" w:eastAsia="Arial" w:hAnsi="Arial"/>
+                <w:b w:val="false"/>
+                <w:bCs w:val="false"/>
+                <w:sz w:val="20"/>
+                <w:szCs w:val="20"/>
+              </w:rPr>
+              <w:t xml:space="preserve">ml</w:t>
+            </w:r>
+          </w:p>
+        </w:tc>
+        <w:tc>
+          <w:tcPr>
+            <w:tcW w:type="dxa" w:w="5060"/>
+            <w:tcBorders>
+              <w:top w:val="single" w:color="BBBBBB" w:sz="1"/>
+              <w:left w:val="single" w:color="BBBBBB" w:sz="1"/>
+              <w:bottom w:val="single" w:color="BBBBBB" w:sz="1"/>
+              <w:right w:val="single" w:color="BBBBBB" w:sz="1"/>
+            </w:tcBorders>
+            <w:tcMar>
+              <w:top w:type="dxa" w:w="50"/>
+              <w:left w:type="dxa" w:w="110"/>
+              <w:bottom w:type="dxa" w:w="50"/>
+              <w:right w:type="dxa" w:w="110"/>
+            </w:tcMar>
+          </w:tcPr>
+          <w:p>
+            <w:r>
+              <w:rPr>
+                <w:rFonts w:ascii="Arial" w:cs="Arial" w:eastAsia="Arial" w:hAnsi="Arial"/>
+                <w:b w:val="false"/>
+                <w:bCs w:val="false"/>
+                <w:sz w:val="20"/>
+                <w:szCs w:val="20"/>
+              </w:rPr>
+              <w:t xml:space="preserve">HIGH-LEVEL WARNING (2600|2900 plateau edge, trips on the 2900 plateau; E-TC DIN float ORed in): latched UI popup + FeedFollow cuts the feed. NOT during PURGE -- an overfull warm start reads HIGH while the purge is draining it. Not a hard trip.</w:t>
+            </w:r>
+          </w:p>
+        </w:tc>
+      </w:tr>
+      <w:tr>
+        <w:tc>
+          <w:tcPr>
+            <w:tcW w:type="dxa" w:w="2400"/>
+            <w:tcBorders>
+              <w:top w:val="single" w:color="BBBBBB" w:sz="1"/>
+              <w:left w:val="single" w:color="BBBBBB" w:sz="1"/>
+              <w:bottom w:val="single" w:color="BBBBBB" w:sz="1"/>
+              <w:right w:val="single" w:color="BBBBBB" w:sz="1"/>
+            </w:tcBorders>
+            <w:tcMar>
+              <w:top w:type="dxa" w:w="50"/>
+              <w:left w:type="dxa" w:w="110"/>
+              <w:bottom w:type="dxa" w:w="50"/>
+              <w:right w:type="dxa" w:w="110"/>
+            </w:tcMar>
+          </w:tcPr>
+          <w:p>
+            <w:r>
+              <w:rPr>
+                <w:rFonts w:ascii="Consolas" w:cs="Consolas" w:eastAsia="Consolas" w:hAnsi="Consolas"/>
+                <w:b w:val="false"/>
+                <w:bCs w:val="false"/>
+                <w:sz w:val="18"/>
+                <w:szCs w:val="18"/>
+              </w:rPr>
+              <w:t xml:space="preserve">senderFaultS / senderErr</w:t>
+            </w:r>
+          </w:p>
+        </w:tc>
+        <w:tc>
+          <w:tcPr>
+            <w:tcW w:type="dxa" w:w="1100"/>
+            <w:tcBorders>
+              <w:top w:val="single" w:color="BBBBBB" w:sz="1"/>
+              <w:left w:val="single" w:color="BBBBBB" w:sz="1"/>
+              <w:bottom w:val="single" w:color="BBBBBB" w:sz="1"/>
+              <w:right w:val="single" w:color="BBBBBB" w:sz="1"/>
+            </w:tcBorders>
+            <w:tcMar>
+              <w:top w:type="dxa" w:w="50"/>
+              <w:left w:type="dxa" w:w="110"/>
+              <w:bottom w:type="dxa" w:w="50"/>
+              <w:right w:type="dxa" w:w="110"/>
+            </w:tcMar>
+          </w:tcPr>
+          <w:p>
+            <w:r>
+              <w:rPr>
+                <w:rFonts w:ascii="Arial" w:cs="Arial" w:eastAsia="Arial" w:hAnsi="Arial"/>
+                <w:b w:val="false"/>
+                <w:bCs w:val="false"/>
+                <w:sz w:val="20"/>
+                <w:szCs w:val="20"/>
+              </w:rPr>
+              <w:t xml:space="preserve">2 / latch</w:t>
+            </w:r>
+          </w:p>
+        </w:tc>
+        <w:tc>
+          <w:tcPr>
+            <w:tcW w:type="dxa" w:w="800"/>
+            <w:tcBorders>
+              <w:top w:val="single" w:color="BBBBBB" w:sz="1"/>
+              <w:left w:val="single" w:color="BBBBBB" w:sz="1"/>
+              <w:bottom w:val="single" w:color="BBBBBB" w:sz="1"/>
+              <w:right w:val="single" w:color="BBBBBB" w:sz="1"/>
+            </w:tcBorders>
+            <w:tcMar>
+              <w:top w:type="dxa" w:w="50"/>
+              <w:left w:type="dxa" w:w="110"/>
+              <w:bottom w:type="dxa" w:w="50"/>
+              <w:right w:type="dxa" w:w="110"/>
+            </w:tcMar>
+          </w:tcPr>
+          <w:p>
+            <w:r>
+              <w:rPr>
+                <w:rFonts w:ascii="Arial" w:cs="Arial" w:eastAsia="Arial" w:hAnsi="Arial"/>
+                <w:b w:val="false"/>
+                <w:bCs w:val="false"/>
+                <w:sz w:val="20"/>
+                <w:szCs w:val="20"/>
+              </w:rPr>
+              <w:t xml:space="preserve">s</w:t>
+            </w:r>
+          </w:p>
+        </w:tc>
+        <w:tc>
+          <w:tcPr>
+            <w:tcW w:type="dxa" w:w="5060"/>
+            <w:tcBorders>
+              <w:top w:val="single" w:color="BBBBBB" w:sz="1"/>
+              <w:left w:val="single" w:color="BBBBBB" w:sz="1"/>
+              <w:bottom w:val="single" w:color="BBBBBB" w:sz="1"/>
+              <w:right w:val="single" w:color="BBBBBB" w:sz="1"/>
+            </w:tcBorders>
+            <w:tcMar>
+              <w:top w:type="dxa" w:w="50"/>
+              <w:left w:type="dxa" w:w="110"/>
+              <w:bottom w:type="dxa" w:w="50"/>
+              <w:right w:type="dxa" w:w="110"/>
+            </w:tcMar>
+          </w:tcPr>
+          <w:p>
+            <w:r>
+              <w:rPr>
+                <w:rFonts w:ascii="Arial" w:cs="Arial" w:eastAsia="Arial" w:hAnsi="Arial"/>
+                <w:b w:val="false"/>
+                <w:bCs w:val="false"/>
+                <w:sz w:val="20"/>
+                <w:szCs w:val="20"/>
+              </w:rPr>
+              <w:t xml:space="preserve">Level-sender open/short (V outside -0.3..3.3) while running, debounced -&gt; LATCHED trip + popup (a dead sender mid-run would read 'all dry' and slow-flood). Clears on stop.</w:t>
+            </w:r>
+          </w:p>
+        </w:tc>
+      </w:tr>
+      <w:tr>
+        <w:tc>
+          <w:tcPr>
+            <w:tcW w:type="dxa" w:w="2400"/>
+            <w:tcBorders>
+              <w:top w:val="single" w:color="BBBBBB" w:sz="1"/>
+              <w:left w:val="single" w:color="BBBBBB" w:sz="1"/>
+              <w:bottom w:val="single" w:color="BBBBBB" w:sz="1"/>
+              <w:right w:val="single" w:color="BBBBBB" w:sz="1"/>
+            </w:tcBorders>
+            <w:tcMar>
+              <w:top w:type="dxa" w:w="50"/>
+              <w:left w:type="dxa" w:w="110"/>
+              <w:bottom w:type="dxa" w:w="50"/>
+              <w:right w:type="dxa" w:w="110"/>
+            </w:tcMar>
+          </w:tcPr>
+          <w:p>
+            <w:r>
+              <w:rPr>
+                <w:rFonts w:ascii="Consolas" w:cs="Consolas" w:eastAsia="Consolas" w:hAnsi="Consolas"/>
+                <w:b w:val="false"/>
+                <w:bCs w:val="false"/>
+                <w:sz w:val="18"/>
+                <w:szCs w:val="18"/>
+              </w:rPr>
+              <w:t xml:space="preserve">purgeStallS / purgeErr</w:t>
+            </w:r>
+          </w:p>
+        </w:tc>
+        <w:tc>
+          <w:tcPr>
+            <w:tcW w:type="dxa" w:w="1100"/>
+            <w:tcBorders>
+              <w:top w:val="single" w:color="BBBBBB" w:sz="1"/>
+              <w:left w:val="single" w:color="BBBBBB" w:sz="1"/>
+              <w:bottom w:val="single" w:color="BBBBBB" w:sz="1"/>
+              <w:right w:val="single" w:color="BBBBBB" w:sz="1"/>
+            </w:tcBorders>
+            <w:tcMar>
+              <w:top w:type="dxa" w:w="50"/>
+              <w:left w:type="dxa" w:w="110"/>
+              <w:bottom w:type="dxa" w:w="50"/>
+              <w:right w:type="dxa" w:w="110"/>
+            </w:tcMar>
+          </w:tcPr>
+          <w:p>
+            <w:r>
+              <w:rPr>
+                <w:rFonts w:ascii="Arial" w:cs="Arial" w:eastAsia="Arial" w:hAnsi="Arial"/>
+                <w:b w:val="false"/>
+                <w:bCs w:val="false"/>
+                <w:sz w:val="20"/>
+                <w:szCs w:val="20"/>
+              </w:rPr>
+              <w:t xml:space="preserve">240 / latch</w:t>
+            </w:r>
+          </w:p>
+        </w:tc>
+        <w:tc>
+          <w:tcPr>
+            <w:tcW w:type="dxa" w:w="800"/>
+            <w:tcBorders>
+              <w:top w:val="single" w:color="BBBBBB" w:sz="1"/>
+              <w:left w:val="single" w:color="BBBBBB" w:sz="1"/>
+              <w:bottom w:val="single" w:color="BBBBBB" w:sz="1"/>
+              <w:right w:val="single" w:color="BBBBBB" w:sz="1"/>
+            </w:tcBorders>
+            <w:tcMar>
+              <w:top w:type="dxa" w:w="50"/>
+              <w:left w:type="dxa" w:w="110"/>
+              <w:bottom w:type="dxa" w:w="50"/>
+              <w:right w:type="dxa" w:w="110"/>
+            </w:tcMar>
+          </w:tcPr>
+          <w:p>
+            <w:r>
+              <w:rPr>
+                <w:rFonts w:ascii="Arial" w:cs="Arial" w:eastAsia="Arial" w:hAnsi="Arial"/>
+                <w:b w:val="false"/>
+                <w:bCs w:val="false"/>
+                <w:sz w:val="20"/>
+                <w:szCs w:val="20"/>
+              </w:rPr>
+              <w:t xml:space="preserve">s</w:t>
+            </w:r>
+          </w:p>
+        </w:tc>
+        <w:tc>
+          <w:tcPr>
+            <w:tcW w:type="dxa" w:w="5060"/>
+            <w:tcBorders>
+              <w:top w:val="single" w:color="BBBBBB" w:sz="1"/>
+              <w:left w:val="single" w:color="BBBBBB" w:sz="1"/>
+              <w:bottom w:val="single" w:color="BBBBBB" w:sz="1"/>
+              <w:right w:val="single" w:color="BBBBBB" w:sz="1"/>
+            </w:tcBorders>
+            <w:tcMar>
+              <w:top w:type="dxa" w:w="50"/>
+              <w:left w:type="dxa" w:w="110"/>
+              <w:bottom w:type="dxa" w:w="50"/>
+              <w:right w:type="dxa" w:w="110"/>
+            </w:tcMar>
+          </w:tcPr>
+          <w:p>
+            <w:r>
+              <w:rPr>
+                <w:rFonts w:ascii="Arial" w:cs="Arial" w:eastAsia="Arial" w:hAnsi="Arial"/>
+                <w:b w:val="false"/>
+                <w:bCs w:val="false"/>
+                <w:sz w:val="20"/>
+                <w:szCs w:val="20"/>
+              </w:rPr>
+              <w:t xml:space="preserve">PURGE watchdog: level must keep dropping while purging with a good sender (disarmed once bottom is reached). Stall = pump/direction fault -&gt; LATCHED trip + popup.</w:t>
+            </w:r>
+          </w:p>
+        </w:tc>
+      </w:tr>
+      <w:tr>
+        <w:tc>
+          <w:tcPr>
+            <w:tcW w:type="dxa" w:w="2400"/>
+            <w:tcBorders>
+              <w:top w:val="single" w:color="BBBBBB" w:sz="1"/>
+              <w:left w:val="single" w:color="BBBBBB" w:sz="1"/>
+              <w:bottom w:val="single" w:color="BBBBBB" w:sz="1"/>
+              <w:right w:val="single" w:color="BBBBBB" w:sz="1"/>
+            </w:tcBorders>
+            <w:tcMar>
+              <w:top w:type="dxa" w:w="50"/>
+              <w:left w:type="dxa" w:w="110"/>
+              <w:bottom w:type="dxa" w:w="50"/>
+              <w:right w:type="dxa" w:w="110"/>
+            </w:tcMar>
+          </w:tcPr>
+          <w:p>
+            <w:r>
+              <w:rPr>
+                <w:rFonts w:ascii="Consolas" w:cs="Consolas" w:eastAsia="Consolas" w:hAnsi="Consolas"/>
+                <w:b w:val="false"/>
+                <w:bCs w:val="false"/>
+                <w:sz w:val="18"/>
+                <w:szCs w:val="18"/>
+              </w:rPr>
+              <w:t xml:space="preserve">Flood trip</w:t>
+            </w:r>
+          </w:p>
+        </w:tc>
+        <w:tc>
+          <w:tcPr>
+            <w:tcW w:type="dxa" w:w="1100"/>
+            <w:tcBorders>
+              <w:top w:val="single" w:color="BBBBBB" w:sz="1"/>
+              <w:left w:val="single" w:color="BBBBBB" w:sz="1"/>
+              <w:bottom w:val="single" w:color="BBBBBB" w:sz="1"/>
+              <w:right w:val="single" w:color="BBBBBB" w:sz="1"/>
+            </w:tcBorders>
+            <w:tcMar>
+              <w:top w:type="dxa" w:w="50"/>
+              <w:left w:type="dxa" w:w="110"/>
+              <w:bottom w:type="dxa" w:w="50"/>
+              <w:right w:type="dxa" w:w="110"/>
+            </w:tcMar>
+          </w:tcPr>
+          <w:p>
+            <w:r>
+              <w:rPr>
+                <w:rFonts w:ascii="Arial" w:cs="Arial" w:eastAsia="Arial" w:hAnsi="Arial"/>
+                <w:b w:val="false"/>
+                <w:bCs w:val="false"/>
+                <w:sz w:val="20"/>
+                <w:szCs w:val="20"/>
+              </w:rPr>
+              <w:t xml:space="preserve">AND gate</w:t>
+            </w:r>
+          </w:p>
+        </w:tc>
+        <w:tc>
+          <w:tcPr>
+            <w:tcW w:type="dxa" w:w="800"/>
+            <w:tcBorders>
+              <w:top w:val="single" w:color="BBBBBB" w:sz="1"/>
+              <w:left w:val="single" w:color="BBBBBB" w:sz="1"/>
+              <w:bottom w:val="single" w:color="BBBBBB" w:sz="1"/>
+              <w:right w:val="single" w:color="BBBBBB" w:sz="1"/>
+            </w:tcBorders>
+            <w:tcMar>
+              <w:top w:type="dxa" w:w="50"/>
+              <w:left w:type="dxa" w:w="110"/>
+              <w:bottom w:type="dxa" w:w="50"/>
+              <w:right w:type="dxa" w:w="110"/>
+            </w:tcMar>
+          </w:tcPr>
+          <w:p>
+            <w:r>
+              <w:rPr>
+                <w:rFonts w:ascii="Arial" w:cs="Arial" w:eastAsia="Arial" w:hAnsi="Arial"/>
+                <w:b w:val="false"/>
+                <w:bCs w:val="false"/>
+                <w:sz w:val="20"/>
+                <w:szCs w:val="20"/>
+              </w:rPr>
+              <w:t xml:space="preserve">-</w:t>
+            </w:r>
+          </w:p>
+        </w:tc>
+        <w:tc>
+          <w:tcPr>
+            <w:tcW w:type="dxa" w:w="5060"/>
+            <w:tcBorders>
+              <w:top w:val="single" w:color="BBBBBB" w:sz="1"/>
+              <w:left w:val="single" w:color="BBBBBB" w:sz="1"/>
+              <w:bottom w:val="single" w:color="BBBBBB" w:sz="1"/>
+              <w:right w:val="single" w:color="BBBBBB" w:sz="1"/>
+            </w:tcBorders>
+            <w:tcMar>
+              <w:top w:type="dxa" w:w="50"/>
+              <w:left w:type="dxa" w:w="110"/>
+              <w:bottom w:type="dxa" w:w="50"/>
+              <w:right w:type="dxa" w:w="110"/>
+            </w:tcMar>
+          </w:tcPr>
+          <w:p>
+            <w:r>
+              <w:rPr>
+                <w:rFonts w:ascii="Arial" w:cs="Arial" w:eastAsia="Arial" w:hAnsi="Arial"/>
+                <w:b w:val="false"/>
+                <w:bCs w:val="false"/>
+                <w:sz w:val="20"/>
+                <w:szCs w:val="20"/>
+              </w:rPr>
+              <w:t xml:space="preserve">DemisterFlood counts only when DemisterWater is ALSO wet: flood physically sits above the demist sensor, so a real flood always has both; fog/condensation films the flood sensor alone (false-tripped on the rig).</w:t>
             </w:r>
           </w:p>
         </w:tc>
@@ -5575,7 +6428,7 @@
                 <w:sz w:val="20"/>
                 <w:szCs w:val="20"/>
               </w:rPr>
-              <w:t xml:space="preserve">40</w:t>
+              <w:t xml:space="preserve">20</w:t>
             </w:r>
           </w:p>
         </w:tc>
@@ -5633,7 +6486,7 @@
                 <w:sz w:val="20"/>
                 <w:szCs w:val="20"/>
               </w:rPr>
-              <w:t xml:space="preserve">Blower production-control gain.</w:t>
+              <w:t xml:space="preserve">Blower production-control gain. Anti-windup: the target is not raised while the soft-start/ramped command still lags it.</w:t>
             </w:r>
           </w:p>
         </w:tc>
@@ -5664,7 +6517,7 @@
                 <w:sz w:val="18"/>
                 <w:szCs w:val="18"/>
               </w:rPr>
-              <w:t xml:space="preserve">kFeedLevel</w:t>
+              <w:t xml:space="preserve">kFeedLevel / kFeedLevelI</w:t>
             </w:r>
           </w:p>
         </w:tc>
@@ -5693,7 +6546,7 @@
                 <w:sz w:val="20"/>
                 <w:szCs w:val="20"/>
               </w:rPr>
-              <w:t xml:space="preserve">0.003</w:t>
+              <w:t xml:space="preserve">0.015 / 0.0015</w:t>
             </w:r>
           </w:p>
         </w:tc>
@@ -5722,7 +6575,7 @@
                 <w:sz w:val="20"/>
                 <w:szCs w:val="20"/>
               </w:rPr>
-              <w:t xml:space="preserve">(L/min)/ml</w:t>
+              <w:t xml:space="preserve">(L/min)/ml, (L/min)/s</w:t>
             </w:r>
           </w:p>
         </w:tc>
@@ -5751,7 +6604,243 @@
                 <w:sz w:val="20"/>
                 <w:szCs w:val="20"/>
               </w:rPr>
-              <w:t xml:space="preserve">Feed level-control gain (0 = feed-forward only).</w:t>
+              <w:t xml:space="preserve">Feed level P gain (active OUTSIDE the deadband: fill + upset recovery) / slow edge-ride integral (INSIDE the deadband; the tight hold).</w:t>
+            </w:r>
+          </w:p>
+        </w:tc>
+      </w:tr>
+      <w:tr>
+        <w:tc>
+          <w:tcPr>
+            <w:tcW w:type="dxa" w:w="2200"/>
+            <w:tcBorders>
+              <w:top w:val="single" w:color="BBBBBB" w:sz="1"/>
+              <w:left w:val="single" w:color="BBBBBB" w:sz="1"/>
+              <w:bottom w:val="single" w:color="BBBBBB" w:sz="1"/>
+              <w:right w:val="single" w:color="BBBBBB" w:sz="1"/>
+            </w:tcBorders>
+            <w:tcMar>
+              <w:top w:type="dxa" w:w="50"/>
+              <w:left w:type="dxa" w:w="110"/>
+              <w:bottom w:type="dxa" w:w="50"/>
+              <w:right w:type="dxa" w:w="110"/>
+            </w:tcMar>
+          </w:tcPr>
+          <w:p>
+            <w:r>
+              <w:rPr>
+                <w:rFonts w:ascii="Consolas" w:cs="Consolas" w:eastAsia="Consolas" w:hAnsi="Consolas"/>
+                <w:b w:val="false"/>
+                <w:bCs w:val="false"/>
+                <w:sz w:val="18"/>
+                <w:szCs w:val="18"/>
+              </w:rPr>
+              <w:t xml:space="preserve">levelDeadML</w:t>
+            </w:r>
+          </w:p>
+        </w:tc>
+        <w:tc>
+          <w:tcPr>
+            <w:tcW w:type="dxa" w:w="1300"/>
+            <w:tcBorders>
+              <w:top w:val="single" w:color="BBBBBB" w:sz="1"/>
+              <w:left w:val="single" w:color="BBBBBB" w:sz="1"/>
+              <w:bottom w:val="single" w:color="BBBBBB" w:sz="1"/>
+              <w:right w:val="single" w:color="BBBBBB" w:sz="1"/>
+            </w:tcBorders>
+            <w:tcMar>
+              <w:top w:type="dxa" w:w="50"/>
+              <w:left w:type="dxa" w:w="110"/>
+              <w:bottom w:type="dxa" w:w="50"/>
+              <w:right w:type="dxa" w:w="110"/>
+            </w:tcMar>
+          </w:tcPr>
+          <w:p>
+            <w:r>
+              <w:rPr>
+                <w:rFonts w:ascii="Arial" w:cs="Arial" w:eastAsia="Arial" w:hAnsi="Arial"/>
+                <w:b w:val="false"/>
+                <w:bCs w:val="false"/>
+                <w:sz w:val="20"/>
+                <w:szCs w:val="20"/>
+              </w:rPr>
+              <w:t xml:space="preserve">100</w:t>
+            </w:r>
+          </w:p>
+        </w:tc>
+        <w:tc>
+          <w:tcPr>
+            <w:tcW w:type="dxa" w:w="1500"/>
+            <w:tcBorders>
+              <w:top w:val="single" w:color="BBBBBB" w:sz="1"/>
+              <w:left w:val="single" w:color="BBBBBB" w:sz="1"/>
+              <w:bottom w:val="single" w:color="BBBBBB" w:sz="1"/>
+              <w:right w:val="single" w:color="BBBBBB" w:sz="1"/>
+            </w:tcBorders>
+            <w:tcMar>
+              <w:top w:type="dxa" w:w="50"/>
+              <w:left w:type="dxa" w:w="110"/>
+              <w:bottom w:type="dxa" w:w="50"/>
+              <w:right w:type="dxa" w:w="110"/>
+            </w:tcMar>
+          </w:tcPr>
+          <w:p>
+            <w:r>
+              <w:rPr>
+                <w:rFonts w:ascii="Arial" w:cs="Arial" w:eastAsia="Arial" w:hAnsi="Arial"/>
+                <w:b w:val="false"/>
+                <w:bCs w:val="false"/>
+                <w:sz w:val="20"/>
+                <w:szCs w:val="20"/>
+              </w:rPr>
+              <w:t xml:space="preserve">ml</w:t>
+            </w:r>
+          </w:p>
+        </w:tc>
+        <w:tc>
+          <w:tcPr>
+            <w:tcW w:type="dxa" w:w="4360"/>
+            <w:tcBorders>
+              <w:top w:val="single" w:color="BBBBBB" w:sz="1"/>
+              <w:left w:val="single" w:color="BBBBBB" w:sz="1"/>
+              <w:bottom w:val="single" w:color="BBBBBB" w:sz="1"/>
+              <w:right w:val="single" w:color="BBBBBB" w:sz="1"/>
+            </w:tcBorders>
+            <w:tcMar>
+              <w:top w:type="dxa" w:w="50"/>
+              <w:left w:type="dxa" w:w="110"/>
+              <w:bottom w:type="dxa" w:w="50"/>
+              <w:right w:type="dxa" w:w="110"/>
+            </w:tcMar>
+          </w:tcPr>
+          <w:p>
+            <w:r>
+              <w:rPr>
+                <w:rFonts w:ascii="Arial" w:cs="Arial" w:eastAsia="Arial" w:hAnsi="Arial"/>
+                <w:b w:val="false"/>
+                <w:bCs w:val="false"/>
+                <w:sz w:val="20"/>
+                <w:szCs w:val="20"/>
+              </w:rPr>
+              <w:t xml:space="preserve">P deadband around the setpoint: P silent inside (the EvapMid edge integral rules), active outside.</w:t>
+            </w:r>
+          </w:p>
+        </w:tc>
+      </w:tr>
+      <w:tr>
+        <w:tc>
+          <w:tcPr>
+            <w:tcW w:type="dxa" w:w="2200"/>
+            <w:tcBorders>
+              <w:top w:val="single" w:color="BBBBBB" w:sz="1"/>
+              <w:left w:val="single" w:color="BBBBBB" w:sz="1"/>
+              <w:bottom w:val="single" w:color="BBBBBB" w:sz="1"/>
+              <w:right w:val="single" w:color="BBBBBB" w:sz="1"/>
+            </w:tcBorders>
+            <w:tcMar>
+              <w:top w:type="dxa" w:w="50"/>
+              <w:left w:type="dxa" w:w="110"/>
+              <w:bottom w:type="dxa" w:w="50"/>
+              <w:right w:type="dxa" w:w="110"/>
+            </w:tcMar>
+          </w:tcPr>
+          <w:p>
+            <w:r>
+              <w:rPr>
+                <w:rFonts w:ascii="Consolas" w:cs="Consolas" w:eastAsia="Consolas" w:hAnsi="Consolas"/>
+                <w:b w:val="false"/>
+                <w:bCs w:val="false"/>
+                <w:sz w:val="18"/>
+                <w:szCs w:val="18"/>
+              </w:rPr>
+              <w:t xml:space="preserve">senderSpanML / kLevelBias</w:t>
+            </w:r>
+          </w:p>
+        </w:tc>
+        <w:tc>
+          <w:tcPr>
+            <w:tcW w:type="dxa" w:w="1300"/>
+            <w:tcBorders>
+              <w:top w:val="single" w:color="BBBBBB" w:sz="1"/>
+              <w:left w:val="single" w:color="BBBBBB" w:sz="1"/>
+              <w:bottom w:val="single" w:color="BBBBBB" w:sz="1"/>
+              <w:right w:val="single" w:color="BBBBBB" w:sz="1"/>
+            </w:tcBorders>
+            <w:tcMar>
+              <w:top w:type="dxa" w:w="50"/>
+              <w:left w:type="dxa" w:w="110"/>
+              <w:bottom w:type="dxa" w:w="50"/>
+              <w:right w:type="dxa" w:w="110"/>
+            </w:tcMar>
+          </w:tcPr>
+          <w:p>
+            <w:r>
+              <w:rPr>
+                <w:rFonts w:ascii="Arial" w:cs="Arial" w:eastAsia="Arial" w:hAnsi="Arial"/>
+                <w:b w:val="false"/>
+                <w:bCs w:val="false"/>
+                <w:sz w:val="20"/>
+                <w:szCs w:val="20"/>
+              </w:rPr>
+              <w:t xml:space="preserve">200 / 0.0003</w:t>
+            </w:r>
+          </w:p>
+        </w:tc>
+        <w:tc>
+          <w:tcPr>
+            <w:tcW w:type="dxa" w:w="1500"/>
+            <w:tcBorders>
+              <w:top w:val="single" w:color="BBBBBB" w:sz="1"/>
+              <w:left w:val="single" w:color="BBBBBB" w:sz="1"/>
+              <w:bottom w:val="single" w:color="BBBBBB" w:sz="1"/>
+              <w:right w:val="single" w:color="BBBBBB" w:sz="1"/>
+            </w:tcBorders>
+            <w:tcMar>
+              <w:top w:type="dxa" w:w="50"/>
+              <w:left w:type="dxa" w:w="110"/>
+              <w:bottom w:type="dxa" w:w="50"/>
+              <w:right w:type="dxa" w:w="110"/>
+            </w:tcMar>
+          </w:tcPr>
+          <w:p>
+            <w:r>
+              <w:rPr>
+                <w:rFonts w:ascii="Arial" w:cs="Arial" w:eastAsia="Arial" w:hAnsi="Arial"/>
+                <w:b w:val="false"/>
+                <w:bCs w:val="false"/>
+                <w:sz w:val="20"/>
+                <w:szCs w:val="20"/>
+              </w:rPr>
+              <w:t xml:space="preserve">ml / (L/min)/ml</w:t>
+            </w:r>
+          </w:p>
+        </w:tc>
+        <w:tc>
+          <w:tcPr>
+            <w:tcW w:type="dxa" w:w="4360"/>
+            <w:tcBorders>
+              <w:top w:val="single" w:color="BBBBBB" w:sz="1"/>
+              <w:left w:val="single" w:color="BBBBBB" w:sz="1"/>
+              <w:bottom w:val="single" w:color="BBBBBB" w:sz="1"/>
+              <w:right w:val="single" w:color="BBBBBB" w:sz="1"/>
+            </w:tcBorders>
+            <w:tcMar>
+              <w:top w:type="dxa" w:w="50"/>
+              <w:left w:type="dxa" w:w="110"/>
+              <w:bottom w:type="dxa" w:w="50"/>
+              <w:right w:type="dxa" w:w="110"/>
+            </w:tcMar>
+          </w:tcPr>
+          <w:p>
+            <w:r>
+              <w:rPr>
+                <w:rFonts w:ascii="Arial" w:cs="Arial" w:eastAsia="Arial" w:hAnsi="Arial"/>
+                <w:b w:val="false"/>
+                <w:bCs w:val="false"/>
+                <w:sz w:val="20"/>
+                <w:szCs w:val="20"/>
+              </w:rPr>
+              <w:t xml:space="preserve">Fusion window half-width (estimate clamped to plateau center +/- this; no teaching) / rate-bias learning gain (only plateau-CHANGE midpoint snaps teach).</w:t>
             </w:r>
           </w:p>
         </w:tc>
@@ -8323,7 +9412,7 @@
                 <w:sz w:val="20"/>
                 <w:szCs w:val="20"/>
               </w:rPr>
-              <w:t xml:space="preserve">120</w:t>
+              <w:t xml:space="preserve">250</w:t>
             </w:r>
           </w:p>
         </w:tc>
@@ -8381,7 +9470,7 @@
                 <w:sz w:val="20"/>
                 <w:szCs w:val="20"/>
               </w:rPr>
-              <w:t xml:space="preserve">Feed rpm during the PRIME fill.</w:t>
+              <w:t xml:space="preserve">Feed rpm during the PRIME fill (~224 mL/min).</w:t>
             </w:r>
           </w:p>
         </w:tc>
@@ -8441,7 +9530,7 @@
                 <w:sz w:val="20"/>
                 <w:szCs w:val="20"/>
               </w:rPr>
-              <w:t xml:space="preserve">120</w:t>
+              <w:t xml:space="preserve">400</w:t>
             </w:r>
           </w:p>
         </w:tc>
@@ -8499,7 +9588,7 @@
                 <w:sz w:val="20"/>
                 <w:szCs w:val="20"/>
               </w:rPr>
-              <w:t xml:space="preserve">STARTUP PURGE: feed-pump REVERSE rpm that empties the feed/evap side to a known baseline before priming.</w:t>
+              <w:t xml:space="preserve">PURGE / EMPTY / SHUTDOWN: feed-pump REVERSE rpm (~359 mL/min).</w:t>
             </w:r>
           </w:p>
         </w:tc>
@@ -8530,7 +9619,7 @@
                 <w:sz w:val="18"/>
                 <w:szCs w:val="18"/>
               </w:rPr>
-              <w:t xml:space="preserve">purgeMaxML</w:t>
+              <w:t xml:space="preserve">purgeWarmEn</w:t>
             </w:r>
           </w:p>
         </w:tc>
@@ -8559,7 +9648,7 @@
                 <w:sz w:val="20"/>
                 <w:szCs w:val="20"/>
               </w:rPr>
-              <w:t xml:space="preserve">2000</w:t>
+              <w:t xml:space="preserve">1</w:t>
             </w:r>
           </w:p>
         </w:tc>
@@ -8588,7 +9677,7 @@
                 <w:sz w:val="20"/>
                 <w:szCs w:val="20"/>
               </w:rPr>
-              <w:t xml:space="preserve">ml</w:t>
+              <w:t xml:space="preserve">0 / 1</w:t>
             </w:r>
           </w:p>
         </w:tc>
@@ -8617,7 +9706,7 @@
                 <w:sz w:val="20"/>
                 <w:szCs w:val="20"/>
               </w:rPr>
-              <w:t xml:space="preserve">PURGE: ALWAYS reverse-pump this full volume at startup, BLIND. Evaporator contents are unknown at startup -- never trust a level reading here.</w:t>
+              <w:t xml:space="preserve">WARM-START purge: sender shows water at run start -&gt; pump down until the level has dropped AT LEAST ONE plateau (the drop-edge crossing snaps/calibrates the estimate) AND reads at/below the operating mark (an overfull-shutdown restart keeps pumping down to the mark -- coming from above, the last crossing IS the 2475 edge). Then PRIME/HEAT continue from that calibrated level -- no purge-to-dry + refill. 0 = always full purge.</w:t>
             </w:r>
           </w:p>
         </w:tc>
@@ -8648,7 +9737,7 @@
                 <w:sz w:val="18"/>
                 <w:szCs w:val="18"/>
               </w:rPr>
-              <w:t xml:space="preserve">yFeedEmpty / purgeEmptyML</w:t>
+              <w:t xml:space="preserve">purgeExtraML</w:t>
             </w:r>
           </w:p>
         </w:tc>
@@ -8677,7 +9766,7 @@
                 <w:sz w:val="20"/>
                 <w:szCs w:val="20"/>
               </w:rPr>
-              <w:t xml:space="preserve">sensor / 50</w:t>
+              <w:t xml:space="preserve">200</w:t>
             </w:r>
           </w:p>
         </w:tc>
@@ -8706,7 +9795,7 @@
                 <w:sz w:val="20"/>
                 <w:szCs w:val="20"/>
               </w:rPr>
-              <w:t xml:space="preserve">- / ml</w:t>
+              <w:t xml:space="preserve">ml</w:t>
             </w:r>
           </w:p>
         </w:tc>
@@ -8735,7 +9824,7 @@
                 <w:sz w:val="20"/>
                 <w:szCs w:val="20"/>
               </w:rPr>
-              <w:t xml:space="preserve">Input level detector = empty (real sensor; sim: evaporator inventory below purgeEmptyML). Monitoring only -- does NOT shorten the purge.</w:t>
+              <w:t xml:space="preserve">FULL purge only: after the sender reads BOTTOM (plateau 0), keep reverse-pumping this much more (dead-reckoned) -- water below the float pickup is still in there.</w:t>
             </w:r>
           </w:p>
         </w:tc>
@@ -8766,7 +9855,7 @@
                 <w:sz w:val="18"/>
                 <w:szCs w:val="18"/>
               </w:rPr>
-              <w:t xml:space="preserve">EvapLowLevel (AI6) / evapLowMark</w:t>
+              <w:t xml:space="preserve">purgeMaxML</w:t>
             </w:r>
           </w:p>
         </w:tc>
@@ -8795,7 +9884,7 @@
                 <w:sz w:val="20"/>
                 <w:szCs w:val="20"/>
               </w:rPr>
-              <w:t xml:space="preserve">wet-dry / 750</w:t>
+              <w:t xml:space="preserve">2000</w:t>
             </w:r>
           </w:p>
         </w:tc>
@@ -8824,7 +9913,7 @@
                 <w:sz w:val="20"/>
                 <w:szCs w:val="20"/>
               </w:rPr>
-              <w:t xml:space="preserve">0-5V / ml</w:t>
+              <w:t xml:space="preserve">ml</w:t>
             </w:r>
           </w:p>
         </w:tc>
@@ -8853,7 +9942,7 @@
                 <w:sz w:val="20"/>
                 <w:szCs w:val="20"/>
               </w:rPr>
-              <w:t xml:space="preserve">LOW sight-glass sensor: heater-covered floor + wet-confirm to heat. WET above evapLowMark (sim); real: AI &gt; 2.5V. Heater covered ~550ml (simHtrCoverML).</w:t>
+              <w:t xml:space="preserve">FULL-purge backstop: blind reverse-pump cap, used only if the level sender is faulted (normally the purge stops at bottom + purgeExtraML, or at the mark on a warm start).</w:t>
             </w:r>
           </w:p>
         </w:tc>
@@ -8884,7 +9973,7 @@
                 <w:sz w:val="18"/>
                 <w:szCs w:val="18"/>
               </w:rPr>
-              <w:t xml:space="preserve">EvapMidLevel (AI7) / evapMidMark</w:t>
+              <w:t xml:space="preserve">emptyMaxML</w:t>
             </w:r>
           </w:p>
         </w:tc>
@@ -8913,7 +10002,7 @@
                 <w:sz w:val="20"/>
                 <w:szCs w:val="20"/>
               </w:rPr>
-              <w:t xml:space="preserve">wet-dry / 2000</w:t>
+              <w:t xml:space="preserve">4000</w:t>
             </w:r>
           </w:p>
         </w:tc>
@@ -8942,7 +10031,7 @@
                 <w:sz w:val="20"/>
                 <w:szCs w:val="20"/>
               </w:rPr>
-              <w:t xml:space="preserve">0-5V / ml</w:t>
+              <w:t xml:space="preserve">ml</w:t>
             </w:r>
           </w:p>
         </w:tc>
@@ -8971,7 +10060,7 @@
                 <w:sz w:val="20"/>
                 <w:szCs w:val="20"/>
               </w:rPr>
-              <w:t xml:space="preserve">OPERATING-level sight-glass sensor (~3/4 up HX). The feed holds the level AT this mark via a slow wet/dry integral.</w:t>
+              <w:t xml:space="preserve">EMPTY/SHUTDOWN drain backstop: must exceed a FULL operating charge (~2.5 L) + purgeExtraML. (purgeMaxML is sized for the startup residual and would cut a full-charge drain short.)</w:t>
             </w:r>
           </w:p>
         </w:tc>
@@ -9002,7 +10091,7 @@
                 <w:sz w:val="18"/>
                 <w:szCs w:val="18"/>
               </w:rPr>
-              <w:t xml:space="preserve">evapLevelSet / kFeedLevel / kFeedLevelI / levelDeadML</w:t>
+              <w:t xml:space="preserve">yFeedEmpty / purgeEmptyML</w:t>
             </w:r>
           </w:p>
         </w:tc>
@@ -9031,7 +10120,7 @@
                 <w:sz w:val="20"/>
                 <w:szCs w:val="20"/>
               </w:rPr>
-              <w:t xml:space="preserve">3025 / 0.015 / 0.0015 / 100</w:t>
+              <w:t xml:space="preserve">sensor / 50</w:t>
             </w:r>
           </w:p>
         </w:tc>
@@ -9060,7 +10149,7 @@
                 <w:sz w:val="20"/>
                 <w:szCs w:val="20"/>
               </w:rPr>
-              <w:t xml:space="preserve">ml / (L/min/mL) / (L/min/s) / ml</w:t>
+              <w:t xml:space="preserve">- / ml</w:t>
             </w:r>
           </w:p>
         </w:tc>
@@ -9089,7 +10178,7 @@
                 <w:sz w:val="20"/>
                 <w:szCs w:val="20"/>
               </w:rPr>
-              <w:t xml:space="preserve">Operating level = the 2900|3150 plateau edge = the measured 75%-full point (cal notes: 70%=2900, 80%=3150). Mid-edge INTEGRAL rides the edge; P outside the deadband recovers fill/upsets. Holds ~3019..3032 (band ~13mL) in sim.</w:t>
+              <w:t xml:space="preserve">Input level detector = empty (real sensor; sim: evaporator inventory below purgeEmptyML). Monitoring only.</w:t>
             </w:r>
           </w:p>
         </w:tc>
@@ -9120,7 +10209,7 @@
                 <w:sz w:val="18"/>
                 <w:szCs w:val="18"/>
               </w:rPr>
-              <w:t xml:space="preserve">Tank-gauge sender (AI6 EvapLevel)</w:t>
+              <w:t xml:space="preserve">evapLowMark</w:t>
             </w:r>
           </w:p>
         </w:tc>
@@ -9149,7 +10238,7 @@
                 <w:sz w:val="20"/>
                 <w:szCs w:val="20"/>
               </w:rPr>
-              <w:t xml:space="preserve">cal table</w:t>
+              <w:t xml:space="preserve">750</w:t>
             </w:r>
           </w:p>
         </w:tc>
@@ -9178,7 +10267,7 @@
                 <w:sz w:val="20"/>
                 <w:szCs w:val="20"/>
               </w:rPr>
-              <w:t xml:space="preserve">V -&gt; ml</w:t>
+              <w:t xml:space="preserve">ml</w:t>
             </w:r>
           </w:p>
         </w:tc>
@@ -9207,7 +10296,7 @@
                 <w:sz w:val="20"/>
                 <w:szCs w:val="20"/>
               </w:rPr>
-              <w:t xml:space="preserve">33-240ohm arm-float sender + 550ohm (4x2.2k parallel) pullup to REGULATED 12V. AI6 slope -1.0 / offset 3.68 (KEEP: the cal is in these scaled volts; dry=0V, full ~3.0V, uh-oh-full 3600ml). Level-vs-ohms is strongly NONLINEAR (arm swing + tank geometry), so the decode is the MEASURED 14-plateau table (MVR Level Cal.csv) mapping scaled V -&gt; plateau-center ml. Valid range -0.3..3.3V; outside (open wire = negative, short = 3.68) -&gt; all switches DRY, no heat. Level switches derive from the decoded plateau: low 750 (587|850 edge), mid 3025 (2900|3150 edge = the measured 75%-FULL point = operating), high 3250 (trips on the 3.0V full plateau ~3325; spill into the demister only past ~3.8L). feedInvEst FUSED: dead-reckon + plateau-change midpoint snaps (teach the rate-bias) + span window (+/-senderSpanML 200, no teaching).</w:t>
+              <w:t xml:space="preserve">LOW mark (587|850 plateau edge, physical ~720): heater-covered floor + PRIME wet-confirm. Heater covered ~550ml (simHtrCoverML).</w:t>
             </w:r>
           </w:p>
         </w:tc>
@@ -9238,7 +10327,7 @@
                 <w:sz w:val="18"/>
                 <w:szCs w:val="18"/>
               </w:rPr>
-              <w:t xml:space="preserve">condCalFactor</w:t>
+              <w:t xml:space="preserve">evapMidMark</w:t>
             </w:r>
           </w:p>
         </w:tc>
@@ -9267,7 +10356,7 @@
                 <w:sz w:val="20"/>
                 <w:szCs w:val="20"/>
               </w:rPr>
-              <w:t xml:space="preserve">1.0 (MANUAL)</w:t>
+              <w:t xml:space="preserve">2475</w:t>
             </w:r>
           </w:p>
         </w:tc>
@@ -9296,7 +10385,7 @@
                 <w:sz w:val="20"/>
                 <w:szCs w:val="20"/>
               </w:rPr>
-              <w:t xml:space="preserve">x</w:t>
+              <w:t xml:space="preserve">ml</w:t>
             </w:r>
           </w:p>
         </w:tc>
@@ -9325,7 +10414,7 @@
                 <w:sz w:val="20"/>
                 <w:szCs w:val="20"/>
               </w:rPr>
-              <w:t xml:space="preserve">Flow-meter cal -- set ONCE against the feed pump at steady level: distillate = feed/(1+blowdownFrac). Auto-cal removed (it looped through the blower production control).</w:t>
+              <w:t xml:space="preserve">OPERATING mark (2350|2600 plateau edge, ~2.5 L) = evapLevelSet. The feed holds the level here (deadband P + edge integral, 2.2a).</w:t>
             </w:r>
           </w:p>
         </w:tc>
@@ -9356,7 +10445,7 @@
                 <w:sz w:val="18"/>
                 <w:szCs w:val="18"/>
               </w:rPr>
-              <w:t xml:space="preserve">evapLevelCheckML</w:t>
+              <w:t xml:space="preserve">Tank-gauge sender (AI6 EvapLevel)</w:t>
             </w:r>
           </w:p>
         </w:tc>
@@ -9385,7 +10474,7 @@
                 <w:sz w:val="20"/>
                 <w:szCs w:val="20"/>
               </w:rPr>
-              <w:t xml:space="preserve">1000</w:t>
+              <w:t xml:space="preserve">cal table</w:t>
             </w:r>
           </w:p>
         </w:tc>
@@ -9414,7 +10503,7 @@
                 <w:sz w:val="20"/>
                 <w:szCs w:val="20"/>
               </w:rPr>
-              <w:t xml:space="preserve">ml</w:t>
+              <w:t xml:space="preserve">V -&gt; ml</w:t>
             </w:r>
           </w:p>
         </w:tc>
@@ -9443,7 +10532,7 @@
                 <w:sz w:val="20"/>
                 <w:szCs w:val="20"/>
               </w:rPr>
-              <w:t xml:space="preserve">PRIME verify: if this much fill is dead-reckoned and EvapLow is still DRY -&gt; evapLevelErr fault + popup (feed-pump or sensor failure).</w:t>
+              <w:t xml:space="preserve">33-240ohm arm-float sender + 550ohm (4x2.2k parallel) pullup to REGULATED 12V. AI6 slope -1.0 / offset 3.68 (KEEP: the cal is in these scaled volts; dry=0V, full ~3.0V, uh-oh-full 3600ml). Level-vs-ohms is strongly NONLINEAR (arm swing + tank geometry), so the decode is the MEASURED 14-plateau table (MVR Level Cal.csv) mapping scaled V -&gt; plateau-center ml. Valid range -0.3..3.3V; outside (open wire = negative, short = 3.68) -&gt; all switches DRY, no heat (+ senderErr trip mid-run). Level switches derive from the decoded plateau: low 750, mid/operating 2475, high-warn 2750. feedInvEst FUSED: dead-reckon + plateau-change midpoint snaps (teach the rate-bias) + span window (+/-senderSpanML, no teaching). HARDWARE: the gauge vent line ties to the EVAP VAPOR SPACE (connected-vessel manometer), so the sender reads TRUE level at any evaporator pressure -- keep that vent line sloped so condensate drains (a water slug in it re-creates an offset).</w:t>
             </w:r>
           </w:p>
         </w:tc>
@@ -9474,7 +10563,7 @@
                 <w:sz w:val="18"/>
                 <w:szCs w:val="18"/>
               </w:rPr>
-              <w:t xml:space="preserve">feedInvEst</w:t>
+              <w:t xml:space="preserve">condCalFactor</w:t>
             </w:r>
           </w:p>
         </w:tc>
@@ -9503,7 +10592,7 @@
                 <w:sz w:val="20"/>
                 <w:szCs w:val="20"/>
               </w:rPr>
-              <w:t xml:space="preserve">0 (-&gt;~1500)</w:t>
+              <w:t xml:space="preserve">1.0 (MANUAL)</w:t>
             </w:r>
           </w:p>
         </w:tc>
@@ -9532,7 +10621,7 @@
                 <w:sz w:val="20"/>
                 <w:szCs w:val="20"/>
               </w:rPr>
-              <w:t xml:space="preserve">ml</w:t>
+              <w:t xml:space="preserve">x</w:t>
             </w:r>
           </w:p>
         </w:tc>
@@ -9561,7 +10650,7 @@
                 <w:sz w:val="20"/>
                 <w:szCs w:val="20"/>
               </w:rPr>
-              <w:t xml:space="preserve">Feed-side inventory dead-reckon: feed in - distillate out. Watch for 'getting low'.</w:t>
+              <w:t xml:space="preserve">Flow-meter cal -- set ONCE against the feed pump at steady level: distillate = feed/(1+blowdownFrac). Auto-cal removed (it looped through the blower production control).</w:t>
             </w:r>
           </w:p>
         </w:tc>
@@ -9592,7 +10681,7 @@
                 <w:sz w:val="18"/>
                 <w:szCs w:val="18"/>
               </w:rPr>
-              <w:t xml:space="preserve">condTubeTripML</w:t>
+              <w:t xml:space="preserve">evapLevelCheckML</w:t>
             </w:r>
           </w:p>
         </w:tc>
@@ -9621,7 +10710,7 @@
                 <w:sz w:val="20"/>
                 <w:szCs w:val="20"/>
               </w:rPr>
-              <w:t xml:space="preserve">130</w:t>
+              <w:t xml:space="preserve">1000</w:t>
             </w:r>
           </w:p>
         </w:tc>
@@ -9679,7 +10768,7 @@
                 <w:sz w:val="20"/>
                 <w:szCs w:val="20"/>
               </w:rPr>
-              <w:t xml:space="preserve">Volume in the HX bottom tube at the ~3/4 sensor (1.16in ID x 7.5in). The nominal distillate batch.</w:t>
+              <w:t xml:space="preserve">PRIME verify: if this much fill is dead-reckoned and EvapLow is still DRY -&gt; evapLevelErr fault + popup (feed-pump or sensor failure).</w:t>
             </w:r>
           </w:p>
         </w:tc>
@@ -9710,6 +10799,360 @@
                 <w:sz w:val="18"/>
                 <w:szCs w:val="18"/>
               </w:rPr>
+              <w:t xml:space="preserve">feedInvEst</w:t>
+            </w:r>
+          </w:p>
+        </w:tc>
+        <w:tc>
+          <w:tcPr>
+            <w:tcW w:type="dxa" w:w="1400"/>
+            <w:tcBorders>
+              <w:top w:val="single" w:color="BBBBBB" w:sz="1"/>
+              <w:left w:val="single" w:color="BBBBBB" w:sz="1"/>
+              <w:bottom w:val="single" w:color="BBBBBB" w:sz="1"/>
+              <w:right w:val="single" w:color="BBBBBB" w:sz="1"/>
+            </w:tcBorders>
+            <w:tcMar>
+              <w:top w:type="dxa" w:w="50"/>
+              <w:left w:type="dxa" w:w="110"/>
+              <w:bottom w:type="dxa" w:w="50"/>
+              <w:right w:type="dxa" w:w="110"/>
+            </w:tcMar>
+          </w:tcPr>
+          <w:p>
+            <w:r>
+              <w:rPr>
+                <w:rFonts w:ascii="Arial" w:cs="Arial" w:eastAsia="Arial" w:hAnsi="Arial"/>
+                <w:b w:val="false"/>
+                <w:bCs w:val="false"/>
+                <w:sz w:val="20"/>
+                <w:szCs w:val="20"/>
+              </w:rPr>
+              <w:t xml:space="preserve">0 (-&gt;~2475)</w:t>
+            </w:r>
+          </w:p>
+        </w:tc>
+        <w:tc>
+          <w:tcPr>
+            <w:tcW w:type="dxa" w:w="2000"/>
+            <w:tcBorders>
+              <w:top w:val="single" w:color="BBBBBB" w:sz="1"/>
+              <w:left w:val="single" w:color="BBBBBB" w:sz="1"/>
+              <w:bottom w:val="single" w:color="BBBBBB" w:sz="1"/>
+              <w:right w:val="single" w:color="BBBBBB" w:sz="1"/>
+            </w:tcBorders>
+            <w:tcMar>
+              <w:top w:type="dxa" w:w="50"/>
+              <w:left w:type="dxa" w:w="110"/>
+              <w:bottom w:type="dxa" w:w="50"/>
+              <w:right w:type="dxa" w:w="110"/>
+            </w:tcMar>
+          </w:tcPr>
+          <w:p>
+            <w:r>
+              <w:rPr>
+                <w:rFonts w:ascii="Arial" w:cs="Arial" w:eastAsia="Arial" w:hAnsi="Arial"/>
+                <w:b w:val="false"/>
+                <w:bCs w:val="false"/>
+                <w:sz w:val="20"/>
+                <w:szCs w:val="20"/>
+              </w:rPr>
+              <w:t xml:space="preserve">ml</w:t>
+            </w:r>
+          </w:p>
+        </w:tc>
+        <w:tc>
+          <w:tcPr>
+            <w:tcW w:type="dxa" w:w="3960"/>
+            <w:tcBorders>
+              <w:top w:val="single" w:color="BBBBBB" w:sz="1"/>
+              <w:left w:val="single" w:color="BBBBBB" w:sz="1"/>
+              <w:bottom w:val="single" w:color="BBBBBB" w:sz="1"/>
+              <w:right w:val="single" w:color="BBBBBB" w:sz="1"/>
+            </w:tcBorders>
+            <w:tcMar>
+              <w:top w:type="dxa" w:w="50"/>
+              <w:left w:type="dxa" w:w="110"/>
+              <w:bottom w:type="dxa" w:w="50"/>
+              <w:right w:type="dxa" w:w="110"/>
+            </w:tcMar>
+          </w:tcPr>
+          <w:p>
+            <w:r>
+              <w:rPr>
+                <w:rFonts w:ascii="Arial" w:cs="Arial" w:eastAsia="Arial" w:hAnsi="Arial"/>
+                <w:b w:val="false"/>
+                <w:bCs w:val="false"/>
+                <w:sz w:val="20"/>
+                <w:szCs w:val="20"/>
+              </w:rPr>
+              <w:t xml:space="preserve">Feed-side inventory estimate: dead-reckon fused with the sender (snaps + window). Seeded from the sender at run start and purge exit -- never fiat-zeroed.</w:t>
+            </w:r>
+          </w:p>
+        </w:tc>
+      </w:tr>
+      <w:tr>
+        <w:tc>
+          <w:tcPr>
+            <w:tcW w:type="dxa" w:w="2000"/>
+            <w:tcBorders>
+              <w:top w:val="single" w:color="BBBBBB" w:sz="1"/>
+              <w:left w:val="single" w:color="BBBBBB" w:sz="1"/>
+              <w:bottom w:val="single" w:color="BBBBBB" w:sz="1"/>
+              <w:right w:val="single" w:color="BBBBBB" w:sz="1"/>
+            </w:tcBorders>
+            <w:tcMar>
+              <w:top w:type="dxa" w:w="50"/>
+              <w:left w:type="dxa" w:w="110"/>
+              <w:bottom w:type="dxa" w:w="50"/>
+              <w:right w:type="dxa" w:w="110"/>
+            </w:tcMar>
+          </w:tcPr>
+          <w:p>
+            <w:r>
+              <w:rPr>
+                <w:rFonts w:ascii="Consolas" w:cs="Consolas" w:eastAsia="Consolas" w:hAnsi="Consolas"/>
+                <w:b w:val="false"/>
+                <w:bCs w:val="false"/>
+                <w:sz w:val="18"/>
+                <w:szCs w:val="18"/>
+              </w:rPr>
+              <w:t xml:space="preserve">blowerStartTemp / blowerRampRpm0 / blowerRampRpmS</w:t>
+            </w:r>
+          </w:p>
+        </w:tc>
+        <w:tc>
+          <w:tcPr>
+            <w:tcW w:type="dxa" w:w="1400"/>
+            <w:tcBorders>
+              <w:top w:val="single" w:color="BBBBBB" w:sz="1"/>
+              <w:left w:val="single" w:color="BBBBBB" w:sz="1"/>
+              <w:bottom w:val="single" w:color="BBBBBB" w:sz="1"/>
+              <w:right w:val="single" w:color="BBBBBB" w:sz="1"/>
+            </w:tcBorders>
+            <w:tcMar>
+              <w:top w:type="dxa" w:w="50"/>
+              <w:left w:type="dxa" w:w="110"/>
+              <w:bottom w:type="dxa" w:w="50"/>
+              <w:right w:type="dxa" w:w="110"/>
+            </w:tcMar>
+          </w:tcPr>
+          <w:p>
+            <w:r>
+              <w:rPr>
+                <w:rFonts w:ascii="Arial" w:cs="Arial" w:eastAsia="Arial" w:hAnsi="Arial"/>
+                <w:b w:val="false"/>
+                <w:bCs w:val="false"/>
+                <w:sz w:val="20"/>
+                <w:szCs w:val="20"/>
+              </w:rPr>
+              <w:t xml:space="preserve">90 / 200 / 10</w:t>
+            </w:r>
+          </w:p>
+        </w:tc>
+        <w:tc>
+          <w:tcPr>
+            <w:tcW w:type="dxa" w:w="2000"/>
+            <w:tcBorders>
+              <w:top w:val="single" w:color="BBBBBB" w:sz="1"/>
+              <w:left w:val="single" w:color="BBBBBB" w:sz="1"/>
+              <w:bottom w:val="single" w:color="BBBBBB" w:sz="1"/>
+              <w:right w:val="single" w:color="BBBBBB" w:sz="1"/>
+            </w:tcBorders>
+            <w:tcMar>
+              <w:top w:type="dxa" w:w="50"/>
+              <w:left w:type="dxa" w:w="110"/>
+              <w:bottom w:type="dxa" w:w="50"/>
+              <w:right w:type="dxa" w:w="110"/>
+            </w:tcMar>
+          </w:tcPr>
+          <w:p>
+            <w:r>
+              <w:rPr>
+                <w:rFonts w:ascii="Arial" w:cs="Arial" w:eastAsia="Arial" w:hAnsi="Arial"/>
+                <w:b w:val="false"/>
+                <w:bCs w:val="false"/>
+                <w:sz w:val="20"/>
+                <w:szCs w:val="20"/>
+              </w:rPr>
+              <w:t xml:space="preserve">C / rpm / rpm/s</w:t>
+            </w:r>
+          </w:p>
+        </w:tc>
+        <w:tc>
+          <w:tcPr>
+            <w:tcW w:type="dxa" w:w="3960"/>
+            <w:tcBorders>
+              <w:top w:val="single" w:color="BBBBBB" w:sz="1"/>
+              <w:left w:val="single" w:color="BBBBBB" w:sz="1"/>
+              <w:bottom w:val="single" w:color="BBBBBB" w:sz="1"/>
+              <w:right w:val="single" w:color="BBBBBB" w:sz="1"/>
+            </w:tcBorders>
+            <w:tcMar>
+              <w:top w:type="dxa" w:w="50"/>
+              <w:left w:type="dxa" w:w="110"/>
+              <w:bottom w:type="dxa" w:w="50"/>
+              <w:right w:type="dxa" w:w="110"/>
+            </w:tcMar>
+          </w:tcPr>
+          <w:p>
+            <w:r>
+              <w:rPr>
+                <w:rFonts w:ascii="Arial" w:cs="Arial" w:eastAsia="Arial" w:hAnsi="Arial"/>
+                <w:b w:val="false"/>
+                <w:bCs w:val="false"/>
+                <w:sz w:val="20"/>
+                <w:szCs w:val="20"/>
+              </w:rPr>
+              <w:t xml:space="preserve">Blower SOFT-START: OFF below blowerStartTemp (cold evaporator has no vapor -- it only pulls vacuum), then ramp from blowerRampRpm0 at blowerRampRpmS to the target. blowerCmdRpm is the ONLY rpm sent to the VFD.</w:t>
+            </w:r>
+          </w:p>
+        </w:tc>
+      </w:tr>
+      <w:tr>
+        <w:tc>
+          <w:tcPr>
+            <w:tcW w:type="dxa" w:w="2000"/>
+            <w:tcBorders>
+              <w:top w:val="single" w:color="BBBBBB" w:sz="1"/>
+              <w:left w:val="single" w:color="BBBBBB" w:sz="1"/>
+              <w:bottom w:val="single" w:color="BBBBBB" w:sz="1"/>
+              <w:right w:val="single" w:color="BBBBBB" w:sz="1"/>
+            </w:tcBorders>
+            <w:tcMar>
+              <w:top w:type="dxa" w:w="50"/>
+              <w:left w:type="dxa" w:w="110"/>
+              <w:bottom w:type="dxa" w:w="50"/>
+              <w:right w:type="dxa" w:w="110"/>
+            </w:tcMar>
+          </w:tcPr>
+          <w:p>
+            <w:r>
+              <w:rPr>
+                <w:rFonts w:ascii="Consolas" w:cs="Consolas" w:eastAsia="Consolas" w:hAnsi="Consolas"/>
+                <w:b w:val="false"/>
+                <w:bCs w:val="false"/>
+                <w:sz w:val="18"/>
+                <w:szCs w:val="18"/>
+              </w:rPr>
+              <w:t xml:space="preserve">condTubeTripML</w:t>
+            </w:r>
+          </w:p>
+        </w:tc>
+        <w:tc>
+          <w:tcPr>
+            <w:tcW w:type="dxa" w:w="1400"/>
+            <w:tcBorders>
+              <w:top w:val="single" w:color="BBBBBB" w:sz="1"/>
+              <w:left w:val="single" w:color="BBBBBB" w:sz="1"/>
+              <w:bottom w:val="single" w:color="BBBBBB" w:sz="1"/>
+              <w:right w:val="single" w:color="BBBBBB" w:sz="1"/>
+            </w:tcBorders>
+            <w:tcMar>
+              <w:top w:type="dxa" w:w="50"/>
+              <w:left w:type="dxa" w:w="110"/>
+              <w:bottom w:type="dxa" w:w="50"/>
+              <w:right w:type="dxa" w:w="110"/>
+            </w:tcMar>
+          </w:tcPr>
+          <w:p>
+            <w:r>
+              <w:rPr>
+                <w:rFonts w:ascii="Arial" w:cs="Arial" w:eastAsia="Arial" w:hAnsi="Arial"/>
+                <w:b w:val="false"/>
+                <w:bCs w:val="false"/>
+                <w:sz w:val="20"/>
+                <w:szCs w:val="20"/>
+              </w:rPr>
+              <w:t xml:space="preserve">300</w:t>
+            </w:r>
+          </w:p>
+        </w:tc>
+        <w:tc>
+          <w:tcPr>
+            <w:tcW w:type="dxa" w:w="2000"/>
+            <w:tcBorders>
+              <w:top w:val="single" w:color="BBBBBB" w:sz="1"/>
+              <w:left w:val="single" w:color="BBBBBB" w:sz="1"/>
+              <w:bottom w:val="single" w:color="BBBBBB" w:sz="1"/>
+              <w:right w:val="single" w:color="BBBBBB" w:sz="1"/>
+            </w:tcBorders>
+            <w:tcMar>
+              <w:top w:type="dxa" w:w="50"/>
+              <w:left w:type="dxa" w:w="110"/>
+              <w:bottom w:type="dxa" w:w="50"/>
+              <w:right w:type="dxa" w:w="110"/>
+            </w:tcMar>
+          </w:tcPr>
+          <w:p>
+            <w:r>
+              <w:rPr>
+                <w:rFonts w:ascii="Arial" w:cs="Arial" w:eastAsia="Arial" w:hAnsi="Arial"/>
+                <w:b w:val="false"/>
+                <w:bCs w:val="false"/>
+                <w:sz w:val="20"/>
+                <w:szCs w:val="20"/>
+              </w:rPr>
+              <w:t xml:space="preserve">ml</w:t>
+            </w:r>
+          </w:p>
+        </w:tc>
+        <w:tc>
+          <w:tcPr>
+            <w:tcW w:type="dxa" w:w="3960"/>
+            <w:tcBorders>
+              <w:top w:val="single" w:color="BBBBBB" w:sz="1"/>
+              <w:left w:val="single" w:color="BBBBBB" w:sz="1"/>
+              <w:bottom w:val="single" w:color="BBBBBB" w:sz="1"/>
+              <w:right w:val="single" w:color="BBBBBB" w:sz="1"/>
+            </w:tcBorders>
+            <w:tcMar>
+              <w:top w:type="dxa" w:w="50"/>
+              <w:left w:type="dxa" w:w="110"/>
+              <w:bottom w:type="dxa" w:w="50"/>
+              <w:right w:type="dxa" w:w="110"/>
+            </w:tcMar>
+          </w:tcPr>
+          <w:p>
+            <w:r>
+              <w:rPr>
+                <w:rFonts w:ascii="Arial" w:cs="Arial" w:eastAsia="Arial" w:hAnsi="Arial"/>
+                <w:b w:val="false"/>
+                <w:bCs w:val="false"/>
+                <w:sz w:val="20"/>
+                <w:szCs w:val="20"/>
+              </w:rPr>
+              <w:t xml:space="preserve">Condensate reservoir level at the wet/dry sensor (~3/4 up) = pump-START. The nominal distillate batch.</w:t>
+            </w:r>
+          </w:p>
+        </w:tc>
+      </w:tr>
+      <w:tr>
+        <w:tc>
+          <w:tcPr>
+            <w:tcW w:type="dxa" w:w="2000"/>
+            <w:tcBorders>
+              <w:top w:val="single" w:color="BBBBBB" w:sz="1"/>
+              <w:left w:val="single" w:color="BBBBBB" w:sz="1"/>
+              <w:bottom w:val="single" w:color="BBBBBB" w:sz="1"/>
+              <w:right w:val="single" w:color="BBBBBB" w:sz="1"/>
+            </w:tcBorders>
+            <w:tcMar>
+              <w:top w:type="dxa" w:w="50"/>
+              <w:left w:type="dxa" w:w="110"/>
+              <w:bottom w:type="dxa" w:w="50"/>
+              <w:right w:type="dxa" w:w="110"/>
+            </w:tcMar>
+          </w:tcPr>
+          <w:p>
+            <w:r>
+              <w:rPr>
+                <w:rFonts w:ascii="Consolas" w:cs="Consolas" w:eastAsia="Consolas" w:hAnsi="Consolas"/>
+                <w:b w:val="false"/>
+                <w:bCs w:val="false"/>
+                <w:sz w:val="18"/>
+                <w:szCs w:val="18"/>
+              </w:rPr>
               <w:t xml:space="preserve">condTubeFullML</w:t>
             </w:r>
           </w:p>
@@ -9739,7 +11182,7 @@
                 <w:sz w:val="20"/>
                 <w:szCs w:val="20"/>
               </w:rPr>
-              <w:t xml:space="preserve">173</w:t>
+              <w:t xml:space="preserve">400</w:t>
             </w:r>
           </w:p>
         </w:tc>
@@ -9797,7 +11240,7 @@
                 <w:sz w:val="20"/>
                 <w:szCs w:val="20"/>
               </w:rPr>
-              <w:t xml:space="preserve">Full HX bottom tube volume (1.16in ID x 10in deep).</w:t>
+              <w:t xml:space="preserve">Full condensate reservoir volume.</w:t>
             </w:r>
           </w:p>
         </w:tc>
@@ -11580,7 +13023,7 @@
                 <w:sz w:val="20"/>
                 <w:szCs w:val="20"/>
               </w:rPr>
-              <w:t xml:space="preserve">300 ml</w:t>
+              <w:t xml:space="preserve">550 ml</w:t>
             </w:r>
           </w:p>
         </w:tc>
@@ -11609,7 +13052,7 @@
                 <w:sz w:val="20"/>
                 <w:szCs w:val="20"/>
               </w:rPr>
-              <w:t xml:space="preserve">Evaporator inventory above which the makeup cartridge stays covered.</w:t>
+              <w:t xml:space="preserve">Evaporator inventory above which the makeup cartridge stays covered (inlet tube + fittings - heater displacement, element top ~9.5 in up).</w:t>
             </w:r>
           </w:p>
         </w:tc>
@@ -11699,6 +13142,184 @@
                 <w:szCs w:val="20"/>
               </w:rPr>
               <w:t xml:space="preserve">Cartridge surface rise per duty (uncovered makeup / superheat).</w:t>
+            </w:r>
+          </w:p>
+        </w:tc>
+      </w:tr>
+      <w:tr>
+        <w:tc>
+          <w:tcPr>
+            <w:tcW w:type="dxa" w:w="2600"/>
+            <w:tcBorders>
+              <w:top w:val="single" w:color="BBBBBB" w:sz="1"/>
+              <w:left w:val="single" w:color="BBBBBB" w:sz="1"/>
+              <w:bottom w:val="single" w:color="BBBBBB" w:sz="1"/>
+              <w:right w:val="single" w:color="BBBBBB" w:sz="1"/>
+            </w:tcBorders>
+            <w:tcMar>
+              <w:top w:type="dxa" w:w="50"/>
+              <w:left w:type="dxa" w:w="110"/>
+              <w:bottom w:type="dxa" w:w="50"/>
+              <w:right w:type="dxa" w:w="110"/>
+            </w:tcMar>
+          </w:tcPr>
+          <w:p>
+            <w:r>
+              <w:rPr>
+                <w:rFonts w:ascii="Consolas" w:cs="Consolas" w:eastAsia="Consolas" w:hAnsi="Consolas"/>
+                <w:b w:val="false"/>
+                <w:bCs w:val="false"/>
+                <w:sz w:val="18"/>
+                <w:szCs w:val="18"/>
+              </w:rPr>
+              <w:t xml:space="preserve">simLevelBobML</w:t>
+            </w:r>
+          </w:p>
+        </w:tc>
+        <w:tc>
+          <w:tcPr>
+            <w:tcW w:type="dxa" w:w="1500"/>
+            <w:tcBorders>
+              <w:top w:val="single" w:color="BBBBBB" w:sz="1"/>
+              <w:left w:val="single" w:color="BBBBBB" w:sz="1"/>
+              <w:bottom w:val="single" w:color="BBBBBB" w:sz="1"/>
+              <w:right w:val="single" w:color="BBBBBB" w:sz="1"/>
+            </w:tcBorders>
+            <w:tcMar>
+              <w:top w:type="dxa" w:w="50"/>
+              <w:left w:type="dxa" w:w="110"/>
+              <w:bottom w:type="dxa" w:w="50"/>
+              <w:right w:type="dxa" w:w="110"/>
+            </w:tcMar>
+          </w:tcPr>
+          <w:p>
+            <w:r>
+              <w:rPr>
+                <w:rFonts w:ascii="Arial" w:cs="Arial" w:eastAsia="Arial" w:hAnsi="Arial"/>
+                <w:b w:val="false"/>
+                <w:bCs w:val="false"/>
+                <w:sz w:val="20"/>
+                <w:szCs w:val="20"/>
+              </w:rPr>
+              <w:t xml:space="preserve">30 ml</w:t>
+            </w:r>
+          </w:p>
+        </w:tc>
+        <w:tc>
+          <w:tcPr>
+            <w:tcW w:type="dxa" w:w="5260"/>
+            <w:tcBorders>
+              <w:top w:val="single" w:color="BBBBBB" w:sz="1"/>
+              <w:left w:val="single" w:color="BBBBBB" w:sz="1"/>
+              <w:bottom w:val="single" w:color="BBBBBB" w:sz="1"/>
+              <w:right w:val="single" w:color="BBBBBB" w:sz="1"/>
+            </w:tcBorders>
+            <w:tcMar>
+              <w:top w:type="dxa" w:w="50"/>
+              <w:left w:type="dxa" w:w="110"/>
+              <w:bottom w:type="dxa" w:w="50"/>
+              <w:right w:type="dxa" w:w="110"/>
+            </w:tcMar>
+          </w:tcPr>
+          <w:p>
+            <w:r>
+              <w:rPr>
+                <w:rFonts w:ascii="Arial" w:cs="Arial" w:eastAsia="Arial" w:hAnsi="Arial"/>
+                <w:b w:val="false"/>
+                <w:bCs w:val="false"/>
+                <w:sz w:val="20"/>
+                <w:szCs w:val="20"/>
+              </w:rPr>
+              <w:t xml:space="preserve">Float bob from the boil (RMS) on the simulated sender reading.</w:t>
+            </w:r>
+          </w:p>
+        </w:tc>
+      </w:tr>
+      <w:tr>
+        <w:tc>
+          <w:tcPr>
+            <w:tcW w:type="dxa" w:w="2600"/>
+            <w:tcBorders>
+              <w:top w:val="single" w:color="BBBBBB" w:sz="1"/>
+              <w:left w:val="single" w:color="BBBBBB" w:sz="1"/>
+              <w:bottom w:val="single" w:color="BBBBBB" w:sz="1"/>
+              <w:right w:val="single" w:color="BBBBBB" w:sz="1"/>
+            </w:tcBorders>
+            <w:tcMar>
+              <w:top w:type="dxa" w:w="50"/>
+              <w:left w:type="dxa" w:w="110"/>
+              <w:bottom w:type="dxa" w:w="50"/>
+              <w:right w:type="dxa" w:w="110"/>
+            </w:tcMar>
+          </w:tcPr>
+          <w:p>
+            <w:r>
+              <w:rPr>
+                <w:rFonts w:ascii="Consolas" w:cs="Consolas" w:eastAsia="Consolas" w:hAnsi="Consolas"/>
+                <w:b w:val="false"/>
+                <w:bCs w:val="false"/>
+                <w:sz w:val="18"/>
+                <w:szCs w:val="18"/>
+              </w:rPr>
+              <w:t xml:space="preserve">simSpillML</w:t>
+            </w:r>
+          </w:p>
+        </w:tc>
+        <w:tc>
+          <w:tcPr>
+            <w:tcW w:type="dxa" w:w="1500"/>
+            <w:tcBorders>
+              <w:top w:val="single" w:color="BBBBBB" w:sz="1"/>
+              <w:left w:val="single" w:color="BBBBBB" w:sz="1"/>
+              <w:bottom w:val="single" w:color="BBBBBB" w:sz="1"/>
+              <w:right w:val="single" w:color="BBBBBB" w:sz="1"/>
+            </w:tcBorders>
+            <w:tcMar>
+              <w:top w:type="dxa" w:w="50"/>
+              <w:left w:type="dxa" w:w="110"/>
+              <w:bottom w:type="dxa" w:w="50"/>
+              <w:right w:type="dxa" w:w="110"/>
+            </w:tcMar>
+          </w:tcPr>
+          <w:p>
+            <w:r>
+              <w:rPr>
+                <w:rFonts w:ascii="Arial" w:cs="Arial" w:eastAsia="Arial" w:hAnsi="Arial"/>
+                <w:b w:val="false"/>
+                <w:bCs w:val="false"/>
+                <w:sz w:val="20"/>
+                <w:szCs w:val="20"/>
+              </w:rPr>
+              <w:t xml:space="preserve">3800 ml</w:t>
+            </w:r>
+          </w:p>
+        </w:tc>
+        <w:tc>
+          <w:tcPr>
+            <w:tcW w:type="dxa" w:w="5260"/>
+            <w:tcBorders>
+              <w:top w:val="single" w:color="BBBBBB" w:sz="1"/>
+              <w:left w:val="single" w:color="BBBBBB" w:sz="1"/>
+              <w:bottom w:val="single" w:color="BBBBBB" w:sz="1"/>
+              <w:right w:val="single" w:color="BBBBBB" w:sz="1"/>
+            </w:tcBorders>
+            <w:tcMar>
+              <w:top w:type="dxa" w:w="50"/>
+              <w:left w:type="dxa" w:w="110"/>
+              <w:bottom w:type="dxa" w:w="50"/>
+              <w:right w:type="dxa" w:w="110"/>
+            </w:tcMar>
+          </w:tcPr>
+          <w:p>
+            <w:r>
+              <w:rPr>
+                <w:rFonts w:ascii="Arial" w:cs="Arial" w:eastAsia="Arial" w:hAnsi="Arial"/>
+                <w:b w:val="false"/>
+                <w:bCs w:val="false"/>
+                <w:sz w:val="20"/>
+                <w:szCs w:val="20"/>
+              </w:rPr>
+              <w:t xml:space="preserve">Sender-referenced level where overfill SPILLS into the demister (past totally-full 3.6 L + fittings).</w:t>
             </w:r>
           </w:p>
         </w:tc>

</xml_diff>

<commit_message>
Doc: SH element-temp regulation (200C) + 250C backstop in 2.5 and the safety table
Co-Authored-By: Claude Opus 4.8 <noreply@anthropic.com>
</commit_message>
<xml_diff>
--- a/MVR_Model_Reference.docx
+++ b/MVR_Model_Reference.docx
@@ -955,7 +955,7 @@
         <w:pStyle w:val="Heading2"/>
       </w:pPr>
       <w:r>
-        <w:t xml:space="preserve">2.5  Superheat heater PI (SuperheatControl)</w:t>
+        <w:t xml:space="preserve">2.5  Superheat heater -- element-temp regulation + PI (SuperheatControl)</w:t>
       </w:r>
     </w:p>
     <w:p>
@@ -963,35 +963,92 @@
         <w:spacing w:after="120"/>
       </w:pPr>
       <w:r>
-        <w:t xml:space="preserve">Holds vapor superheat. Gated by heatOK AND phase &gt;= RUN AND blowerCmdRpm &gt;= blowerMinRpm -- the cartridge only fires with REAL vapor flow past the copper mesh (during the soft-start ramp the flow is a trickle and it would dry-fire). Both heater PI integrators reset to 0 whenever their heater is off, so no stale windup carries across a stop. The wet-compression (low-superheat) trip likewise arms only once the blower has reached its target.</w:t>
-      </w:r>
-    </w:p>
-    <w:p>
-      <w:pPr>
-        <w:spacing w:after="60"/>
-        <w:ind w:left="360"/>
-      </w:pPr>
+        <w:t xml:space="preserve">Rig finding: the cartridge couples heat into thin vapor POORLY -- dry/low-flow, the surface just soars (the old 180C trip fired before any superheat showed). The duty is now the </w:t>
+      </w:r>
+      <w:r>
+        <w:rPr>
+          <w:b/>
+          <w:bCs/>
+        </w:rPr>
+        <w:t xml:space="preserve">MIN of two demands</w:t>
+      </w:r>
+      <w:r>
+        <w:t xml:space="preserve">: (1) the superheat PI -- the real control, meaningful once vapor flows -- and (2) an element-temp P regulator holding the cartridge TC at </w:t>
+      </w:r>
       <w:r>
         <w:rPr>
           <w:rFonts w:ascii="Consolas" w:cs="Consolas" w:eastAsia="Consolas" w:hAnsi="Consolas"/>
           <w:sz w:val="19"/>
           <w:szCs w:val="19"/>
         </w:rPr>
-        <w:t xml:space="preserve">err  = superheatSetSafe - superheatIn</w:t>
-      </w:r>
-    </w:p>
-    <w:p>
-      <w:pPr>
-        <w:spacing w:after="60"/>
-        <w:ind w:left="360"/>
-      </w:pPr>
+        <w:t xml:space="preserve">superHtrRegC</w:t>
+      </w:r>
+      <w:r>
+        <w:t xml:space="preserve"> (200C). From the moment the blower is turning (</w:t>
+      </w:r>
       <w:r>
         <w:rPr>
           <w:rFonts w:ascii="Consolas" w:cs="Consolas" w:eastAsia="Consolas" w:hAnsi="Consolas"/>
           <w:sz w:val="19"/>
           <w:szCs w:val="19"/>
         </w:rPr>
-        <w:t xml:space="preserve">duty = clamp( kpSuper * err + I , 0 , 1 )       -&gt;  DO:SuperHtr  (superDuty)</w:t>
+        <w:t xml:space="preserve">blowerCmdRpm &gt;= blowerRampRpm0</w:t>
+      </w:r>
+      <w:r>
+        <w:t xml:space="preserve">) the element preheats REGULATED at ~200C; as vapor flow builds it carries the heat away, the element cools, the regulator releases, and the superheat PI takes over seamlessly. The regulation IS the dry-fire protection; </w:t>
+      </w:r>
+      <w:r>
+        <w:rPr>
+          <w:rFonts w:ascii="Consolas" w:cs="Consolas" w:eastAsia="Consolas" w:hAnsi="Consolas"/>
+          <w:sz w:val="19"/>
+          <w:szCs w:val="19"/>
+        </w:rPr>
+        <w:t xml:space="preserve">superHtrMax</w:t>
+      </w:r>
+      <w:r>
+        <w:t xml:space="preserve"> (250C) is the hard backstop. The PI integral holds while the regulator limits (anti-windup); both heater integrators reset whenever their heater is off. The wet-compression (low-superheat) trip arms only once the blower reaches its target.</w:t>
+      </w:r>
+    </w:p>
+    <w:p>
+      <w:pPr>
+        <w:spacing w:after="60"/>
+        <w:ind w:left="360"/>
+      </w:pPr>
+      <w:r>
+        <w:rPr>
+          <w:rFonts w:ascii="Consolas" w:cs="Consolas" w:eastAsia="Consolas" w:hAnsi="Consolas"/>
+          <w:sz w:val="19"/>
+          <w:szCs w:val="19"/>
+        </w:rPr>
+        <w:t xml:space="preserve">pi   = clamp( kpSuper*(superheatSetSafe - superheatIn) + I , 0 , 1 )</w:t>
+      </w:r>
+    </w:p>
+    <w:p>
+      <w:pPr>
+        <w:spacing w:after="60"/>
+        <w:ind w:left="360"/>
+      </w:pPr>
+      <w:r>
+        <w:rPr>
+          <w:rFonts w:ascii="Consolas" w:cs="Consolas" w:eastAsia="Consolas" w:hAnsi="Consolas"/>
+          <w:sz w:val="19"/>
+          <w:szCs w:val="19"/>
+        </w:rPr>
+        <w:t xml:space="preserve">elem = clamp( kpShElem * (superHtrRegC - ySuperHtrTemp) , 0 , 1 )</w:t>
+      </w:r>
+    </w:p>
+    <w:p>
+      <w:pPr>
+        <w:spacing w:after="60"/>
+        <w:ind w:left="360"/>
+      </w:pPr>
+      <w:r>
+        <w:rPr>
+          <w:rFonts w:ascii="Consolas" w:cs="Consolas" w:eastAsia="Consolas" w:hAnsi="Consolas"/>
+          <w:sz w:val="19"/>
+          <w:szCs w:val="19"/>
+        </w:rPr>
+        <w:t xml:space="preserve">duty = min( pi , elem )       -&gt;  DO:SuperHtr  (superDuty)</w:t>
       </w:r>
     </w:p>
     <w:p>
@@ -5096,7 +5153,7 @@
                 <w:sz w:val="20"/>
                 <w:szCs w:val="20"/>
               </w:rPr>
-              <w:t xml:space="preserve">180</w:t>
+              <w:t xml:space="preserve">250</w:t>
             </w:r>
           </w:p>
         </w:tc>
@@ -5154,7 +5211,125 @@
                 <w:sz w:val="20"/>
                 <w:szCs w:val="20"/>
               </w:rPr>
-              <w:t xml:space="preserve">Superheat-cartridge TC over-temp TRIP. Latched.</w:t>
+              <w:t xml:space="preserve">Superheat-cartridge TC over-temp TRIP -- hard backstop above the 200C element regulation (the cartridge runs HOT by design in thin vapor). Latched.</w:t>
+            </w:r>
+          </w:p>
+        </w:tc>
+      </w:tr>
+      <w:tr>
+        <w:tc>
+          <w:tcPr>
+            <w:tcW w:type="dxa" w:w="2400"/>
+            <w:tcBorders>
+              <w:top w:val="single" w:color="BBBBBB" w:sz="1"/>
+              <w:left w:val="single" w:color="BBBBBB" w:sz="1"/>
+              <w:bottom w:val="single" w:color="BBBBBB" w:sz="1"/>
+              <w:right w:val="single" w:color="BBBBBB" w:sz="1"/>
+            </w:tcBorders>
+            <w:tcMar>
+              <w:top w:type="dxa" w:w="50"/>
+              <w:left w:type="dxa" w:w="110"/>
+              <w:bottom w:type="dxa" w:w="50"/>
+              <w:right w:type="dxa" w:w="110"/>
+            </w:tcMar>
+          </w:tcPr>
+          <w:p>
+            <w:r>
+              <w:rPr>
+                <w:rFonts w:ascii="Consolas" w:cs="Consolas" w:eastAsia="Consolas" w:hAnsi="Consolas"/>
+                <w:b w:val="false"/>
+                <w:bCs w:val="false"/>
+                <w:sz w:val="18"/>
+                <w:szCs w:val="18"/>
+              </w:rPr>
+              <w:t xml:space="preserve">superHtrRegC / kpShElem</w:t>
+            </w:r>
+          </w:p>
+        </w:tc>
+        <w:tc>
+          <w:tcPr>
+            <w:tcW w:type="dxa" w:w="1100"/>
+            <w:tcBorders>
+              <w:top w:val="single" w:color="BBBBBB" w:sz="1"/>
+              <w:left w:val="single" w:color="BBBBBB" w:sz="1"/>
+              <w:bottom w:val="single" w:color="BBBBBB" w:sz="1"/>
+              <w:right w:val="single" w:color="BBBBBB" w:sz="1"/>
+            </w:tcBorders>
+            <w:tcMar>
+              <w:top w:type="dxa" w:w="50"/>
+              <w:left w:type="dxa" w:w="110"/>
+              <w:bottom w:type="dxa" w:w="50"/>
+              <w:right w:type="dxa" w:w="110"/>
+            </w:tcMar>
+          </w:tcPr>
+          <w:p>
+            <w:r>
+              <w:rPr>
+                <w:rFonts w:ascii="Arial" w:cs="Arial" w:eastAsia="Arial" w:hAnsi="Arial"/>
+                <w:b w:val="false"/>
+                <w:bCs w:val="false"/>
+                <w:sz w:val="20"/>
+                <w:szCs w:val="20"/>
+              </w:rPr>
+              <w:t xml:space="preserve">200 / 0.05</w:t>
+            </w:r>
+          </w:p>
+        </w:tc>
+        <w:tc>
+          <w:tcPr>
+            <w:tcW w:type="dxa" w:w="800"/>
+            <w:tcBorders>
+              <w:top w:val="single" w:color="BBBBBB" w:sz="1"/>
+              <w:left w:val="single" w:color="BBBBBB" w:sz="1"/>
+              <w:bottom w:val="single" w:color="BBBBBB" w:sz="1"/>
+              <w:right w:val="single" w:color="BBBBBB" w:sz="1"/>
+            </w:tcBorders>
+            <w:tcMar>
+              <w:top w:type="dxa" w:w="50"/>
+              <w:left w:type="dxa" w:w="110"/>
+              <w:bottom w:type="dxa" w:w="50"/>
+              <w:right w:type="dxa" w:w="110"/>
+            </w:tcMar>
+          </w:tcPr>
+          <w:p>
+            <w:r>
+              <w:rPr>
+                <w:rFonts w:ascii="Arial" w:cs="Arial" w:eastAsia="Arial" w:hAnsi="Arial"/>
+                <w:b w:val="false"/>
+                <w:bCs w:val="false"/>
+                <w:sz w:val="20"/>
+                <w:szCs w:val="20"/>
+              </w:rPr>
+              <w:t xml:space="preserve">C / duty/C</w:t>
+            </w:r>
+          </w:p>
+        </w:tc>
+        <w:tc>
+          <w:tcPr>
+            <w:tcW w:type="dxa" w:w="5060"/>
+            <w:tcBorders>
+              <w:top w:val="single" w:color="BBBBBB" w:sz="1"/>
+              <w:left w:val="single" w:color="BBBBBB" w:sz="1"/>
+              <w:bottom w:val="single" w:color="BBBBBB" w:sz="1"/>
+              <w:right w:val="single" w:color="BBBBBB" w:sz="1"/>
+            </w:tcBorders>
+            <w:tcMar>
+              <w:top w:type="dxa" w:w="50"/>
+              <w:left w:type="dxa" w:w="110"/>
+              <w:bottom w:type="dxa" w:w="50"/>
+              <w:right w:type="dxa" w:w="110"/>
+            </w:tcMar>
+          </w:tcPr>
+          <w:p>
+            <w:r>
+              <w:rPr>
+                <w:rFonts w:ascii="Arial" w:cs="Arial" w:eastAsia="Arial" w:hAnsi="Arial"/>
+                <w:b w:val="false"/>
+                <w:bCs w:val="false"/>
+                <w:sz w:val="20"/>
+                <w:szCs w:val="20"/>
+              </w:rPr>
+              <w:t xml:space="preserve">SH ELEMENT-TEMP REGULATION: duty capped so the cartridge holds ~200C until real vapor flow carries the heat away (poor coupling into thin vapor); then the superheat PI takes over. Full duty 20C below target.</w:t>
             </w:r>
           </w:p>
         </w:tc>

</xml_diff>

<commit_message>
MVR: air-purge vent closes at 95C vapor-out (was 101 -- never reached on the rig, vent sat open bleeding steam); re-open below 92
Co-Authored-By: Claude Opus 4.8 <noreply@anthropic.com>
</commit_message>
<xml_diff>
--- a/MVR_Model_Reference.docx
+++ b/MVR_Model_Reference.docx
@@ -8255,7 +8255,7 @@
                 <w:sz w:val="20"/>
                 <w:szCs w:val="20"/>
               </w:rPr>
-              <w:t xml:space="preserve">98 / 101</w:t>
+              <w:t xml:space="preserve">92 / 95</w:t>
             </w:r>
           </w:p>
         </w:tc>
@@ -8313,7 +8313,7 @@
                 <w:sz w:val="20"/>
                 <w:szCs w:val="20"/>
               </w:rPr>
-              <w:t xml:space="preserve">Startup air-purge vent: OPEN below / CLOSE above this blower-out vapor temp (yVaporOut). Hysteresis.</w:t>
+              <w:t xml:space="preserve">Startup air-purge vent: OPEN below / CLOSE above this blower-out vapor temp (yVaporOut). Hysteresis. Lowered from 98/101 -- the rig never reached 101 at the vent TC, so it sat open bleeding steam; 95 seals it as soon as real vapor shows.</w:t>
             </w:r>
           </w:p>
         </w:tc>

</xml_diff>

<commit_message>
Doc: blower gate hysteresis, vent latch + production-control vent gate, feed cold-crash guard
Co-Authored-By: Claude Opus 4.8 <noreply@anthropic.com>
</commit_message>
<xml_diff>
--- a/MVR_Model_Reference.docx
+++ b/MVR_Model_Reference.docx
@@ -1192,6 +1192,32 @@
       </w:pPr>
       <w:r>
         <w:t xml:space="preserve">Velocity is driven as a LEVEL (0 = stop) so every run/stop transition re-triggers the stepper move. The edge integral -- not the dead-reckon -- closes the tight loop, so a mis-calibrated flow meter can never run the level away ('wet' always pulls feed below boil-off).</w:t>
+      </w:r>
+    </w:p>
+    <w:p>
+      <w:pPr>
+        <w:spacing w:after="120"/>
+      </w:pPr>
+      <w:r>
+        <w:rPr>
+          <w:b/>
+          <w:bCs/>
+        </w:rPr>
+        <w:t xml:space="preserve">COLD-CRASH GUARD (RUN only): </w:t>
+      </w:r>
+      <w:r>
+        <w:t xml:space="preserve">a max-feed level recovery dumps cold water faster than the heaters can carry (0.27 L/min of 18C feed ~ 2.6 kW &gt; the 2 kW makeup) -- on the rig this crashed the evap temp under the blower gate and the run limit-cycled. The level-correction terms fold back to production-match as </w:t>
+      </w:r>
+      <w:r>
+        <w:rPr>
+          <w:rFonts w:ascii="Consolas" w:cs="Consolas" w:eastAsia="Consolas" w:hAnsi="Consolas"/>
+          <w:sz w:val="19"/>
+          <w:szCs w:val="19"/>
+        </w:rPr>
+        <w:t xml:space="preserve">yEvapTemp</w:t>
+      </w:r>
+      <w:r>
+        <w:t xml:space="preserve"> sags: full correction at set-3, production-match only by set-8. Level can wait; heat can't.</w:t>
       </w:r>
     </w:p>
     <w:p>
@@ -8313,7 +8339,7 @@
                 <w:sz w:val="20"/>
                 <w:szCs w:val="20"/>
               </w:rPr>
-              <w:t xml:space="preserve">Startup air-purge vent: OPEN below / CLOSE above this blower-out vapor temp (yVaporOut). Hysteresis. Lowered from 98/101 -- the rig never reached 101 at the vent TC, so it sat open bleeding steam; 95 seals it as soon as real vapor shows.</w:t>
+              <w:t xml:space="preserve">Startup air-purge vent: OPEN below / CLOSE above this blower-out vapor temp (yVaporOut). Lowered from 98/101 -- the rig never reached 101 at the vent TC, so it sat open bleeding steam. Once closed it LATCHES closed for the rest of the run (ventDone): the air purge is once-per-run; a mid-run upset cooling yVaporOut must not re-open it. ProductionControl does not integrate while the vent is open (production is being vented -- the meter can't see it).</w:t>
             </w:r>
           </w:p>
         </w:tc>
@@ -11092,7 +11118,7 @@
                 <w:sz w:val="18"/>
                 <w:szCs w:val="18"/>
               </w:rPr>
-              <w:t xml:space="preserve">blowerStartTemp / blowerRampRpm0 / blowerRampRpmS</w:t>
+              <w:t xml:space="preserve">blowerStartTemp / blowerStopTemp / blowerRampRpm0 / blowerRampRpmS</w:t>
             </w:r>
           </w:p>
         </w:tc>
@@ -11121,7 +11147,7 @@
                 <w:sz w:val="20"/>
                 <w:szCs w:val="20"/>
               </w:rPr>
-              <w:t xml:space="preserve">90 / 200 / 10</w:t>
+              <w:t xml:space="preserve">90 / 80 / 200 / 10</w:t>
             </w:r>
           </w:p>
         </w:tc>
@@ -11150,7 +11176,7 @@
                 <w:sz w:val="20"/>
                 <w:szCs w:val="20"/>
               </w:rPr>
-              <w:t xml:space="preserve">C / rpm / rpm/s</w:t>
+              <w:t xml:space="preserve">C / C / rpm / rpm/s</w:t>
             </w:r>
           </w:p>
         </w:tc>
@@ -11179,7 +11205,7 @@
                 <w:sz w:val="20"/>
                 <w:szCs w:val="20"/>
               </w:rPr>
-              <w:t xml:space="preserve">Blower SOFT-START: OFF below blowerStartTemp (cold evaporator has no vapor -- it only pulls vacuum), then ramp from blowerRampRpm0 at blowerRampRpmS to the target. blowerCmdRpm is the ONLY rpm sent to the VFD.</w:t>
+              <w:t xml:space="preserve">Blower SOFT-START with HYSTERESIS: starts at blowerStartTemp (cold evaporator has no vapor -- it only pulls vacuum), ramps from blowerRampRpm0 at blowerRampRpmS to the target. Once RUNNING it stops only below blowerStopTemp -- the pipe TC hovers near 90 with flow, and a single 90C gate limit-cycled the blower on the rig. blowerCmdRpm is the ONLY rpm sent to the VFD.</w:t>
             </w:r>
           </w:p>
         </w:tc>

</xml_diff>

<commit_message>
Doc: wet-comp trip gates/debounce in the safety table
Co-Authored-By: Claude Opus 4.8 <noreply@anthropic.com>
</commit_message>
<xml_diff>
--- a/MVR_Model_Reference.docx
+++ b/MVR_Model_Reference.docx
@@ -5622,7 +5622,7 @@
                 <w:sz w:val="18"/>
                 <w:szCs w:val="18"/>
               </w:rPr>
-              <w:t xml:space="preserve">minSuperheat</w:t>
+              <w:t xml:space="preserve">minSuperheat / superHFaultS</w:t>
             </w:r>
           </w:p>
         </w:tc>
@@ -5651,7 +5651,7 @@
                 <w:sz w:val="20"/>
                 <w:szCs w:val="20"/>
               </w:rPr>
-              <w:t xml:space="preserve">0.5</w:t>
+              <w:t xml:space="preserve">0.5 / 20</w:t>
             </w:r>
           </w:p>
         </w:tc>
@@ -5680,7 +5680,7 @@
                 <w:sz w:val="20"/>
                 <w:szCs w:val="20"/>
               </w:rPr>
-              <w:t xml:space="preserve">C</w:t>
+              <w:t xml:space="preserve">C / s</w:t>
             </w:r>
           </w:p>
         </w:tc>
@@ -5709,7 +5709,7 @@
                 <w:sz w:val="20"/>
                 <w:szCs w:val="20"/>
               </w:rPr>
-              <w:t xml:space="preserve">Wet-compression (low-superheat) trip; arms only once the blower has REACHED its target rpm (soft-start ramp legitimately collapses superheat). Latched-arm.</w:t>
+              <w:t xml:space="preserve">Wet-compression (low-superheat) trip. Fires/arms only at REAL speed (target*0.9 AND &gt;= blowerMinRpm) AND with the evaporator at temp (&gt;= set-5); DISARMS whenever the blower leaves at-speed (restart ramps legitimately collapse superheat); superheat must sit below the floor for superHFaultS CONTINUOUSLY (swings dip briefly, wet compression persists). Latched.</w:t>
             </w:r>
           </w:p>
         </w:tc>

</xml_diff>

<commit_message>
Doc: two-stage blower ramp in the startup table
Co-Authored-By: Claude Opus 4.8 <noreply@anthropic.com>
</commit_message>
<xml_diff>
--- a/MVR_Model_Reference.docx
+++ b/MVR_Model_Reference.docx
@@ -11118,7 +11118,7 @@
                 <w:sz w:val="18"/>
                 <w:szCs w:val="18"/>
               </w:rPr>
-              <w:t xml:space="preserve">blowerStartTemp / blowerStopTemp / blowerRampRpm0 / blowerRampRpmS</w:t>
+              <w:t xml:space="preserve">blowerStartTemp / blowerStopTemp / blowerRampRpm0 / blowerRampRpmS / blowerRampHotS</w:t>
             </w:r>
           </w:p>
         </w:tc>
@@ -11147,7 +11147,7 @@
                 <w:sz w:val="20"/>
                 <w:szCs w:val="20"/>
               </w:rPr>
-              <w:t xml:space="preserve">90 / 80 / 200 / 10</w:t>
+              <w:t xml:space="preserve">90 / 80 / 200 / 10 / 50</w:t>
             </w:r>
           </w:p>
         </w:tc>
@@ -11176,7 +11176,7 @@
                 <w:sz w:val="20"/>
                 <w:szCs w:val="20"/>
               </w:rPr>
-              <w:t xml:space="preserve">C / C / rpm / rpm/s</w:t>
+              <w:t xml:space="preserve">C / C / rpm / rpm/s / rpm/s</w:t>
             </w:r>
           </w:p>
         </w:tc>
@@ -11205,7 +11205,7 @@
                 <w:sz w:val="20"/>
                 <w:szCs w:val="20"/>
               </w:rPr>
-              <w:t xml:space="preserve">Blower SOFT-START with HYSTERESIS: starts at blowerStartTemp (cold evaporator has no vapor -- it only pulls vacuum), ramps from blowerRampRpm0 at blowerRampRpmS to the target. Once RUNNING it stops only below blowerStopTemp -- the pipe TC hovers near 90 with flow, and a single 90C gate limit-cycled the blower on the rig. blowerCmdRpm is the ONLY rpm sent to the VFD.</w:t>
+              <w:t xml:space="preserve">Blower SOFT-START with HYSTERESIS: starts at blowerStartTemp (cold evaporator has no vapor -- it only pulls vacuum), ramps from blowerRampRpm0. TWO-STAGE ramp: blowerRampRpmS while warming (thin vapor), blowerRampHotS once the evaporator is at temp (&gt;= set-3; 200-&gt;1500 in ~26s). Once RUNNING it stops only below blowerStopTemp -- the pipe TC hovers near 90 with flow, and a single 90C gate limit-cycled the blower on the rig. blowerCmdRpm is the ONLY rpm sent to the VFD.</w:t>
             </w:r>
           </w:p>
         </w:tc>

</xml_diff>

<commit_message>
Doc: SH PI retune + element-limited wet-comp gate
Co-Authored-By: Claude Opus 4.8 <noreply@anthropic.com>
</commit_message>
<xml_diff>
--- a/MVR_Model_Reference.docx
+++ b/MVR_Model_Reference.docx
@@ -5709,7 +5709,7 @@
                 <w:sz w:val="20"/>
                 <w:szCs w:val="20"/>
               </w:rPr>
-              <w:t xml:space="preserve">Wet-compression (low-superheat) trip. Fires/arms only at REAL speed (target*0.9 AND &gt;= blowerMinRpm) AND with the evaporator at temp (&gt;= set-5); DISARMS whenever the blower leaves at-speed (restart ramps legitimately collapse superheat); superheat must sit below the floor for superHFaultS CONTINUOUSLY (swings dip briefly, wet compression persists). Latched.</w:t>
+              <w:t xml:space="preserve">Wet-compression (low-superheat) trip. Fires/arms only at REAL speed (target*0.9 AND &gt;= blowerMinRpm) AND with the evaporator at temp (&gt;= set-5); DISARMS whenever the blower leaves at-speed (restart ramps legitimately collapse superheat); superheat must sit below the floor for superHFaultS CONTINUOUSLY (swings dip briefly, wet compression persists); and the sag does NOT count while the ELEMENT REGULATOR caps the duty (shElemLim: a 200C mesh can't be wet -- that sag is a capability limit; real wet comp cools the mesh, the cap releases, and the sag then counts). Latched.</w:t>
             </w:r>
           </w:p>
         </w:tc>
@@ -6511,7 +6511,7 @@
                 <w:sz w:val="20"/>
                 <w:szCs w:val="20"/>
               </w:rPr>
-              <w:t xml:space="preserve">0.05 / 0.01</w:t>
+              <w:t xml:space="preserve">0.01 / 0.0005</w:t>
             </w:r>
           </w:p>
         </w:tc>
@@ -6569,7 +6569,7 @@
                 <w:sz w:val="20"/>
                 <w:szCs w:val="20"/>
               </w:rPr>
-              <w:t xml:space="preserve">Superheat-heater PI gains.</w:t>
+              <w:t xml:space="preserve">Superheat-heater PI gains. Retuned for the THIN-FLOW end where plant gain is ~100C superheat per unit duty (operating duty ~0.05 holds ~5C) -- the original 0.05/0.01 slammed the duty 0..0.66 and bounced the element 173..209C on the rig.</w:t>
             </w:r>
           </w:p>
         </w:tc>

</xml_diff>

<commit_message>
Doc: pressure-seek blower target row
Co-Authored-By: Claude Opus 4.8 <noreply@anthropic.com>
</commit_message>
<xml_diff>
--- a/MVR_Model_Reference.docx
+++ b/MVR_Model_Reference.docx
@@ -8458,6 +8458,124 @@
                 <w:szCs w:val="20"/>
               </w:rPr>
               <w:t xml:space="preserve">VENT-PURGE BOOST: blower target while the vent is open with the evaporator at temp (&gt;= set-3). At the nominal 1500 the vapor mass flow is too thin to heat the discharge path -- VaporOut crawled 65-&gt;84C in 14min on the rig and the vent never closed. Boost shoves mass through; the instant the vent closes the target drops back to blowerRpmSet.</w:t>
+            </w:r>
+          </w:p>
+        </w:tc>
+      </w:tr>
+      <w:tr>
+        <w:tc>
+          <w:tcPr>
+            <w:tcW w:type="dxa" w:w="2200"/>
+            <w:tcBorders>
+              <w:top w:val="single" w:color="BBBBBB" w:sz="1"/>
+              <w:left w:val="single" w:color="BBBBBB" w:sz="1"/>
+              <w:bottom w:val="single" w:color="BBBBBB" w:sz="1"/>
+              <w:right w:val="single" w:color="BBBBBB" w:sz="1"/>
+            </w:tcBorders>
+            <w:tcMar>
+              <w:top w:type="dxa" w:w="50"/>
+              <w:left w:type="dxa" w:w="110"/>
+              <w:bottom w:type="dxa" w:w="50"/>
+              <w:right w:type="dxa" w:w="110"/>
+            </w:tcMar>
+          </w:tcPr>
+          <w:p>
+            <w:r>
+              <w:rPr>
+                <w:rFonts w:ascii="Consolas" w:cs="Consolas" w:eastAsia="Consolas" w:hAnsi="Consolas"/>
+                <w:b w:val="false"/>
+                <w:bCs w:val="false"/>
+                <w:sz w:val="18"/>
+                <w:szCs w:val="18"/>
+              </w:rPr>
+              <w:t xml:space="preserve">evapPressMin / blowerSeekRpmS</w:t>
+            </w:r>
+          </w:p>
+        </w:tc>
+        <w:tc>
+          <w:tcPr>
+            <w:tcW w:type="dxa" w:w="1300"/>
+            <w:tcBorders>
+              <w:top w:val="single" w:color="BBBBBB" w:sz="1"/>
+              <w:left w:val="single" w:color="BBBBBB" w:sz="1"/>
+              <w:bottom w:val="single" w:color="BBBBBB" w:sz="1"/>
+              <w:right w:val="single" w:color="BBBBBB" w:sz="1"/>
+            </w:tcBorders>
+            <w:tcMar>
+              <w:top w:type="dxa" w:w="50"/>
+              <w:left w:type="dxa" w:w="110"/>
+              <w:bottom w:type="dxa" w:w="50"/>
+              <w:right w:type="dxa" w:w="110"/>
+            </w:tcMar>
+          </w:tcPr>
+          <w:p>
+            <w:r>
+              <w:rPr>
+                <w:rFonts w:ascii="Arial" w:cs="Arial" w:eastAsia="Arial" w:hAnsi="Arial"/>
+                <w:b w:val="false"/>
+                <w:bCs w:val="false"/>
+                <w:sz w:val="20"/>
+                <w:szCs w:val="20"/>
+              </w:rPr>
+              <w:t xml:space="preserve">13.0 / 8</w:t>
+            </w:r>
+          </w:p>
+        </w:tc>
+        <w:tc>
+          <w:tcPr>
+            <w:tcW w:type="dxa" w:w="1500"/>
+            <w:tcBorders>
+              <w:top w:val="single" w:color="BBBBBB" w:sz="1"/>
+              <w:left w:val="single" w:color="BBBBBB" w:sz="1"/>
+              <w:bottom w:val="single" w:color="BBBBBB" w:sz="1"/>
+              <w:right w:val="single" w:color="BBBBBB" w:sz="1"/>
+            </w:tcBorders>
+            <w:tcMar>
+              <w:top w:type="dxa" w:w="50"/>
+              <w:left w:type="dxa" w:w="110"/>
+              <w:bottom w:type="dxa" w:w="50"/>
+              <w:right w:type="dxa" w:w="110"/>
+            </w:tcMar>
+          </w:tcPr>
+          <w:p>
+            <w:r>
+              <w:rPr>
+                <w:rFonts w:ascii="Arial" w:cs="Arial" w:eastAsia="Arial" w:hAnsi="Arial"/>
+                <w:b w:val="false"/>
+                <w:bCs w:val="false"/>
+                <w:sz w:val="20"/>
+                <w:szCs w:val="20"/>
+              </w:rPr>
+              <w:t xml:space="preserve">psia / rpm/s</w:t>
+            </w:r>
+          </w:p>
+        </w:tc>
+        <w:tc>
+          <w:tcPr>
+            <w:tcW w:type="dxa" w:w="4360"/>
+            <w:tcBorders>
+              <w:top w:val="single" w:color="BBBBBB" w:sz="1"/>
+              <w:left w:val="single" w:color="BBBBBB" w:sz="1"/>
+              <w:bottom w:val="single" w:color="BBBBBB" w:sz="1"/>
+              <w:right w:val="single" w:color="BBBBBB" w:sz="1"/>
+            </w:tcBorders>
+            <w:tcMar>
+              <w:top w:type="dxa" w:w="50"/>
+              <w:left w:type="dxa" w:w="110"/>
+              <w:bottom w:type="dxa" w:w="50"/>
+              <w:right w:type="dxa" w:w="110"/>
+            </w:tcMar>
+          </w:tcPr>
+          <w:p>
+            <w:r>
+              <w:rPr>
+                <w:rFonts w:ascii="Arial" w:cs="Arial" w:eastAsia="Arial" w:hAnsi="Arial"/>
+                <w:b w:val="false"/>
+                <w:bCs w:val="false"/>
+                <w:sz w:val="20"/>
+                <w:szCs w:val="20"/>
+              </w:rPr>
+              <w:t xml:space="preserve">Blower PRESSURE-SEEK (RUN, vent closed, BEFORE the first condensate batch): no measured production exists yet, so instead of freezing at the nominal 1500 the target CLIMBS at blowerSeekRpmS while the evap (suction) pressure holds above evapPressMin+0.3. Suction is the honest capability signal -- it only drops when the blower outpaces the boil. After batches, the production integral takes over but never raises the target with suction at the floor; either mode backs off below the floor.</w:t>
             </w:r>
           </w:p>
         </w:tc>

</xml_diff>

<commit_message>
Doc: seek ceiling + SH flow feedforward rows
Co-Authored-By: Claude Opus 4.8 <noreply@anthropic.com>
</commit_message>
<xml_diff>
--- a/MVR_Model_Reference.docx
+++ b/MVR_Model_Reference.docx
@@ -6482,7 +6482,7 @@
                 <w:sz w:val="18"/>
                 <w:szCs w:val="18"/>
               </w:rPr>
-              <w:t xml:space="preserve">kpSuper / kiSuper</w:t>
+              <w:t xml:space="preserve">kpSuper / kiSuper / kShFF</w:t>
             </w:r>
           </w:p>
         </w:tc>
@@ -6511,7 +6511,7 @@
                 <w:sz w:val="20"/>
                 <w:szCs w:val="20"/>
               </w:rPr>
-              <w:t xml:space="preserve">0.01 / 0.0005</w:t>
+              <w:t xml:space="preserve">0.01 / 0.0005 / 0.03</w:t>
             </w:r>
           </w:p>
         </w:tc>
@@ -6540,7 +6540,7 @@
                 <w:sz w:val="20"/>
                 <w:szCs w:val="20"/>
               </w:rPr>
-              <w:t xml:space="preserve">-</w:t>
+              <w:t xml:space="preserve">- / - / duty/krpm</w:t>
             </w:r>
           </w:p>
         </w:tc>
@@ -6569,7 +6569,7 @@
                 <w:sz w:val="20"/>
                 <w:szCs w:val="20"/>
               </w:rPr>
-              <w:t xml:space="preserve">Superheat-heater PI gains. Retuned for the THIN-FLOW end where plant gain is ~100C superheat per unit duty (operating duty ~0.05 holds ~5C) -- the original 0.05/0.01 slammed the duty 0..0.66 and bounced the element 173..209C on the rig.</w:t>
+              <w:t xml:space="preserve">Superheat control = FLOW FEEDFORWARD + PI trim. The duty operating point scales with vapor mass flow (0.05 holds ~5C at 1500rpm, the same duty is nothing at 4000 -- the rig sagged into the wet-comp trip while the PI crawled), so kShFF*rpm/1000 carries it and the PI (retuned soft after the 0.05/0.01 gains bounced the element 173..209C) only trims; the integral clamps +/-0.4 so it can cancel excess FF.</w:t>
             </w:r>
           </w:p>
         </w:tc>
@@ -8488,7 +8488,7 @@
                 <w:sz w:val="18"/>
                 <w:szCs w:val="18"/>
               </w:rPr>
-              <w:t xml:space="preserve">evapPressMin / blowerSeekRpmS</w:t>
+              <w:t xml:space="preserve">evapPressMin / blowerSeekRpmS / blowerSeekMaxRpm</w:t>
             </w:r>
           </w:p>
         </w:tc>
@@ -8517,7 +8517,7 @@
                 <w:sz w:val="20"/>
                 <w:szCs w:val="20"/>
               </w:rPr>
-              <w:t xml:space="preserve">13.0 / 8</w:t>
+              <w:t xml:space="preserve">13.0 / 8 / 2800</w:t>
             </w:r>
           </w:p>
         </w:tc>
@@ -8546,7 +8546,7 @@
                 <w:sz w:val="20"/>
                 <w:szCs w:val="20"/>
               </w:rPr>
-              <w:t xml:space="preserve">psia / rpm/s</w:t>
+              <w:t xml:space="preserve">psia / rpm/s / rpm</w:t>
             </w:r>
           </w:p>
         </w:tc>
@@ -8575,7 +8575,7 @@
                 <w:sz w:val="20"/>
                 <w:szCs w:val="20"/>
               </w:rPr>
-              <w:t xml:space="preserve">Blower PRESSURE-SEEK (RUN, vent closed, BEFORE the first condensate batch): no measured production exists yet, so instead of freezing at the nominal 1500 the target CLIMBS at blowerSeekRpmS while the evap (suction) pressure holds above evapPressMin+0.3. Suction is the honest capability signal -- it only drops when the blower outpaces the boil. After batches, the production integral takes over but never raises the target with suction at the floor; either mode backs off below the floor.</w:t>
+              <w:t xml:space="preserve">Blower PRESSURE-SEEK (RUN, vent closed, BEFORE the first condensate batch): no measured production exists yet, so instead of freezing at the nominal 1500 the target CLIMBS at blowerSeekRpmS while the suction holds above evapPressMin+0.3 AND superheat is healthy (&gt; minSuperheat+1) -- superheat collapse is the other 'outpacing the plant' signal -- CAPPED at blowerSeekMaxRpm (the rig boils hard enough that suction never sagged and the seek ran to the 4000 clamp). After batches, the production integral takes over (may exceed the cap) but never raises the target with suction at the floor; either mode backs off below the floor.</w:t>
             </w:r>
           </w:p>
         </w:tc>

</xml_diff>

<commit_message>
Doc: rate sanity + run turndown floor rows
Co-Authored-By: Claude Opus 4.8 <noreply@anthropic.com>
</commit_message>
<xml_diff>
--- a/MVR_Model_Reference.docx
+++ b/MVR_Model_Reference.docx
@@ -4914,6 +4914,124 @@
                 <w:sz w:val="18"/>
                 <w:szCs w:val="18"/>
               </w:rPr>
+              <w:t xml:space="preserve">blowerRunMinRpm</w:t>
+            </w:r>
+          </w:p>
+        </w:tc>
+        <w:tc>
+          <w:tcPr>
+            <w:tcW w:type="dxa" w:w="1100"/>
+            <w:tcBorders>
+              <w:top w:val="single" w:color="BBBBBB" w:sz="1"/>
+              <w:left w:val="single" w:color="BBBBBB" w:sz="1"/>
+              <w:bottom w:val="single" w:color="BBBBBB" w:sz="1"/>
+              <w:right w:val="single" w:color="BBBBBB" w:sz="1"/>
+            </w:tcBorders>
+            <w:tcMar>
+              <w:top w:type="dxa" w:w="50"/>
+              <w:left w:type="dxa" w:w="110"/>
+              <w:bottom w:type="dxa" w:w="50"/>
+              <w:right w:type="dxa" w:w="110"/>
+            </w:tcMar>
+          </w:tcPr>
+          <w:p>
+            <w:r>
+              <w:rPr>
+                <w:rFonts w:ascii="Arial" w:cs="Arial" w:eastAsia="Arial" w:hAnsi="Arial"/>
+                <w:b w:val="false"/>
+                <w:bCs w:val="false"/>
+                <w:sz w:val="20"/>
+                <w:szCs w:val="20"/>
+              </w:rPr>
+              <w:t xml:space="preserve">1950</w:t>
+            </w:r>
+          </w:p>
+        </w:tc>
+        <w:tc>
+          <w:tcPr>
+            <w:tcW w:type="dxa" w:w="800"/>
+            <w:tcBorders>
+              <w:top w:val="single" w:color="BBBBBB" w:sz="1"/>
+              <w:left w:val="single" w:color="BBBBBB" w:sz="1"/>
+              <w:bottom w:val="single" w:color="BBBBBB" w:sz="1"/>
+              <w:right w:val="single" w:color="BBBBBB" w:sz="1"/>
+            </w:tcBorders>
+            <w:tcMar>
+              <w:top w:type="dxa" w:w="50"/>
+              <w:left w:type="dxa" w:w="110"/>
+              <w:bottom w:type="dxa" w:w="50"/>
+              <w:right w:type="dxa" w:w="110"/>
+            </w:tcMar>
+          </w:tcPr>
+          <w:p>
+            <w:r>
+              <w:rPr>
+                <w:rFonts w:ascii="Arial" w:cs="Arial" w:eastAsia="Arial" w:hAnsi="Arial"/>
+                <w:b w:val="false"/>
+                <w:bCs w:val="false"/>
+                <w:sz w:val="20"/>
+                <w:szCs w:val="20"/>
+              </w:rPr>
+              <w:t xml:space="preserve">rpm</w:t>
+            </w:r>
+          </w:p>
+        </w:tc>
+        <w:tc>
+          <w:tcPr>
+            <w:tcW w:type="dxa" w:w="5060"/>
+            <w:tcBorders>
+              <w:top w:val="single" w:color="BBBBBB" w:sz="1"/>
+              <w:left w:val="single" w:color="BBBBBB" w:sz="1"/>
+              <w:bottom w:val="single" w:color="BBBBBB" w:sz="1"/>
+              <w:right w:val="single" w:color="BBBBBB" w:sz="1"/>
+            </w:tcBorders>
+            <w:tcMar>
+              <w:top w:type="dxa" w:w="50"/>
+              <w:left w:type="dxa" w:w="110"/>
+              <w:bottom w:type="dxa" w:w="50"/>
+              <w:right w:type="dxa" w:w="110"/>
+            </w:tcMar>
+          </w:tcPr>
+          <w:p>
+            <w:r>
+              <w:rPr>
+                <w:rFonts w:ascii="Arial" w:cs="Arial" w:eastAsia="Arial" w:hAnsi="Arial"/>
+                <w:b w:val="false"/>
+                <w:bCs w:val="false"/>
+                <w:sz w:val="20"/>
+                <w:szCs w:val="20"/>
+              </w:rPr>
+              <w:t xml:space="preserve">Production-control TURNDOWN FLOOR: once running, the blower target never drops below this -- below ~2000 there is no real vapor flow, superheat dies, and the run's thermal progress unwinds. If production exceeds productionSet at the floor, the feed simply matches it. (blowerMinRpm 800 remains the absolute floor used by gates elsewhere.)</w:t>
+            </w:r>
+          </w:p>
+        </w:tc>
+      </w:tr>
+      <w:tr>
+        <w:tc>
+          <w:tcPr>
+            <w:tcW w:type="dxa" w:w="2400"/>
+            <w:tcBorders>
+              <w:top w:val="single" w:color="BBBBBB" w:sz="1"/>
+              <w:left w:val="single" w:color="BBBBBB" w:sz="1"/>
+              <w:bottom w:val="single" w:color="BBBBBB" w:sz="1"/>
+              <w:right w:val="single" w:color="BBBBBB" w:sz="1"/>
+            </w:tcBorders>
+            <w:tcMar>
+              <w:top w:type="dxa" w:w="50"/>
+              <w:left w:type="dxa" w:w="110"/>
+              <w:bottom w:type="dxa" w:w="50"/>
+              <w:right w:type="dxa" w:w="110"/>
+            </w:tcMar>
+          </w:tcPr>
+          <w:p>
+            <w:r>
+              <w:rPr>
+                <w:rFonts w:ascii="Consolas" w:cs="Consolas" w:eastAsia="Consolas" w:hAnsi="Consolas"/>
+                <w:b w:val="false"/>
+                <w:bCs w:val="false"/>
+                <w:sz w:val="18"/>
+                <w:szCs w:val="18"/>
+              </w:rPr>
               <w:t xml:space="preserve">feedRpmMax</w:t>
             </w:r>
           </w:p>
@@ -7986,6 +8104,124 @@
                 <w:szCs w:val="20"/>
               </w:rPr>
               <w:t xml:space="preserve">Stop the pump if a single metered batch exceeds this (backstop for a meter that keeps counting on air).</w:t>
+            </w:r>
+          </w:p>
+        </w:tc>
+      </w:tr>
+      <w:tr>
+        <w:tc>
+          <w:tcPr>
+            <w:tcW w:type="dxa" w:w="2200"/>
+            <w:tcBorders>
+              <w:top w:val="single" w:color="BBBBBB" w:sz="1"/>
+              <w:left w:val="single" w:color="BBBBBB" w:sz="1"/>
+              <w:bottom w:val="single" w:color="BBBBBB" w:sz="1"/>
+              <w:right w:val="single" w:color="BBBBBB" w:sz="1"/>
+            </w:tcBorders>
+            <w:tcMar>
+              <w:top w:type="dxa" w:w="50"/>
+              <w:left w:type="dxa" w:w="110"/>
+              <w:bottom w:type="dxa" w:w="50"/>
+              <w:right w:type="dxa" w:w="110"/>
+            </w:tcMar>
+          </w:tcPr>
+          <w:p>
+            <w:r>
+              <w:rPr>
+                <w:rFonts w:ascii="Consolas" w:cs="Consolas" w:eastAsia="Consolas" w:hAnsi="Consolas"/>
+                <w:b w:val="false"/>
+                <w:bCs w:val="false"/>
+                <w:sz w:val="18"/>
+                <w:szCs w:val="18"/>
+              </w:rPr>
+              <w:t xml:space="preserve">condRateMinML / condRateMaxLpm</w:t>
+            </w:r>
+          </w:p>
+        </w:tc>
+        <w:tc>
+          <w:tcPr>
+            <w:tcW w:type="dxa" w:w="1300"/>
+            <w:tcBorders>
+              <w:top w:val="single" w:color="BBBBBB" w:sz="1"/>
+              <w:left w:val="single" w:color="BBBBBB" w:sz="1"/>
+              <w:bottom w:val="single" w:color="BBBBBB" w:sz="1"/>
+              <w:right w:val="single" w:color="BBBBBB" w:sz="1"/>
+            </w:tcBorders>
+            <w:tcMar>
+              <w:top w:type="dxa" w:w="50"/>
+              <w:left w:type="dxa" w:w="110"/>
+              <w:bottom w:type="dxa" w:w="50"/>
+              <w:right w:type="dxa" w:w="110"/>
+            </w:tcMar>
+          </w:tcPr>
+          <w:p>
+            <w:r>
+              <w:rPr>
+                <w:rFonts w:ascii="Arial" w:cs="Arial" w:eastAsia="Arial" w:hAnsi="Arial"/>
+                <w:b w:val="false"/>
+                <w:bCs w:val="false"/>
+                <w:sz w:val="20"/>
+                <w:szCs w:val="20"/>
+              </w:rPr>
+              <w:t xml:space="preserve">50 / 0.5</w:t>
+            </w:r>
+          </w:p>
+        </w:tc>
+        <w:tc>
+          <w:tcPr>
+            <w:tcW w:type="dxa" w:w="1500"/>
+            <w:tcBorders>
+              <w:top w:val="single" w:color="BBBBBB" w:sz="1"/>
+              <w:left w:val="single" w:color="BBBBBB" w:sz="1"/>
+              <w:bottom w:val="single" w:color="BBBBBB" w:sz="1"/>
+              <w:right w:val="single" w:color="BBBBBB" w:sz="1"/>
+            </w:tcBorders>
+            <w:tcMar>
+              <w:top w:type="dxa" w:w="50"/>
+              <w:left w:type="dxa" w:w="110"/>
+              <w:bottom w:type="dxa" w:w="50"/>
+              <w:right w:type="dxa" w:w="110"/>
+            </w:tcMar>
+          </w:tcPr>
+          <w:p>
+            <w:r>
+              <w:rPr>
+                <w:rFonts w:ascii="Arial" w:cs="Arial" w:eastAsia="Arial" w:hAnsi="Arial"/>
+                <w:b w:val="false"/>
+                <w:bCs w:val="false"/>
+                <w:sz w:val="20"/>
+                <w:szCs w:val="20"/>
+              </w:rPr>
+              <w:t xml:space="preserve">ml / L/min</w:t>
+            </w:r>
+          </w:p>
+        </w:tc>
+        <w:tc>
+          <w:tcPr>
+            <w:tcW w:type="dxa" w:w="4360"/>
+            <w:tcBorders>
+              <w:top w:val="single" w:color="BBBBBB" w:sz="1"/>
+              <w:left w:val="single" w:color="BBBBBB" w:sz="1"/>
+              <w:bottom w:val="single" w:color="BBBBBB" w:sz="1"/>
+              <w:right w:val="single" w:color="BBBBBB" w:sz="1"/>
+            </w:tcBorders>
+            <w:tcMar>
+              <w:top w:type="dxa" w:w="50"/>
+              <w:left w:type="dxa" w:w="110"/>
+              <w:bottom w:type="dxa" w:w="50"/>
+              <w:right w:type="dxa" w:w="110"/>
+            </w:tcMar>
+          </w:tcPr>
+          <w:p>
+            <w:r>
+              <w:rPr>
+                <w:rFonts w:ascii="Arial" w:cs="Arial" w:eastAsia="Arial" w:hAnsi="Arial"/>
+                <w:b w:val="false"/>
+                <w:bCs w:val="false"/>
+                <w:sz w:val="20"/>
+                <w:szCs w:val="20"/>
+              </w:rPr>
+              <w:t xml:space="preserve">Production-rate SANITY (rig 7/13): batches under condRateMinML are noise (pump-prime lag trips the dry-detect at ~1ml) -- no rate is computed and the fill timer KEEPS RUNNING (micro-batches resetting it made a real 458ml batch read an impossible 0.75 L/min and the blower turned down 3400-&gt;800 chasing it). Computed rates above condRateMaxLpm (~28kW-equivalent) are discarded; the last good rate is kept.</w:t>
             </w:r>
           </w:p>
         </w:tc>

</xml_diff>

<commit_message>
Doc: SH regulation 250 / trip 275
Co-Authored-By: Claude Opus 4.8 <noreply@anthropic.com>
</commit_message>
<xml_diff>
--- a/MVR_Model_Reference.docx
+++ b/MVR_Model_Reference.docx
@@ -5297,7 +5297,7 @@
                 <w:sz w:val="20"/>
                 <w:szCs w:val="20"/>
               </w:rPr>
-              <w:t xml:space="preserve">250</w:t>
+              <w:t xml:space="preserve">275</w:t>
             </w:r>
           </w:p>
         </w:tc>
@@ -5355,7 +5355,7 @@
                 <w:sz w:val="20"/>
                 <w:szCs w:val="20"/>
               </w:rPr>
-              <w:t xml:space="preserve">Superheat-cartridge TC over-temp TRIP -- hard backstop above the 200C element regulation (the cartridge runs HOT by design in thin vapor). Latched.</w:t>
+              <w:t xml:space="preserve">Superheat-cartridge TC over-temp TRIP -- hard backstop above the 250C element regulation (the cartridge runs HOT by design in thin vapor). Latched.</w:t>
             </w:r>
           </w:p>
         </w:tc>
@@ -5415,7 +5415,7 @@
                 <w:sz w:val="20"/>
                 <w:szCs w:val="20"/>
               </w:rPr>
-              <w:t xml:space="preserve">200 / 0.05</w:t>
+              <w:t xml:space="preserve">250 / 0.05</w:t>
             </w:r>
           </w:p>
         </w:tc>

</xml_diff>

<commit_message>
Doc: prodWinS totalizer-window rate row
Co-Authored-By: Claude Opus 4.8 <noreply@anthropic.com>
</commit_message>
<xml_diff>
--- a/MVR_Model_Reference.docx
+++ b/MVR_Model_Reference.docx
@@ -8104,6 +8104,124 @@
                 <w:szCs w:val="20"/>
               </w:rPr>
               <w:t xml:space="preserve">Stop the pump if a single metered batch exceeds this (backstop for a meter that keeps counting on air).</w:t>
+            </w:r>
+          </w:p>
+        </w:tc>
+      </w:tr>
+      <w:tr>
+        <w:tc>
+          <w:tcPr>
+            <w:tcW w:type="dxa" w:w="2200"/>
+            <w:tcBorders>
+              <w:top w:val="single" w:color="BBBBBB" w:sz="1"/>
+              <w:left w:val="single" w:color="BBBBBB" w:sz="1"/>
+              <w:bottom w:val="single" w:color="BBBBBB" w:sz="1"/>
+              <w:right w:val="single" w:color="BBBBBB" w:sz="1"/>
+            </w:tcBorders>
+            <w:tcMar>
+              <w:top w:type="dxa" w:w="50"/>
+              <w:left w:type="dxa" w:w="110"/>
+              <w:bottom w:type="dxa" w:w="50"/>
+              <w:right w:type="dxa" w:w="110"/>
+            </w:tcMar>
+          </w:tcPr>
+          <w:p>
+            <w:r>
+              <w:rPr>
+                <w:rFonts w:ascii="Consolas" w:cs="Consolas" w:eastAsia="Consolas" w:hAnsi="Consolas"/>
+                <w:b w:val="false"/>
+                <w:bCs w:val="false"/>
+                <w:sz w:val="18"/>
+                <w:szCs w:val="18"/>
+              </w:rPr>
+              <w:t xml:space="preserve">prodWinS</w:t>
+            </w:r>
+          </w:p>
+        </w:tc>
+        <w:tc>
+          <w:tcPr>
+            <w:tcW w:type="dxa" w:w="1300"/>
+            <w:tcBorders>
+              <w:top w:val="single" w:color="BBBBBB" w:sz="1"/>
+              <w:left w:val="single" w:color="BBBBBB" w:sz="1"/>
+              <w:bottom w:val="single" w:color="BBBBBB" w:sz="1"/>
+              <w:right w:val="single" w:color="BBBBBB" w:sz="1"/>
+            </w:tcBorders>
+            <w:tcMar>
+              <w:top w:type="dxa" w:w="50"/>
+              <w:left w:type="dxa" w:w="110"/>
+              <w:bottom w:type="dxa" w:w="50"/>
+              <w:right w:type="dxa" w:w="110"/>
+            </w:tcMar>
+          </w:tcPr>
+          <w:p>
+            <w:r>
+              <w:rPr>
+                <w:rFonts w:ascii="Arial" w:cs="Arial" w:eastAsia="Arial" w:hAnsi="Arial"/>
+                <w:b w:val="false"/>
+                <w:bCs w:val="false"/>
+                <w:sz w:val="20"/>
+                <w:szCs w:val="20"/>
+              </w:rPr>
+              <w:t xml:space="preserve">180</w:t>
+            </w:r>
+          </w:p>
+        </w:tc>
+        <w:tc>
+          <w:tcPr>
+            <w:tcW w:type="dxa" w:w="1500"/>
+            <w:tcBorders>
+              <w:top w:val="single" w:color="BBBBBB" w:sz="1"/>
+              <w:left w:val="single" w:color="BBBBBB" w:sz="1"/>
+              <w:bottom w:val="single" w:color="BBBBBB" w:sz="1"/>
+              <w:right w:val="single" w:color="BBBBBB" w:sz="1"/>
+            </w:tcBorders>
+            <w:tcMar>
+              <w:top w:type="dxa" w:w="50"/>
+              <w:left w:type="dxa" w:w="110"/>
+              <w:bottom w:type="dxa" w:w="50"/>
+              <w:right w:type="dxa" w:w="110"/>
+            </w:tcMar>
+          </w:tcPr>
+          <w:p>
+            <w:r>
+              <w:rPr>
+                <w:rFonts w:ascii="Arial" w:cs="Arial" w:eastAsia="Arial" w:hAnsi="Arial"/>
+                <w:b w:val="false"/>
+                <w:bCs w:val="false"/>
+                <w:sz w:val="20"/>
+                <w:szCs w:val="20"/>
+              </w:rPr>
+              <w:t xml:space="preserve">s</w:t>
+            </w:r>
+          </w:p>
+        </w:tc>
+        <w:tc>
+          <w:tcPr>
+            <w:tcW w:type="dxa" w:w="4360"/>
+            <w:tcBorders>
+              <w:top w:val="single" w:color="BBBBBB" w:sz="1"/>
+              <w:left w:val="single" w:color="BBBBBB" w:sz="1"/>
+              <w:bottom w:val="single" w:color="BBBBBB" w:sz="1"/>
+              <w:right w:val="single" w:color="BBBBBB" w:sz="1"/>
+            </w:tcBorders>
+            <w:tcMar>
+              <w:top w:type="dxa" w:w="50"/>
+              <w:left w:type="dxa" w:w="110"/>
+              <w:bottom w:type="dxa" w:w="50"/>
+              <w:right w:type="dxa" w:w="110"/>
+            </w:tcMar>
+          </w:tcPr>
+          <w:p>
+            <w:r>
+              <w:rPr>
+                <w:rFonts w:ascii="Arial" w:cs="Arial" w:eastAsia="Arial" w:hAnsi="Arial"/>
+                <w:b w:val="false"/>
+                <w:bCs w:val="false"/>
+                <w:sz w:val="20"/>
+                <w:szCs w:val="20"/>
+              </w:rPr>
+              <w:t xml:space="preserve">TOTALIZER-WINDOW production rate: condRateLpm/condHaveRate also update from the cumulative meter delta over this rolling window -- needs NO pump cycles (a stuck-wet CondLevel micro-cycles the pump so no batch ever reaches condRateMinML; the rig sat blind at the seek cap with a WORKING meter). Batches still refresh the same rate more precisely when they land; &gt;= 5ml/window required, plausibility-capped.</w:t>
             </w:r>
           </w:p>
         </w:tc>

</xml_diff>

<commit_message>
Doc: prodUseInput input-side measurement row
Co-Authored-By: Claude Opus 4.8 <noreply@anthropic.com>
</commit_message>
<xml_diff>
--- a/MVR_Model_Reference.docx
+++ b/MVR_Model_Reference.docx
@@ -8104,6 +8104,124 @@
                 <w:szCs w:val="20"/>
               </w:rPr>
               <w:t xml:space="preserve">Stop the pump if a single metered batch exceeds this (backstop for a meter that keeps counting on air).</w:t>
+            </w:r>
+          </w:p>
+        </w:tc>
+      </w:tr>
+      <w:tr>
+        <w:tc>
+          <w:tcPr>
+            <w:tcW w:type="dxa" w:w="2200"/>
+            <w:tcBorders>
+              <w:top w:val="single" w:color="BBBBBB" w:sz="1"/>
+              <w:left w:val="single" w:color="BBBBBB" w:sz="1"/>
+              <w:bottom w:val="single" w:color="BBBBBB" w:sz="1"/>
+              <w:right w:val="single" w:color="BBBBBB" w:sz="1"/>
+            </w:tcBorders>
+            <w:tcMar>
+              <w:top w:type="dxa" w:w="50"/>
+              <w:left w:type="dxa" w:w="110"/>
+              <w:bottom w:type="dxa" w:w="50"/>
+              <w:right w:type="dxa" w:w="110"/>
+            </w:tcMar>
+          </w:tcPr>
+          <w:p>
+            <w:r>
+              <w:rPr>
+                <w:rFonts w:ascii="Consolas" w:cs="Consolas" w:eastAsia="Consolas" w:hAnsi="Consolas"/>
+                <w:b w:val="false"/>
+                <w:bCs w:val="false"/>
+                <w:sz w:val="18"/>
+                <w:szCs w:val="18"/>
+              </w:rPr>
+              <w:t xml:space="preserve">prodUseInput / prodInWinS</w:t>
+            </w:r>
+          </w:p>
+        </w:tc>
+        <w:tc>
+          <w:tcPr>
+            <w:tcW w:type="dxa" w:w="1300"/>
+            <w:tcBorders>
+              <w:top w:val="single" w:color="BBBBBB" w:sz="1"/>
+              <w:left w:val="single" w:color="BBBBBB" w:sz="1"/>
+              <w:bottom w:val="single" w:color="BBBBBB" w:sz="1"/>
+              <w:right w:val="single" w:color="BBBBBB" w:sz="1"/>
+            </w:tcBorders>
+            <w:tcMar>
+              <w:top w:type="dxa" w:w="50"/>
+              <w:left w:type="dxa" w:w="110"/>
+              <w:bottom w:type="dxa" w:w="50"/>
+              <w:right w:type="dxa" w:w="110"/>
+            </w:tcMar>
+          </w:tcPr>
+          <w:p>
+            <w:r>
+              <w:rPr>
+                <w:rFonts w:ascii="Arial" w:cs="Arial" w:eastAsia="Arial" w:hAnsi="Arial"/>
+                <w:b w:val="false"/>
+                <w:bCs w:val="false"/>
+                <w:sz w:val="20"/>
+                <w:szCs w:val="20"/>
+              </w:rPr>
+              <w:t xml:space="preserve">0 / 240</w:t>
+            </w:r>
+          </w:p>
+        </w:tc>
+        <w:tc>
+          <w:tcPr>
+            <w:tcW w:type="dxa" w:w="1500"/>
+            <w:tcBorders>
+              <w:top w:val="single" w:color="BBBBBB" w:sz="1"/>
+              <w:left w:val="single" w:color="BBBBBB" w:sz="1"/>
+              <w:bottom w:val="single" w:color="BBBBBB" w:sz="1"/>
+              <w:right w:val="single" w:color="BBBBBB" w:sz="1"/>
+            </w:tcBorders>
+            <w:tcMar>
+              <w:top w:type="dxa" w:w="50"/>
+              <w:left w:type="dxa" w:w="110"/>
+              <w:bottom w:type="dxa" w:w="50"/>
+              <w:right w:type="dxa" w:w="110"/>
+            </w:tcMar>
+          </w:tcPr>
+          <w:p>
+            <w:r>
+              <w:rPr>
+                <w:rFonts w:ascii="Arial" w:cs="Arial" w:eastAsia="Arial" w:hAnsi="Arial"/>
+                <w:b w:val="false"/>
+                <w:bCs w:val="false"/>
+                <w:sz w:val="20"/>
+                <w:szCs w:val="20"/>
+              </w:rPr>
+              <w:t xml:space="preserve">0-1 / s</w:t>
+            </w:r>
+          </w:p>
+        </w:tc>
+        <w:tc>
+          <w:tcPr>
+            <w:tcW w:type="dxa" w:w="4360"/>
+            <w:tcBorders>
+              <w:top w:val="single" w:color="BBBBBB" w:sz="1"/>
+              <w:left w:val="single" w:color="BBBBBB" w:sz="1"/>
+              <w:bottom w:val="single" w:color="BBBBBB" w:sz="1"/>
+              <w:right w:val="single" w:color="BBBBBB" w:sz="1"/>
+            </w:tcBorders>
+            <w:tcMar>
+              <w:top w:type="dxa" w:w="50"/>
+              <w:left w:type="dxa" w:w="110"/>
+              <w:bottom w:type="dxa" w:w="50"/>
+              <w:right w:type="dxa" w:w="110"/>
+            </w:tcMar>
+          </w:tcPr>
+          <w:p>
+            <w:r>
+              <w:rPr>
+                <w:rFonts w:ascii="Arial" w:cs="Arial" w:eastAsia="Arial" w:hAnsi="Arial"/>
+                <w:b w:val="false"/>
+                <w:bCs w:val="false"/>
+                <w:sz w:val="20"/>
+                <w:szCs w:val="20"/>
+              </w:rPr>
+              <w:t xml:space="preserve">INPUT-SIDE production measurement OPTION: prod = calibrated feed IN minus the sender-anchored level CHANGE over the window -- only the positive-displacement pump + fused level, nothing from the condensate meter (for when the output measurement can't be trusted; in sim the input estimate beat a 12%-miscalibrated meter). prodUseInput=1 selects it for the blower production control; 0 = output measurement (default). All downstream logic (integral, floor, seek, caps) shared.</w:t>
             </w:r>
           </w:p>
         </w:tc>

</xml_diff>

<commit_message>
Doc: timed condensate pumping fallback row
Co-Authored-By: Claude Opus 4.8 <noreply@anthropic.com>
</commit_message>
<xml_diff>
--- a/MVR_Model_Reference.docx
+++ b/MVR_Model_Reference.docx
@@ -8340,6 +8340,124 @@
                 <w:szCs w:val="20"/>
               </w:rPr>
               <w:t xml:space="preserve">TOTALIZER-WINDOW production rate: condRateLpm/condHaveRate also update from the cumulative meter delta over this rolling window -- needs NO pump cycles (a stuck-wet CondLevel micro-cycles the pump so no batch ever reaches condRateMinML; the rig sat blind at the seek cap with a WORKING meter). Batches still refresh the same rate more precisely when they land; &gt;= 5ml/window required, plausibility-capped.</w:t>
+            </w:r>
+          </w:p>
+        </w:tc>
+      </w:tr>
+      <w:tr>
+        <w:tc>
+          <w:tcPr>
+            <w:tcW w:type="dxa" w:w="2200"/>
+            <w:tcBorders>
+              <w:top w:val="single" w:color="BBBBBB" w:sz="1"/>
+              <w:left w:val="single" w:color="BBBBBB" w:sz="1"/>
+              <w:bottom w:val="single" w:color="BBBBBB" w:sz="1"/>
+              <w:right w:val="single" w:color="BBBBBB" w:sz="1"/>
+            </w:tcBorders>
+            <w:tcMar>
+              <w:top w:type="dxa" w:w="50"/>
+              <w:left w:type="dxa" w:w="110"/>
+              <w:bottom w:type="dxa" w:w="50"/>
+              <w:right w:type="dxa" w:w="110"/>
+            </w:tcMar>
+          </w:tcPr>
+          <w:p>
+            <w:r>
+              <w:rPr>
+                <w:rFonts w:ascii="Consolas" w:cs="Consolas" w:eastAsia="Consolas" w:hAnsi="Consolas"/>
+                <w:b w:val="false"/>
+                <w:bCs w:val="false"/>
+                <w:sz w:val="18"/>
+                <w:szCs w:val="18"/>
+              </w:rPr>
+              <w:t xml:space="preserve">condTimedEn / condTimedOnS / condTimedOffS</w:t>
+            </w:r>
+          </w:p>
+        </w:tc>
+        <w:tc>
+          <w:tcPr>
+            <w:tcW w:type="dxa" w:w="1300"/>
+            <w:tcBorders>
+              <w:top w:val="single" w:color="BBBBBB" w:sz="1"/>
+              <w:left w:val="single" w:color="BBBBBB" w:sz="1"/>
+              <w:bottom w:val="single" w:color="BBBBBB" w:sz="1"/>
+              <w:right w:val="single" w:color="BBBBBB" w:sz="1"/>
+            </w:tcBorders>
+            <w:tcMar>
+              <w:top w:type="dxa" w:w="50"/>
+              <w:left w:type="dxa" w:w="110"/>
+              <w:bottom w:type="dxa" w:w="50"/>
+              <w:right w:type="dxa" w:w="110"/>
+            </w:tcMar>
+          </w:tcPr>
+          <w:p>
+            <w:r>
+              <w:rPr>
+                <w:rFonts w:ascii="Arial" w:cs="Arial" w:eastAsia="Arial" w:hAnsi="Arial"/>
+                <w:b w:val="false"/>
+                <w:bCs w:val="false"/>
+                <w:sz w:val="20"/>
+                <w:szCs w:val="20"/>
+              </w:rPr>
+              <w:t xml:space="preserve">1 / 30 / 60</w:t>
+            </w:r>
+          </w:p>
+        </w:tc>
+        <w:tc>
+          <w:tcPr>
+            <w:tcW w:type="dxa" w:w="1500"/>
+            <w:tcBorders>
+              <w:top w:val="single" w:color="BBBBBB" w:sz="1"/>
+              <w:left w:val="single" w:color="BBBBBB" w:sz="1"/>
+              <w:bottom w:val="single" w:color="BBBBBB" w:sz="1"/>
+              <w:right w:val="single" w:color="BBBBBB" w:sz="1"/>
+            </w:tcBorders>
+            <w:tcMar>
+              <w:top w:type="dxa" w:w="50"/>
+              <w:left w:type="dxa" w:w="110"/>
+              <w:bottom w:type="dxa" w:w="50"/>
+              <w:right w:type="dxa" w:w="110"/>
+            </w:tcMar>
+          </w:tcPr>
+          <w:p>
+            <w:r>
+              <w:rPr>
+                <w:rFonts w:ascii="Arial" w:cs="Arial" w:eastAsia="Arial" w:hAnsi="Arial"/>
+                <w:b w:val="false"/>
+                <w:bCs w:val="false"/>
+                <w:sz w:val="20"/>
+                <w:szCs w:val="20"/>
+              </w:rPr>
+              <w:t xml:space="preserve">0-1 / s / s</w:t>
+            </w:r>
+          </w:p>
+        </w:tc>
+        <w:tc>
+          <w:tcPr>
+            <w:tcW w:type="dxa" w:w="4360"/>
+            <w:tcBorders>
+              <w:top w:val="single" w:color="BBBBBB" w:sz="1"/>
+              <w:left w:val="single" w:color="BBBBBB" w:sz="1"/>
+              <w:bottom w:val="single" w:color="BBBBBB" w:sz="1"/>
+              <w:right w:val="single" w:color="BBBBBB" w:sz="1"/>
+            </w:tcBorders>
+            <w:tcMar>
+              <w:top w:type="dxa" w:w="50"/>
+              <w:left w:type="dxa" w:w="110"/>
+              <w:bottom w:type="dxa" w:w="50"/>
+              <w:right w:type="dxa" w:w="110"/>
+            </w:tcMar>
+          </w:tcPr>
+          <w:p>
+            <w:r>
+              <w:rPr>
+                <w:rFonts w:ascii="Arial" w:cs="Arial" w:eastAsia="Arial" w:hAnsi="Arial"/>
+                <w:b w:val="false"/>
+                <w:bCs w:val="false"/>
+                <w:sz w:val="20"/>
+                <w:szCs w:val="20"/>
+              </w:rPr>
+              <w:t xml:space="preserve">SENSOR-BAD FALLBACK (optional): if the pump cycled condMeterFaultS with no real batch but the METER counted flow (&gt;= 5ml), the CondLevel sensor is the liar (fog film) -&gt; condSensErr popup + TIMED pumping for the rest of the run (ON condTimedOnS / OFF condTimedOffS). Timed cycles are CLEAN pump cycles, so batches + the batch rate come back despite the bad sensor. Meter counted nothing -&gt; condMeterErr as before. Latched until Stop.</w:t>
             </w:r>
           </w:p>
         </w:tc>

</xml_diff>

<commit_message>
UI 2.1.79 + doc: feed-stall popup text, deltaTMin + feed-stall rows
Co-Authored-By: Claude Opus 4.8 <noreply@anthropic.com>
</commit_message>
<xml_diff>
--- a/MVR_Model_Reference.docx
+++ b/MVR_Model_Reference.docx
@@ -5828,6 +5828,242 @@
                 <w:szCs w:val="20"/>
               </w:rPr>
               <w:t xml:space="preserve">Wet-compression (low-superheat) trip. Fires/arms only at REAL speed (target*0.9 AND &gt;= blowerMinRpm) AND with the evaporator at temp (&gt;= set-5); DISARMS whenever the blower leaves at-speed (restart ramps legitimately collapse superheat); superheat must sit below the floor for superHFaultS CONTINUOUSLY (swings dip briefly, wet compression persists); and the sag does NOT count while the ELEMENT REGULATOR caps the duty (shElemLim: a 200C mesh can't be wet -- that sag is a capability limit; real wet comp cools the mesh, the cap releases, and the sag then counts). Latched.</w:t>
+            </w:r>
+          </w:p>
+        </w:tc>
+      </w:tr>
+      <w:tr>
+        <w:tc>
+          <w:tcPr>
+            <w:tcW w:type="dxa" w:w="2400"/>
+            <w:tcBorders>
+              <w:top w:val="single" w:color="BBBBBB" w:sz="1"/>
+              <w:left w:val="single" w:color="BBBBBB" w:sz="1"/>
+              <w:bottom w:val="single" w:color="BBBBBB" w:sz="1"/>
+              <w:right w:val="single" w:color="BBBBBB" w:sz="1"/>
+            </w:tcBorders>
+            <w:tcMar>
+              <w:top w:type="dxa" w:w="50"/>
+              <w:left w:type="dxa" w:w="110"/>
+              <w:bottom w:type="dxa" w:w="50"/>
+              <w:right w:type="dxa" w:w="110"/>
+            </w:tcMar>
+          </w:tcPr>
+          <w:p>
+            <w:r>
+              <w:rPr>
+                <w:rFonts w:ascii="Consolas" w:cs="Consolas" w:eastAsia="Consolas" w:hAnsi="Consolas"/>
+                <w:b w:val="false"/>
+                <w:bCs w:val="false"/>
+                <w:sz w:val="18"/>
+                <w:szCs w:val="18"/>
+              </w:rPr>
+              <w:t xml:space="preserve">deltaTMin</w:t>
+            </w:r>
+          </w:p>
+        </w:tc>
+        <w:tc>
+          <w:tcPr>
+            <w:tcW w:type="dxa" w:w="1100"/>
+            <w:tcBorders>
+              <w:top w:val="single" w:color="BBBBBB" w:sz="1"/>
+              <w:left w:val="single" w:color="BBBBBB" w:sz="1"/>
+              <w:bottom w:val="single" w:color="BBBBBB" w:sz="1"/>
+              <w:right w:val="single" w:color="BBBBBB" w:sz="1"/>
+            </w:tcBorders>
+            <w:tcMar>
+              <w:top w:type="dxa" w:w="50"/>
+              <w:left w:type="dxa" w:w="110"/>
+              <w:bottom w:type="dxa" w:w="50"/>
+              <w:right w:type="dxa" w:w="110"/>
+            </w:tcMar>
+          </w:tcPr>
+          <w:p>
+            <w:r>
+              <w:rPr>
+                <w:rFonts w:ascii="Arial" w:cs="Arial" w:eastAsia="Arial" w:hAnsi="Arial"/>
+                <w:b w:val="false"/>
+                <w:bCs w:val="false"/>
+                <w:sz w:val="20"/>
+                <w:szCs w:val="20"/>
+              </w:rPr>
+              <w:t xml:space="preserve">2.5</w:t>
+            </w:r>
+          </w:p>
+        </w:tc>
+        <w:tc>
+          <w:tcPr>
+            <w:tcW w:type="dxa" w:w="800"/>
+            <w:tcBorders>
+              <w:top w:val="single" w:color="BBBBBB" w:sz="1"/>
+              <w:left w:val="single" w:color="BBBBBB" w:sz="1"/>
+              <w:bottom w:val="single" w:color="BBBBBB" w:sz="1"/>
+              <w:right w:val="single" w:color="BBBBBB" w:sz="1"/>
+            </w:tcBorders>
+            <w:tcMar>
+              <w:top w:type="dxa" w:w="50"/>
+              <w:left w:type="dxa" w:w="110"/>
+              <w:bottom w:type="dxa" w:w="50"/>
+              <w:right w:type="dxa" w:w="110"/>
+            </w:tcMar>
+          </w:tcPr>
+          <w:p>
+            <w:r>
+              <w:rPr>
+                <w:rFonts w:ascii="Arial" w:cs="Arial" w:eastAsia="Arial" w:hAnsi="Arial"/>
+                <w:b w:val="false"/>
+                <w:bCs w:val="false"/>
+                <w:sz w:val="20"/>
+                <w:szCs w:val="20"/>
+              </w:rPr>
+              <w:t xml:space="preserve">C</w:t>
+            </w:r>
+          </w:p>
+        </w:tc>
+        <w:tc>
+          <w:tcPr>
+            <w:tcW w:type="dxa" w:w="5060"/>
+            <w:tcBorders>
+              <w:top w:val="single" w:color="BBBBBB" w:sz="1"/>
+              <w:left w:val="single" w:color="BBBBBB" w:sz="1"/>
+              <w:bottom w:val="single" w:color="BBBBBB" w:sz="1"/>
+              <w:right w:val="single" w:color="BBBBBB" w:sz="1"/>
+            </w:tcBorders>
+            <w:tcMar>
+              <w:top w:type="dxa" w:w="50"/>
+              <w:left w:type="dxa" w:w="110"/>
+              <w:bottom w:type="dxa" w:w="50"/>
+              <w:right w:type="dxa" w:w="110"/>
+            </w:tcMar>
+          </w:tcPr>
+          <w:p>
+            <w:r>
+              <w:rPr>
+                <w:rFonts w:ascii="Arial" w:cs="Arial" w:eastAsia="Arial" w:hAnsi="Arial"/>
+                <w:b w:val="false"/>
+                <w:bCs w:val="false"/>
+                <w:sz w:val="20"/>
+                <w:szCs w:val="20"/>
+              </w:rPr>
+              <w:t xml:space="preserve">MINIMUM COMPRESSION LIFT: deltaT (steamTsat - evapTsat) is the MVR's working head -- at ~1C the HX moves no heat, nothing condenses, and the sealed system just pressurizes. Below this (at temp, vent closed, HEAT or RUN) the blower target RAISES toward the seek cap; the superheat rescue only acts when lift is adequate.</w:t>
+            </w:r>
+          </w:p>
+        </w:tc>
+      </w:tr>
+      <w:tr>
+        <w:tc>
+          <w:tcPr>
+            <w:tcW w:type="dxa" w:w="2400"/>
+            <w:tcBorders>
+              <w:top w:val="single" w:color="BBBBBB" w:sz="1"/>
+              <w:left w:val="single" w:color="BBBBBB" w:sz="1"/>
+              <w:bottom w:val="single" w:color="BBBBBB" w:sz="1"/>
+              <w:right w:val="single" w:color="BBBBBB" w:sz="1"/>
+            </w:tcBorders>
+            <w:tcMar>
+              <w:top w:type="dxa" w:w="50"/>
+              <w:left w:type="dxa" w:w="110"/>
+              <w:bottom w:type="dxa" w:w="50"/>
+              <w:right w:type="dxa" w:w="110"/>
+            </w:tcMar>
+          </w:tcPr>
+          <w:p>
+            <w:r>
+              <w:rPr>
+                <w:rFonts w:ascii="Consolas" w:cs="Consolas" w:eastAsia="Consolas" w:hAnsi="Consolas"/>
+                <w:b w:val="false"/>
+                <w:bCs w:val="false"/>
+                <w:sz w:val="18"/>
+                <w:szCs w:val="18"/>
+              </w:rPr>
+              <w:t xml:space="preserve">feedStallRpm / feedStallMaxML</w:t>
+            </w:r>
+          </w:p>
+        </w:tc>
+        <w:tc>
+          <w:tcPr>
+            <w:tcW w:type="dxa" w:w="1100"/>
+            <w:tcBorders>
+              <w:top w:val="single" w:color="BBBBBB" w:sz="1"/>
+              <w:left w:val="single" w:color="BBBBBB" w:sz="1"/>
+              <w:bottom w:val="single" w:color="BBBBBB" w:sz="1"/>
+              <w:right w:val="single" w:color="BBBBBB" w:sz="1"/>
+            </w:tcBorders>
+            <w:tcMar>
+              <w:top w:type="dxa" w:w="50"/>
+              <w:left w:type="dxa" w:w="110"/>
+              <w:bottom w:type="dxa" w:w="50"/>
+              <w:right w:type="dxa" w:w="110"/>
+            </w:tcMar>
+          </w:tcPr>
+          <w:p>
+            <w:r>
+              <w:rPr>
+                <w:rFonts w:ascii="Arial" w:cs="Arial" w:eastAsia="Arial" w:hAnsi="Arial"/>
+                <w:b w:val="false"/>
+                <w:bCs w:val="false"/>
+                <w:sz w:val="20"/>
+                <w:szCs w:val="20"/>
+              </w:rPr>
+              <w:t xml:space="preserve">200 / 1500</w:t>
+            </w:r>
+          </w:p>
+        </w:tc>
+        <w:tc>
+          <w:tcPr>
+            <w:tcW w:type="dxa" w:w="800"/>
+            <w:tcBorders>
+              <w:top w:val="single" w:color="BBBBBB" w:sz="1"/>
+              <w:left w:val="single" w:color="BBBBBB" w:sz="1"/>
+              <w:bottom w:val="single" w:color="BBBBBB" w:sz="1"/>
+              <w:right w:val="single" w:color="BBBBBB" w:sz="1"/>
+            </w:tcBorders>
+            <w:tcMar>
+              <w:top w:type="dxa" w:w="50"/>
+              <w:left w:type="dxa" w:w="110"/>
+              <w:bottom w:type="dxa" w:w="50"/>
+              <w:right w:type="dxa" w:w="110"/>
+            </w:tcMar>
+          </w:tcPr>
+          <w:p>
+            <w:r>
+              <w:rPr>
+                <w:rFonts w:ascii="Arial" w:cs="Arial" w:eastAsia="Arial" w:hAnsi="Arial"/>
+                <w:b w:val="false"/>
+                <w:bCs w:val="false"/>
+                <w:sz w:val="20"/>
+                <w:szCs w:val="20"/>
+              </w:rPr>
+              <w:t xml:space="preserve">rpm / ml</w:t>
+            </w:r>
+          </w:p>
+        </w:tc>
+        <w:tc>
+          <w:tcPr>
+            <w:tcW w:type="dxa" w:w="5060"/>
+            <w:tcBorders>
+              <w:top w:val="single" w:color="BBBBBB" w:sz="1"/>
+              <w:left w:val="single" w:color="BBBBBB" w:sz="1"/>
+              <w:bottom w:val="single" w:color="BBBBBB" w:sz="1"/>
+              <w:right w:val="single" w:color="BBBBBB" w:sz="1"/>
+            </w:tcBorders>
+            <w:tcMar>
+              <w:top w:type="dxa" w:w="50"/>
+              <w:left w:type="dxa" w:w="110"/>
+              <w:bottom w:type="dxa" w:w="50"/>
+              <w:right w:type="dxa" w:w="110"/>
+            </w:tcMar>
+          </w:tcPr>
+          <w:p>
+            <w:r>
+              <w:rPr>
+                <w:rFonts w:ascii="Arial" w:cs="Arial" w:eastAsia="Arial" w:hAnsi="Arial"/>
+                <w:b w:val="false"/>
+                <w:bCs w:val="false"/>
+                <w:sz w:val="20"/>
+                <w:szCs w:val="20"/>
+              </w:rPr>
+              <w:t xml:space="preserve">FEED-STALL guard: this much feed dead-reckoned at fill-rate commands without one UPWARD sender step -&gt; the pump is not delivering (empty supply/tubing/stepper) or the sender is stuck -&gt; latches evapLevelErr (trip + popup). Rig 7/14: 300rpm for 15min, ~4L commanded, level frozen, vessel slowly pressurizing.</w:t>
             </w:r>
           </w:p>
         </w:tc>

</xml_diff>

<commit_message>
Doc: tuning round (kpMakeup 0.35, rate cap 0.25, seek 15)
Co-Authored-By: Claude Opus 4.8 <noreply@anthropic.com>
</commit_message>
<xml_diff>
--- a/MVR_Model_Reference.docx
+++ b/MVR_Model_Reference.docx
@@ -6747,7 +6747,7 @@
                 <w:sz w:val="20"/>
                 <w:szCs w:val="20"/>
               </w:rPr>
-              <w:t xml:space="preserve">0.05 / 0.01</w:t>
+              <w:t xml:space="preserve">0.35 / 0.01</w:t>
             </w:r>
           </w:p>
         </w:tc>
@@ -6805,7 +6805,7 @@
                 <w:sz w:val="20"/>
                 <w:szCs w:val="20"/>
               </w:rPr>
-              <w:t xml:space="preserve">Makeup-heater PI gains.</w:t>
+              <w:t xml:space="preserve">Makeup-heater PI gains. kp raised 0.05 -&gt; 0.35 (rig 7/14): P was ~nothing so the integral did everything -- rail-to-rail duty, eT +/-2.5C. P leads, I trims.</w:t>
             </w:r>
           </w:p>
         </w:tc>
@@ -8871,7 +8871,7 @@
                 <w:sz w:val="20"/>
                 <w:szCs w:val="20"/>
               </w:rPr>
-              <w:t xml:space="preserve">50 / 0.5</w:t>
+              <w:t xml:space="preserve">50 / 0.25</w:t>
             </w:r>
           </w:p>
         </w:tc>
@@ -9461,7 +9461,7 @@
                 <w:sz w:val="20"/>
                 <w:szCs w:val="20"/>
               </w:rPr>
-              <w:t xml:space="preserve">13.0 / 8 / 2800</w:t>
+              <w:t xml:space="preserve">13.0 / 15 / 2800</w:t>
             </w:r>
           </w:p>
         </w:tc>

</xml_diff>

<commit_message>
Doc: round-9 rows (flow-follow pumping, feed slew, tsatTrimC, gains)
Co-Authored-By: Claude Opus 4.8 <noreply@anthropic.com>
</commit_message>
<xml_diff>
--- a/MVR_Model_Reference.docx
+++ b/MVR_Model_Reference.docx
@@ -6094,6 +6094,242 @@
                 <w:sz w:val="18"/>
                 <w:szCs w:val="18"/>
               </w:rPr>
+              <w:t xml:space="preserve">tsatTrimC</w:t>
+            </w:r>
+          </w:p>
+        </w:tc>
+        <w:tc>
+          <w:tcPr>
+            <w:tcW w:type="dxa" w:w="1100"/>
+            <w:tcBorders>
+              <w:top w:val="single" w:color="BBBBBB" w:sz="1"/>
+              <w:left w:val="single" w:color="BBBBBB" w:sz="1"/>
+              <w:bottom w:val="single" w:color="BBBBBB" w:sz="1"/>
+              <w:right w:val="single" w:color="BBBBBB" w:sz="1"/>
+            </w:tcBorders>
+            <w:tcMar>
+              <w:top w:type="dxa" w:w="50"/>
+              <w:left w:type="dxa" w:w="110"/>
+              <w:bottom w:type="dxa" w:w="50"/>
+              <w:right w:type="dxa" w:w="110"/>
+            </w:tcMar>
+          </w:tcPr>
+          <w:p>
+            <w:r>
+              <w:rPr>
+                <w:rFonts w:ascii="Arial" w:cs="Arial" w:eastAsia="Arial" w:hAnsi="Arial"/>
+                <w:b w:val="false"/>
+                <w:bCs w:val="false"/>
+                <w:sz w:val="20"/>
+                <w:szCs w:val="20"/>
+              </w:rPr>
+              <w:t xml:space="preserve">0 (calibrate)</w:t>
+            </w:r>
+          </w:p>
+        </w:tc>
+        <w:tc>
+          <w:tcPr>
+            <w:tcW w:type="dxa" w:w="800"/>
+            <w:tcBorders>
+              <w:top w:val="single" w:color="BBBBBB" w:sz="1"/>
+              <w:left w:val="single" w:color="BBBBBB" w:sz="1"/>
+              <w:bottom w:val="single" w:color="BBBBBB" w:sz="1"/>
+              <w:right w:val="single" w:color="BBBBBB" w:sz="1"/>
+            </w:tcBorders>
+            <w:tcMar>
+              <w:top w:type="dxa" w:w="50"/>
+              <w:left w:type="dxa" w:w="110"/>
+              <w:bottom w:type="dxa" w:w="50"/>
+              <w:right w:type="dxa" w:w="110"/>
+            </w:tcMar>
+          </w:tcPr>
+          <w:p>
+            <w:r>
+              <w:rPr>
+                <w:rFonts w:ascii="Arial" w:cs="Arial" w:eastAsia="Arial" w:hAnsi="Arial"/>
+                <w:b w:val="false"/>
+                <w:bCs w:val="false"/>
+                <w:sz w:val="20"/>
+                <w:szCs w:val="20"/>
+              </w:rPr>
+              <w:t xml:space="preserve">C</w:t>
+            </w:r>
+          </w:p>
+        </w:tc>
+        <w:tc>
+          <w:tcPr>
+            <w:tcW w:type="dxa" w:w="5060"/>
+            <w:tcBorders>
+              <w:top w:val="single" w:color="BBBBBB" w:sz="1"/>
+              <w:left w:val="single" w:color="BBBBBB" w:sz="1"/>
+              <w:bottom w:val="single" w:color="BBBBBB" w:sz="1"/>
+              <w:right w:val="single" w:color="BBBBBB" w:sz="1"/>
+            </w:tcBorders>
+            <w:tcMar>
+              <w:top w:type="dxa" w:w="50"/>
+              <w:left w:type="dxa" w:w="110"/>
+              <w:bottom w:type="dxa" w:w="50"/>
+              <w:right w:type="dxa" w:w="110"/>
+            </w:tcMar>
+          </w:tcPr>
+          <w:p>
+            <w:r>
+              <w:rPr>
+                <w:rFonts w:ascii="Arial" w:cs="Arial" w:eastAsia="Arial" w:hAnsi="Arial"/>
+                <w:b w:val="false"/>
+                <w:bCs w:val="false"/>
+                <w:sz w:val="20"/>
+                <w:szCs w:val="20"/>
+              </w:rPr>
+              <w:t xml:space="preserve">TSAT ALIGNMENT TRIM added to both computed Tsats: TCs + pressure transducers carry small offsets (rig: the evap TC read ~1.4C above Tsat(eP) at a rolling boil -- computed superheat inflated, boil needed eTset 101.5+). CALIBRATE at a vigorous VENTED boil: tsatTrimC = yEvapTemp - evapTsat. Cancels in deltaT; lowers superheatIn by the trim.</w:t>
+            </w:r>
+          </w:p>
+        </w:tc>
+      </w:tr>
+      <w:tr>
+        <w:tc>
+          <w:tcPr>
+            <w:tcW w:type="dxa" w:w="2400"/>
+            <w:tcBorders>
+              <w:top w:val="single" w:color="BBBBBB" w:sz="1"/>
+              <w:left w:val="single" w:color="BBBBBB" w:sz="1"/>
+              <w:bottom w:val="single" w:color="BBBBBB" w:sz="1"/>
+              <w:right w:val="single" w:color="BBBBBB" w:sz="1"/>
+            </w:tcBorders>
+            <w:tcMar>
+              <w:top w:type="dxa" w:w="50"/>
+              <w:left w:type="dxa" w:w="110"/>
+              <w:bottom w:type="dxa" w:w="50"/>
+              <w:right w:type="dxa" w:w="110"/>
+            </w:tcMar>
+          </w:tcPr>
+          <w:p>
+            <w:r>
+              <w:rPr>
+                <w:rFonts w:ascii="Consolas" w:cs="Consolas" w:eastAsia="Consolas" w:hAnsi="Consolas"/>
+                <w:b w:val="false"/>
+                <w:bCs w:val="false"/>
+                <w:sz w:val="18"/>
+                <w:szCs w:val="18"/>
+              </w:rPr>
+              <w:t xml:space="preserve">feedSlewRpmS</w:t>
+            </w:r>
+          </w:p>
+        </w:tc>
+        <w:tc>
+          <w:tcPr>
+            <w:tcW w:type="dxa" w:w="1100"/>
+            <w:tcBorders>
+              <w:top w:val="single" w:color="BBBBBB" w:sz="1"/>
+              <w:left w:val="single" w:color="BBBBBB" w:sz="1"/>
+              <w:bottom w:val="single" w:color="BBBBBB" w:sz="1"/>
+              <w:right w:val="single" w:color="BBBBBB" w:sz="1"/>
+            </w:tcBorders>
+            <w:tcMar>
+              <w:top w:type="dxa" w:w="50"/>
+              <w:left w:type="dxa" w:w="110"/>
+              <w:bottom w:type="dxa" w:w="50"/>
+              <w:right w:type="dxa" w:w="110"/>
+            </w:tcMar>
+          </w:tcPr>
+          <w:p>
+            <w:r>
+              <w:rPr>
+                <w:rFonts w:ascii="Arial" w:cs="Arial" w:eastAsia="Arial" w:hAnsi="Arial"/>
+                <w:b w:val="false"/>
+                <w:bCs w:val="false"/>
+                <w:sz w:val="20"/>
+                <w:szCs w:val="20"/>
+              </w:rPr>
+              <w:t xml:space="preserve">10</w:t>
+            </w:r>
+          </w:p>
+        </w:tc>
+        <w:tc>
+          <w:tcPr>
+            <w:tcW w:type="dxa" w:w="800"/>
+            <w:tcBorders>
+              <w:top w:val="single" w:color="BBBBBB" w:sz="1"/>
+              <w:left w:val="single" w:color="BBBBBB" w:sz="1"/>
+              <w:bottom w:val="single" w:color="BBBBBB" w:sz="1"/>
+              <w:right w:val="single" w:color="BBBBBB" w:sz="1"/>
+            </w:tcBorders>
+            <w:tcMar>
+              <w:top w:type="dxa" w:w="50"/>
+              <w:left w:type="dxa" w:w="110"/>
+              <w:bottom w:type="dxa" w:w="50"/>
+              <w:right w:type="dxa" w:w="110"/>
+            </w:tcMar>
+          </w:tcPr>
+          <w:p>
+            <w:r>
+              <w:rPr>
+                <w:rFonts w:ascii="Arial" w:cs="Arial" w:eastAsia="Arial" w:hAnsi="Arial"/>
+                <w:b w:val="false"/>
+                <w:bCs w:val="false"/>
+                <w:sz w:val="20"/>
+                <w:szCs w:val="20"/>
+              </w:rPr>
+              <w:t xml:space="preserve">rpm/s</w:t>
+            </w:r>
+          </w:p>
+        </w:tc>
+        <w:tc>
+          <w:tcPr>
+            <w:tcW w:type="dxa" w:w="5060"/>
+            <w:tcBorders>
+              <w:top w:val="single" w:color="BBBBBB" w:sz="1"/>
+              <w:left w:val="single" w:color="BBBBBB" w:sz="1"/>
+              <w:bottom w:val="single" w:color="BBBBBB" w:sz="1"/>
+              <w:right w:val="single" w:color="BBBBBB" w:sz="1"/>
+            </w:tcBorders>
+            <w:tcMar>
+              <w:top w:type="dxa" w:w="50"/>
+              <w:left w:type="dxa" w:w="110"/>
+              <w:bottom w:type="dxa" w:w="50"/>
+              <w:right w:type="dxa" w:w="110"/>
+            </w:tcMar>
+          </w:tcPr>
+          <w:p>
+            <w:r>
+              <w:rPr>
+                <w:rFonts w:ascii="Arial" w:cs="Arial" w:eastAsia="Arial" w:hAnsi="Arial"/>
+                <w:b w:val="false"/>
+                <w:bCs w:val="false"/>
+                <w:sz w:val="20"/>
+                <w:szCs w:val="20"/>
+              </w:rPr>
+              <w:t xml:space="preserve">AUTO-FEED SLEW LIMIT: production-measure jumps slammed the feed 0..450rpm, and every slam is a cold-water rush the makeup PI then chases (the 42s eT limit cycle). The level loop is slow anyway -- the command is rate-limited.</w:t>
+            </w:r>
+          </w:p>
+        </w:tc>
+      </w:tr>
+      <w:tr>
+        <w:tc>
+          <w:tcPr>
+            <w:tcW w:type="dxa" w:w="2400"/>
+            <w:tcBorders>
+              <w:top w:val="single" w:color="BBBBBB" w:sz="1"/>
+              <w:left w:val="single" w:color="BBBBBB" w:sz="1"/>
+              <w:bottom w:val="single" w:color="BBBBBB" w:sz="1"/>
+              <w:right w:val="single" w:color="BBBBBB" w:sz="1"/>
+            </w:tcBorders>
+            <w:tcMar>
+              <w:top w:type="dxa" w:w="50"/>
+              <w:left w:type="dxa" w:w="110"/>
+              <w:bottom w:type="dxa" w:w="50"/>
+              <w:right w:type="dxa" w:w="110"/>
+            </w:tcMar>
+          </w:tcPr>
+          <w:p>
+            <w:r>
+              <w:rPr>
+                <w:rFonts w:ascii="Consolas" w:cs="Consolas" w:eastAsia="Consolas" w:hAnsi="Consolas"/>
+                <w:b w:val="false"/>
+                <w:bCs w:val="false"/>
+                <w:sz w:val="18"/>
+                <w:szCs w:val="18"/>
+              </w:rPr>
               <w:t xml:space="preserve">evapHighMark</w:t>
             </w:r>
           </w:p>
@@ -6747,7 +6983,7 @@
                 <w:sz w:val="20"/>
                 <w:szCs w:val="20"/>
               </w:rPr>
-              <w:t xml:space="preserve">0.35 / 0.01</w:t>
+              <w:t xml:space="preserve">0.5 / 0.03</w:t>
             </w:r>
           </w:p>
         </w:tc>
@@ -6805,7 +7041,7 @@
                 <w:sz w:val="20"/>
                 <w:szCs w:val="20"/>
               </w:rPr>
-              <w:t xml:space="preserve">Makeup-heater PI gains. kp raised 0.05 -&gt; 0.35 (rig 7/14): P was ~nothing so the integral did everything -- rail-to-rail duty, eT +/-2.5C. P leads, I trims.</w:t>
+              <w:t xml:space="preserve">Makeup-heater PI gains. 0.05 was integral-only (rail-to-rail duty, eT +/-2.5C); the user's 0.7/0.07 gave a fast 42s +/-1.2C limit cycle against the ~10s TC lag. 0.5/0.03 + the FEED SLEW LIMIT (the real disturbance was cold-water feed rushes) is the balance.</w:t>
             </w:r>
           </w:p>
         </w:tc>
@@ -6865,7 +7101,7 @@
                 <w:sz w:val="20"/>
                 <w:szCs w:val="20"/>
               </w:rPr>
-              <w:t xml:space="preserve">0.01 / 0.0005 / 0.03</w:t>
+              <w:t xml:space="preserve">0.02 / 0.002 / 0.03</w:t>
             </w:r>
           </w:p>
         </w:tc>
@@ -8606,7 +8842,7 @@
                 <w:sz w:val="18"/>
                 <w:szCs w:val="18"/>
               </w:rPr>
-              <w:t xml:space="preserve">condTimedEn / condTimedOnS / condTimedOffS</w:t>
+              <w:t xml:space="preserve">condTimedEn / condTimedOnS / condTimedOffS / condTimedMinLpm / condTimedAlways</w:t>
             </w:r>
           </w:p>
         </w:tc>
@@ -8635,7 +8871,7 @@
                 <w:sz w:val="20"/>
                 <w:szCs w:val="20"/>
               </w:rPr>
-              <w:t xml:space="preserve">1 / 30 / 60</w:t>
+              <w:t xml:space="preserve">1 / 5 / 30 / 0.05 / 0</w:t>
             </w:r>
           </w:p>
         </w:tc>
@@ -8664,7 +8900,7 @@
                 <w:sz w:val="20"/>
                 <w:szCs w:val="20"/>
               </w:rPr>
-              <w:t xml:space="preserve">0-1 / s / s</w:t>
+              <w:t xml:space="preserve">-</w:t>
             </w:r>
           </w:p>
         </w:tc>
@@ -8693,7 +8929,7 @@
                 <w:sz w:val="20"/>
                 <w:szCs w:val="20"/>
               </w:rPr>
-              <w:t xml:space="preserve">SENSOR-BAD FALLBACK (optional): if the pump cycled condMeterFaultS with no real batch but the METER counted flow (&gt;= 5ml), the CondLevel sensor is the liar (fog film) -&gt; condSensErr popup + TIMED pumping for the rest of the run (ON condTimedOnS / OFF condTimedOffS). Timed cycles are CLEAN pump cycles, so batches + the batch rate come back despite the bad sensor. Meter counted nothing -&gt; condMeterErr as before. Latched until Stop.</w:t>
+              <w:t xml:space="preserve">TIMED FLOW-FOLLOW pumping (rig-proven): probe every condTimedOffS (30s), run at least condTimedOnS (5s), then KEEP pumping while the 5s-avg meter flow holds above condTimedMinLpm -- the METER decides when the reservoir is empty, not the fogged CondLevel sensor. condTimedAlways=1 = primary strategy from RUN start; 0 = sensor-driven with this as the automatic sensor-bad fallback (condSensErr popup: pump cycled condMeterFaultS with no real batch but the meter counted flow). Timed cycles are CLEAN pump cycles, so batches + the batch rate still work.</w:t>
             </w:r>
           </w:p>
         </w:tc>
@@ -9461,7 +9697,7 @@
                 <w:sz w:val="20"/>
                 <w:szCs w:val="20"/>
               </w:rPr>
-              <w:t xml:space="preserve">13.0 / 15 / 2800</w:t>
+              <w:t xml:space="preserve">13.0 / 25 / 2800</w:t>
             </w:r>
           </w:p>
         </w:tc>

</xml_diff>

<commit_message>
Doc: stuck-hot defenses (3500 cap, vaporOutSoft, ventReliefC)
Co-Authored-By: Claude Opus 4.8 <noreply@anthropic.com>
</commit_message>
<xml_diff>
--- a/MVR_Model_Reference.docx
+++ b/MVR_Model_Reference.docx
@@ -4825,7 +4825,7 @@
                 <w:sz w:val="20"/>
                 <w:szCs w:val="20"/>
               </w:rPr>
-              <w:t xml:space="preserve">4000</w:t>
+              <w:t xml:space="preserve">3500</w:t>
             </w:r>
           </w:p>
         </w:tc>
@@ -4883,7 +4883,7 @@
                 <w:sz w:val="20"/>
                 <w:szCs w:val="20"/>
               </w:rPr>
-              <w:t xml:space="preserve">Blower clamp (overspeed allowed) (-&gt; blowerRpmSafe).</w:t>
+              <w:t xml:space="preserve">Blower clamp (-&gt; blowerRpmSafe). Lowered from 4000: in the stuck-hot deadlock the integral wound to 4000 and just churned the same steam hotter.</w:t>
             </w:r>
           </w:p>
         </w:tc>
@@ -5474,6 +5474,242 @@
                 <w:szCs w:val="20"/>
               </w:rPr>
               <w:t xml:space="preserve">SH ELEMENT-TEMP REGULATION: duty capped so the cartridge holds ~250C until real vapor flow carries the heat away (poor coupling into thin vapor); then the superheat PI takes over. Raised 200 -&gt; 250 per rig (200 couldn't keep up). Full duty 20C below target.</w:t>
+            </w:r>
+          </w:p>
+        </w:tc>
+      </w:tr>
+      <w:tr>
+        <w:tc>
+          <w:tcPr>
+            <w:tcW w:type="dxa" w:w="2400"/>
+            <w:tcBorders>
+              <w:top w:val="single" w:color="BBBBBB" w:sz="1"/>
+              <w:left w:val="single" w:color="BBBBBB" w:sz="1"/>
+              <w:bottom w:val="single" w:color="BBBBBB" w:sz="1"/>
+              <w:right w:val="single" w:color="BBBBBB" w:sz="1"/>
+            </w:tcBorders>
+            <w:tcMar>
+              <w:top w:type="dxa" w:w="50"/>
+              <w:left w:type="dxa" w:w="110"/>
+              <w:bottom w:type="dxa" w:w="50"/>
+              <w:right w:type="dxa" w:w="110"/>
+            </w:tcMar>
+          </w:tcPr>
+          <w:p>
+            <w:r>
+              <w:rPr>
+                <w:rFonts w:ascii="Consolas" w:cs="Consolas" w:eastAsia="Consolas" w:hAnsi="Consolas"/>
+                <w:b w:val="false"/>
+                <w:bCs w:val="false"/>
+                <w:sz w:val="18"/>
+                <w:szCs w:val="18"/>
+              </w:rPr>
+              <w:t xml:space="preserve">vaporOutSoft</w:t>
+            </w:r>
+          </w:p>
+        </w:tc>
+        <w:tc>
+          <w:tcPr>
+            <w:tcW w:type="dxa" w:w="1100"/>
+            <w:tcBorders>
+              <w:top w:val="single" w:color="BBBBBB" w:sz="1"/>
+              <w:left w:val="single" w:color="BBBBBB" w:sz="1"/>
+              <w:bottom w:val="single" w:color="BBBBBB" w:sz="1"/>
+              <w:right w:val="single" w:color="BBBBBB" w:sz="1"/>
+            </w:tcBorders>
+            <w:tcMar>
+              <w:top w:type="dxa" w:w="50"/>
+              <w:left w:type="dxa" w:w="110"/>
+              <w:bottom w:type="dxa" w:w="50"/>
+              <w:right w:type="dxa" w:w="110"/>
+            </w:tcMar>
+          </w:tcPr>
+          <w:p>
+            <w:r>
+              <w:rPr>
+                <w:rFonts w:ascii="Arial" w:cs="Arial" w:eastAsia="Arial" w:hAnsi="Arial"/>
+                <w:b w:val="false"/>
+                <w:bCs w:val="false"/>
+                <w:sz w:val="20"/>
+                <w:szCs w:val="20"/>
+              </w:rPr>
+              <w:t xml:space="preserve">120</w:t>
+            </w:r>
+          </w:p>
+        </w:tc>
+        <w:tc>
+          <w:tcPr>
+            <w:tcW w:type="dxa" w:w="800"/>
+            <w:tcBorders>
+              <w:top w:val="single" w:color="BBBBBB" w:sz="1"/>
+              <w:left w:val="single" w:color="BBBBBB" w:sz="1"/>
+              <w:bottom w:val="single" w:color="BBBBBB" w:sz="1"/>
+              <w:right w:val="single" w:color="BBBBBB" w:sz="1"/>
+            </w:tcBorders>
+            <w:tcMar>
+              <w:top w:type="dxa" w:w="50"/>
+              <w:left w:type="dxa" w:w="110"/>
+              <w:bottom w:type="dxa" w:w="50"/>
+              <w:right w:type="dxa" w:w="110"/>
+            </w:tcMar>
+          </w:tcPr>
+          <w:p>
+            <w:r>
+              <w:rPr>
+                <w:rFonts w:ascii="Arial" w:cs="Arial" w:eastAsia="Arial" w:hAnsi="Arial"/>
+                <w:b w:val="false"/>
+                <w:bCs w:val="false"/>
+                <w:sz w:val="20"/>
+                <w:szCs w:val="20"/>
+              </w:rPr>
+              <w:t xml:space="preserve">C</w:t>
+            </w:r>
+          </w:p>
+        </w:tc>
+        <w:tc>
+          <w:tcPr>
+            <w:tcW w:type="dxa" w:w="5060"/>
+            <w:tcBorders>
+              <w:top w:val="single" w:color="BBBBBB" w:sz="1"/>
+              <w:left w:val="single" w:color="BBBBBB" w:sz="1"/>
+              <w:bottom w:val="single" w:color="BBBBBB" w:sz="1"/>
+              <w:right w:val="single" w:color="BBBBBB" w:sz="1"/>
+            </w:tcBorders>
+            <w:tcMar>
+              <w:top w:type="dxa" w:w="50"/>
+              <w:left w:type="dxa" w:w="110"/>
+              <w:bottom w:type="dxa" w:w="50"/>
+              <w:right w:type="dxa" w:w="110"/>
+            </w:tcMar>
+          </w:tcPr>
+          <w:p>
+            <w:r>
+              <w:rPr>
+                <w:rFonts w:ascii="Arial" w:cs="Arial" w:eastAsia="Arial" w:hAnsi="Arial"/>
+                <w:b w:val="false"/>
+                <w:bCs w:val="false"/>
+                <w:sz w:val="20"/>
+                <w:szCs w:val="20"/>
+              </w:rPr>
+              <w:t xml:space="preserve">Blower VAPOR-OUT FOLD-BACK: above this discharge temp, ALL blower raises pause (integral/seek/lift) and the target actively backs off -- the blower is heating the vapor, not pumping it (rig 7/15: vO rode 110-138 against the 140 trip while nothing condensed and every other gate read green).</w:t>
+            </w:r>
+          </w:p>
+        </w:tc>
+      </w:tr>
+      <w:tr>
+        <w:tc>
+          <w:tcPr>
+            <w:tcW w:type="dxa" w:w="2400"/>
+            <w:tcBorders>
+              <w:top w:val="single" w:color="BBBBBB" w:sz="1"/>
+              <w:left w:val="single" w:color="BBBBBB" w:sz="1"/>
+              <w:bottom w:val="single" w:color="BBBBBB" w:sz="1"/>
+              <w:right w:val="single" w:color="BBBBBB" w:sz="1"/>
+            </w:tcBorders>
+            <w:tcMar>
+              <w:top w:type="dxa" w:w="50"/>
+              <w:left w:type="dxa" w:w="110"/>
+              <w:bottom w:type="dxa" w:w="50"/>
+              <w:right w:type="dxa" w:w="110"/>
+            </w:tcMar>
+          </w:tcPr>
+          <w:p>
+            <w:r>
+              <w:rPr>
+                <w:rFonts w:ascii="Consolas" w:cs="Consolas" w:eastAsia="Consolas" w:hAnsi="Consolas"/>
+                <w:b w:val="false"/>
+                <w:bCs w:val="false"/>
+                <w:sz w:val="18"/>
+                <w:szCs w:val="18"/>
+              </w:rPr>
+              <w:t xml:space="preserve">ventReliefC</w:t>
+            </w:r>
+          </w:p>
+        </w:tc>
+        <w:tc>
+          <w:tcPr>
+            <w:tcW w:type="dxa" w:w="1100"/>
+            <w:tcBorders>
+              <w:top w:val="single" w:color="BBBBBB" w:sz="1"/>
+              <w:left w:val="single" w:color="BBBBBB" w:sz="1"/>
+              <w:bottom w:val="single" w:color="BBBBBB" w:sz="1"/>
+              <w:right w:val="single" w:color="BBBBBB" w:sz="1"/>
+            </w:tcBorders>
+            <w:tcMar>
+              <w:top w:type="dxa" w:w="50"/>
+              <w:left w:type="dxa" w:w="110"/>
+              <w:bottom w:type="dxa" w:w="50"/>
+              <w:right w:type="dxa" w:w="110"/>
+            </w:tcMar>
+          </w:tcPr>
+          <w:p>
+            <w:r>
+              <w:rPr>
+                <w:rFonts w:ascii="Arial" w:cs="Arial" w:eastAsia="Arial" w:hAnsi="Arial"/>
+                <w:b w:val="false"/>
+                <w:bCs w:val="false"/>
+                <w:sz w:val="20"/>
+                <w:szCs w:val="20"/>
+              </w:rPr>
+              <w:t xml:space="preserve">125</w:t>
+            </w:r>
+          </w:p>
+        </w:tc>
+        <w:tc>
+          <w:tcPr>
+            <w:tcW w:type="dxa" w:w="800"/>
+            <w:tcBorders>
+              <w:top w:val="single" w:color="BBBBBB" w:sz="1"/>
+              <w:left w:val="single" w:color="BBBBBB" w:sz="1"/>
+              <w:bottom w:val="single" w:color="BBBBBB" w:sz="1"/>
+              <w:right w:val="single" w:color="BBBBBB" w:sz="1"/>
+            </w:tcBorders>
+            <w:tcMar>
+              <w:top w:type="dxa" w:w="50"/>
+              <w:left w:type="dxa" w:w="110"/>
+              <w:bottom w:type="dxa" w:w="50"/>
+              <w:right w:type="dxa" w:w="110"/>
+            </w:tcMar>
+          </w:tcPr>
+          <w:p>
+            <w:r>
+              <w:rPr>
+                <w:rFonts w:ascii="Arial" w:cs="Arial" w:eastAsia="Arial" w:hAnsi="Arial"/>
+                <w:b w:val="false"/>
+                <w:bCs w:val="false"/>
+                <w:sz w:val="20"/>
+                <w:szCs w:val="20"/>
+              </w:rPr>
+              <w:t xml:space="preserve">C</w:t>
+            </w:r>
+          </w:p>
+        </w:tc>
+        <w:tc>
+          <w:tcPr>
+            <w:tcW w:type="dxa" w:w="5060"/>
+            <w:tcBorders>
+              <w:top w:val="single" w:color="BBBBBB" w:sz="1"/>
+              <w:left w:val="single" w:color="BBBBBB" w:sz="1"/>
+              <w:bottom w:val="single" w:color="BBBBBB" w:sz="1"/>
+              <w:right w:val="single" w:color="BBBBBB" w:sz="1"/>
+            </w:tcBorders>
+            <w:tcMar>
+              <w:top w:type="dxa" w:w="50"/>
+              <w:left w:type="dxa" w:w="110"/>
+              <w:bottom w:type="dxa" w:w="50"/>
+              <w:right w:type="dxa" w:w="110"/>
+            </w:tcMar>
+          </w:tcPr>
+          <w:p>
+            <w:r>
+              <w:rPr>
+                <w:rFonts w:ascii="Arial" w:cs="Arial" w:eastAsia="Arial" w:hAnsi="Arial"/>
+                <w:b w:val="false"/>
+                <w:bCs w:val="false"/>
+                <w:sz w:val="20"/>
+                <w:szCs w:val="20"/>
+              </w:rPr>
+              <w:t xml:space="preserve">THERMAL-RELIEF vent: above this vapor-out the vent OPENS regardless of the ventDone air-purge latch -- dumps the superheated charge so fresh saturated vapor pulls through (superheated gas will not condense; the manual remedy that recovered the rig). Hysteresis: closes below this -10.</w:t>
             </w:r>
           </w:p>
         </w:tc>

</xml_diff>

<commit_message>
Doc: feedMinLpm cold-sink row
Co-Authored-By: Claude Opus 4.8 <noreply@anthropic.com>
</commit_message>
<xml_diff>
--- a/MVR_Model_Reference.docx
+++ b/MVR_Model_Reference.docx
@@ -6418,6 +6418,124 @@
                 <w:szCs w:val="20"/>
               </w:rPr>
               <w:t xml:space="preserve">TSAT ALIGNMENT TRIM added to both computed Tsats: TCs + pressure transducers carry small offsets (rig: the evap TC read ~1.4C above Tsat(eP) at a rolling boil -- computed superheat inflated, boil needed eTset 101.5+). CALIBRATE at a vigorous VENTED boil: tsatTrimC = yEvapTemp - evapTsat. Cancels in deltaT; lowers superheatIn by the trim.</w:t>
+            </w:r>
+          </w:p>
+        </w:tc>
+      </w:tr>
+      <w:tr>
+        <w:tc>
+          <w:tcPr>
+            <w:tcW w:type="dxa" w:w="2400"/>
+            <w:tcBorders>
+              <w:top w:val="single" w:color="BBBBBB" w:sz="1"/>
+              <w:left w:val="single" w:color="BBBBBB" w:sz="1"/>
+              <w:bottom w:val="single" w:color="BBBBBB" w:sz="1"/>
+              <w:right w:val="single" w:color="BBBBBB" w:sz="1"/>
+            </w:tcBorders>
+            <w:tcMar>
+              <w:top w:type="dxa" w:w="50"/>
+              <w:left w:type="dxa" w:w="110"/>
+              <w:bottom w:type="dxa" w:w="50"/>
+              <w:right w:type="dxa" w:w="110"/>
+            </w:tcMar>
+          </w:tcPr>
+          <w:p>
+            <w:r>
+              <w:rPr>
+                <w:rFonts w:ascii="Consolas" w:cs="Consolas" w:eastAsia="Consolas" w:hAnsi="Consolas"/>
+                <w:b w:val="false"/>
+                <w:bCs w:val="false"/>
+                <w:sz w:val="18"/>
+                <w:szCs w:val="18"/>
+              </w:rPr>
+              <w:t xml:space="preserve">feedMinLpm</w:t>
+            </w:r>
+          </w:p>
+        </w:tc>
+        <w:tc>
+          <w:tcPr>
+            <w:tcW w:type="dxa" w:w="1100"/>
+            <w:tcBorders>
+              <w:top w:val="single" w:color="BBBBBB" w:sz="1"/>
+              <w:left w:val="single" w:color="BBBBBB" w:sz="1"/>
+              <w:bottom w:val="single" w:color="BBBBBB" w:sz="1"/>
+              <w:right w:val="single" w:color="BBBBBB" w:sz="1"/>
+            </w:tcBorders>
+            <w:tcMar>
+              <w:top w:type="dxa" w:w="50"/>
+              <w:left w:type="dxa" w:w="110"/>
+              <w:bottom w:type="dxa" w:w="50"/>
+              <w:right w:type="dxa" w:w="110"/>
+            </w:tcMar>
+          </w:tcPr>
+          <w:p>
+            <w:r>
+              <w:rPr>
+                <w:rFonts w:ascii="Arial" w:cs="Arial" w:eastAsia="Arial" w:hAnsi="Arial"/>
+                <w:b w:val="false"/>
+                <w:bCs w:val="false"/>
+                <w:sz w:val="20"/>
+                <w:szCs w:val="20"/>
+              </w:rPr>
+              <w:t xml:space="preserve">0.03</w:t>
+            </w:r>
+          </w:p>
+        </w:tc>
+        <w:tc>
+          <w:tcPr>
+            <w:tcW w:type="dxa" w:w="800"/>
+            <w:tcBorders>
+              <w:top w:val="single" w:color="BBBBBB" w:sz="1"/>
+              <w:left w:val="single" w:color="BBBBBB" w:sz="1"/>
+              <w:bottom w:val="single" w:color="BBBBBB" w:sz="1"/>
+              <w:right w:val="single" w:color="BBBBBB" w:sz="1"/>
+            </w:tcBorders>
+            <w:tcMar>
+              <w:top w:type="dxa" w:w="50"/>
+              <w:left w:type="dxa" w:w="110"/>
+              <w:bottom w:type="dxa" w:w="50"/>
+              <w:right w:type="dxa" w:w="110"/>
+            </w:tcMar>
+          </w:tcPr>
+          <w:p>
+            <w:r>
+              <w:rPr>
+                <w:rFonts w:ascii="Arial" w:cs="Arial" w:eastAsia="Arial" w:hAnsi="Arial"/>
+                <w:b w:val="false"/>
+                <w:bCs w:val="false"/>
+                <w:sz w:val="20"/>
+                <w:szCs w:val="20"/>
+              </w:rPr>
+              <w:t xml:space="preserve">L/min</w:t>
+            </w:r>
+          </w:p>
+        </w:tc>
+        <w:tc>
+          <w:tcPr>
+            <w:tcW w:type="dxa" w:w="5060"/>
+            <w:tcBorders>
+              <w:top w:val="single" w:color="BBBBBB" w:sz="1"/>
+              <w:left w:val="single" w:color="BBBBBB" w:sz="1"/>
+              <w:bottom w:val="single" w:color="BBBBBB" w:sz="1"/>
+              <w:right w:val="single" w:color="BBBBBB" w:sz="1"/>
+            </w:tcBorders>
+            <w:tcMar>
+              <w:top w:type="dxa" w:w="50"/>
+              <w:left w:type="dxa" w:w="110"/>
+              <w:bottom w:type="dxa" w:w="50"/>
+              <w:right w:type="dxa" w:w="110"/>
+            </w:tcMar>
+          </w:tcPr>
+          <w:p>
+            <w:r>
+              <w:rPr>
+                <w:rFonts w:ascii="Arial" w:cs="Arial" w:eastAsia="Arial" w:hAnsi="Arial"/>
+                <w:b w:val="false"/>
+                <w:bCs w:val="false"/>
+                <w:sz w:val="20"/>
+                <w:szCs w:val="20"/>
+              </w:rPr>
+              <w:t xml:space="preserve">MINIMUM RUN FEED: the cold feed IS the subcooler's heat sink -- at feed 0 nothing condenses, production reads 0, the level never drops, and level control correctly asks for zero feed (a self-sustaining deadlock the level loop cannot see; rig 7/15). A trickle keeps the condensing path alive; the high-level cut overrides. The feedLevelTrim negative bound is -0.05 for the same reason (it only ever needs to shave feed-forward bias).</w:t>
             </w:r>
           </w:p>
         </w:tc>

</xml_diff>

<commit_message>
Doc: air-accumulation purge rows + vent thresholds 97/100
Co-Authored-By: Claude Opus 4.8 <noreply@anthropic.com>
</commit_message>
<xml_diff>
--- a/MVR_Model_Reference.docx
+++ b/MVR_Model_Reference.docx
@@ -5622,6 +5622,124 @@
                 <w:sz w:val="18"/>
                 <w:szCs w:val="18"/>
               </w:rPr>
+              <w:t xml:space="preserve">prodStallLpm / prodStallS / ventPulseS</w:t>
+            </w:r>
+          </w:p>
+        </w:tc>
+        <w:tc>
+          <w:tcPr>
+            <w:tcW w:type="dxa" w:w="1100"/>
+            <w:tcBorders>
+              <w:top w:val="single" w:color="BBBBBB" w:sz="1"/>
+              <w:left w:val="single" w:color="BBBBBB" w:sz="1"/>
+              <w:bottom w:val="single" w:color="BBBBBB" w:sz="1"/>
+              <w:right w:val="single" w:color="BBBBBB" w:sz="1"/>
+            </w:tcBorders>
+            <w:tcMar>
+              <w:top w:type="dxa" w:w="50"/>
+              <w:left w:type="dxa" w:w="110"/>
+              <w:bottom w:type="dxa" w:w="50"/>
+              <w:right w:type="dxa" w:w="110"/>
+            </w:tcMar>
+          </w:tcPr>
+          <w:p>
+            <w:r>
+              <w:rPr>
+                <w:rFonts w:ascii="Arial" w:cs="Arial" w:eastAsia="Arial" w:hAnsi="Arial"/>
+                <w:b w:val="false"/>
+                <w:bCs w:val="false"/>
+                <w:sz w:val="20"/>
+                <w:szCs w:val="20"/>
+              </w:rPr>
+              <w:t xml:space="preserve">0.03 / 300 / 30</w:t>
+            </w:r>
+          </w:p>
+        </w:tc>
+        <w:tc>
+          <w:tcPr>
+            <w:tcW w:type="dxa" w:w="800"/>
+            <w:tcBorders>
+              <w:top w:val="single" w:color="BBBBBB" w:sz="1"/>
+              <w:left w:val="single" w:color="BBBBBB" w:sz="1"/>
+              <w:bottom w:val="single" w:color="BBBBBB" w:sz="1"/>
+              <w:right w:val="single" w:color="BBBBBB" w:sz="1"/>
+            </w:tcBorders>
+            <w:tcMar>
+              <w:top w:type="dxa" w:w="50"/>
+              <w:left w:type="dxa" w:w="110"/>
+              <w:bottom w:type="dxa" w:w="50"/>
+              <w:right w:type="dxa" w:w="110"/>
+            </w:tcMar>
+          </w:tcPr>
+          <w:p>
+            <w:r>
+              <w:rPr>
+                <w:rFonts w:ascii="Arial" w:cs="Arial" w:eastAsia="Arial" w:hAnsi="Arial"/>
+                <w:b w:val="false"/>
+                <w:bCs w:val="false"/>
+                <w:sz w:val="20"/>
+                <w:szCs w:val="20"/>
+              </w:rPr>
+              <w:t xml:space="preserve">L/min / s / s</w:t>
+            </w:r>
+          </w:p>
+        </w:tc>
+        <w:tc>
+          <w:tcPr>
+            <w:tcW w:type="dxa" w:w="5060"/>
+            <w:tcBorders>
+              <w:top w:val="single" w:color="BBBBBB" w:sz="1"/>
+              <w:left w:val="single" w:color="BBBBBB" w:sz="1"/>
+              <w:bottom w:val="single" w:color="BBBBBB" w:sz="1"/>
+              <w:right w:val="single" w:color="BBBBBB" w:sz="1"/>
+            </w:tcBorders>
+            <w:tcMar>
+              <w:top w:type="dxa" w:w="50"/>
+              <w:left w:type="dxa" w:w="110"/>
+              <w:bottom w:type="dxa" w:w="50"/>
+              <w:right w:type="dxa" w:w="110"/>
+            </w:tcMar>
+          </w:tcPr>
+          <w:p>
+            <w:r>
+              <w:rPr>
+                <w:rFonts w:ascii="Arial" w:cs="Arial" w:eastAsia="Arial" w:hAnsi="Arial"/>
+                <w:b w:val="false"/>
+                <w:bCs w:val="false"/>
+                <w:sz w:val="20"/>
+                <w:szCs w:val="20"/>
+              </w:rPr>
+              <w:t xml:space="preserve">AIR-ACCUMULATION PURGE: RUN production stalled below prodStallLpm at temp for prodStallS -&gt; the vent PULSES ventPulseS to dump the non-condensable blanket, repeating while stalled. Feed water carries dissolved air in continuously; air collects exactly on the condensing surface, and the steam side then runs 1-3 psi above Psat(T) -- the pressure-derived deltaT looks healthy while the true thermal dT is ~0 and nothing condenses (rig 7/15).</w:t>
+            </w:r>
+          </w:p>
+        </w:tc>
+      </w:tr>
+      <w:tr>
+        <w:tc>
+          <w:tcPr>
+            <w:tcW w:type="dxa" w:w="2400"/>
+            <w:tcBorders>
+              <w:top w:val="single" w:color="BBBBBB" w:sz="1"/>
+              <w:left w:val="single" w:color="BBBBBB" w:sz="1"/>
+              <w:bottom w:val="single" w:color="BBBBBB" w:sz="1"/>
+              <w:right w:val="single" w:color="BBBBBB" w:sz="1"/>
+            </w:tcBorders>
+            <w:tcMar>
+              <w:top w:type="dxa" w:w="50"/>
+              <w:left w:type="dxa" w:w="110"/>
+              <w:bottom w:type="dxa" w:w="50"/>
+              <w:right w:type="dxa" w:w="110"/>
+            </w:tcMar>
+          </w:tcPr>
+          <w:p>
+            <w:r>
+              <w:rPr>
+                <w:rFonts w:ascii="Consolas" w:cs="Consolas" w:eastAsia="Consolas" w:hAnsi="Consolas"/>
+                <w:b w:val="false"/>
+                <w:bCs w:val="false"/>
+                <w:sz w:val="18"/>
+                <w:szCs w:val="18"/>
+              </w:rPr>
               <w:t xml:space="preserve">ventReliefC</w:t>
             </w:r>
           </w:p>
@@ -9815,7 +9933,7 @@
                 <w:sz w:val="20"/>
                 <w:szCs w:val="20"/>
               </w:rPr>
-              <w:t xml:space="preserve">92 / 95</w:t>
+              <w:t xml:space="preserve">97 / 100</w:t>
             </w:r>
           </w:p>
         </w:tc>

</xml_diff>

<commit_message>
Doc: proportional fold-back row
Co-Authored-By: Claude Opus 4.8 <noreply@anthropic.com>
</commit_message>
<xml_diff>
--- a/MVR_Model_Reference.docx
+++ b/MVR_Model_Reference.docx
@@ -5533,7 +5533,7 @@
                 <w:sz w:val="20"/>
                 <w:szCs w:val="20"/>
               </w:rPr>
-              <w:t xml:space="preserve">120</w:t>
+              <w:t xml:space="preserve">115</w:t>
             </w:r>
           </w:p>
         </w:tc>
@@ -5591,7 +5591,7 @@
                 <w:sz w:val="20"/>
                 <w:szCs w:val="20"/>
               </w:rPr>
-              <w:t xml:space="preserve">Blower VAPOR-OUT FOLD-BACK: above this discharge temp, ALL blower raises pause (integral/seek/lift) and the target actively backs off -- the blower is heating the vapor, not pumping it (rig 7/15: vO rode 110-138 against the 140 trip while nothing condensed and every other gate read green).</w:t>
+              <w:t xml:space="preserve">Blower VAPOR-OUT FOLD-BACK: above this discharge temp all raises pause (resume below this-5) and the target backs off PROPORTIONALLY (0.3x just above, 3x at +30C -- the discharge climbs 20C in 30s, so a fixed rate sawtoothed and still let a 142C spike trip). The blower settles at the temperature-limited rpm.</w:t>
             </w:r>
           </w:p>
         </w:tc>

</xml_diff>

<commit_message>
Doc: fillStopML + high-warn debounce rows
Co-Authored-By: Claude Opus 4.8 <noreply@anthropic.com>
</commit_message>
<xml_diff>
--- a/MVR_Model_Reference.docx
+++ b/MVR_Model_Reference.docx
@@ -6802,7 +6802,7 @@
                 <w:sz w:val="18"/>
                 <w:szCs w:val="18"/>
               </w:rPr>
-              <w:t xml:space="preserve">evapHighMark</w:t>
+              <w:t xml:space="preserve">evapHighMark / evapHighWarnS</w:t>
             </w:r>
           </w:p>
         </w:tc>
@@ -6831,7 +6831,7 @@
                 <w:sz w:val="20"/>
                 <w:szCs w:val="20"/>
               </w:rPr>
-              <w:t xml:space="preserve">2750</w:t>
+              <w:t xml:space="preserve">2750 / 3</w:t>
             </w:r>
           </w:p>
         </w:tc>
@@ -6860,7 +6860,7 @@
                 <w:sz w:val="20"/>
                 <w:szCs w:val="20"/>
               </w:rPr>
-              <w:t xml:space="preserve">ml</w:t>
+              <w:t xml:space="preserve">ml / s</w:t>
             </w:r>
           </w:p>
         </w:tc>
@@ -6889,7 +6889,7 @@
                 <w:sz w:val="20"/>
                 <w:szCs w:val="20"/>
               </w:rPr>
-              <w:t xml:space="preserve">HIGH-LEVEL WARNING (2600|2900 plateau edge, trips on the 2900 plateau; E-TC DIN float ORed in): latched UI popup + FeedFollow cuts the feed. NOT during PURGE -- an overfull warm start reads HIGH while the purge is draining it. Not a hard trip.</w:t>
+              <w:t xml:space="preserve">HIGH-LEVEL WARNING (2600|2900 plateau edge; E-TC DIN float ORed in): latched UI popup after 3s persistence (float bob flicks single samples onto the 2900 plateau from ~2650 true) + FeedFollow cuts the feed INSTANTLY on yEvapHigh. Not during PURGE; not a hard trip.</w:t>
             </w:r>
           </w:p>
         </w:tc>
@@ -12504,6 +12504,124 @@
                 <w:szCs w:val="20"/>
               </w:rPr>
               <w:t xml:space="preserve">OPERATING mark (2350|2600 plateau edge, ~2.5 L) = evapLevelSet. The feed holds the level here (deadband P + edge integral, 2.2a).</w:t>
+            </w:r>
+          </w:p>
+        </w:tc>
+      </w:tr>
+      <w:tr>
+        <w:tc>
+          <w:tcPr>
+            <w:tcW w:type="dxa" w:w="2000"/>
+            <w:tcBorders>
+              <w:top w:val="single" w:color="BBBBBB" w:sz="1"/>
+              <w:left w:val="single" w:color="BBBBBB" w:sz="1"/>
+              <w:bottom w:val="single" w:color="BBBBBB" w:sz="1"/>
+              <w:right w:val="single" w:color="BBBBBB" w:sz="1"/>
+            </w:tcBorders>
+            <w:tcMar>
+              <w:top w:type="dxa" w:w="50"/>
+              <w:left w:type="dxa" w:w="110"/>
+              <w:bottom w:type="dxa" w:w="50"/>
+              <w:right w:type="dxa" w:w="110"/>
+            </w:tcMar>
+          </w:tcPr>
+          <w:p>
+            <w:r>
+              <w:rPr>
+                <w:rFonts w:ascii="Consolas" w:cs="Consolas" w:eastAsia="Consolas" w:hAnsi="Consolas"/>
+                <w:b w:val="false"/>
+                <w:bCs w:val="false"/>
+                <w:sz w:val="18"/>
+                <w:szCs w:val="18"/>
+              </w:rPr>
+              <w:t xml:space="preserve">fillStopML</w:t>
+            </w:r>
+          </w:p>
+        </w:tc>
+        <w:tc>
+          <w:tcPr>
+            <w:tcW w:type="dxa" w:w="1400"/>
+            <w:tcBorders>
+              <w:top w:val="single" w:color="BBBBBB" w:sz="1"/>
+              <w:left w:val="single" w:color="BBBBBB" w:sz="1"/>
+              <w:bottom w:val="single" w:color="BBBBBB" w:sz="1"/>
+              <w:right w:val="single" w:color="BBBBBB" w:sz="1"/>
+            </w:tcBorders>
+            <w:tcMar>
+              <w:top w:type="dxa" w:w="50"/>
+              <w:left w:type="dxa" w:w="110"/>
+              <w:bottom w:type="dxa" w:w="50"/>
+              <w:right w:type="dxa" w:w="110"/>
+            </w:tcMar>
+          </w:tcPr>
+          <w:p>
+            <w:r>
+              <w:rPr>
+                <w:rFonts w:ascii="Arial" w:cs="Arial" w:eastAsia="Arial" w:hAnsi="Arial"/>
+                <w:b w:val="false"/>
+                <w:bCs w:val="false"/>
+                <w:sz w:val="20"/>
+                <w:szCs w:val="20"/>
+              </w:rPr>
+              <w:t xml:space="preserve">200</w:t>
+            </w:r>
+          </w:p>
+        </w:tc>
+        <w:tc>
+          <w:tcPr>
+            <w:tcW w:type="dxa" w:w="2000"/>
+            <w:tcBorders>
+              <w:top w:val="single" w:color="BBBBBB" w:sz="1"/>
+              <w:left w:val="single" w:color="BBBBBB" w:sz="1"/>
+              <w:bottom w:val="single" w:color="BBBBBB" w:sz="1"/>
+              <w:right w:val="single" w:color="BBBBBB" w:sz="1"/>
+            </w:tcBorders>
+            <w:tcMar>
+              <w:top w:type="dxa" w:w="50"/>
+              <w:left w:type="dxa" w:w="110"/>
+              <w:bottom w:type="dxa" w:w="50"/>
+              <w:right w:type="dxa" w:w="110"/>
+            </w:tcMar>
+          </w:tcPr>
+          <w:p>
+            <w:r>
+              <w:rPr>
+                <w:rFonts w:ascii="Arial" w:cs="Arial" w:eastAsia="Arial" w:hAnsi="Arial"/>
+                <w:b w:val="false"/>
+                <w:bCs w:val="false"/>
+                <w:sz w:val="20"/>
+                <w:szCs w:val="20"/>
+              </w:rPr>
+              <w:t xml:space="preserve">ml</w:t>
+            </w:r>
+          </w:p>
+        </w:tc>
+        <w:tc>
+          <w:tcPr>
+            <w:tcW w:type="dxa" w:w="3960"/>
+            <w:tcBorders>
+              <w:top w:val="single" w:color="BBBBBB" w:sz="1"/>
+              <w:left w:val="single" w:color="BBBBBB" w:sz="1"/>
+              <w:bottom w:val="single" w:color="BBBBBB" w:sz="1"/>
+              <w:right w:val="single" w:color="BBBBBB" w:sz="1"/>
+            </w:tcBorders>
+            <w:tcMar>
+              <w:top w:type="dxa" w:w="50"/>
+              <w:left w:type="dxa" w:w="110"/>
+              <w:bottom w:type="dxa" w:w="50"/>
+              <w:right w:type="dxa" w:w="110"/>
+            </w:tcMar>
+          </w:tcPr>
+          <w:p>
+            <w:r>
+              <w:rPr>
+                <w:rFonts w:ascii="Arial" w:cs="Arial" w:eastAsia="Arial" w:hAnsi="Arial"/>
+                <w:b w:val="false"/>
+                <w:bCs w:val="false"/>
+                <w:sz w:val="20"/>
+                <w:szCs w:val="20"/>
+              </w:rPr>
+              <w:t xml:space="preserve">HEAT fills COLD water to evapMidMark - this: the charge expands ~4% to boiling and the slew-limited decel keeps delivering, so filling to the mark itself overshot into the high warn every startup. Expansion + RUN's capped-P close the gap; HEAT-&gt;RUN advances on temp + raw &gt;= mark-fillStopML.</w:t>
             </w:r>
           </w:p>
         </w:tc>

</xml_diff>

<commit_message>
Doc: net stall guard + prodSetMax 0.5
Co-Authored-By: Claude Opus 4.8 <noreply@anthropic.com>
</commit_message>
<xml_diff>
--- a/MVR_Model_Reference.docx
+++ b/MVR_Model_Reference.docx
@@ -4471,7 +4471,7 @@
                 <w:sz w:val="20"/>
                 <w:szCs w:val="20"/>
               </w:rPr>
-              <w:t xml:space="preserve">0.3</w:t>
+              <w:t xml:space="preserve">0.5</w:t>
             </w:r>
           </w:p>
         </w:tc>
@@ -4529,7 +4529,7 @@
                 <w:sz w:val="20"/>
                 <w:szCs w:val="20"/>
               </w:rPr>
-              <w:t xml:space="preserve">productionSet rejected above this (or below 0); last valid kept (prodSetSafe).</w:t>
+              <w:t xml:space="preserve">productionSet rejected above this (or below 0); last valid kept (prodSetSafe). Raised from 0.3 after the rig measured 0.43 (the old clamp silently rejected productionSet=0.4).</w:t>
             </w:r>
           </w:p>
         </w:tc>
@@ -6417,7 +6417,7 @@
                 <w:sz w:val="20"/>
                 <w:szCs w:val="20"/>
               </w:rPr>
-              <w:t xml:space="preserve">FEED-STALL guard: this much feed dead-reckoned at fill-rate commands without one UPWARD sender step -&gt; the pump is not delivering (empty supply/tubing/stepper) or the sender is stuck -&gt; latches evapLevelErr (trip + popup). Rig 7/14: 300rpm for 15min, ~4L commanded, level frozen, vessel slowly pressurizing.</w:t>
+              <w:t xml:space="preserve">FEED-STALL guard: this much feed dead-reckoned NET of measured production at fill-rate commands without one UPWARD sender step -&gt; the pump is not delivering (empty supply/tubing/stepper) or the sender is stuck -&gt; latches evapLevelErr (trip + popup). Net basis (7/21): at high production the feed legitimately runs at fill-rate forever with a steady level -- feed matching production accumulates ~nothing; a dead feed line still counts at full rate.</w:t>
             </w:r>
           </w:p>
         </w:tc>

</xml_diff>

<commit_message>
Doc: evapHighClrS row (fix missed anchor)
Co-Authored-By: Claude Opus 4.8 <noreply@anthropic.com>
</commit_message>
<xml_diff>
--- a/MVR_Model_Reference.docx
+++ b/MVR_Model_Reference.docx
@@ -6890,6 +6890,124 @@
                 <w:szCs w:val="20"/>
               </w:rPr>
               <w:t xml:space="preserve">HIGH-LEVEL WARNING (2600|2900 plateau edge; E-TC DIN float ORed in): latched UI popup after 3s persistence (float bob flicks single samples onto the 2900 plateau from ~2650 true) + FeedFollow cuts the feed INSTANTLY on yEvapHigh. Not during PURGE; not a hard trip.</w:t>
+            </w:r>
+          </w:p>
+        </w:tc>
+      </w:tr>
+      <w:tr>
+        <w:tc>
+          <w:tcPr>
+            <w:tcW w:type="dxa" w:w="2400"/>
+            <w:tcBorders>
+              <w:top w:val="single" w:color="BBBBBB" w:sz="1"/>
+              <w:left w:val="single" w:color="BBBBBB" w:sz="1"/>
+              <w:bottom w:val="single" w:color="BBBBBB" w:sz="1"/>
+              <w:right w:val="single" w:color="BBBBBB" w:sz="1"/>
+            </w:tcBorders>
+            <w:tcMar>
+              <w:top w:type="dxa" w:w="50"/>
+              <w:left w:type="dxa" w:w="110"/>
+              <w:bottom w:type="dxa" w:w="50"/>
+              <w:right w:type="dxa" w:w="110"/>
+            </w:tcMar>
+          </w:tcPr>
+          <w:p>
+            <w:r>
+              <w:rPr>
+                <w:rFonts w:ascii="Consolas" w:cs="Consolas" w:eastAsia="Consolas" w:hAnsi="Consolas"/>
+                <w:b w:val="false"/>
+                <w:bCs w:val="false"/>
+                <w:sz w:val="18"/>
+                <w:szCs w:val="18"/>
+              </w:rPr>
+              <w:t xml:space="preserve">evapHighClrS</w:t>
+            </w:r>
+          </w:p>
+        </w:tc>
+        <w:tc>
+          <w:tcPr>
+            <w:tcW w:type="dxa" w:w="1100"/>
+            <w:tcBorders>
+              <w:top w:val="single" w:color="BBBBBB" w:sz="1"/>
+              <w:left w:val="single" w:color="BBBBBB" w:sz="1"/>
+              <w:bottom w:val="single" w:color="BBBBBB" w:sz="1"/>
+              <w:right w:val="single" w:color="BBBBBB" w:sz="1"/>
+            </w:tcBorders>
+            <w:tcMar>
+              <w:top w:type="dxa" w:w="50"/>
+              <w:left w:type="dxa" w:w="110"/>
+              <w:bottom w:type="dxa" w:w="50"/>
+              <w:right w:type="dxa" w:w="110"/>
+            </w:tcMar>
+          </w:tcPr>
+          <w:p>
+            <w:r>
+              <w:rPr>
+                <w:rFonts w:ascii="Arial" w:cs="Arial" w:eastAsia="Arial" w:hAnsi="Arial"/>
+                <w:b w:val="false"/>
+                <w:bCs w:val="false"/>
+                <w:sz w:val="20"/>
+                <w:szCs w:val="20"/>
+              </w:rPr>
+              <w:t xml:space="preserve">60</w:t>
+            </w:r>
+          </w:p>
+        </w:tc>
+        <w:tc>
+          <w:tcPr>
+            <w:tcW w:type="dxa" w:w="800"/>
+            <w:tcBorders>
+              <w:top w:val="single" w:color="BBBBBB" w:sz="1"/>
+              <w:left w:val="single" w:color="BBBBBB" w:sz="1"/>
+              <w:bottom w:val="single" w:color="BBBBBB" w:sz="1"/>
+              <w:right w:val="single" w:color="BBBBBB" w:sz="1"/>
+            </w:tcBorders>
+            <w:tcMar>
+              <w:top w:type="dxa" w:w="50"/>
+              <w:left w:type="dxa" w:w="110"/>
+              <w:bottom w:type="dxa" w:w="50"/>
+              <w:right w:type="dxa" w:w="110"/>
+            </w:tcMar>
+          </w:tcPr>
+          <w:p>
+            <w:r>
+              <w:rPr>
+                <w:rFonts w:ascii="Arial" w:cs="Arial" w:eastAsia="Arial" w:hAnsi="Arial"/>
+                <w:b w:val="false"/>
+                <w:bCs w:val="false"/>
+                <w:sz w:val="20"/>
+                <w:szCs w:val="20"/>
+              </w:rPr>
+              <w:t xml:space="preserve">s</w:t>
+            </w:r>
+          </w:p>
+        </w:tc>
+        <w:tc>
+          <w:tcPr>
+            <w:tcW w:type="dxa" w:w="5060"/>
+            <w:tcBorders>
+              <w:top w:val="single" w:color="BBBBBB" w:sz="1"/>
+              <w:left w:val="single" w:color="BBBBBB" w:sz="1"/>
+              <w:bottom w:val="single" w:color="BBBBBB" w:sz="1"/>
+              <w:right w:val="single" w:color="BBBBBB" w:sz="1"/>
+            </w:tcBorders>
+            <w:tcMar>
+              <w:top w:type="dxa" w:w="50"/>
+              <w:left w:type="dxa" w:w="110"/>
+              <w:bottom w:type="dxa" w:w="50"/>
+              <w:right w:type="dxa" w:w="110"/>
+            </w:tcMar>
+          </w:tcPr>
+          <w:p>
+            <w:r>
+              <w:rPr>
+                <w:rFonts w:ascii="Arial" w:cs="Arial" w:eastAsia="Arial" w:hAnsi="Arial"/>
+                <w:b w:val="false"/>
+                <w:bCs w:val="false"/>
+                <w:sz w:val="20"/>
+                <w:szCs w:val="20"/>
+              </w:rPr>
+              <w:t xml:space="preserve">Warning AUTO-CLEAR: the latched warn extinguishes after the level reads non-high continuously this long (it previously latched until stop and glowed all run after the startup expansion bob).</w:t>
             </w:r>
           </w:p>
         </w:tc>

</xml_diff>

<commit_message>
Doc: wet-compression margin section (2.5a) + generation-timestamp version
New 2.5a explains the wet-compression hazard (droplet erosion /
hydraulic lock), where liquid comes from (saturated vapor + mist +
suction heat loss), why superheat at the INLET is the guarded margin
while SH-Out < SH-In is desirable desuperheating, why the 3C setpoint
sits far above the 0.5C trip (sensor-error stack incl. tsatTrimC lands
in the displayed number at full strength), and the trip arming logic.

Doc now carries a version: generation date/time stamped on the title
page and every footer, refreshed automatically on each regeneration.

Co-Authored-By: Claude Opus 4.8 <noreply@anthropic.com>
</commit_message>
<xml_diff>
--- a/MVR_Model_Reference.docx
+++ b/MVR_Model_Reference.docx
@@ -61,6 +61,22 @@
           <w:szCs w:val="18"/>
         </w:rPr>
         <w:t xml:space="preserve">Generated from server/config/expressions_MVR.json</w:t>
+      </w:r>
+    </w:p>
+    <w:p>
+      <w:pPr>
+        <w:spacing w:before="80"/>
+        <w:jc w:val="center"/>
+      </w:pPr>
+      <w:r>
+        <w:rPr>
+          <w:b/>
+          <w:bCs/>
+          <w:color w:val="555555"/>
+          <w:sz w:val="18"/>
+          <w:szCs w:val="18"/>
+        </w:rPr>
+        <w:t xml:space="preserve">Version 2026-07-21 15:13  (generated)</w:t>
       </w:r>
     </w:p>
     <w:p>
@@ -1049,6 +1065,148 @@
           <w:szCs w:val="19"/>
         </w:rPr>
         <w:t xml:space="preserve">duty = min( pi , elem )       -&gt;  DO:SuperHtr  (superDuty)</w:t>
+      </w:r>
+    </w:p>
+    <w:p>
+      <w:pPr>
+        <w:pStyle w:val="Heading2"/>
+      </w:pPr>
+      <w:r>
+        <w:t xml:space="preserve">2.5a  Wet-compression margin (what superheat is really for)</w:t>
+      </w:r>
+    </w:p>
+    <w:p>
+      <w:pPr>
+        <w:spacing w:after="120"/>
+      </w:pPr>
+      <w:r>
+        <w:rPr>
+          <w:b/>
+          <w:bCs/>
+        </w:rPr>
+        <w:t xml:space="preserve">The hazard: </w:t>
+      </w:r>
+      <w:r>
+        <w:t xml:space="preserve">the blower is a vapor compressor, and it must ingest DRY vapor. Water droplets at 100 C are ~1600x denser than the steam around them; the impeller tips are moving fast, so every droplet strike is a tiny hammer blow -- sustained wet ingestion erodes and pits the blades, unbalances the wheel, spikes the shaft torque, and a big enough liquid slug can hydraulic-lock the machine outright. This is the single fastest way to destroy the most expensive component in the system.</w:t>
+      </w:r>
+    </w:p>
+    <w:p>
+      <w:pPr>
+        <w:spacing w:after="120"/>
+      </w:pPr>
+      <w:r>
+        <w:rPr>
+          <w:b/>
+          <w:bCs/>
+        </w:rPr>
+        <w:t xml:space="preserve">Where the liquid comes from: </w:t>
+      </w:r>
+      <w:r>
+        <w:t xml:space="preserve">vapor leaving a boiling pool is at best exactly SATURATED -- sitting on the dew line -- and in practice always carries entrained mist from bursting bubbles (the demister catches most, not all). Any heat loss along the suction path pulls the vapor below its dew point and condenses MORE liquid on the pipe walls and as fog. Saturated vapor has zero tolerance: remove any heat at all and liquid appears.</w:t>
+      </w:r>
+    </w:p>
+    <w:p>
+      <w:pPr>
+        <w:spacing w:after="120"/>
+      </w:pPr>
+      <w:r>
+        <w:rPr>
+          <w:b/>
+          <w:bCs/>
+        </w:rPr>
+        <w:t xml:space="preserve">The margin: </w:t>
+      </w:r>
+      <w:r>
+        <w:t xml:space="preserve">superheat is temperature ABOVE the dew point at the local pressure: </w:t>
+      </w:r>
+      <w:r>
+        <w:rPr>
+          <w:rFonts w:ascii="Consolas" w:cs="Consolas" w:eastAsia="Consolas" w:hAnsi="Consolas"/>
+          <w:sz w:val="19"/>
+          <w:szCs w:val="19"/>
+        </w:rPr>
+        <w:t xml:space="preserve">superheatIn = yVaporIn - Tsat(evapPress)</w:t>
+      </w:r>
+      <w:r>
+        <w:t xml:space="preserve">. Positive superheat means the vapor thermodynamically CANNOT hold liquid at equilibrium -- entrained droplets evaporate in transit instead of surviving to the impeller, and modest pipe heat-loss just eats margin instead of making fog. The superheat cartridge exists solely to buy this margin ahead of the blower inlet; the margin IS the droplet insurance.</w:t>
+      </w:r>
+    </w:p>
+    <w:p>
+      <w:pPr>
+        <w:spacing w:after="120"/>
+      </w:pPr>
+      <w:r>
+        <w:rPr>
+          <w:b/>
+          <w:bCs/>
+        </w:rPr>
+        <w:t xml:space="preserve">Why the INLET is the guarded point: </w:t>
+      </w:r>
+      <w:r>
+        <w:t xml:space="preserve">compressing dry steam pushes it FURTHER into superheat (compression heats the vapor faster than its dew point rises), so if the inlet is dry the outlet is drier. That is also why SH-Out running BELOW SH-In is normal and even desirable: the discharge path sheds its superheat to the condensing surfaces (desuperheating), delivering near-saturated vapor to the condenser, which condenses best. Low superheat at the OUTLET is efficiency; low superheat at the INLET is blade erosion.</w:t>
+      </w:r>
+    </w:p>
+    <w:p>
+      <w:pPr>
+        <w:spacing w:after="120"/>
+      </w:pPr>
+      <w:r>
+        <w:rPr>
+          <w:b/>
+          <w:bCs/>
+        </w:rPr>
+        <w:t xml:space="preserve">Sizing the margin -- why set 3 C when the trip is 0.5 C: </w:t>
+      </w:r>
+      <w:r>
+        <w:t xml:space="preserve">the DISPLAYED superheat is a computed difference between a TC reading and a pressure-derived saturation temperature, so every sensor error lands in it at full strength: TC offset + PT offset + Antoine/trim error easily stack to +/-1-2 C. In particular </w:t>
+      </w:r>
+      <w:r>
+        <w:rPr>
+          <w:rFonts w:ascii="Consolas" w:cs="Consolas" w:eastAsia="Consolas" w:hAnsi="Consolas"/>
+          <w:sz w:val="19"/>
+          <w:szCs w:val="19"/>
+        </w:rPr>
+        <w:t xml:space="preserve">tsatTrimC</w:t>
+      </w:r>
+      <w:r>
+        <w:t xml:space="preserve"> shifts computed Tsat directly -- change the trim 1 C and the displayed superheat moves 1 C with the true margin unchanged. The 3 C setpoint keeps the TRUE margin comfortably positive even when the DISPLAYED number is optimistic; the </w:t>
+      </w:r>
+      <w:r>
+        <w:rPr>
+          <w:rFonts w:ascii="Consolas" w:cs="Consolas" w:eastAsia="Consolas" w:hAnsi="Consolas"/>
+          <w:sz w:val="19"/>
+          <w:szCs w:val="19"/>
+        </w:rPr>
+        <w:t xml:space="preserve">minSuperheat</w:t>
+      </w:r>
+      <w:r>
+        <w:t xml:space="preserve"> (0.5 C, </w:t>
+      </w:r>
+      <w:r>
+        <w:rPr>
+          <w:rFonts w:ascii="Consolas" w:cs="Consolas" w:eastAsia="Consolas" w:hAnsi="Consolas"/>
+          <w:sz w:val="19"/>
+          <w:szCs w:val="19"/>
+        </w:rPr>
+        <w:t xml:space="preserve">superHFaultS</w:t>
+      </w:r>
+      <w:r>
+        <w:t xml:space="preserve"> persistence) trip is the last-ditch floor, not the operating target. This is why the sensor calibrations (TC zero, PT zero, tsatTrimC at a vented boil) matter: they shrink the uncertainty that the margin has to cover.</w:t>
+      </w:r>
+    </w:p>
+    <w:p>
+      <w:pPr>
+        <w:spacing w:after="120"/>
+      </w:pPr>
+      <w:r>
+        <w:rPr>
+          <w:b/>
+          <w:bCs/>
+        </w:rPr>
+        <w:t xml:space="preserve">Arming: </w:t>
+      </w:r>
+      <w:r>
+        <w:t xml:space="preserve">the wet-compression trip arms only once superheat is first established with the blower at real speed and the evaporator at temp, then stays armed until stop -- during cold start there is no meaningful vapor flow, the pipe TC reads transient garbage, and tripping on it would deadlock the startup (the very condition the trip watches for is the normal state of a machine that has not boiled yet).</w:t>
       </w:r>
     </w:p>
     <w:p>
@@ -17120,7 +17278,7 @@
         <w:sz w:val="16"/>
         <w:szCs w:val="16"/>
       </w:rPr>
-      <w:t xml:space="preserve">MVR Model &amp; Control Reference  -  </w:t>
+      <w:t xml:space="preserve">MVR Model &amp; Control Reference  -  v2026-07-21 15:13  -  </w:t>
     </w:r>
     <w:r>
       <w:rPr>

</xml_diff>

<commit_message>
Doc: prodFast fast feed FF, feedTrimMax, trim anti-windup rows + 2.7 update
Co-Authored-By: Claude Opus 4.8 <noreply@anthropic.com>
</commit_message>
<xml_diff>
--- a/MVR_Model_Reference.docx
+++ b/MVR_Model_Reference.docx
@@ -76,7 +76,7 @@
           <w:sz w:val="18"/>
           <w:szCs w:val="18"/>
         </w:rPr>
-        <w:t xml:space="preserve">Version 2026-07-21 15:13  (generated)</w:t>
+        <w:t xml:space="preserve">Version 2026-07-21 16:00  (generated)</w:t>
       </w:r>
     </w:p>
     <w:p>
@@ -1313,7 +1313,7 @@
           <w:sz w:val="19"/>
           <w:szCs w:val="19"/>
         </w:rPr>
-        <w:t xml:space="preserve">feedLpm = prodMeas*(1+blowdownFrac) + P(fused est, outside deadband) + feedLevelTrim</w:t>
+        <w:t xml:space="preserve">feedFF  = (prodFast &gt; 0 ? prodFast : prodMeas) * (1+blowdownFrac)</w:t>
       </w:r>
     </w:p>
     <w:p>
@@ -1327,7 +1327,7 @@
           <w:sz w:val="19"/>
           <w:szCs w:val="19"/>
         </w:rPr>
-        <w:t xml:space="preserve">feedLevelTrim += kFeedLevelI * (EvapMid dry ? +1 : -1) * dt      (INSIDE the deadband only)</w:t>
+        <w:t xml:space="preserve">feedLpm = feedFF + P(fused est, outside deadband) + feedLevelTrim</w:t>
       </w:r>
     </w:p>
     <w:p>
@@ -1341,7 +1341,47 @@
           <w:sz w:val="19"/>
           <w:szCs w:val="19"/>
         </w:rPr>
+        <w:t xml:space="preserve">feedLevelTrim += kFeedLevelI * (EvapMid dry ? +1 : -1) * dt      (INSIDE the deadband only)</w:t>
+      </w:r>
+    </w:p>
+    <w:p>
+      <w:pPr>
+        <w:spacing w:after="60"/>
+        <w:ind w:left="360"/>
+      </w:pPr>
+      <w:r>
+        <w:rPr>
+          <w:rFonts w:ascii="Consolas" w:cs="Consolas" w:eastAsia="Consolas" w:hAnsi="Consolas"/>
+          <w:sz w:val="19"/>
+          <w:szCs w:val="19"/>
+        </w:rPr>
         <w:t xml:space="preserve">feedRpmSet = clamp( feedLpm / (stepsPerRev*LPerStep) , 0 , feedRpmMax )   -&gt; STEP:Feed.VELOCITY</w:t>
+      </w:r>
+    </w:p>
+    <w:p>
+      <w:pPr>
+        <w:spacing w:after="120"/>
+      </w:pPr>
+      <w:r>
+        <w:rPr>
+          <w:b/>
+          <w:bCs/>
+        </w:rPr>
+        <w:t xml:space="preserve">FAST FEED-FORWARD (rig 7/21): </w:t>
+      </w:r>
+      <w:r>
+        <w:t xml:space="preserve">the feed follows </w:t>
+      </w:r>
+      <w:r>
+        <w:rPr>
+          <w:rFonts w:ascii="Consolas" w:cs="Consolas" w:eastAsia="Consolas" w:hAnsi="Consolas"/>
+          <w:sz w:val="19"/>
+          <w:szCs w:val="19"/>
+        </w:rPr>
+        <w:t xml:space="preserve">prodFast</w:t>
+      </w:r>
+      <w:r>
+        <w:t xml:space="preserve"> (60s meter windows, 180s EMA) instead of the ~10min-lagging prodMeas: the slow FF starved a production surge (level crash 2600-&gt;1500), wound the trim up covering it, then FF-catch-up + fat trim overfed to 2900 in a sawtooth. The fast estimate keeps the FF honest within ~2-3min in both directions; the blower keeps the slow prodMeas for stability. FeedFollow is also compiled as FLAT GUARDED SECTIONS after a transpiler hoisting miscompile put its tail outside the autoFeed guard.</w:t>
       </w:r>
     </w:p>
     <w:p>
@@ -8143,7 +8183,243 @@
                 <w:sz w:val="20"/>
                 <w:szCs w:val="20"/>
               </w:rPr>
-              <w:t xml:space="preserve">Feed level P gain (active OUTSIDE the deadband: fill + upset recovery) / slow edge-ride integral (INSIDE the deadband; the tight hold).</w:t>
+              <w:t xml:space="preserve">Feed level P gain (active OUTSIDE the deadband: fill + upset recovery) / slow edge-ride integral (INSIDE the deadband; the tight hold). ANTI-WINDUP (7/21): the trim also unwinds at normal rate while the level is ABOVE the deadband and bleeds at 4x during a high-level cut -- frozen trim wound up in a trough used to power the overfill that followed.</w:t>
+            </w:r>
+          </w:p>
+        </w:tc>
+      </w:tr>
+      <w:tr>
+        <w:tc>
+          <w:tcPr>
+            <w:tcW w:type="dxa" w:w="2200"/>
+            <w:tcBorders>
+              <w:top w:val="single" w:color="BBBBBB" w:sz="1"/>
+              <w:left w:val="single" w:color="BBBBBB" w:sz="1"/>
+              <w:bottom w:val="single" w:color="BBBBBB" w:sz="1"/>
+              <w:right w:val="single" w:color="BBBBBB" w:sz="1"/>
+            </w:tcBorders>
+            <w:tcMar>
+              <w:top w:type="dxa" w:w="50"/>
+              <w:left w:type="dxa" w:w="110"/>
+              <w:bottom w:type="dxa" w:w="50"/>
+              <w:right w:type="dxa" w:w="110"/>
+            </w:tcMar>
+          </w:tcPr>
+          <w:p>
+            <w:r>
+              <w:rPr>
+                <w:rFonts w:ascii="Consolas" w:cs="Consolas" w:eastAsia="Consolas" w:hAnsi="Consolas"/>
+                <w:b w:val="false"/>
+                <w:bCs w:val="false"/>
+                <w:sz w:val="18"/>
+                <w:szCs w:val="18"/>
+              </w:rPr>
+              <w:t xml:space="preserve">feedTrimMax</w:t>
+            </w:r>
+          </w:p>
+        </w:tc>
+        <w:tc>
+          <w:tcPr>
+            <w:tcW w:type="dxa" w:w="1300"/>
+            <w:tcBorders>
+              <w:top w:val="single" w:color="BBBBBB" w:sz="1"/>
+              <w:left w:val="single" w:color="BBBBBB" w:sz="1"/>
+              <w:bottom w:val="single" w:color="BBBBBB" w:sz="1"/>
+              <w:right w:val="single" w:color="BBBBBB" w:sz="1"/>
+            </w:tcBorders>
+            <w:tcMar>
+              <w:top w:type="dxa" w:w="50"/>
+              <w:left w:type="dxa" w:w="110"/>
+              <w:bottom w:type="dxa" w:w="50"/>
+              <w:right w:type="dxa" w:w="110"/>
+            </w:tcMar>
+          </w:tcPr>
+          <w:p>
+            <w:r>
+              <w:rPr>
+                <w:rFonts w:ascii="Arial" w:cs="Arial" w:eastAsia="Arial" w:hAnsi="Arial"/>
+                <w:b w:val="false"/>
+                <w:bCs w:val="false"/>
+                <w:sz w:val="20"/>
+                <w:szCs w:val="20"/>
+              </w:rPr>
+              <w:t xml:space="preserve">0.12</w:t>
+            </w:r>
+          </w:p>
+        </w:tc>
+        <w:tc>
+          <w:tcPr>
+            <w:tcW w:type="dxa" w:w="1500"/>
+            <w:tcBorders>
+              <w:top w:val="single" w:color="BBBBBB" w:sz="1"/>
+              <w:left w:val="single" w:color="BBBBBB" w:sz="1"/>
+              <w:bottom w:val="single" w:color="BBBBBB" w:sz="1"/>
+              <w:right w:val="single" w:color="BBBBBB" w:sz="1"/>
+            </w:tcBorders>
+            <w:tcMar>
+              <w:top w:type="dxa" w:w="50"/>
+              <w:left w:type="dxa" w:w="110"/>
+              <w:bottom w:type="dxa" w:w="50"/>
+              <w:right w:type="dxa" w:w="110"/>
+            </w:tcMar>
+          </w:tcPr>
+          <w:p>
+            <w:r>
+              <w:rPr>
+                <w:rFonts w:ascii="Arial" w:cs="Arial" w:eastAsia="Arial" w:hAnsi="Arial"/>
+                <w:b w:val="false"/>
+                <w:bCs w:val="false"/>
+                <w:sz w:val="20"/>
+                <w:szCs w:val="20"/>
+              </w:rPr>
+              <w:t xml:space="preserve">L/min</w:t>
+            </w:r>
+          </w:p>
+        </w:tc>
+        <w:tc>
+          <w:tcPr>
+            <w:tcW w:type="dxa" w:w="4360"/>
+            <w:tcBorders>
+              <w:top w:val="single" w:color="BBBBBB" w:sz="1"/>
+              <w:left w:val="single" w:color="BBBBBB" w:sz="1"/>
+              <w:bottom w:val="single" w:color="BBBBBB" w:sz="1"/>
+              <w:right w:val="single" w:color="BBBBBB" w:sz="1"/>
+            </w:tcBorders>
+            <w:tcMar>
+              <w:top w:type="dxa" w:w="50"/>
+              <w:left w:type="dxa" w:w="110"/>
+              <w:bottom w:type="dxa" w:w="50"/>
+              <w:right w:type="dxa" w:w="110"/>
+            </w:tcMar>
+          </w:tcPr>
+          <w:p>
+            <w:r>
+              <w:rPr>
+                <w:rFonts w:ascii="Arial" w:cs="Arial" w:eastAsia="Arial" w:hAnsi="Arial"/>
+                <w:b w:val="false"/>
+                <w:bCs w:val="false"/>
+                <w:sz w:val="20"/>
+                <w:szCs w:val="20"/>
+              </w:rPr>
+              <w:t xml:space="preserve">Edge-integral trim UPPER bound. Was the full feed range (0.46!) -- the trim wound to +0.20 covering the 7/21 prodMeas lag and then overfed the level to 2900 repeatedly. The trim shaves feed-forward bias; production belongs to the FF. (No-sender fallback keeps the wide bound: there the trim IS the feed.)</w:t>
+            </w:r>
+          </w:p>
+        </w:tc>
+      </w:tr>
+      <w:tr>
+        <w:tc>
+          <w:tcPr>
+            <w:tcW w:type="dxa" w:w="2200"/>
+            <w:tcBorders>
+              <w:top w:val="single" w:color="BBBBBB" w:sz="1"/>
+              <w:left w:val="single" w:color="BBBBBB" w:sz="1"/>
+              <w:bottom w:val="single" w:color="BBBBBB" w:sz="1"/>
+              <w:right w:val="single" w:color="BBBBBB" w:sz="1"/>
+            </w:tcBorders>
+            <w:tcMar>
+              <w:top w:type="dxa" w:w="50"/>
+              <w:left w:type="dxa" w:w="110"/>
+              <w:bottom w:type="dxa" w:w="50"/>
+              <w:right w:type="dxa" w:w="110"/>
+            </w:tcMar>
+          </w:tcPr>
+          <w:p>
+            <w:r>
+              <w:rPr>
+                <w:rFonts w:ascii="Consolas" w:cs="Consolas" w:eastAsia="Consolas" w:hAnsi="Consolas"/>
+                <w:b w:val="false"/>
+                <w:bCs w:val="false"/>
+                <w:sz w:val="18"/>
+                <w:szCs w:val="18"/>
+              </w:rPr>
+              <w:t xml:space="preserve">prodFastWinS / prodFastAvgS</w:t>
+            </w:r>
+          </w:p>
+        </w:tc>
+        <w:tc>
+          <w:tcPr>
+            <w:tcW w:type="dxa" w:w="1300"/>
+            <w:tcBorders>
+              <w:top w:val="single" w:color="BBBBBB" w:sz="1"/>
+              <w:left w:val="single" w:color="BBBBBB" w:sz="1"/>
+              <w:bottom w:val="single" w:color="BBBBBB" w:sz="1"/>
+              <w:right w:val="single" w:color="BBBBBB" w:sz="1"/>
+            </w:tcBorders>
+            <w:tcMar>
+              <w:top w:type="dxa" w:w="50"/>
+              <w:left w:type="dxa" w:w="110"/>
+              <w:bottom w:type="dxa" w:w="50"/>
+              <w:right w:type="dxa" w:w="110"/>
+            </w:tcMar>
+          </w:tcPr>
+          <w:p>
+            <w:r>
+              <w:rPr>
+                <w:rFonts w:ascii="Arial" w:cs="Arial" w:eastAsia="Arial" w:hAnsi="Arial"/>
+                <w:b w:val="false"/>
+                <w:bCs w:val="false"/>
+                <w:sz w:val="20"/>
+                <w:szCs w:val="20"/>
+              </w:rPr>
+              <w:t xml:space="preserve">60 / 180</w:t>
+            </w:r>
+          </w:p>
+        </w:tc>
+        <w:tc>
+          <w:tcPr>
+            <w:tcW w:type="dxa" w:w="1500"/>
+            <w:tcBorders>
+              <w:top w:val="single" w:color="BBBBBB" w:sz="1"/>
+              <w:left w:val="single" w:color="BBBBBB" w:sz="1"/>
+              <w:bottom w:val="single" w:color="BBBBBB" w:sz="1"/>
+              <w:right w:val="single" w:color="BBBBBB" w:sz="1"/>
+            </w:tcBorders>
+            <w:tcMar>
+              <w:top w:type="dxa" w:w="50"/>
+              <w:left w:type="dxa" w:w="110"/>
+              <w:bottom w:type="dxa" w:w="50"/>
+              <w:right w:type="dxa" w:w="110"/>
+            </w:tcMar>
+          </w:tcPr>
+          <w:p>
+            <w:r>
+              <w:rPr>
+                <w:rFonts w:ascii="Arial" w:cs="Arial" w:eastAsia="Arial" w:hAnsi="Arial"/>
+                <w:b w:val="false"/>
+                <w:bCs w:val="false"/>
+                <w:sz w:val="20"/>
+                <w:szCs w:val="20"/>
+              </w:rPr>
+              <w:t xml:space="preserve">s / s</w:t>
+            </w:r>
+          </w:p>
+        </w:tc>
+        <w:tc>
+          <w:tcPr>
+            <w:tcW w:type="dxa" w:w="4360"/>
+            <w:tcBorders>
+              <w:top w:val="single" w:color="BBBBBB" w:sz="1"/>
+              <w:left w:val="single" w:color="BBBBBB" w:sz="1"/>
+              <w:bottom w:val="single" w:color="BBBBBB" w:sz="1"/>
+              <w:right w:val="single" w:color="BBBBBB" w:sz="1"/>
+            </w:tcBorders>
+            <w:tcMar>
+              <w:top w:type="dxa" w:w="50"/>
+              <w:left w:type="dxa" w:w="110"/>
+              <w:bottom w:type="dxa" w:w="50"/>
+              <w:right w:type="dxa" w:w="110"/>
+            </w:tcMar>
+          </w:tcPr>
+          <w:p>
+            <w:r>
+              <w:rPr>
+                <w:rFonts w:ascii="Arial" w:cs="Arial" w:eastAsia="Arial" w:hAnsi="Arial"/>
+                <w:b w:val="false"/>
+                <w:bCs w:val="false"/>
+                <w:sz w:val="20"/>
+                <w:szCs w:val="20"/>
+              </w:rPr>
+              <w:t xml:space="preserve">FAST production estimate (prodFast) for the FEED feed-forward: 60s totalizer windows into a 180s EMA (~2-3min response vs prodMeas ~10min). RUN + proven meter only; cleared outside RUN. The BLOWER keeps the slow stable prodMeas -- two consumers, two time constants.</w:t>
             </w:r>
           </w:p>
         </w:tc>
@@ -17278,7 +17554,7 @@
         <w:sz w:val="16"/>
         <w:szCs w:val="16"/>
       </w:rPr>
-      <w:t xml:space="preserve">MVR Model &amp; Control Reference  -  v2026-07-21 15:13  -  </w:t>
+      <w:t xml:space="preserve">MVR Model &amp; Control Reference  -  v2026-07-21 16:00  -  </w:t>
     </w:r>
     <w:r>
       <w:rPr>

</xml_diff>

<commit_message>
MVR: adopt rig DOLILO settings as file defaults (7/21)
tsatTrimC 1.4 -> 2.0, feedRpmMax 300 -> 425, feedSlewRpmS 10 -> 15,
feedPrimeRpm 250 -> 400 -- the user's proven day-of-launch running
values, so a recompile/Load->Save no longer resets them. Sim: cold
start reaches HEAT 80s sooner (400rpm prime); all scenarios pass.

Co-Authored-By: Claude Opus 4.8 <noreply@anthropic.com>
</commit_message>
<xml_diff>
--- a/MVR_Model_Reference.docx
+++ b/MVR_Model_Reference.docx
@@ -76,7 +76,7 @@
           <w:sz w:val="18"/>
           <w:szCs w:val="18"/>
         </w:rPr>
-        <w:t xml:space="preserve">Version 2026-07-21 16:00  (generated)</w:t>
+        <w:t xml:space="preserve">Version 2026-07-21 16:08  (generated)</w:t>
       </w:r>
     </w:p>
     <w:p>
@@ -5259,7 +5259,7 @@
                 <w:sz w:val="20"/>
                 <w:szCs w:val="20"/>
               </w:rPr>
-              <w:t xml:space="preserve">300</w:t>
+              <w:t xml:space="preserve">425</w:t>
             </w:r>
           </w:p>
         </w:tc>
@@ -5317,7 +5317,7 @@
                 <w:sz w:val="20"/>
                 <w:szCs w:val="20"/>
               </w:rPr>
-              <w:t xml:space="preserve">Feed-pump clamp (-&gt; feedRpmSafe).</w:t>
+              <w:t xml:space="preserve">Feed-pump clamp (-&gt; feedRpmSafe). Rig DOLILO 7/21: 300 -&gt; 425 (375 also fine) -- at 0.4+ L/min production the feed must sustain ~400rpm just to match boil-off.</w:t>
             </w:r>
           </w:p>
         </w:tc>
@@ -6675,7 +6675,7 @@
                 <w:sz w:val="20"/>
                 <w:szCs w:val="20"/>
               </w:rPr>
-              <w:t xml:space="preserve">1.4 (calibrate)</w:t>
+              <w:t xml:space="preserve">2.0 (calibrate)</w:t>
             </w:r>
           </w:p>
         </w:tc>
@@ -6733,7 +6733,7 @@
                 <w:sz w:val="20"/>
                 <w:szCs w:val="20"/>
               </w:rPr>
-              <w:t xml:space="preserve">TSAT ALIGNMENT TRIM added to both computed Tsats: TCs + pressure transducers carry small offsets (rig: the evap TC read ~1.4C above Tsat(eP) at a rolling boil -- computed superheat inflated, boil needed eTset 101.5+). CALIBRATE at a vigorous VENTED boil: tsatTrimC = yEvapTemp - evapTsat. Cancels in deltaT; lowers superheatIn by the trim.</w:t>
+              <w:t xml:space="preserve">TSAT ALIGNMENT TRIM added to both computed Tsats: TCs + pressure transducers carry small offsets (rig 7/14 measured ~1.4; DOLILO 7/21 running value 2.0 adopted as default -- re-derive after the TC/PT zero cal). CALIBRATE at a vigorous VENTED boil: tsatTrimC = yEvapTemp - evapTsat. Cancels in deltaT; lowers superheatIn by the trim.</w:t>
             </w:r>
           </w:p>
         </w:tc>
@@ -6911,7 +6911,7 @@
                 <w:sz w:val="20"/>
                 <w:szCs w:val="20"/>
               </w:rPr>
-              <w:t xml:space="preserve">10</w:t>
+              <w:t xml:space="preserve">15</w:t>
             </w:r>
           </w:p>
         </w:tc>
@@ -12053,7 +12053,7 @@
                 <w:sz w:val="20"/>
                 <w:szCs w:val="20"/>
               </w:rPr>
-              <w:t xml:space="preserve">250</w:t>
+              <w:t xml:space="preserve">400</w:t>
             </w:r>
           </w:p>
         </w:tc>
@@ -12111,7 +12111,7 @@
                 <w:sz w:val="20"/>
                 <w:szCs w:val="20"/>
               </w:rPr>
-              <w:t xml:space="preserve">Feed rpm during the PRIME fill (~224 mL/min).</w:t>
+              <w:t xml:space="preserve">Feed rpm during the PRIME fill. Rig DOLILO 7/21: 250 -&gt; 400.</w:t>
             </w:r>
           </w:p>
         </w:tc>
@@ -17554,7 +17554,7 @@
         <w:sz w:val="16"/>
         <w:szCs w:val="16"/>
       </w:rPr>
-      <w:t xml:space="preserve">MVR Model &amp; Control Reference  -  v2026-07-21 16:00  -  </w:t>
+      <w:t xml:space="preserve">MVR Model &amp; Control Reference  -  v2026-07-21 16:08  -  </w:t>
     </w:r>
     <w:r>
       <w:rPr>

</xml_diff>

<commit_message>
Doc: feedLowRawML raw-low override row + prodFast no-wait note
Co-Authored-By: Claude Opus 4.8 <noreply@anthropic.com>
</commit_message>
<xml_diff>
--- a/MVR_Model_Reference.docx
+++ b/MVR_Model_Reference.docx
@@ -76,7 +76,7 @@
           <w:sz w:val="18"/>
           <w:szCs w:val="18"/>
         </w:rPr>
-        <w:t xml:space="preserve">Version 2026-07-21 16:08  (generated)</w:t>
+        <w:t xml:space="preserve">Version 2026-07-21 16:19  (generated)</w:t>
       </w:r>
     </w:p>
     <w:p>
@@ -8419,7 +8419,7 @@
                 <w:sz w:val="20"/>
                 <w:szCs w:val="20"/>
               </w:rPr>
-              <w:t xml:space="preserve">FAST production estimate (prodFast) for the FEED feed-forward: 60s totalizer windows into a 180s EMA (~2-3min response vs prodMeas ~10min). RUN + proven meter only; cleared outside RUN. The BLOWER keeps the slow stable prodMeas -- two consumers, two time constants.</w:t>
+              <w:t xml:space="preserve">FAST production estimate (prodFast) for the FEED feed-forward: 60s totalizer windows into a 180s EMA (~2-3min response vs prodMeas ~10min). RUN only, NO proven-meter wait (a recompile resets that flag and left the fast FF blind at 0 while 0.6 L/min pumped out -- flow past the meter IS proof); cleared outside RUN. The BLOWER keeps the slow stable prodMeas -- two consumers, two time constants.</w:t>
             </w:r>
           </w:p>
         </w:tc>
@@ -13086,6 +13086,124 @@
                 <w:sz w:val="18"/>
                 <w:szCs w:val="18"/>
               </w:rPr>
+              <w:t xml:space="preserve">feedLowRawML</w:t>
+            </w:r>
+          </w:p>
+        </w:tc>
+        <w:tc>
+          <w:tcPr>
+            <w:tcW w:type="dxa" w:w="1400"/>
+            <w:tcBorders>
+              <w:top w:val="single" w:color="BBBBBB" w:sz="1"/>
+              <w:left w:val="single" w:color="BBBBBB" w:sz="1"/>
+              <w:bottom w:val="single" w:color="BBBBBB" w:sz="1"/>
+              <w:right w:val="single" w:color="BBBBBB" w:sz="1"/>
+            </w:tcBorders>
+            <w:tcMar>
+              <w:top w:type="dxa" w:w="50"/>
+              <w:left w:type="dxa" w:w="110"/>
+              <w:bottom w:type="dxa" w:w="50"/>
+              <w:right w:type="dxa" w:w="110"/>
+            </w:tcMar>
+          </w:tcPr>
+          <w:p>
+            <w:r>
+              <w:rPr>
+                <w:rFonts w:ascii="Arial" w:cs="Arial" w:eastAsia="Arial" w:hAnsi="Arial"/>
+                <w:b w:val="false"/>
+                <w:bCs w:val="false"/>
+                <w:sz w:val="20"/>
+                <w:szCs w:val="20"/>
+              </w:rPr>
+              <w:t xml:space="preserve">300</w:t>
+            </w:r>
+          </w:p>
+        </w:tc>
+        <w:tc>
+          <w:tcPr>
+            <w:tcW w:type="dxa" w:w="2000"/>
+            <w:tcBorders>
+              <w:top w:val="single" w:color="BBBBBB" w:sz="1"/>
+              <w:left w:val="single" w:color="BBBBBB" w:sz="1"/>
+              <w:bottom w:val="single" w:color="BBBBBB" w:sz="1"/>
+              <w:right w:val="single" w:color="BBBBBB" w:sz="1"/>
+            </w:tcBorders>
+            <w:tcMar>
+              <w:top w:type="dxa" w:w="50"/>
+              <w:left w:type="dxa" w:w="110"/>
+              <w:bottom w:type="dxa" w:w="50"/>
+              <w:right w:type="dxa" w:w="110"/>
+            </w:tcMar>
+          </w:tcPr>
+          <w:p>
+            <w:r>
+              <w:rPr>
+                <w:rFonts w:ascii="Arial" w:cs="Arial" w:eastAsia="Arial" w:hAnsi="Arial"/>
+                <w:b w:val="false"/>
+                <w:bCs w:val="false"/>
+                <w:sz w:val="20"/>
+                <w:szCs w:val="20"/>
+              </w:rPr>
+              <w:t xml:space="preserve">ml</w:t>
+            </w:r>
+          </w:p>
+        </w:tc>
+        <w:tc>
+          <w:tcPr>
+            <w:tcW w:type="dxa" w:w="3960"/>
+            <w:tcBorders>
+              <w:top w:val="single" w:color="BBBBBB" w:sz="1"/>
+              <w:left w:val="single" w:color="BBBBBB" w:sz="1"/>
+              <w:bottom w:val="single" w:color="BBBBBB" w:sz="1"/>
+              <w:right w:val="single" w:color="BBBBBB" w:sz="1"/>
+            </w:tcBorders>
+            <w:tcMar>
+              <w:top w:type="dxa" w:w="50"/>
+              <w:left w:type="dxa" w:w="110"/>
+              <w:bottom w:type="dxa" w:w="50"/>
+              <w:right w:type="dxa" w:w="110"/>
+            </w:tcMar>
+          </w:tcPr>
+          <w:p>
+            <w:r>
+              <w:rPr>
+                <w:rFonts w:ascii="Arial" w:cs="Arial" w:eastAsia="Arial" w:hAnsi="Arial"/>
+                <w:b w:val="false"/>
+                <w:bCs w:val="false"/>
+                <w:sz w:val="20"/>
+                <w:szCs w:val="20"/>
+              </w:rPr>
+              <w:t xml:space="preserve">RAW-LOW OVERRIDE (rig 7/21 restart): in RUN, the raw sender below evapLevelSet - this (&gt;= one plateau genuinely low) forces fill-rate feed (feedFF + feedFillLpm) over every cap and fold. The physical sensor outranks all estimates: low is LOW. Sits after the cold-crash fold -- an emptying evaporator (dry heater) outranks a temperature sag.</w:t>
+            </w:r>
+          </w:p>
+        </w:tc>
+      </w:tr>
+      <w:tr>
+        <w:tc>
+          <w:tcPr>
+            <w:tcW w:type="dxa" w:w="2000"/>
+            <w:tcBorders>
+              <w:top w:val="single" w:color="BBBBBB" w:sz="1"/>
+              <w:left w:val="single" w:color="BBBBBB" w:sz="1"/>
+              <w:bottom w:val="single" w:color="BBBBBB" w:sz="1"/>
+              <w:right w:val="single" w:color="BBBBBB" w:sz="1"/>
+            </w:tcBorders>
+            <w:tcMar>
+              <w:top w:type="dxa" w:w="50"/>
+              <w:left w:type="dxa" w:w="110"/>
+              <w:bottom w:type="dxa" w:w="50"/>
+              <w:right w:type="dxa" w:w="110"/>
+            </w:tcMar>
+          </w:tcPr>
+          <w:p>
+            <w:r>
+              <w:rPr>
+                <w:rFonts w:ascii="Consolas" w:cs="Consolas" w:eastAsia="Consolas" w:hAnsi="Consolas"/>
+                <w:b w:val="false"/>
+                <w:bCs w:val="false"/>
+                <w:sz w:val="18"/>
+                <w:szCs w:val="18"/>
+              </w:rPr>
               <w:t xml:space="preserve">fillStopML</w:t>
             </w:r>
           </w:p>
@@ -17554,7 +17672,7 @@
         <w:sz w:val="16"/>
         <w:szCs w:val="16"/>
       </w:rPr>
-      <w:t xml:space="preserve">MVR Model &amp; Control Reference  -  v2026-07-21 16:08  -  </w:t>
+      <w:t xml:space="preserve">MVR Model &amp; Control Reference  -  v2026-07-21 16:19  -  </w:t>
     </w:r>
     <w:r>
       <w:rPr>

</xml_diff>

<commit_message>
Doc: feedHighRawML raw-high throttle row
Co-Authored-By: Claude Opus 4.8 <noreply@anthropic.com>
</commit_message>
<xml_diff>
--- a/MVR_Model_Reference.docx
+++ b/MVR_Model_Reference.docx
@@ -76,7 +76,7 @@
           <w:sz w:val="18"/>
           <w:szCs w:val="18"/>
         </w:rPr>
-        <w:t xml:space="preserve">Version 2026-07-21 16:19  (generated)</w:t>
+        <w:t xml:space="preserve">Version 2026-07-21 16:46  (generated)</w:t>
       </w:r>
     </w:p>
     <w:p>
@@ -13086,6 +13086,124 @@
                 <w:sz w:val="18"/>
                 <w:szCs w:val="18"/>
               </w:rPr>
+              <w:t xml:space="preserve">feedHighRawML</w:t>
+            </w:r>
+          </w:p>
+        </w:tc>
+        <w:tc>
+          <w:tcPr>
+            <w:tcW w:type="dxa" w:w="1400"/>
+            <w:tcBorders>
+              <w:top w:val="single" w:color="BBBBBB" w:sz="1"/>
+              <w:left w:val="single" w:color="BBBBBB" w:sz="1"/>
+              <w:bottom w:val="single" w:color="BBBBBB" w:sz="1"/>
+              <w:right w:val="single" w:color="BBBBBB" w:sz="1"/>
+            </w:tcBorders>
+            <w:tcMar>
+              <w:top w:type="dxa" w:w="50"/>
+              <w:left w:type="dxa" w:w="110"/>
+              <w:bottom w:type="dxa" w:w="50"/>
+              <w:right w:type="dxa" w:w="110"/>
+            </w:tcMar>
+          </w:tcPr>
+          <w:p>
+            <w:r>
+              <w:rPr>
+                <w:rFonts w:ascii="Arial" w:cs="Arial" w:eastAsia="Arial" w:hAnsi="Arial"/>
+                <w:b w:val="false"/>
+                <w:bCs w:val="false"/>
+                <w:sz w:val="20"/>
+                <w:szCs w:val="20"/>
+              </w:rPr>
+              <w:t xml:space="preserve">100</w:t>
+            </w:r>
+          </w:p>
+        </w:tc>
+        <w:tc>
+          <w:tcPr>
+            <w:tcW w:type="dxa" w:w="2000"/>
+            <w:tcBorders>
+              <w:top w:val="single" w:color="BBBBBB" w:sz="1"/>
+              <w:left w:val="single" w:color="BBBBBB" w:sz="1"/>
+              <w:bottom w:val="single" w:color="BBBBBB" w:sz="1"/>
+              <w:right w:val="single" w:color="BBBBBB" w:sz="1"/>
+            </w:tcBorders>
+            <w:tcMar>
+              <w:top w:type="dxa" w:w="50"/>
+              <w:left w:type="dxa" w:w="110"/>
+              <w:bottom w:type="dxa" w:w="50"/>
+              <w:right w:type="dxa" w:w="110"/>
+            </w:tcMar>
+          </w:tcPr>
+          <w:p>
+            <w:r>
+              <w:rPr>
+                <w:rFonts w:ascii="Arial" w:cs="Arial" w:eastAsia="Arial" w:hAnsi="Arial"/>
+                <w:b w:val="false"/>
+                <w:bCs w:val="false"/>
+                <w:sz w:val="20"/>
+                <w:szCs w:val="20"/>
+              </w:rPr>
+              <w:t xml:space="preserve">ml</w:t>
+            </w:r>
+          </w:p>
+        </w:tc>
+        <w:tc>
+          <w:tcPr>
+            <w:tcW w:type="dxa" w:w="3960"/>
+            <w:tcBorders>
+              <w:top w:val="single" w:color="BBBBBB" w:sz="1"/>
+              <w:left w:val="single" w:color="BBBBBB" w:sz="1"/>
+              <w:bottom w:val="single" w:color="BBBBBB" w:sz="1"/>
+              <w:right w:val="single" w:color="BBBBBB" w:sz="1"/>
+            </w:tcBorders>
+            <w:tcMar>
+              <w:top w:type="dxa" w:w="50"/>
+              <w:left w:type="dxa" w:w="110"/>
+              <w:bottom w:type="dxa" w:w="50"/>
+              <w:right w:type="dxa" w:w="110"/>
+            </w:tcMar>
+          </w:tcPr>
+          <w:p>
+            <w:r>
+              <w:rPr>
+                <w:rFonts w:ascii="Arial" w:cs="Arial" w:eastAsia="Arial" w:hAnsi="Arial"/>
+                <w:b w:val="false"/>
+                <w:bCs w:val="false"/>
+                <w:sz w:val="20"/>
+                <w:szCs w:val="20"/>
+              </w:rPr>
+              <w:t xml:space="preserve">RAW-HIGH THROTTLE (rig 7/21): raw sender ABOVE evapLevelSet + this (= stepped onto the 2600 plateau) caps the feed at HALF production-match and bleeds the trim at 2x -- the level drifts back down NOW instead of coasting into the 2750 warn (which remains the full-cut backstop). Sim steady band 100-200ml -&gt; 15ml: the plateau edges, not the estimates, bound the level on both sides.</w:t>
+            </w:r>
+          </w:p>
+        </w:tc>
+      </w:tr>
+      <w:tr>
+        <w:tc>
+          <w:tcPr>
+            <w:tcW w:type="dxa" w:w="2000"/>
+            <w:tcBorders>
+              <w:top w:val="single" w:color="BBBBBB" w:sz="1"/>
+              <w:left w:val="single" w:color="BBBBBB" w:sz="1"/>
+              <w:bottom w:val="single" w:color="BBBBBB" w:sz="1"/>
+              <w:right w:val="single" w:color="BBBBBB" w:sz="1"/>
+            </w:tcBorders>
+            <w:tcMar>
+              <w:top w:type="dxa" w:w="50"/>
+              <w:left w:type="dxa" w:w="110"/>
+              <w:bottom w:type="dxa" w:w="50"/>
+              <w:right w:type="dxa" w:w="110"/>
+            </w:tcMar>
+          </w:tcPr>
+          <w:p>
+            <w:r>
+              <w:rPr>
+                <w:rFonts w:ascii="Consolas" w:cs="Consolas" w:eastAsia="Consolas" w:hAnsi="Consolas"/>
+                <w:b w:val="false"/>
+                <w:bCs w:val="false"/>
+                <w:sz w:val="18"/>
+                <w:szCs w:val="18"/>
+              </w:rPr>
               <w:t xml:space="preserve">feedLowRawML</w:t>
             </w:r>
           </w:p>
@@ -17672,7 +17790,7 @@
         <w:sz w:val="16"/>
         <w:szCs w:val="16"/>
       </w:rPr>
-      <w:t xml:space="preserve">MVR Model &amp; Control Reference  -  v2026-07-21 16:19  -  </w:t>
+      <w:t xml:space="preserve">MVR Model &amp; Control Reference  -  v2026-07-21 16:46  -  </w:t>
     </w:r>
     <w:r>
       <w:rPr>

</xml_diff>

<commit_message>
MVR: prodAvgS 600 -> 120 default (rig DOLILO: blower tracks 0.35 at ~0.36)
The 600s burst-averaging horizon was tuned for the pre-flow-follow era
of sparse batches; with the condensate pump cycling ~2x/min the meter
delivers steady data and 120s tracks beautifully on the rig. ~60 noted
as plausible next step. Doc row added.

Co-Authored-By: Claude Opus 4.8 <noreply@anthropic.com>
</commit_message>
<xml_diff>
--- a/MVR_Model_Reference.docx
+++ b/MVR_Model_Reference.docx
@@ -76,7 +76,7 @@
           <w:sz w:val="18"/>
           <w:szCs w:val="18"/>
         </w:rPr>
-        <w:t xml:space="preserve">Version 2026-07-21 16:46  (generated)</w:t>
+        <w:t xml:space="preserve">Version 2026-07-21 16:49  (generated)</w:t>
       </w:r>
     </w:p>
     <w:p>
@@ -9866,6 +9866,124 @@
                 <w:sz w:val="18"/>
                 <w:szCs w:val="18"/>
               </w:rPr>
+              <w:t xml:space="preserve">prodAvgS</w:t>
+            </w:r>
+          </w:p>
+        </w:tc>
+        <w:tc>
+          <w:tcPr>
+            <w:tcW w:type="dxa" w:w="1300"/>
+            <w:tcBorders>
+              <w:top w:val="single" w:color="BBBBBB" w:sz="1"/>
+              <w:left w:val="single" w:color="BBBBBB" w:sz="1"/>
+              <w:bottom w:val="single" w:color="BBBBBB" w:sz="1"/>
+              <w:right w:val="single" w:color="BBBBBB" w:sz="1"/>
+            </w:tcBorders>
+            <w:tcMar>
+              <w:top w:type="dxa" w:w="50"/>
+              <w:left w:type="dxa" w:w="110"/>
+              <w:bottom w:type="dxa" w:w="50"/>
+              <w:right w:type="dxa" w:w="110"/>
+            </w:tcMar>
+          </w:tcPr>
+          <w:p>
+            <w:r>
+              <w:rPr>
+                <w:rFonts w:ascii="Arial" w:cs="Arial" w:eastAsia="Arial" w:hAnsi="Arial"/>
+                <w:b w:val="false"/>
+                <w:bCs w:val="false"/>
+                <w:sz w:val="20"/>
+                <w:szCs w:val="20"/>
+              </w:rPr>
+              <w:t xml:space="preserve">120</w:t>
+            </w:r>
+          </w:p>
+        </w:tc>
+        <w:tc>
+          <w:tcPr>
+            <w:tcW w:type="dxa" w:w="1500"/>
+            <w:tcBorders>
+              <w:top w:val="single" w:color="BBBBBB" w:sz="1"/>
+              <w:left w:val="single" w:color="BBBBBB" w:sz="1"/>
+              <w:bottom w:val="single" w:color="BBBBBB" w:sz="1"/>
+              <w:right w:val="single" w:color="BBBBBB" w:sz="1"/>
+            </w:tcBorders>
+            <w:tcMar>
+              <w:top w:type="dxa" w:w="50"/>
+              <w:left w:type="dxa" w:w="110"/>
+              <w:bottom w:type="dxa" w:w="50"/>
+              <w:right w:type="dxa" w:w="110"/>
+            </w:tcMar>
+          </w:tcPr>
+          <w:p>
+            <w:r>
+              <w:rPr>
+                <w:rFonts w:ascii="Arial" w:cs="Arial" w:eastAsia="Arial" w:hAnsi="Arial"/>
+                <w:b w:val="false"/>
+                <w:bCs w:val="false"/>
+                <w:sz w:val="20"/>
+                <w:szCs w:val="20"/>
+              </w:rPr>
+              <w:t xml:space="preserve">s</w:t>
+            </w:r>
+          </w:p>
+        </w:tc>
+        <w:tc>
+          <w:tcPr>
+            <w:tcW w:type="dxa" w:w="4360"/>
+            <w:tcBorders>
+              <w:top w:val="single" w:color="BBBBBB" w:sz="1"/>
+              <w:left w:val="single" w:color="BBBBBB" w:sz="1"/>
+              <w:bottom w:val="single" w:color="BBBBBB" w:sz="1"/>
+              <w:right w:val="single" w:color="BBBBBB" w:sz="1"/>
+            </w:tcBorders>
+            <w:tcMar>
+              <w:top w:type="dxa" w:w="50"/>
+              <w:left w:type="dxa" w:w="110"/>
+              <w:bottom w:type="dxa" w:w="50"/>
+              <w:right w:type="dxa" w:w="110"/>
+            </w:tcMar>
+          </w:tcPr>
+          <w:p>
+            <w:r>
+              <w:rPr>
+                <w:rFonts w:ascii="Arial" w:cs="Arial" w:eastAsia="Arial" w:hAnsi="Arial"/>
+                <w:b w:val="false"/>
+                <w:bCs w:val="false"/>
+                <w:sz w:val="20"/>
+                <w:szCs w:val="20"/>
+              </w:rPr>
+              <w:t xml:space="preserve">Production BURST-AVERAGING horizon: every totalizer window feeds a time-weighted EMA over this, so pump-out bursts and quiet windows average to the TRUE rate. Rig DOLILO 7/21: 600 -&gt; 120 (blower tracks prodSet 0.35 at avg ~0.36); ~60 is plausible since the pump cycles 2x/min in production.</w:t>
+            </w:r>
+          </w:p>
+        </w:tc>
+      </w:tr>
+      <w:tr>
+        <w:tc>
+          <w:tcPr>
+            <w:tcW w:type="dxa" w:w="2200"/>
+            <w:tcBorders>
+              <w:top w:val="single" w:color="BBBBBB" w:sz="1"/>
+              <w:left w:val="single" w:color="BBBBBB" w:sz="1"/>
+              <w:bottom w:val="single" w:color="BBBBBB" w:sz="1"/>
+              <w:right w:val="single" w:color="BBBBBB" w:sz="1"/>
+            </w:tcBorders>
+            <w:tcMar>
+              <w:top w:type="dxa" w:w="50"/>
+              <w:left w:type="dxa" w:w="110"/>
+              <w:bottom w:type="dxa" w:w="50"/>
+              <w:right w:type="dxa" w:w="110"/>
+            </w:tcMar>
+          </w:tcPr>
+          <w:p>
+            <w:r>
+              <w:rPr>
+                <w:rFonts w:ascii="Consolas" w:cs="Consolas" w:eastAsia="Consolas" w:hAnsi="Consolas"/>
+                <w:b w:val="false"/>
+                <w:bCs w:val="false"/>
+                <w:sz w:val="18"/>
+                <w:szCs w:val="18"/>
+              </w:rPr>
               <w:t xml:space="preserve">condTimedEn / condTimedOnS / condTimedOffS / condTimedMinLpm / condTimedAlways</w:t>
             </w:r>
           </w:p>
@@ -17790,7 +17908,7 @@
         <w:sz w:val="16"/>
         <w:szCs w:val="16"/>
       </w:rPr>
-      <w:t xml:space="preserve">MVR Model &amp; Control Reference  -  v2026-07-21 16:46  -  </w:t>
+      <w:t xml:space="preserve">MVR Model &amp; Control Reference  -  v2026-07-21 16:49  -  </w:t>
     </w:r>
     <w:r>
       <w:rPr>

</xml_diff>

<commit_message>
Doc: adaptive feed base rows + 2.7 paragraph
Co-Authored-By: Claude Opus 4.8 <noreply@anthropic.com>
</commit_message>
<xml_diff>
--- a/MVR_Model_Reference.docx
+++ b/MVR_Model_Reference.docx
@@ -76,7 +76,7 @@
           <w:sz w:val="18"/>
           <w:szCs w:val="18"/>
         </w:rPr>
-        <w:t xml:space="preserve">Version 2026-07-21 16:49  (generated)</w:t>
+        <w:t xml:space="preserve">Version 2026-07-21 17:32  (generated)</w:t>
       </w:r>
     </w:p>
     <w:p>
@@ -1356,6 +1356,32 @@
           <w:szCs w:val="19"/>
         </w:rPr>
         <w:t xml:space="preserve">feedRpmSet = clamp( feedLpm / (stepsPerRev*LPerStep) , 0 , feedRpmMax )   -&gt; STEP:Feed.VELOCITY</w:t>
+      </w:r>
+    </w:p>
+    <w:p>
+      <w:pPr>
+        <w:spacing w:after="120"/>
+      </w:pPr>
+      <w:r>
+        <w:rPr>
+          <w:b/>
+          <w:bCs/>
+        </w:rPr>
+        <w:t xml:space="preserve">ADAPTIVE BASE (rig 7/21 evening): </w:t>
+      </w:r>
+      <w:r>
+        <w:t xml:space="preserve">the commanded-feed EMA </w:t>
+      </w:r>
+      <w:r>
+        <w:rPr>
+          <w:rFonts w:ascii="Consolas" w:cs="Consolas" w:eastAsia="Consolas" w:hAnsi="Consolas"/>
+          <w:sz w:val="19"/>
+          <w:szCs w:val="19"/>
+        </w:rPr>
+        <w:t xml:space="preserve">feedBaseLpm</w:t>
+      </w:r>
+      <w:r>
+        <w:t xml:space="preserve"> learns the true balance rate (average feed = boil-off while the level is band-held); as RUN-time confidence grows the FF blends toward it (meter noise/cal error attenuated up to 70%) and the raw-edge overrides soften from bang-bang (425&lt;-&gt;190rpm, cold-slug slams) to ripples around the base.</w:t>
       </w:r>
     </w:p>
     <w:p>
@@ -13204,6 +13230,124 @@
                 <w:sz w:val="18"/>
                 <w:szCs w:val="18"/>
               </w:rPr>
+              <w:t xml:space="preserve">feedBaseTau / feedBaseRampS</w:t>
+            </w:r>
+          </w:p>
+        </w:tc>
+        <w:tc>
+          <w:tcPr>
+            <w:tcW w:type="dxa" w:w="1400"/>
+            <w:tcBorders>
+              <w:top w:val="single" w:color="BBBBBB" w:sz="1"/>
+              <w:left w:val="single" w:color="BBBBBB" w:sz="1"/>
+              <w:bottom w:val="single" w:color="BBBBBB" w:sz="1"/>
+              <w:right w:val="single" w:color="BBBBBB" w:sz="1"/>
+            </w:tcBorders>
+            <w:tcMar>
+              <w:top w:type="dxa" w:w="50"/>
+              <w:left w:type="dxa" w:w="110"/>
+              <w:bottom w:type="dxa" w:w="50"/>
+              <w:right w:type="dxa" w:w="110"/>
+            </w:tcMar>
+          </w:tcPr>
+          <w:p>
+            <w:r>
+              <w:rPr>
+                <w:rFonts w:ascii="Arial" w:cs="Arial" w:eastAsia="Arial" w:hAnsi="Arial"/>
+                <w:b w:val="false"/>
+                <w:bCs w:val="false"/>
+                <w:sz w:val="20"/>
+                <w:szCs w:val="20"/>
+              </w:rPr>
+              <w:t xml:space="preserve">240 / 600</w:t>
+            </w:r>
+          </w:p>
+        </w:tc>
+        <w:tc>
+          <w:tcPr>
+            <w:tcW w:type="dxa" w:w="2000"/>
+            <w:tcBorders>
+              <w:top w:val="single" w:color="BBBBBB" w:sz="1"/>
+              <w:left w:val="single" w:color="BBBBBB" w:sz="1"/>
+              <w:bottom w:val="single" w:color="BBBBBB" w:sz="1"/>
+              <w:right w:val="single" w:color="BBBBBB" w:sz="1"/>
+            </w:tcBorders>
+            <w:tcMar>
+              <w:top w:type="dxa" w:w="50"/>
+              <w:left w:type="dxa" w:w="110"/>
+              <w:bottom w:type="dxa" w:w="50"/>
+              <w:right w:type="dxa" w:w="110"/>
+            </w:tcMar>
+          </w:tcPr>
+          <w:p>
+            <w:r>
+              <w:rPr>
+                <w:rFonts w:ascii="Arial" w:cs="Arial" w:eastAsia="Arial" w:hAnsi="Arial"/>
+                <w:b w:val="false"/>
+                <w:bCs w:val="false"/>
+                <w:sz w:val="20"/>
+                <w:szCs w:val="20"/>
+              </w:rPr>
+              <w:t xml:space="preserve">s / s</w:t>
+            </w:r>
+          </w:p>
+        </w:tc>
+        <w:tc>
+          <w:tcPr>
+            <w:tcW w:type="dxa" w:w="3960"/>
+            <w:tcBorders>
+              <w:top w:val="single" w:color="BBBBBB" w:sz="1"/>
+              <w:left w:val="single" w:color="BBBBBB" w:sz="1"/>
+              <w:bottom w:val="single" w:color="BBBBBB" w:sz="1"/>
+              <w:right w:val="single" w:color="BBBBBB" w:sz="1"/>
+            </w:tcBorders>
+            <w:tcMar>
+              <w:top w:type="dxa" w:w="50"/>
+              <w:left w:type="dxa" w:w="110"/>
+              <w:bottom w:type="dxa" w:w="50"/>
+              <w:right w:type="dxa" w:w="110"/>
+            </w:tcMar>
+          </w:tcPr>
+          <w:p>
+            <w:r>
+              <w:rPr>
+                <w:rFonts w:ascii="Arial" w:cs="Arial" w:eastAsia="Arial" w:hAnsi="Arial"/>
+                <w:b w:val="false"/>
+                <w:bCs w:val="false"/>
+                <w:sz w:val="20"/>
+                <w:szCs w:val="20"/>
+              </w:rPr>
+              <w:t xml:space="preserve">ADAPTIVE FEED BASE (rig 7/21): feedBaseLpm = slow EMA of the COMMANDED feed -- the level is held in a band, so the long-run average feed IS the balance rate (calibrated pump side: immune to meter cal error and prodFast burst aliasing). Confidence w ramps 0 -&gt; 0.7 over feedBaseRampS of RUN time: FF becomes blend(prodFast, base) and the raw-edge override amplitudes soften by 1-0.6w (low fill +0.20 -&gt; +0.12; high cut 0.5xFF -&gt; 0.71xFF). Cure for the 425&lt;-&gt;190rpm bang-bang whose 425 slams were cold slugs the makeup fought at full duty. Base retained across stop/start; each run re-proves the ramp.</w:t>
+            </w:r>
+          </w:p>
+        </w:tc>
+      </w:tr>
+      <w:tr>
+        <w:tc>
+          <w:tcPr>
+            <w:tcW w:type="dxa" w:w="2000"/>
+            <w:tcBorders>
+              <w:top w:val="single" w:color="BBBBBB" w:sz="1"/>
+              <w:left w:val="single" w:color="BBBBBB" w:sz="1"/>
+              <w:bottom w:val="single" w:color="BBBBBB" w:sz="1"/>
+              <w:right w:val="single" w:color="BBBBBB" w:sz="1"/>
+            </w:tcBorders>
+            <w:tcMar>
+              <w:top w:type="dxa" w:w="50"/>
+              <w:left w:type="dxa" w:w="110"/>
+              <w:bottom w:type="dxa" w:w="50"/>
+              <w:right w:type="dxa" w:w="110"/>
+            </w:tcMar>
+          </w:tcPr>
+          <w:p>
+            <w:r>
+              <w:rPr>
+                <w:rFonts w:ascii="Consolas" w:cs="Consolas" w:eastAsia="Consolas" w:hAnsi="Consolas"/>
+                <w:b w:val="false"/>
+                <w:bCs w:val="false"/>
+                <w:sz w:val="18"/>
+                <w:szCs w:val="18"/>
+              </w:rPr>
               <w:t xml:space="preserve">feedHighRawML</w:t>
             </w:r>
           </w:p>
@@ -17908,7 +18052,7 @@
         <w:sz w:val="16"/>
         <w:szCs w:val="16"/>
       </w:rPr>
-      <w:t xml:space="preserve">MVR Model &amp; Control Reference  -  v2026-07-21 16:49  -  </w:t>
+      <w:t xml:space="preserve">MVR Model &amp; Control Reference  -  v2026-07-21 17:32  -  </w:t>
     </w:r>
     <w:r>
       <w:rPr>

</xml_diff>

<commit_message>
Doc: production-loop fast measurement + kProdDown/kProdBand rows
Co-Authored-By: Claude Opus 4.8 <noreply@anthropic.com>
</commit_message>
<xml_diff>
--- a/MVR_Model_Reference.docx
+++ b/MVR_Model_Reference.docx
@@ -76,7 +76,7 @@
           <w:sz w:val="18"/>
           <w:szCs w:val="18"/>
         </w:rPr>
-        <w:t xml:space="preserve">Version 2026-07-21 17:32  (generated)</w:t>
+        <w:t xml:space="preserve">Version 2026-07-21 17:46  (generated)</w:t>
       </w:r>
     </w:p>
     <w:p>
@@ -1264,7 +1264,35 @@
           <w:sz w:val="19"/>
           <w:szCs w:val="19"/>
         </w:rPr>
-        <w:t xml:space="preserve">blowerRpmSet = clamp( blowerRpmSet + kProd*(prodSetSafe - prodMeas)*cdt , min , max )</w:t>
+        <w:t xml:space="preserve">pm  = prodFast (fast, ~60-90s) when available, else prodMeas</w:t>
+      </w:r>
+    </w:p>
+    <w:p>
+      <w:pPr>
+        <w:spacing w:after="60"/>
+        <w:ind w:left="360"/>
+      </w:pPr>
+      <w:r>
+        <w:rPr>
+          <w:rFonts w:ascii="Consolas" w:cs="Consolas" w:eastAsia="Consolas" w:hAnsi="Consolas"/>
+          <w:sz w:val="19"/>
+          <w:szCs w:val="19"/>
+        </w:rPr>
+        <w:t xml:space="preserve">err = prodSetSafe - pm    ; err in (0, kProdBand) -&gt; 0 ; err &gt; 0.15 -&gt; 0.15 ; err &lt; 0 -&gt; err * kProdDown</w:t>
+      </w:r>
+    </w:p>
+    <w:p>
+      <w:pPr>
+        <w:spacing w:after="60"/>
+        <w:ind w:left="360"/>
+      </w:pPr>
+      <w:r>
+        <w:rPr>
+          <w:rFonts w:ascii="Consolas" w:cs="Consolas" w:eastAsia="Consolas" w:hAnsi="Consolas"/>
+          <w:sz w:val="19"/>
+          <w:szCs w:val="19"/>
+        </w:rPr>
+        <w:t xml:space="preserve">blowerRpmSet = clamp( blowerRpmSet + kProd*err*cdt , min , max )</w:t>
       </w:r>
     </w:p>
     <w:p>
@@ -8091,7 +8119,125 @@
                 <w:sz w:val="20"/>
                 <w:szCs w:val="20"/>
               </w:rPr>
-              <w:t xml:space="preserve">Blower production-control gain. Anti-windup: the target is not raised while the soft-start/ramped command still lags it.</w:t>
+              <w:t xml:space="preserve">Blower production-control gain. Anti-windup: the target is not raised while the soft-start/ramped command still lags it. Steers on the FAST estimate (prodFast) when available -- the double-smoothed prodMeas kept it climbing on stale data (rig 7/21: 1950 -&gt; 2860 with production already over set). Up-rate capped at err 0.15 (3rpm/s).</w:t>
+            </w:r>
+          </w:p>
+        </w:tc>
+      </w:tr>
+      <w:tr>
+        <w:tc>
+          <w:tcPr>
+            <w:tcW w:type="dxa" w:w="2200"/>
+            <w:tcBorders>
+              <w:top w:val="single" w:color="BBBBBB" w:sz="1"/>
+              <w:left w:val="single" w:color="BBBBBB" w:sz="1"/>
+              <w:bottom w:val="single" w:color="BBBBBB" w:sz="1"/>
+              <w:right w:val="single" w:color="BBBBBB" w:sz="1"/>
+            </w:tcBorders>
+            <w:tcMar>
+              <w:top w:type="dxa" w:w="50"/>
+              <w:left w:type="dxa" w:w="110"/>
+              <w:bottom w:type="dxa" w:w="50"/>
+              <w:right w:type="dxa" w:w="110"/>
+            </w:tcMar>
+          </w:tcPr>
+          <w:p>
+            <w:r>
+              <w:rPr>
+                <w:rFonts w:ascii="Consolas" w:cs="Consolas" w:eastAsia="Consolas" w:hAnsi="Consolas"/>
+                <w:b w:val="false"/>
+                <w:bCs w:val="false"/>
+                <w:sz w:val="18"/>
+                <w:szCs w:val="18"/>
+              </w:rPr>
+              <w:t xml:space="preserve">kProdDown / kProdBand</w:t>
+            </w:r>
+          </w:p>
+        </w:tc>
+        <w:tc>
+          <w:tcPr>
+            <w:tcW w:type="dxa" w:w="1300"/>
+            <w:tcBorders>
+              <w:top w:val="single" w:color="BBBBBB" w:sz="1"/>
+              <w:left w:val="single" w:color="BBBBBB" w:sz="1"/>
+              <w:bottom w:val="single" w:color="BBBBBB" w:sz="1"/>
+              <w:right w:val="single" w:color="BBBBBB" w:sz="1"/>
+            </w:tcBorders>
+            <w:tcMar>
+              <w:top w:type="dxa" w:w="50"/>
+              <w:left w:type="dxa" w:w="110"/>
+              <w:bottom w:type="dxa" w:w="50"/>
+              <w:right w:type="dxa" w:w="110"/>
+            </w:tcMar>
+          </w:tcPr>
+          <w:p>
+            <w:r>
+              <w:rPr>
+                <w:rFonts w:ascii="Arial" w:cs="Arial" w:eastAsia="Arial" w:hAnsi="Arial"/>
+                <w:b w:val="false"/>
+                <w:bCs w:val="false"/>
+                <w:sz w:val="20"/>
+                <w:szCs w:val="20"/>
+              </w:rPr>
+              <w:t xml:space="preserve">4 / 0.03</w:t>
+            </w:r>
+          </w:p>
+        </w:tc>
+        <w:tc>
+          <w:tcPr>
+            <w:tcW w:type="dxa" w:w="1500"/>
+            <w:tcBorders>
+              <w:top w:val="single" w:color="BBBBBB" w:sz="1"/>
+              <w:left w:val="single" w:color="BBBBBB" w:sz="1"/>
+              <w:bottom w:val="single" w:color="BBBBBB" w:sz="1"/>
+              <w:right w:val="single" w:color="BBBBBB" w:sz="1"/>
+            </w:tcBorders>
+            <w:tcMar>
+              <w:top w:type="dxa" w:w="50"/>
+              <w:left w:type="dxa" w:w="110"/>
+              <w:bottom w:type="dxa" w:w="50"/>
+              <w:right w:type="dxa" w:w="110"/>
+            </w:tcMar>
+          </w:tcPr>
+          <w:p>
+            <w:r>
+              <w:rPr>
+                <w:rFonts w:ascii="Arial" w:cs="Arial" w:eastAsia="Arial" w:hAnsi="Arial"/>
+                <w:b w:val="false"/>
+                <w:bCs w:val="false"/>
+                <w:sz w:val="20"/>
+                <w:szCs w:val="20"/>
+              </w:rPr>
+              <w:t xml:space="preserve">x / L/min</w:t>
+            </w:r>
+          </w:p>
+        </w:tc>
+        <w:tc>
+          <w:tcPr>
+            <w:tcW w:type="dxa" w:w="4360"/>
+            <w:tcBorders>
+              <w:top w:val="single" w:color="BBBBBB" w:sz="1"/>
+              <w:left w:val="single" w:color="BBBBBB" w:sz="1"/>
+              <w:bottom w:val="single" w:color="BBBBBB" w:sz="1"/>
+              <w:right w:val="single" w:color="BBBBBB" w:sz="1"/>
+            </w:tcBorders>
+            <w:tcMar>
+              <w:top w:type="dxa" w:w="50"/>
+              <w:left w:type="dxa" w:w="110"/>
+              <w:bottom w:type="dxa" w:w="50"/>
+              <w:right w:type="dxa" w:w="110"/>
+            </w:tcMar>
+          </w:tcPr>
+          <w:p>
+            <w:r>
+              <w:rPr>
+                <w:rFonts w:ascii="Arial" w:cs="Arial" w:eastAsia="Arial" w:hAnsi="Arial"/>
+                <w:b w:val="false"/>
+                <w:bCs w:val="false"/>
+                <w:sz w:val="20"/>
+                <w:szCs w:val="20"/>
+              </w:rPr>
+              <w:t xml:space="preserve">OVERSHOOT UNWIND + RAISE DEADBAND (rig 7/21): production above set falls at kProd*kProdDown (2860 -&gt; 2100 in ~90s instead of ~6min of overselling at +30%); raising stops within kProdBand of set so momentum + measurement lag close the gap instead of overshooting it.</w:t>
             </w:r>
           </w:p>
         </w:tc>
@@ -18052,7 +18198,7 @@
         <w:sz w:val="16"/>
         <w:szCs w:val="16"/>
       </w:rPr>
-      <w:t xml:space="preserve">MVR Model &amp; Control Reference  -  v2026-07-21 17:32  -  </w:t>
+      <w:t xml:space="preserve">MVR Model &amp; Control Reference  -  v2026-07-21 17:46  -  </w:t>
     </w:r>
     <w:r>
       <w:rPr>

</xml_diff>

<commit_message>
Doc: PowerMeter + wet-comp auto-restart sections (2.11/2.12)
Co-Authored-By: Claude Opus 4.8 <noreply@anthropic.com>
</commit_message>
<xml_diff>
--- a/MVR_Model_Reference.docx
+++ b/MVR_Model_Reference.docx
@@ -76,7 +76,7 @@
           <w:sz w:val="18"/>
           <w:szCs w:val="18"/>
         </w:rPr>
-        <w:t xml:space="preserve">Version 2026-07-21 17:46  (generated)</w:t>
+        <w:t xml:space="preserve">Version 2026-07-22 09:59  (generated)</w:t>
       </w:r>
     </w:p>
     <w:p>
@@ -1822,6 +1822,198 @@
           <w:szCs w:val="19"/>
         </w:rPr>
         <w:t xml:space="preserve">bypassV = clamp( (surgeThresh - deltaT) * surgeGain , 0 , 10 )   -&gt;  AO:BypassValve</w:t>
+      </w:r>
+    </w:p>
+    <w:p>
+      <w:pPr>
+        <w:pStyle w:val="Heading2"/>
+      </w:pPr>
+      <w:r>
+        <w:t xml:space="preserve">2.11  Power meter (PowerMeter)</w:t>
+      </w:r>
+    </w:p>
+    <w:p>
+      <w:pPr>
+        <w:spacing w:after="120"/>
+      </w:pPr>
+      <w:r>
+        <w:t xml:space="preserve">Instantaneous electrical power and a running energy totalizer. Heater draw = rated watts x PWM duty (the duty IS the power fraction); blower draw = the VFD's own output-power report (</w:t>
+      </w:r>
+      <w:r>
+        <w:rPr>
+          <w:rFonts w:ascii="Consolas" w:cs="Consolas" w:eastAsia="Consolas" w:hAnsi="Consolas"/>
+          <w:sz w:val="19"/>
+          <w:szCs w:val="19"/>
+        </w:rPr>
+        <w:t xml:space="preserve">vfdOutPwr</w:t>
+      </w:r>
+      <w:r>
+        <w:t xml:space="preserve">, watts, via monitorMotor .POWER; 0 in sim); small loads are flat ratings gated by their run states. Ratings are setpoints: </w:t>
+      </w:r>
+      <w:r>
+        <w:rPr>
+          <w:rFonts w:ascii="Consolas" w:cs="Consolas" w:eastAsia="Consolas" w:hAnsi="Consolas"/>
+          <w:sz w:val="19"/>
+          <w:szCs w:val="19"/>
+        </w:rPr>
+        <w:t xml:space="preserve">pwrMakeupW</w:t>
+      </w:r>
+      <w:r>
+        <w:t xml:space="preserve"> 2000, </w:t>
+      </w:r>
+      <w:r>
+        <w:rPr>
+          <w:rFonts w:ascii="Consolas" w:cs="Consolas" w:eastAsia="Consolas" w:hAnsi="Consolas"/>
+          <w:sz w:val="19"/>
+          <w:szCs w:val="19"/>
+        </w:rPr>
+        <w:t xml:space="preserve">pwrSuperW</w:t>
+      </w:r>
+      <w:r>
+        <w:t xml:space="preserve"> 300, </w:t>
+      </w:r>
+      <w:r>
+        <w:rPr>
+          <w:rFonts w:ascii="Consolas" w:cs="Consolas" w:eastAsia="Consolas" w:hAnsi="Consolas"/>
+          <w:sz w:val="19"/>
+          <w:szCs w:val="19"/>
+        </w:rPr>
+        <w:t xml:space="preserve">pwrCondW</w:t>
+      </w:r>
+      <w:r>
+        <w:t xml:space="preserve">/</w:t>
+      </w:r>
+      <w:r>
+        <w:rPr>
+          <w:rFonts w:ascii="Consolas" w:cs="Consolas" w:eastAsia="Consolas" w:hAnsi="Consolas"/>
+          <w:sz w:val="19"/>
+          <w:szCs w:val="19"/>
+        </w:rPr>
+        <w:t xml:space="preserve">pwrMistW</w:t>
+      </w:r>
+      <w:r>
+        <w:t xml:space="preserve"> 20 (while pumping/draining), </w:t>
+      </w:r>
+      <w:r>
+        <w:rPr>
+          <w:rFonts w:ascii="Consolas" w:cs="Consolas" w:eastAsia="Consolas" w:hAnsi="Consolas"/>
+          <w:sz w:val="19"/>
+          <w:szCs w:val="19"/>
+        </w:rPr>
+        <w:t xml:space="preserve">pwrFeedW</w:t>
+      </w:r>
+      <w:r>
+        <w:t xml:space="preserve"> 30 (while commanded), </w:t>
+      </w:r>
+      <w:r>
+        <w:rPr>
+          <w:rFonts w:ascii="Consolas" w:cs="Consolas" w:eastAsia="Consolas" w:hAnsi="Consolas"/>
+          <w:sz w:val="19"/>
+          <w:szCs w:val="19"/>
+        </w:rPr>
+        <w:t xml:space="preserve">pwrBaseW</w:t>
+      </w:r>
+      <w:r>
+        <w:t xml:space="preserve"> 30 (always). Zero </w:t>
+      </w:r>
+      <w:r>
+        <w:rPr>
+          <w:rFonts w:ascii="Consolas" w:cs="Consolas" w:eastAsia="Consolas" w:hAnsi="Consolas"/>
+          <w:sz w:val="19"/>
+          <w:szCs w:val="19"/>
+        </w:rPr>
+        <w:t xml:space="preserve">energyKWh</w:t>
+      </w:r>
+      <w:r>
+        <w:t xml:space="preserve"> from a Static Var widget to start a measurement window; it accumulates on sim-scaled time like every other integrator.</w:t>
+      </w:r>
+    </w:p>
+    <w:p>
+      <w:pPr>
+        <w:spacing w:after="60"/>
+        <w:ind w:left="360"/>
+      </w:pPr>
+      <w:r>
+        <w:rPr>
+          <w:rFonts w:ascii="Consolas" w:cs="Consolas" w:eastAsia="Consolas" w:hAnsi="Consolas"/>
+          <w:sz w:val="19"/>
+          <w:szCs w:val="19"/>
+        </w:rPr>
+        <w:t xml:space="preserve">powerW    = base + mkDuty*2000 + shDuty*300 + vfdOutPwr + pumps</w:t>
+      </w:r>
+    </w:p>
+    <w:p>
+      <w:pPr>
+        <w:spacing w:after="60"/>
+        <w:ind w:left="360"/>
+      </w:pPr>
+      <w:r>
+        <w:rPr>
+          <w:rFonts w:ascii="Consolas" w:cs="Consolas" w:eastAsia="Consolas" w:hAnsi="Consolas"/>
+          <w:sz w:val="19"/>
+          <w:szCs w:val="19"/>
+        </w:rPr>
+        <w:t xml:space="preserve">energyKWh += powerW * dt / 3.6e6</w:t>
+      </w:r>
+    </w:p>
+    <w:p>
+      <w:pPr>
+        <w:pStyle w:val="Heading2"/>
+      </w:pPr>
+      <w:r>
+        <w:t xml:space="preserve">2.12  Wet-compression AUTO-RESTART</w:t>
+      </w:r>
+    </w:p>
+    <w:p>
+      <w:pPr>
+        <w:spacing w:after="120"/>
+      </w:pPr>
+      <w:r>
+        <w:t xml:space="preserve">Rig 7/22: a wet-comp trip cuts the blower and heat, flow stops, the sag clears -- and a warm resume is gentle. So the trip recovers AUTOMATICALLY: after </w:t>
+      </w:r>
+      <w:r>
+        <w:rPr>
+          <w:rFonts w:ascii="Consolas" w:cs="Consolas" w:eastAsia="Consolas" w:hAnsi="Consolas"/>
+          <w:sz w:val="19"/>
+          <w:szCs w:val="19"/>
+        </w:rPr>
+        <w:t xml:space="preserve">shAutoRstS</w:t>
+      </w:r>
+      <w:r>
+        <w:t xml:space="preserve"> (45s) cooldown the latch clears and the run resumes IN PLACE (soft-restart, no purge). </w:t>
+      </w:r>
+      <w:r>
+        <w:rPr>
+          <w:rFonts w:ascii="Consolas" w:cs="Consolas" w:eastAsia="Consolas" w:hAnsi="Consolas"/>
+          <w:sz w:val="19"/>
+          <w:szCs w:val="19"/>
+        </w:rPr>
+        <w:t xml:space="preserve">shArmed</w:t>
+      </w:r>
+      <w:r>
+        <w:t xml:space="preserve"> resets too, so the trip cannot re-fire until superheat is genuinely re-established at speed. Bounded: </w:t>
+      </w:r>
+      <w:r>
+        <w:rPr>
+          <w:rFonts w:ascii="Consolas" w:cs="Consolas" w:eastAsia="Consolas" w:hAnsi="Consolas"/>
+          <w:sz w:val="19"/>
+          <w:szCs w:val="19"/>
+        </w:rPr>
+        <w:t xml:space="preserve">shAutoRstMax</w:t>
+      </w:r>
+      <w:r>
+        <w:t xml:space="preserve"> (3) attempts per run, then it stays tripped for the operator; </w:t>
+      </w:r>
+      <w:r>
+        <w:rPr>
+          <w:rFonts w:ascii="Consolas" w:cs="Consolas" w:eastAsia="Consolas" w:hAnsi="Consolas"/>
+          <w:sz w:val="19"/>
+          <w:szCs w:val="19"/>
+        </w:rPr>
+        <w:t xml:space="preserve">shAutoRstEn</w:t>
+      </w:r>
+      <w:r>
+        <w:t xml:space="preserve">=0 disables. The 7/22 trip itself: RUN with the startup air vent still open (vapor-out plateaued 98-99C, under the 100C close threshold, BECAUSE the vent was bleeding the steam that would heat it) -- blower at 2938 venting steam, makeup losing ground, superheat collapsed with the cartridge at full duty, and the SH rescue is vent-gated so it stood by.</w:t>
       </w:r>
     </w:p>
     <w:p>
@@ -18198,7 +18390,7 @@
         <w:sz w:val="16"/>
         <w:szCs w:val="16"/>
       </w:rPr>
-      <w:t xml:space="preserve">MVR Model &amp; Control Reference  -  v2026-07-21 17:46  -  </w:t>
+      <w:t xml:space="preserve">MVR Model &amp; Control Reference  -  v2026-07-22 09:59  -  </w:t>
     </w:r>
     <w:r>
       <w:rPr>

</xml_diff>

<commit_message>
Doc: swell-qualified warn + cold-fill cap rows
Co-Authored-By: Claude Opus 4.8 <noreply@anthropic.com>
</commit_message>
<xml_diff>
--- a/MVR_Model_Reference.docx
+++ b/MVR_Model_Reference.docx
@@ -76,7 +76,7 @@
           <w:sz w:val="18"/>
           <w:szCs w:val="18"/>
         </w:rPr>
-        <w:t xml:space="preserve">Version 2026-07-22 10:05  (generated)</w:t>
+        <w:t xml:space="preserve">Version 2026-07-22 10:56  (generated)</w:t>
       </w:r>
     </w:p>
     <w:p>
@@ -7333,7 +7333,7 @@
                 <w:sz w:val="20"/>
                 <w:szCs w:val="20"/>
               </w:rPr>
-              <w:t xml:space="preserve">HIGH-LEVEL WARNING (2600|2900 plateau edge; E-TC DIN float ORed in): latched UI popup after 3s persistence (float bob flicks single samples onto the 2900 plateau from ~2650 true) + FeedFollow cuts the feed INSTANTLY on yEvapHigh. Not during PURGE; not a hard trip.</w:t>
+              <w:t xml:space="preserve">HIGH-LEVEL WARNING (2600|2900 plateau edge; E-TC DIN float ORed in): latched UI popup after 3s persistence, RUN-only and SWELL-QUALIFIED (7/22): the warn also requires recent-feed (feedRecentLpm 60s EMA) above feedWarnLpm (0.05) -- boil swell walks the reading over the edge with the feed idle (cold-start boil onset hit raw 3150 with feed OFF) and froth is not overfill. FeedFollow still cuts the feed INSTANTLY and unconditionally on yEvapHigh. Not during PURGE; not a hard trip.</w:t>
             </w:r>
           </w:p>
         </w:tc>
@@ -14127,7 +14127,7 @@
                 <w:sz w:val="20"/>
                 <w:szCs w:val="20"/>
               </w:rPr>
-              <w:t xml:space="preserve">HEAT fills COLD water to evapMidMark - this: the charge expands ~4% to boiling and the slew-limited decel keeps delivering, so filling to the mark itself overshot into the high warn every startup. Expansion + RUN's capped-P close the gap; HEAT-&gt;RUN advances on temp + raw &gt;= mark-fillStopML.</w:t>
+              <w:t xml:space="preserve">HEAT fills COLD water to evapMidMark - this, and (7/22) a COLD-FILL CAP holds it there: level-P + trim used to walk the cold charge up to the mark anyway, and boil-onset swell (+500ml froth on this rig) launched from 2500 to raw 3150. Above the reduced target in HEAT the feed caps at FF (~0) and trim wind-up is frozen; expansion + swell carry the level the rest, RUN tops off under the sensors. HEAT-&gt;RUN advances on temp + raw &gt;= mark-fillStopML.</w:t>
             </w:r>
           </w:p>
         </w:tc>
@@ -18508,7 +18508,7 @@
         <w:sz w:val="16"/>
         <w:szCs w:val="16"/>
       </w:rPr>
-      <w:t xml:space="preserve">MVR Model &amp; Control Reference  -  v2026-07-22 10:05  -  </w:t>
+      <w:t xml:space="preserve">MVR Model &amp; Control Reference  -  v2026-07-22 10:56  -  </w:t>
     </w:r>
     <w:r>
       <w:rPr>

</xml_diff>

<commit_message>
Doc: specific-energy window + reset button in 2.11
Co-Authored-By: Claude Opus 4.8 <noreply@anthropic.com>
</commit_message>
<xml_diff>
--- a/MVR_Model_Reference.docx
+++ b/MVR_Model_Reference.docx
@@ -76,7 +76,7 @@
           <w:sz w:val="18"/>
           <w:szCs w:val="18"/>
         </w:rPr>
-        <w:t xml:space="preserve">Version 2026-07-22 10:56  (generated)</w:t>
+        <w:t xml:space="preserve">Version 2026-07-22 11:10  (generated)</w:t>
       </w:r>
     </w:p>
     <w:p>
@@ -1954,6 +1954,90 @@
           <w:szCs w:val="19"/>
         </w:rPr>
         <w:t xml:space="preserve">energyKWh += powerW * dt / 3.6e6</w:t>
+      </w:r>
+    </w:p>
+    <w:p>
+      <w:pPr>
+        <w:spacing w:after="60"/>
+        <w:ind w:left="360"/>
+      </w:pPr>
+      <w:r>
+        <w:rPr>
+          <w:rFonts w:ascii="Consolas" w:cs="Consolas" w:eastAsia="Consolas" w:hAnsi="Consolas"/>
+          <w:sz w:val="19"/>
+          <w:szCs w:val="19"/>
+        </w:rPr>
+        <w:t xml:space="preserve">energyProdL += yCondFlow * condCalFactor * dt/60   ; specKWhL = energyKWh / energyProdL</w:t>
+      </w:r>
+    </w:p>
+    <w:p>
+      <w:pPr>
+        <w:spacing w:after="120"/>
+      </w:pPr>
+      <w:r>
+        <w:rPr>
+          <w:b/>
+          <w:bCs/>
+        </w:rPr>
+        <w:t xml:space="preserve">Specific energy (kWh/L): </w:t>
+      </w:r>
+      <w:r>
+        <w:t xml:space="preserve">a dashboard Button widget (VARIABLE mode) named </w:t>
+      </w:r>
+      <w:r>
+        <w:rPr>
+          <w:rFonts w:ascii="Consolas" w:cs="Consolas" w:eastAsia="Consolas" w:hAnsi="Consolas"/>
+          <w:sz w:val="19"/>
+          <w:szCs w:val="19"/>
+        </w:rPr>
+        <w:t xml:space="preserve">resetEnergyCalcs</w:t>
+      </w:r>
+      <w:r>
+        <w:t xml:space="preserve"> zeroes </w:t>
+      </w:r>
+      <w:r>
+        <w:rPr>
+          <w:rFonts w:ascii="Consolas" w:cs="Consolas" w:eastAsia="Consolas" w:hAnsi="Consolas"/>
+          <w:sz w:val="19"/>
+          <w:szCs w:val="19"/>
+        </w:rPr>
+        <w:t xml:space="preserve">energyKWh</w:t>
+      </w:r>
+      <w:r>
+        <w:t xml:space="preserve"> and the window product totalizer </w:t>
+      </w:r>
+      <w:r>
+        <w:rPr>
+          <w:rFonts w:ascii="Consolas" w:cs="Consolas" w:eastAsia="Consolas" w:hAnsi="Consolas"/>
+          <w:sz w:val="19"/>
+          <w:szCs w:val="19"/>
+        </w:rPr>
+        <w:t xml:space="preserve">energyProdL</w:t>
+      </w:r>
+      <w:r>
+        <w:t xml:space="preserve"> TOGETHER, so both cover the same window -- press+release at RUN entry and </w:t>
+      </w:r>
+      <w:r>
+        <w:rPr>
+          <w:rFonts w:ascii="Consolas" w:cs="Consolas" w:eastAsia="Consolas" w:hAnsi="Consolas"/>
+          <w:sz w:val="19"/>
+          <w:szCs w:val="19"/>
+        </w:rPr>
+        <w:t xml:space="preserve">specKWhL</w:t>
+      </w:r>
+      <w:r>
+        <w:t xml:space="preserve"> reads live kWh-per-L for the run (guarded until ~50ml lands). The MVR figure of merit: raw resistive distillation ~0.63 kWh/L; this machine targets ~0.1-0.15. </w:t>
+      </w:r>
+      <w:r>
+        <w:rPr>
+          <w:rFonts w:ascii="Consolas" w:cs="Consolas" w:eastAsia="Consolas" w:hAnsi="Consolas"/>
+          <w:sz w:val="19"/>
+          <w:szCs w:val="19"/>
+        </w:rPr>
+        <w:t xml:space="preserve">powerKW</w:t>
+      </w:r>
+      <w:r>
+        <w:t xml:space="preserve"> = powerW/1000 for display.</w:t>
       </w:r>
     </w:p>
     <w:p>
@@ -18508,7 +18592,7 @@
         <w:sz w:val="16"/>
         <w:szCs w:val="16"/>
       </w:rPr>
-      <w:t xml:space="preserve">MVR Model &amp; Control Reference  -  v2026-07-22 10:56  -  </w:t>
+      <w:t xml:space="preserve">MVR Model &amp; Control Reference  -  v2026-07-22 11:10  -  </w:t>
     </w:r>
     <w:r>
       <w:rPr>

</xml_diff>

<commit_message>
MVR: drop powerKW -- powerW stays the power display (russ: W for power, kWh for totals)
Co-Authored-By: Claude Opus 4.8 <noreply@anthropic.com>
</commit_message>
<xml_diff>
--- a/MVR_Model_Reference.docx
+++ b/MVR_Model_Reference.docx
@@ -76,7 +76,7 @@
           <w:sz w:val="18"/>
           <w:szCs w:val="18"/>
         </w:rPr>
-        <w:t xml:space="preserve">Version 2026-07-22 11:10  (generated)</w:t>
+        <w:t xml:space="preserve">Version 2026-07-22 11:15  (generated)</w:t>
       </w:r>
     </w:p>
     <w:p>
@@ -2026,18 +2026,7 @@
         <w:t xml:space="preserve">specKWhL</w:t>
       </w:r>
       <w:r>
-        <w:t xml:space="preserve"> reads live kWh-per-L for the run (guarded until ~50ml lands). The MVR figure of merit: raw resistive distillation ~0.63 kWh/L; this machine targets ~0.1-0.15. </w:t>
-      </w:r>
-      <w:r>
-        <w:rPr>
-          <w:rFonts w:ascii="Consolas" w:cs="Consolas" w:eastAsia="Consolas" w:hAnsi="Consolas"/>
-          <w:sz w:val="19"/>
-          <w:szCs w:val="19"/>
-        </w:rPr>
-        <w:t xml:space="preserve">powerKW</w:t>
-      </w:r>
-      <w:r>
-        <w:t xml:space="preserve"> = powerW/1000 for display.</w:t>
+        <w:t xml:space="preserve"> reads live kWh-per-L for the run (guarded until ~50ml lands). The MVR figure of merit: raw resistive distillation ~0.63 kWh/L; this machine targets ~0.1-0.15. Power displays as powerW (watts); energy totals in kWh.</w:t>
       </w:r>
     </w:p>
     <w:p>
@@ -18592,7 +18581,7 @@
         <w:sz w:val="16"/>
         <w:szCs w:val="16"/>
       </w:rPr>
-      <w:t xml:space="preserve">MVR Model &amp; Control Reference  -  v2026-07-22 11:10  -  </w:t>
+      <w:t xml:space="preserve">MVR Model &amp; Control Reference  -  v2026-07-22 11:15  -  </w:t>
     </w:r>
     <w:r>
       <w:rPr>

</xml_diff>

<commit_message>
Doc: cycle-synced prodFast row update
Co-Authored-By: Claude Opus 4.8 <noreply@anthropic.com>
</commit_message>
<xml_diff>
--- a/MVR_Model_Reference.docx
+++ b/MVR_Model_Reference.docx
@@ -76,7 +76,7 @@
           <w:sz w:val="18"/>
           <w:szCs w:val="18"/>
         </w:rPr>
-        <w:t xml:space="preserve">Version 2026-07-22 11:15  (generated)</w:t>
+        <w:t xml:space="preserve">Version 2026-07-22 11:31  (generated)</w:t>
       </w:r>
     </w:p>
     <w:p>
@@ -8798,7 +8798,7 @@
                 <w:sz w:val="20"/>
                 <w:szCs w:val="20"/>
               </w:rPr>
-              <w:t xml:space="preserve">60 / 180</w:t>
+              <w:t xml:space="preserve">300 cap / 180</w:t>
             </w:r>
           </w:p>
         </w:tc>
@@ -8856,7 +8856,7 @@
                 <w:sz w:val="20"/>
                 <w:szCs w:val="20"/>
               </w:rPr>
-              <w:t xml:space="preserve">FAST production estimate (prodFast) for the FEED feed-forward: 60s totalizer windows into a 180s EMA (~2-3min response vs prodMeas ~10min). RUN only, NO proven-meter wait (a recompile resets that flag and left the fast FF blind at 0 while 0.6 L/min pumped out -- flow past the meter IS proof); cleared outside RUN. The BLOWER keeps the slow stable prodMeas -- two consumers, two time constants.</w:t>
+              <w:t xml:space="preserve">FAST production estimate (prodFast), CYCLE-SYNCED (7/22): the window closes at each PUMP-OFF edge -- the reservoir is in the same just-emptied state cycle to cycle, so volume/period is EXACT. Fixed 60s windows ALIASED against the 400-750s flow-follow pump cycles (prodFast swung 0.19-0.47 while true per-cycle production sat flat at 0.46; the blower hunted +/-900rpm, ~10min period, chasing it). prodFastWinS is only the CAP (continuous pumping/stall); prodFastMinS (45s) ignores micro-cycles. Feeds the feed FF AND the blower loop (pmG). RUN only, NO proven-meter wait (a recompile resets that flag and left the fast FF blind at 0 while 0.6 L/min pumped out -- flow past the meter IS proof); cleared outside RUN. The BLOWER keeps the slow stable prodMeas -- two consumers, two time constants.</w:t>
             </w:r>
           </w:p>
         </w:tc>
@@ -18581,7 +18581,7 @@
         <w:sz w:val="16"/>
         <w:szCs w:val="16"/>
       </w:rPr>
-      <w:t xml:space="preserve">MVR Model &amp; Control Reference  -  v2026-07-22 11:15  -  </w:t>
+      <w:t xml:space="preserve">MVR Model &amp; Control Reference  -  v2026-07-22 11:31  -  </w:t>
     </w:r>
     <w:r>
       <w:rPr>

</xml_diff>

<commit_message>
Doc: feedHiEscS escalating throttle row
Co-Authored-By: Claude Opus 4.8 <noreply@anthropic.com>
</commit_message>
<xml_diff>
--- a/MVR_Model_Reference.docx
+++ b/MVR_Model_Reference.docx
@@ -76,7 +76,7 @@
           <w:sz w:val="18"/>
           <w:szCs w:val="18"/>
         </w:rPr>
-        <w:t xml:space="preserve">Version 2026-07-22 11:31  (generated)</w:t>
+        <w:t xml:space="preserve">Version 2026-07-22 12:32  (generated)</w:t>
       </w:r>
     </w:p>
     <w:p>
@@ -13877,6 +13877,124 @@
                 <w:sz w:val="18"/>
                 <w:szCs w:val="18"/>
               </w:rPr>
+              <w:t xml:space="preserve">feedHiEscS</w:t>
+            </w:r>
+          </w:p>
+        </w:tc>
+        <w:tc>
+          <w:tcPr>
+            <w:tcW w:type="dxa" w:w="1400"/>
+            <w:tcBorders>
+              <w:top w:val="single" w:color="BBBBBB" w:sz="1"/>
+              <w:left w:val="single" w:color="BBBBBB" w:sz="1"/>
+              <w:bottom w:val="single" w:color="BBBBBB" w:sz="1"/>
+              <w:right w:val="single" w:color="BBBBBB" w:sz="1"/>
+            </w:tcBorders>
+            <w:tcMar>
+              <w:top w:type="dxa" w:w="50"/>
+              <w:left w:type="dxa" w:w="110"/>
+              <w:bottom w:type="dxa" w:w="50"/>
+              <w:right w:type="dxa" w:w="110"/>
+            </w:tcMar>
+          </w:tcPr>
+          <w:p>
+            <w:r>
+              <w:rPr>
+                <w:rFonts w:ascii="Arial" w:cs="Arial" w:eastAsia="Arial" w:hAnsi="Arial"/>
+                <w:b w:val="false"/>
+                <w:bCs w:val="false"/>
+                <w:sz w:val="20"/>
+                <w:szCs w:val="20"/>
+              </w:rPr>
+              <w:t xml:space="preserve">30</w:t>
+            </w:r>
+          </w:p>
+        </w:tc>
+        <w:tc>
+          <w:tcPr>
+            <w:tcW w:type="dxa" w:w="2000"/>
+            <w:tcBorders>
+              <w:top w:val="single" w:color="BBBBBB" w:sz="1"/>
+              <w:left w:val="single" w:color="BBBBBB" w:sz="1"/>
+              <w:bottom w:val="single" w:color="BBBBBB" w:sz="1"/>
+              <w:right w:val="single" w:color="BBBBBB" w:sz="1"/>
+            </w:tcBorders>
+            <w:tcMar>
+              <w:top w:type="dxa" w:w="50"/>
+              <w:left w:type="dxa" w:w="110"/>
+              <w:bottom w:type="dxa" w:w="50"/>
+              <w:right w:type="dxa" w:w="110"/>
+            </w:tcMar>
+          </w:tcPr>
+          <w:p>
+            <w:r>
+              <w:rPr>
+                <w:rFonts w:ascii="Arial" w:cs="Arial" w:eastAsia="Arial" w:hAnsi="Arial"/>
+                <w:b w:val="false"/>
+                <w:bCs w:val="false"/>
+                <w:sz w:val="20"/>
+                <w:szCs w:val="20"/>
+              </w:rPr>
+              <w:t xml:space="preserve">s</w:t>
+            </w:r>
+          </w:p>
+        </w:tc>
+        <w:tc>
+          <w:tcPr>
+            <w:tcW w:type="dxa" w:w="3960"/>
+            <w:tcBorders>
+              <w:top w:val="single" w:color="BBBBBB" w:sz="1"/>
+              <w:left w:val="single" w:color="BBBBBB" w:sz="1"/>
+              <w:bottom w:val="single" w:color="BBBBBB" w:sz="1"/>
+              <w:right w:val="single" w:color="BBBBBB" w:sz="1"/>
+            </w:tcBorders>
+            <w:tcMar>
+              <w:top w:type="dxa" w:w="50"/>
+              <w:left w:type="dxa" w:w="110"/>
+              <w:bottom w:type="dxa" w:w="50"/>
+              <w:right w:type="dxa" w:w="110"/>
+            </w:tcMar>
+          </w:tcPr>
+          <w:p>
+            <w:r>
+              <w:rPr>
+                <w:rFonts w:ascii="Arial" w:cs="Arial" w:eastAsia="Arial" w:hAnsi="Arial"/>
+                <w:b w:val="false"/>
+                <w:bCs w:val="false"/>
+                <w:sz w:val="20"/>
+                <w:szCs w:val="20"/>
+              </w:rPr>
+              <w:t xml:space="preserve">RAW-HIGH ESCALATION (7/22): on the 2600 plateau the feed caps at 0.5xFF immediately, 0.25xFF after this long still high, OFF after 2x -- descent guaranteed regardless of FF bias (the confidence-softened 0.71xFF cap held 367rpm mean ON the plateau). Down-slew runs 4x (cuts are thermally free).</w:t>
+            </w:r>
+          </w:p>
+        </w:tc>
+      </w:tr>
+      <w:tr>
+        <w:tc>
+          <w:tcPr>
+            <w:tcW w:type="dxa" w:w="2000"/>
+            <w:tcBorders>
+              <w:top w:val="single" w:color="BBBBBB" w:sz="1"/>
+              <w:left w:val="single" w:color="BBBBBB" w:sz="1"/>
+              <w:bottom w:val="single" w:color="BBBBBB" w:sz="1"/>
+              <w:right w:val="single" w:color="BBBBBB" w:sz="1"/>
+            </w:tcBorders>
+            <w:tcMar>
+              <w:top w:type="dxa" w:w="50"/>
+              <w:left w:type="dxa" w:w="110"/>
+              <w:bottom w:type="dxa" w:w="50"/>
+              <w:right w:type="dxa" w:w="110"/>
+            </w:tcMar>
+          </w:tcPr>
+          <w:p>
+            <w:r>
+              <w:rPr>
+                <w:rFonts w:ascii="Consolas" w:cs="Consolas" w:eastAsia="Consolas" w:hAnsi="Consolas"/>
+                <w:b w:val="false"/>
+                <w:bCs w:val="false"/>
+                <w:sz w:val="18"/>
+                <w:szCs w:val="18"/>
+              </w:rPr>
               <w:t xml:space="preserve">feedHighRawML</w:t>
             </w:r>
           </w:p>
@@ -18581,7 +18699,7 @@
         <w:sz w:val="16"/>
         <w:szCs w:val="16"/>
       </w:rPr>
-      <w:t xml:space="preserve">MVR Model &amp; Control Reference  -  v2026-07-22 11:31  -  </w:t>
+      <w:t xml:space="preserve">MVR Model &amp; Control Reference  -  v2026-07-22 12:32  -  </w:t>
     </w:r>
     <w:r>
       <w:rPr>

</xml_diff>

<commit_message>
Doc: hot-restart HEAT fill note
Co-Authored-By: Claude Opus 4.8 <noreply@anthropic.com>
</commit_message>
<xml_diff>
--- a/MVR_Model_Reference.docx
+++ b/MVR_Model_Reference.docx
@@ -76,7 +76,7 @@
           <w:sz w:val="18"/>
           <w:szCs w:val="18"/>
         </w:rPr>
-        <w:t xml:space="preserve">Version 2026-07-22 12:32  (generated)</w:t>
+        <w:t xml:space="preserve">Version 2026-07-22 16:29  (generated)</w:t>
       </w:r>
     </w:p>
     <w:p>
@@ -14318,7 +14318,7 @@
                 <w:sz w:val="20"/>
                 <w:szCs w:val="20"/>
               </w:rPr>
-              <w:t xml:space="preserve">HEAT fills COLD water to evapMidMark - this, and (7/22) a COLD-FILL CAP holds it there: level-P + trim used to walk the cold charge up to the mark anyway, and boil-onset swell (+500ml froth on this rig) launched from 2500 to raw 3150. Above the reduced target in HEAT the feed caps at FF (~0) and trim wind-up is frozen; expansion + swell carry the level the rest, RUN tops off under the sensors. HEAT-&gt;RUN advances on temp + raw &gt;= mark-fillStopML.</w:t>
+              <w:t xml:space="preserve">HEAT fills COLD water to evapMidMark - this, and (7/22) a COLD-FILL CAP holds it there: level-P + trim used to walk the cold charge up to the mark anyway, and boil-onset swell (+500ml froth on this rig) launched from 2500 to raw 3150. Above the reduced target in HEAT the feed caps at FF (~0) and trim wind-up is frozen; expansion + swell carry the level the rest, RUN tops off under the sensors. HEAT-&gt;RUN advances on temp + raw &gt;= mark-fillStopML. HOT-RESTART (7/22 pm): the fill floor and cap ride max(FF, blowerProdEst) -- a warm restart boils DURING the fill and the fixed 0.2 floor lost to ~0.4 of boil-off (level drained, HEAT stuck); the deltaT-lift is also gated off below the fill target.</w:t>
             </w:r>
           </w:p>
         </w:tc>
@@ -18699,7 +18699,7 @@
         <w:sz w:val="16"/>
         <w:szCs w:val="16"/>
       </w:rPr>
-      <w:t xml:space="preserve">MVR Model &amp; Control Reference  -  v2026-07-22 12:32  -  </w:t>
+      <w:t xml:space="preserve">MVR Model &amp; Control Reference  -  v2026-07-22 16:29  -  </w:t>
     </w:r>
     <w:r>
       <w:rPr>

</xml_diff>

<commit_message>
Doc: plain-EMA production measurement rows
Co-Authored-By: Claude Opus 4.8 <noreply@anthropic.com>
</commit_message>
<xml_diff>
--- a/MVR_Model_Reference.docx
+++ b/MVR_Model_Reference.docx
@@ -76,7 +76,7 @@
           <w:sz w:val="18"/>
           <w:szCs w:val="18"/>
         </w:rPr>
-        <w:t xml:space="preserve">Version 2026-07-22 16:29  (generated)</w:t>
+        <w:t xml:space="preserve">Version 2026-07-23 13:48  (generated)</w:t>
       </w:r>
     </w:p>
     <w:p>
@@ -8769,7 +8769,7 @@
                 <w:sz w:val="18"/>
                 <w:szCs w:val="18"/>
               </w:rPr>
-              <w:t xml:space="preserve">prodFastWinS / prodFastAvgS</w:t>
+              <w:t xml:space="preserve">prodFastAvgS / prodAvgS</w:t>
             </w:r>
           </w:p>
         </w:tc>
@@ -8798,7 +8798,7 @@
                 <w:sz w:val="20"/>
                 <w:szCs w:val="20"/>
               </w:rPr>
-              <w:t xml:space="preserve">300 cap / 180</w:t>
+              <w:t xml:space="preserve">60 / 120</w:t>
             </w:r>
           </w:p>
         </w:tc>
@@ -8856,7 +8856,7 @@
                 <w:sz w:val="20"/>
                 <w:szCs w:val="20"/>
               </w:rPr>
-              <w:t xml:space="preserve">FAST production estimate (prodFast), CYCLE-SYNCED (7/22): the window closes at each PUMP-OFF edge -- the reservoir is in the same just-emptied state cycle to cycle, so volume/period is EXACT. Fixed 60s windows ALIASED against the 400-750s flow-follow pump cycles (prodFast swung 0.19-0.47 while true per-cycle production sat flat at 0.46; the blower hunted +/-900rpm, ~10min period, chasing it). prodFastWinS is only the CAP (continuous pumping/stall); prodFastMinS (45s) ignores micro-cycles. Feeds the feed FF AND the blower loop (pmG). RUN only, NO proven-meter wait (a recompile resets that flag and left the fast FF blind at 0 while 0.6 L/min pumped out -- flow past the meter IS proof); cleared outside RUN. The BLOWER keeps the slow stable prodMeas -- two consumers, two time constants.</w:t>
+              <w:t xml:space="preserve">Production measurement (7/23): PLAIN CONTINUOUS EMAs of calibrated meter flow (clamp(yCondFlow,0,5) x condCalFactor) -- the windowed/cycle-synced schemes froze between updates and pinned at clamps (prodMeas stuck at 0.484 through changing flow). prodFast (60s) drives the feed FF; prodMeas (120s) steadies the blower loop/displays/stall logic. Both move every tick; over any horizon &gt;&gt; one pump cycle the EMA mean IS production. Ripple grows with pump-cycle length -- raise the horizons if the feed breathes with the pump.</w:t>
             </w:r>
           </w:p>
         </w:tc>
@@ -10273,124 +10273,6 @@
                 <w:szCs w:val="20"/>
               </w:rPr>
               <w:t xml:space="preserve">TOTALIZER-WINDOW production rate: with prodFromTotal=1 (default) condRateLpm comes SOLELY from the cumulative meter delta over this rolling window -- needs NO pump cycles (a stuck-wet CondLevel micro-cycles the pump so no batch ever reaches condRateMinML; the rig sat blind at the seek cap with a WORKING meter). Batches still refresh the same rate more precisely when they land; &gt;= 5ml/window required, plausibility-capped.</w:t>
-            </w:r>
-          </w:p>
-        </w:tc>
-      </w:tr>
-      <w:tr>
-        <w:tc>
-          <w:tcPr>
-            <w:tcW w:type="dxa" w:w="2200"/>
-            <w:tcBorders>
-              <w:top w:val="single" w:color="BBBBBB" w:sz="1"/>
-              <w:left w:val="single" w:color="BBBBBB" w:sz="1"/>
-              <w:bottom w:val="single" w:color="BBBBBB" w:sz="1"/>
-              <w:right w:val="single" w:color="BBBBBB" w:sz="1"/>
-            </w:tcBorders>
-            <w:tcMar>
-              <w:top w:type="dxa" w:w="50"/>
-              <w:left w:type="dxa" w:w="110"/>
-              <w:bottom w:type="dxa" w:w="50"/>
-              <w:right w:type="dxa" w:w="110"/>
-            </w:tcMar>
-          </w:tcPr>
-          <w:p>
-            <w:r>
-              <w:rPr>
-                <w:rFonts w:ascii="Consolas" w:cs="Consolas" w:eastAsia="Consolas" w:hAnsi="Consolas"/>
-                <w:b w:val="false"/>
-                <w:bCs w:val="false"/>
-                <w:sz w:val="18"/>
-                <w:szCs w:val="18"/>
-              </w:rPr>
-              <w:t xml:space="preserve">prodAvgS</w:t>
-            </w:r>
-          </w:p>
-        </w:tc>
-        <w:tc>
-          <w:tcPr>
-            <w:tcW w:type="dxa" w:w="1300"/>
-            <w:tcBorders>
-              <w:top w:val="single" w:color="BBBBBB" w:sz="1"/>
-              <w:left w:val="single" w:color="BBBBBB" w:sz="1"/>
-              <w:bottom w:val="single" w:color="BBBBBB" w:sz="1"/>
-              <w:right w:val="single" w:color="BBBBBB" w:sz="1"/>
-            </w:tcBorders>
-            <w:tcMar>
-              <w:top w:type="dxa" w:w="50"/>
-              <w:left w:type="dxa" w:w="110"/>
-              <w:bottom w:type="dxa" w:w="50"/>
-              <w:right w:type="dxa" w:w="110"/>
-            </w:tcMar>
-          </w:tcPr>
-          <w:p>
-            <w:r>
-              <w:rPr>
-                <w:rFonts w:ascii="Arial" w:cs="Arial" w:eastAsia="Arial" w:hAnsi="Arial"/>
-                <w:b w:val="false"/>
-                <w:bCs w:val="false"/>
-                <w:sz w:val="20"/>
-                <w:szCs w:val="20"/>
-              </w:rPr>
-              <w:t xml:space="preserve">120</w:t>
-            </w:r>
-          </w:p>
-        </w:tc>
-        <w:tc>
-          <w:tcPr>
-            <w:tcW w:type="dxa" w:w="1500"/>
-            <w:tcBorders>
-              <w:top w:val="single" w:color="BBBBBB" w:sz="1"/>
-              <w:left w:val="single" w:color="BBBBBB" w:sz="1"/>
-              <w:bottom w:val="single" w:color="BBBBBB" w:sz="1"/>
-              <w:right w:val="single" w:color="BBBBBB" w:sz="1"/>
-            </w:tcBorders>
-            <w:tcMar>
-              <w:top w:type="dxa" w:w="50"/>
-              <w:left w:type="dxa" w:w="110"/>
-              <w:bottom w:type="dxa" w:w="50"/>
-              <w:right w:type="dxa" w:w="110"/>
-            </w:tcMar>
-          </w:tcPr>
-          <w:p>
-            <w:r>
-              <w:rPr>
-                <w:rFonts w:ascii="Arial" w:cs="Arial" w:eastAsia="Arial" w:hAnsi="Arial"/>
-                <w:b w:val="false"/>
-                <w:bCs w:val="false"/>
-                <w:sz w:val="20"/>
-                <w:szCs w:val="20"/>
-              </w:rPr>
-              <w:t xml:space="preserve">s</w:t>
-            </w:r>
-          </w:p>
-        </w:tc>
-        <w:tc>
-          <w:tcPr>
-            <w:tcW w:type="dxa" w:w="4360"/>
-            <w:tcBorders>
-              <w:top w:val="single" w:color="BBBBBB" w:sz="1"/>
-              <w:left w:val="single" w:color="BBBBBB" w:sz="1"/>
-              <w:bottom w:val="single" w:color="BBBBBB" w:sz="1"/>
-              <w:right w:val="single" w:color="BBBBBB" w:sz="1"/>
-            </w:tcBorders>
-            <w:tcMar>
-              <w:top w:type="dxa" w:w="50"/>
-              <w:left w:type="dxa" w:w="110"/>
-              <w:bottom w:type="dxa" w:w="50"/>
-              <w:right w:type="dxa" w:w="110"/>
-            </w:tcMar>
-          </w:tcPr>
-          <w:p>
-            <w:r>
-              <w:rPr>
-                <w:rFonts w:ascii="Arial" w:cs="Arial" w:eastAsia="Arial" w:hAnsi="Arial"/>
-                <w:b w:val="false"/>
-                <w:bCs w:val="false"/>
-                <w:sz w:val="20"/>
-                <w:szCs w:val="20"/>
-              </w:rPr>
-              <w:t xml:space="preserve">Production BURST-AVERAGING horizon: every totalizer window feeds a time-weighted EMA over this, so pump-out bursts and quiet windows average to the TRUE rate. Rig DOLILO 7/21: 600 -&gt; 120 (blower tracks prodSet 0.35 at avg ~0.36); ~60 is plausible since the pump cycles 2x/min in production.</w:t>
             </w:r>
           </w:p>
         </w:tc>
@@ -18699,7 +18581,7 @@
         <w:sz w:val="16"/>
         <w:szCs w:val="16"/>
       </w:rPr>
-      <w:t xml:space="preserve">MVR Model &amp; Control Reference  -  v2026-07-22 16:29  -  </w:t>
+      <w:t xml:space="preserve">MVR Model &amp; Control Reference  -  v2026-07-23 13:48  -  </w:t>
     </w:r>
     <w:r>
       <w:rPr>

</xml_diff>

<commit_message>
Doc: makeup PI retune row
Co-Authored-By: Claude Opus 4.8 <noreply@anthropic.com>
</commit_message>
<xml_diff>
--- a/MVR_Model_Reference.docx
+++ b/MVR_Model_Reference.docx
@@ -76,7 +76,7 @@
           <w:sz w:val="18"/>
           <w:szCs w:val="18"/>
         </w:rPr>
-        <w:t xml:space="preserve">Version 2026-07-23 13:48  (generated)</w:t>
+        <w:t xml:space="preserve">Version 2026-07-23 13:52  (generated)</w:t>
       </w:r>
     </w:p>
     <w:p>
@@ -8090,7 +8090,7 @@
                 <w:sz w:val="20"/>
                 <w:szCs w:val="20"/>
               </w:rPr>
-              <w:t xml:space="preserve">0.5 / 0.03</w:t>
+              <w:t xml:space="preserve">0.25 / 0.002</w:t>
             </w:r>
           </w:p>
         </w:tc>
@@ -8119,7 +8119,7 @@
                 <w:sz w:val="20"/>
                 <w:szCs w:val="20"/>
               </w:rPr>
-              <w:t xml:space="preserve">-</w:t>
+              <w:t xml:space="preserve">duty/C, duty/C/s</w:t>
             </w:r>
           </w:p>
         </w:tc>
@@ -8148,7 +8148,7 @@
                 <w:sz w:val="20"/>
                 <w:szCs w:val="20"/>
               </w:rPr>
-              <w:t xml:space="preserve">Makeup-heater PI gains. 0.05 was integral-only (rail-to-rail duty, eT +/-2.5C); the user's 0.7/0.07 gave a fast 42s +/-1.2C limit cycle against the ~10s TC lag. 0.5/0.03 + the FEED SLEW LIMIT (the real disturbance was cold-water feed rushes) is the balance.</w:t>
+              <w:t xml:space="preserve">Makeup PI, retuned 7/23: at 0.5/0.03 the integral time (~17s) sat INSIDE the ~20s heater-&gt;water-&gt;TC dead time and the loop limit-cycled ~94s near full scale EVEN WITH FEED CONSTANT -- and at a rolling boil eT barely obeys duty (watts go latent; pool temp is pinned by pressure). tau_i now ~125s: the integral carries the steady duty, P handles transients.</w:t>
             </w:r>
           </w:p>
         </w:tc>
@@ -18581,7 +18581,7 @@
         <w:sz w:val="16"/>
         <w:szCs w:val="16"/>
       </w:rPr>
-      <w:t xml:space="preserve">MVR Model &amp; Control Reference  -  v2026-07-23 13:48  -  </w:t>
+      <w:t xml:space="preserve">MVR Model &amp; Control Reference  -  v2026-07-23 13:52  -  </w:t>
     </w:r>
     <w:r>
       <w:rPr>

</xml_diff>

<commit_message>
Doc: symmetric feed slew row
Co-Authored-By: Claude Opus 4.8 <noreply@anthropic.com>
</commit_message>
<xml_diff>
--- a/MVR_Model_Reference.docx
+++ b/MVR_Model_Reference.docx
@@ -76,7 +76,7 @@
           <w:sz w:val="18"/>
           <w:szCs w:val="18"/>
         </w:rPr>
-        <w:t xml:space="preserve">Version 2026-07-24 10:25  (generated)</w:t>
+        <w:t xml:space="preserve">Version 2026-07-24 14:57  (generated)</w:t>
       </w:r>
     </w:p>
     <w:p>
@@ -18699,7 +18699,7 @@
         <w:sz w:val="16"/>
         <w:szCs w:val="16"/>
       </w:rPr>
-      <w:t xml:space="preserve">MVR Model &amp; Control Reference  -  v2026-07-24 10:25  -  </w:t>
+      <w:t xml:space="preserve">MVR Model &amp; Control Reference  -  v2026-07-24 14:57  -  </w:t>
     </w:r>
     <w:r>
       <w:rPr>

</xml_diff>

<commit_message>
Cold-boil fill latch: feed is bang-bang on the physical sender below boiling
Cold start 7/25: level hit the operating mark during HEAT/early-RUN and
the feed kept pouring -- below boiling there is no production for the FF
to follow, no boil-off to relieve the level, and the cold-crash fold
recenters feed to the learned base (cancelling the downward level
terms). Russ stopped it by slamming max rpm to 0 by hand.

New coldFeedTempC (95C) / coldFillHold statics: steam below threshold +
sender at/above evapMidMark -> feed 0, LATCHED until the sender itself
steps a tick down (physical water gone, not estimate) or boiling begins.
Cut bypasses the slew like yEvapHigh. Verified in transpiled C++ (all
sections correctly fActive-guarded, no hoisting). Reference doc updated.

Co-Authored-By: Claude Opus 4.8 <noreply@anthropic.com>
</commit_message>
<xml_diff>
--- a/MVR_Model_Reference.docx
+++ b/MVR_Model_Reference.docx
@@ -76,7 +76,7 @@
           <w:sz w:val="18"/>
           <w:szCs w:val="18"/>
         </w:rPr>
-        <w:t xml:space="preserve">Version 2026-07-24 14:57  (generated)</w:t>
+        <w:t xml:space="preserve">Version 2026-07-25 16:28  (generated)</w:t>
       </w:r>
     </w:p>
     <w:p>
@@ -13877,6 +13877,124 @@
                 <w:sz w:val="18"/>
                 <w:szCs w:val="18"/>
               </w:rPr>
+              <w:t xml:space="preserve">coldFeedTempC</w:t>
+            </w:r>
+          </w:p>
+        </w:tc>
+        <w:tc>
+          <w:tcPr>
+            <w:tcW w:type="dxa" w:w="1400"/>
+            <w:tcBorders>
+              <w:top w:val="single" w:color="BBBBBB" w:sz="1"/>
+              <w:left w:val="single" w:color="BBBBBB" w:sz="1"/>
+              <w:bottom w:val="single" w:color="BBBBBB" w:sz="1"/>
+              <w:right w:val="single" w:color="BBBBBB" w:sz="1"/>
+            </w:tcBorders>
+            <w:tcMar>
+              <w:top w:type="dxa" w:w="50"/>
+              <w:left w:type="dxa" w:w="110"/>
+              <w:bottom w:type="dxa" w:w="50"/>
+              <w:right w:type="dxa" w:w="110"/>
+            </w:tcMar>
+          </w:tcPr>
+          <w:p>
+            <w:r>
+              <w:rPr>
+                <w:rFonts w:ascii="Arial" w:cs="Arial" w:eastAsia="Arial" w:hAnsi="Arial"/>
+                <w:b w:val="false"/>
+                <w:bCs w:val="false"/>
+                <w:sz w:val="20"/>
+                <w:szCs w:val="20"/>
+              </w:rPr>
+              <w:t xml:space="preserve">95</w:t>
+            </w:r>
+          </w:p>
+        </w:tc>
+        <w:tc>
+          <w:tcPr>
+            <w:tcW w:type="dxa" w:w="2000"/>
+            <w:tcBorders>
+              <w:top w:val="single" w:color="BBBBBB" w:sz="1"/>
+              <w:left w:val="single" w:color="BBBBBB" w:sz="1"/>
+              <w:bottom w:val="single" w:color="BBBBBB" w:sz="1"/>
+              <w:right w:val="single" w:color="BBBBBB" w:sz="1"/>
+            </w:tcBorders>
+            <w:tcMar>
+              <w:top w:type="dxa" w:w="50"/>
+              <w:left w:type="dxa" w:w="110"/>
+              <w:bottom w:type="dxa" w:w="50"/>
+              <w:right w:type="dxa" w:w="110"/>
+            </w:tcMar>
+          </w:tcPr>
+          <w:p>
+            <w:r>
+              <w:rPr>
+                <w:rFonts w:ascii="Arial" w:cs="Arial" w:eastAsia="Arial" w:hAnsi="Arial"/>
+                <w:b w:val="false"/>
+                <w:bCs w:val="false"/>
+                <w:sz w:val="20"/>
+                <w:szCs w:val="20"/>
+              </w:rPr>
+              <w:t xml:space="preserve">degC</w:t>
+            </w:r>
+          </w:p>
+        </w:tc>
+        <w:tc>
+          <w:tcPr>
+            <w:tcW w:type="dxa" w:w="3960"/>
+            <w:tcBorders>
+              <w:top w:val="single" w:color="BBBBBB" w:sz="1"/>
+              <w:left w:val="single" w:color="BBBBBB" w:sz="1"/>
+              <w:bottom w:val="single" w:color="BBBBBB" w:sz="1"/>
+              <w:right w:val="single" w:color="BBBBBB" w:sz="1"/>
+            </w:tcBorders>
+            <w:tcMar>
+              <w:top w:type="dxa" w:w="50"/>
+              <w:left w:type="dxa" w:w="110"/>
+              <w:bottom w:type="dxa" w:w="50"/>
+              <w:right w:type="dxa" w:w="110"/>
+            </w:tcMar>
+          </w:tcPr>
+          <w:p>
+            <w:r>
+              <w:rPr>
+                <w:rFonts w:ascii="Arial" w:cs="Arial" w:eastAsia="Arial" w:hAnsi="Arial"/>
+                <w:b w:val="false"/>
+                <w:bCs w:val="false"/>
+                <w:sz w:val="20"/>
+                <w:szCs w:val="20"/>
+              </w:rPr>
+              <w:t xml:space="preserve">COLD-BOIL FILL LATCH (rig 7/25): below this steam temp there is no production for the FF to follow and no boil-off to relieve the level (the cold-crash fold even recenters feed to the learned base, cancelling downward level terms) -- so the feed goes bang-bang on the PHYSICAL sender: fill to the operating mark, then feed OFF, latched until the sender itself steps a tick back DOWN (real water consumed, not an estimate) or boiling begins. The cut bypasses the feed slew (immediate, like yEvapHigh). 0 disables.</w:t>
+            </w:r>
+          </w:p>
+        </w:tc>
+      </w:tr>
+      <w:tr>
+        <w:tc>
+          <w:tcPr>
+            <w:tcW w:type="dxa" w:w="2000"/>
+            <w:tcBorders>
+              <w:top w:val="single" w:color="BBBBBB" w:sz="1"/>
+              <w:left w:val="single" w:color="BBBBBB" w:sz="1"/>
+              <w:bottom w:val="single" w:color="BBBBBB" w:sz="1"/>
+              <w:right w:val="single" w:color="BBBBBB" w:sz="1"/>
+            </w:tcBorders>
+            <w:tcMar>
+              <w:top w:type="dxa" w:w="50"/>
+              <w:left w:type="dxa" w:w="110"/>
+              <w:bottom w:type="dxa" w:w="50"/>
+              <w:right w:type="dxa" w:w="110"/>
+            </w:tcMar>
+          </w:tcPr>
+          <w:p>
+            <w:r>
+              <w:rPr>
+                <w:rFonts w:ascii="Consolas" w:cs="Consolas" w:eastAsia="Consolas" w:hAnsi="Consolas"/>
+                <w:b w:val="false"/>
+                <w:bCs w:val="false"/>
+                <w:sz w:val="18"/>
+                <w:szCs w:val="18"/>
+              </w:rPr>
               <w:t xml:space="preserve">feedHiEscS</w:t>
             </w:r>
           </w:p>
@@ -18699,7 +18817,7 @@
         <w:sz w:val="16"/>
         <w:szCs w:val="16"/>
       </w:rPr>
-      <w:t xml:space="preserve">MVR Model &amp; Control Reference  -  v2026-07-24 14:57  -  </w:t>
+      <w:t xml:space="preserve">MVR Model &amp; Control Reference  -  v2026-07-25 16:28  -  </w:t>
     </w:r>
     <w:r>
       <w:rPr>

</xml_diff>

<commit_message>
Standby droop gated on the in-the-groove signal (yVaporOut > 100C)
Russ: vapor out crossing ~100C is the rig-proven 'actually producing /
operating zone reached' indication and the right moment to fold back
superheat. Below shVapOutGroove the element holds FULL regC through the
entire startup; above it the excess-superheat droop relaxes the hold.
Reference doc gains the standby-system entry.

Co-Authored-By: Claude Opus 4.8 <noreply@anthropic.com>
</commit_message>
<xml_diff>
--- a/MVR_Model_Reference.docx
+++ b/MVR_Model_Reference.docx
@@ -76,7 +76,7 @@
           <w:sz w:val="18"/>
           <w:szCs w:val="18"/>
         </w:rPr>
-        <w:t xml:space="preserve">Version 2026-07-25 16:28  (generated)</w:t>
+        <w:t xml:space="preserve">Version 2026-07-27 11:30  (generated)</w:t>
       </w:r>
     </w:p>
     <w:p>
@@ -13995,6 +13995,124 @@
                 <w:sz w:val="18"/>
                 <w:szCs w:val="18"/>
               </w:rPr>
+              <w:t xml:space="preserve">shStandbyMax / BandC / TaperC / shVapOutGroove</w:t>
+            </w:r>
+          </w:p>
+        </w:tc>
+        <w:tc>
+          <w:tcPr>
+            <w:tcW w:type="dxa" w:w="1400"/>
+            <w:tcBorders>
+              <w:top w:val="single" w:color="BBBBBB" w:sz="1"/>
+              <w:left w:val="single" w:color="BBBBBB" w:sz="1"/>
+              <w:bottom w:val="single" w:color="BBBBBB" w:sz="1"/>
+              <w:right w:val="single" w:color="BBBBBB" w:sz="1"/>
+            </w:tcBorders>
+            <w:tcMar>
+              <w:top w:type="dxa" w:w="50"/>
+              <w:left w:type="dxa" w:w="110"/>
+              <w:bottom w:type="dxa" w:w="50"/>
+              <w:right w:type="dxa" w:w="110"/>
+            </w:tcMar>
+          </w:tcPr>
+          <w:p>
+            <w:r>
+              <w:rPr>
+                <w:rFonts w:ascii="Arial" w:cs="Arial" w:eastAsia="Arial" w:hAnsi="Arial"/>
+                <w:b w:val="false"/>
+                <w:bCs w:val="false"/>
+                <w:sz w:val="20"/>
+                <w:szCs w:val="20"/>
+              </w:rPr>
+              <w:t xml:space="preserve">0.5 / 4 / 40 / 100</w:t>
+            </w:r>
+          </w:p>
+        </w:tc>
+        <w:tc>
+          <w:tcPr>
+            <w:tcW w:type="dxa" w:w="2000"/>
+            <w:tcBorders>
+              <w:top w:val="single" w:color="BBBBBB" w:sz="1"/>
+              <w:left w:val="single" w:color="BBBBBB" w:sz="1"/>
+              <w:bottom w:val="single" w:color="BBBBBB" w:sz="1"/>
+              <w:right w:val="single" w:color="BBBBBB" w:sz="1"/>
+            </w:tcBorders>
+            <w:tcMar>
+              <w:top w:type="dxa" w:w="50"/>
+              <w:left w:type="dxa" w:w="110"/>
+              <w:bottom w:type="dxa" w:w="50"/>
+              <w:right w:type="dxa" w:w="110"/>
+            </w:tcMar>
+          </w:tcPr>
+          <w:p>
+            <w:r>
+              <w:rPr>
+                <w:rFonts w:ascii="Arial" w:cs="Arial" w:eastAsia="Arial" w:hAnsi="Arial"/>
+                <w:b w:val="false"/>
+                <w:bCs w:val="false"/>
+                <w:sz w:val="20"/>
+                <w:szCs w:val="20"/>
+              </w:rPr>
+              <w:t xml:space="preserve">duty/C/C/C</w:t>
+            </w:r>
+          </w:p>
+        </w:tc>
+        <w:tc>
+          <w:tcPr>
+            <w:tcW w:type="dxa" w:w="3960"/>
+            <w:tcBorders>
+              <w:top w:val="single" w:color="BBBBBB" w:sz="1"/>
+              <w:left w:val="single" w:color="BBBBBB" w:sz="1"/>
+              <w:bottom w:val="single" w:color="BBBBBB" w:sz="1"/>
+              <w:right w:val="single" w:color="BBBBBB" w:sz="1"/>
+            </w:tcBorders>
+            <w:tcMar>
+              <w:top w:type="dxa" w:w="50"/>
+              <w:left w:type="dxa" w:w="110"/>
+              <w:bottom w:type="dxa" w:w="50"/>
+              <w:right w:type="dxa" w:w="110"/>
+            </w:tcMar>
+          </w:tcPr>
+          <w:p>
+            <w:r>
+              <w:rPr>
+                <w:rFonts w:ascii="Arial" w:cs="Arial" w:eastAsia="Arial" w:hAnsi="Arial"/>
+                <w:b w:val="false"/>
+                <w:bCs w:val="false"/>
+                <w:sz w:val="20"/>
+                <w:szCs w:val="20"/>
+              </w:rPr>
+              <w:t xml:space="preserve">SUPERHEAT ELEMENT STANDBY (7/27, cured the startup wet-comp trips): the element-temp regulator is now a FLOOR as well as a cap -- with the blower turning, the cartridge is actively held hot so thermal reserve exists BEFORE the RUN-entry transition (the PI used to idle at duty 0 with superheat reading fine, the mesh cooled to 195C, and the suction fold then outran it: 5C to trip in 60s). The hold-temp DROOPS from full superHtrRegC by TaperC across BandC of excess superheat -- but only once yVaporOut exceeds shVapOutGroove (the rig-proven in-the-groove / actually-producing signal): the whole startup holds full reserve, cruise relaxes so superheat settles to the setpoint. shStandbyMax bounds the standby duty; 0 disables.</w:t>
+            </w:r>
+          </w:p>
+        </w:tc>
+      </w:tr>
+      <w:tr>
+        <w:tc>
+          <w:tcPr>
+            <w:tcW w:type="dxa" w:w="2000"/>
+            <w:tcBorders>
+              <w:top w:val="single" w:color="BBBBBB" w:sz="1"/>
+              <w:left w:val="single" w:color="BBBBBB" w:sz="1"/>
+              <w:bottom w:val="single" w:color="BBBBBB" w:sz="1"/>
+              <w:right w:val="single" w:color="BBBBBB" w:sz="1"/>
+            </w:tcBorders>
+            <w:tcMar>
+              <w:top w:type="dxa" w:w="50"/>
+              <w:left w:type="dxa" w:w="110"/>
+              <w:bottom w:type="dxa" w:w="50"/>
+              <w:right w:type="dxa" w:w="110"/>
+            </w:tcMar>
+          </w:tcPr>
+          <w:p>
+            <w:r>
+              <w:rPr>
+                <w:rFonts w:ascii="Consolas" w:cs="Consolas" w:eastAsia="Consolas" w:hAnsi="Consolas"/>
+                <w:b w:val="false"/>
+                <w:bCs w:val="false"/>
+                <w:sz w:val="18"/>
+                <w:szCs w:val="18"/>
+              </w:rPr>
               <w:t xml:space="preserve">feedHiEscS</w:t>
             </w:r>
           </w:p>
@@ -18817,7 +18935,7 @@
         <w:sz w:val="16"/>
         <w:szCs w:val="16"/>
       </w:rPr>
-      <w:t xml:space="preserve">MVR Model &amp; Control Reference  -  v2026-07-25 16:28  -  </w:t>
+      <w:t xml:space="preserve">MVR Model &amp; Control Reference  -  v2026-07-27 11:30  -  </w:t>
     </w:r>
     <w:r>
       <w:rPr>

</xml_diff>

<commit_message>
Smart superheat reserve: rate-of-fall sense + natural producing floor (110C)
Russ rig-truths folded in: the cartridge naturally runs 110-150C once
condensing flow is up -- the relaxed floor now targets shStandbyProdC
(110) instead of fighting the flow-stripped element; and reserve demand
watches d(superheatIn)/dt (shDot EMA, chartable) so a fall at
shDotFullCs (0.1 C/s -- the 7/27 collapse rate) walks the hold target to
full regC AHEAD of the collapse. Demand = max(nearness, rate, groove).

Co-Authored-By: Claude Opus 4.8 <noreply@anthropic.com>
</commit_message>
<xml_diff>
--- a/MVR_Model_Reference.docx
+++ b/MVR_Model_Reference.docx
@@ -76,7 +76,7 @@
           <w:sz w:val="18"/>
           <w:szCs w:val="18"/>
         </w:rPr>
-        <w:t xml:space="preserve">Version 2026-07-27 11:30  (generated)</w:t>
+        <w:t xml:space="preserve">Version 2026-07-27 11:35  (generated)</w:t>
       </w:r>
     </w:p>
     <w:p>
@@ -13995,7 +13995,7 @@
                 <w:sz w:val="18"/>
                 <w:szCs w:val="18"/>
               </w:rPr>
-              <w:t xml:space="preserve">shStandbyMax / BandC / TaperC / shVapOutGroove</w:t>
+              <w:t xml:space="preserve">shStandbyMax / ProdC / BandC / shDotFullCs / shVapOutGroove</w:t>
             </w:r>
           </w:p>
         </w:tc>
@@ -14024,7 +14024,7 @@
                 <w:sz w:val="20"/>
                 <w:szCs w:val="20"/>
               </w:rPr>
-              <w:t xml:space="preserve">0.5 / 4 / 40 / 100</w:t>
+              <w:t xml:space="preserve">0.5 / 110 / 4 / 0.1 / 100</w:t>
             </w:r>
           </w:p>
         </w:tc>
@@ -14053,7 +14053,7 @@
                 <w:sz w:val="20"/>
                 <w:szCs w:val="20"/>
               </w:rPr>
-              <w:t xml:space="preserve">duty/C/C/C</w:t>
+              <w:t xml:space="preserve">duty/C/C/C-per-s/C</w:t>
             </w:r>
           </w:p>
         </w:tc>
@@ -14082,7 +14082,7 @@
                 <w:sz w:val="20"/>
                 <w:szCs w:val="20"/>
               </w:rPr>
-              <w:t xml:space="preserve">SUPERHEAT ELEMENT STANDBY (7/27, cured the startup wet-comp trips): the element-temp regulator is now a FLOOR as well as a cap -- with the blower turning, the cartridge is actively held hot so thermal reserve exists BEFORE the RUN-entry transition (the PI used to idle at duty 0 with superheat reading fine, the mesh cooled to 195C, and the suction fold then outran it: 5C to trip in 60s). The hold-temp DROOPS from full superHtrRegC by TaperC across BandC of excess superheat -- but only once yVaporOut exceeds shVapOutGroove (the rig-proven in-the-groove / actually-producing signal): the whole startup holds full reserve, cruise relaxes so superheat settles to the setpoint. shStandbyMax bounds the standby duty; 0 disables.</w:t>
+              <w:t xml:space="preserve">SUPERHEAT SMART RESERVE (7/27, cured the startup wet-comp trips): the element-temp regulator is a FLOOR as well as a cap. Reserve demand (0..1) = MAX of: nearness (superheat within BandC of set), RATE (superheat falling at shDotFullCs C/s -&gt; full reserve AHEAD of the collapse; shDot is the live EMA d(shIn)/dt, chartable), and the groove gate (yVaporOut below shVapOutGroove = not yet producing -&gt; full reserve through the whole startup). The hold target slides from shStandbyProdC (110C -- the cartridge NATURALLY runs 110-150C once condensing flow strips it; the floor must not fight that) up to superHtrRegC with demand. shStandbyMax bounds standby duty; 0 disables. Root cause it fixes: the PI idled at duty 0 with superheat reading fine, the mesh cooled to 195C, and the RUN-entry suction fold outran the cold element (5C to trip in 60s)</w:t>
             </w:r>
           </w:p>
         </w:tc>
@@ -18935,7 +18935,7 @@
         <w:sz w:val="16"/>
         <w:szCs w:val="16"/>
       </w:rPr>
-      <w:t xml:space="preserve">MVR Model &amp; Control Reference  -  v2026-07-27 11:30  -  </w:t>
+      <w:t xml:space="preserve">MVR Model &amp; Control Reference  -  v2026-07-27 11:35  -  </w:t>
     </w:r>
     <w:r>
       <w:rPr>

</xml_diff>

<commit_message>
STAGED: raw-high throttle persistence (feedHiOnS 10s) + calibration trues
One-change-at-a-time per russ. Control change: the 0.5xFF feed cut now
requires the high plateau to persist 10s -- boundary flicker while
riding the 2350|2600 edge halved the feed instantly, and the ~30s-lagged
thermal response (chest vapor +2C) tripped the makeup fold into a
production collapse (3 episodes 7/28). Escalation timing unchanged.
Calibration (non-behavioral): tsatTrimC default 0.0 (as-run), pump
powers 10W each + electronics 10W (measured true power was ~100W below
the old 20/20/30/30 model).

Co-Authored-By: Claude Opus 4.8 <noreply@anthropic.com>
</commit_message>
<xml_diff>
--- a/MVR_Model_Reference.docx
+++ b/MVR_Model_Reference.docx
@@ -76,7 +76,7 @@
           <w:sz w:val="18"/>
           <w:szCs w:val="18"/>
         </w:rPr>
-        <w:t xml:space="preserve">Version 2026-07-27 11:35  (generated)</w:t>
+        <w:t xml:space="preserve">Version 2026-07-28 12:08  (generated)</w:t>
       </w:r>
     </w:p>
     <w:p>
@@ -14200,7 +14200,7 @@
                 <w:sz w:val="20"/>
                 <w:szCs w:val="20"/>
               </w:rPr>
-              <w:t xml:space="preserve">RAW-HIGH ESCALATION (7/22): on the 2600 plateau the feed caps at 0.5xFF immediately, 0.25xFF after this long still high, OFF after 2x -- descent guaranteed regardless of FF bias (the confidence-softened 0.71xFF cap held 367rpm mean ON the plateau). Down-slew runs 4x (cuts are thermally free).</w:t>
+              <w:t xml:space="preserve">RAW-HIGH ESCALATION (7/22): on the 2600 plateau the feed caps at 0.5xFF after the plateau persists feedHiOnS (10s, 7/28: an instant cut on boundary flicker injected the thermal disturbance behind the eT-excursion/makeup-fold/collapse cycle), 0.25xFF after feedHiEscS still high, OFF after 2x -- descent guaranteed regardless of FF bias (the confidence-softened 0.71xFF cap held 367rpm mean ON the plateau). Down-slew runs 4x (cuts are thermally free).</w:t>
             </w:r>
           </w:p>
         </w:tc>
@@ -18935,7 +18935,7 @@
         <w:sz w:val="16"/>
         <w:szCs w:val="16"/>
       </w:rPr>
-      <w:t xml:space="preserve">MVR Model &amp; Control Reference  -  v2026-07-27 11:35  -  </w:t>
+      <w:t xml:space="preserve">MVR Model &amp; Control Reference  -  v2026-07-28 12:08  -  </w:t>
     </w:r>
     <w:r>
       <w:rPr>

</xml_diff>